<commit_message>
features: integrate frontend with backend APIs
</commit_message>
<xml_diff>
--- a/Daily Report of Project.docx
+++ b/Daily Report of Project.docx
@@ -6351,6 +6351,7 @@
       <w:r>
         <w:rPr>
           <w:rFonts w:ascii="Times New Roman" w:hAnsi="Times New Roman" w:cs="Times New Roman"/>
+          <w:noProof/>
         </w:rPr>
         <w:drawing>
           <wp:inline distT="0" distB="0" distL="0" distR="0" wp14:anchorId="41A71691" wp14:editId="765EE26E">
@@ -6510,7 +6511,7 @@
     </w:p>
     <w:tbl>
       <w:tblPr>
-        <w:tblW w:w="10490" w:type="dxa"/>
+        <w:tblW w:w="10632" w:type="dxa"/>
         <w:tblCellMar>
           <w:left w:w="10" w:type="dxa"/>
           <w:right w:w="10" w:type="dxa"/>
@@ -6518,17 +6519,17 @@
         <w:tblLook w:val="04A0" w:firstRow="1" w:lastRow="0" w:firstColumn="1" w:lastColumn="0" w:noHBand="0" w:noVBand="1"/>
       </w:tblPr>
       <w:tblGrid>
-        <w:gridCol w:w="1418"/>
-        <w:gridCol w:w="4819"/>
-        <w:gridCol w:w="4253"/>
+        <w:gridCol w:w="1437"/>
+        <w:gridCol w:w="4884"/>
+        <w:gridCol w:w="4311"/>
       </w:tblGrid>
       <w:tr>
         <w:trPr>
-          <w:trHeight w:val="2140"/>
+          <w:trHeight w:val="1511"/>
         </w:trPr>
         <w:tc>
           <w:tcPr>
-            <w:tcW w:w="1418" w:type="dxa"/>
+            <w:tcW w:w="1437" w:type="dxa"/>
             <w:tcBorders>
               <w:top w:val="nil"/>
               <w:left w:val="nil"/>
@@ -6553,19 +6554,7 @@
               <w:rPr>
                 <w:rFonts w:ascii="Times New Roman" w:hAnsi="Times New Roman" w:cs="Times New Roman"/>
               </w:rPr>
-              <w:t>2</w:t>
-            </w:r>
-            <w:r>
-              <w:rPr>
-                <w:rFonts w:ascii="Times New Roman" w:hAnsi="Times New Roman" w:cs="Times New Roman"/>
-              </w:rPr>
-              <w:t>8</w:t>
-            </w:r>
-            <w:r>
-              <w:rPr>
-                <w:rFonts w:ascii="Times New Roman" w:hAnsi="Times New Roman" w:cs="Times New Roman"/>
-              </w:rPr>
-              <w:t xml:space="preserve"> July 2026</w:t>
+              <w:t>28 July 2026</w:t>
             </w:r>
           </w:p>
           <w:p>
@@ -6591,7 +6580,7 @@
         </w:tc>
         <w:tc>
           <w:tcPr>
-            <w:tcW w:w="4819" w:type="dxa"/>
+            <w:tcW w:w="4884" w:type="dxa"/>
             <w:tcBorders>
               <w:top w:val="nil"/>
               <w:left w:val="nil"/>
@@ -6635,11 +6624,477 @@
                 <w:bCs/>
               </w:rPr>
             </w:pPr>
+            <w:r>
+              <w:rPr>
+                <w:rFonts w:ascii="Times New Roman" w:hAnsi="Times New Roman" w:cs="Times New Roman"/>
+                <w:b/>
+                <w:bCs/>
+              </w:rPr>
+              <w:t>Backend Setup</w:t>
+            </w:r>
+          </w:p>
+          <w:p>
+            <w:pPr>
+              <w:pStyle w:val="ListParagraph"/>
+              <w:numPr>
+                <w:ilvl w:val="0"/>
+                <w:numId w:val="33"/>
+              </w:numPr>
+              <w:ind w:left="711"/>
+              <w:rPr>
+                <w:rFonts w:ascii="Times New Roman" w:hAnsi="Times New Roman" w:cs="Times New Roman"/>
+              </w:rPr>
+            </w:pPr>
+            <w:r>
+              <w:rPr>
+                <w:rFonts w:ascii="Times New Roman" w:hAnsi="Times New Roman" w:cs="Times New Roman"/>
+              </w:rPr>
+              <w:t>Start backend server locally</w:t>
+            </w:r>
+          </w:p>
+          <w:p>
+            <w:pPr>
+              <w:pStyle w:val="ListParagraph"/>
+              <w:numPr>
+                <w:ilvl w:val="0"/>
+                <w:numId w:val="33"/>
+              </w:numPr>
+              <w:ind w:left="711"/>
+              <w:rPr>
+                <w:rFonts w:ascii="Times New Roman" w:hAnsi="Times New Roman" w:cs="Times New Roman"/>
+              </w:rPr>
+            </w:pPr>
+            <w:r>
+              <w:rPr>
+                <w:rFonts w:ascii="Times New Roman" w:hAnsi="Times New Roman" w:cs="Times New Roman"/>
+              </w:rPr>
+              <w:t>Test APIs with Postman: /</w:t>
+            </w:r>
+            <w:proofErr w:type="spellStart"/>
+            <w:r>
+              <w:rPr>
+                <w:rFonts w:ascii="Times New Roman" w:hAnsi="Times New Roman" w:cs="Times New Roman"/>
+              </w:rPr>
+              <w:t>api</w:t>
+            </w:r>
+            <w:proofErr w:type="spellEnd"/>
+            <w:r>
+              <w:rPr>
+                <w:rFonts w:ascii="Times New Roman" w:hAnsi="Times New Roman" w:cs="Times New Roman"/>
+              </w:rPr>
+              <w:t>/upload and /</w:t>
+            </w:r>
+            <w:proofErr w:type="spellStart"/>
+            <w:r>
+              <w:rPr>
+                <w:rFonts w:ascii="Times New Roman" w:hAnsi="Times New Roman" w:cs="Times New Roman"/>
+              </w:rPr>
+              <w:t>api</w:t>
+            </w:r>
+            <w:proofErr w:type="spellEnd"/>
+            <w:r>
+              <w:rPr>
+                <w:rFonts w:ascii="Times New Roman" w:hAnsi="Times New Roman" w:cs="Times New Roman"/>
+              </w:rPr>
+              <w:t>/logs/</w:t>
+            </w:r>
+          </w:p>
+          <w:p>
+            <w:pPr>
+              <w:numPr>
+                <w:ilvl w:val="0"/>
+                <w:numId w:val="4"/>
+              </w:numPr>
+              <w:rPr>
+                <w:rFonts w:ascii="Times New Roman" w:hAnsi="Times New Roman" w:cs="Times New Roman"/>
+                <w:b/>
+                <w:bCs/>
+              </w:rPr>
+            </w:pPr>
+            <w:r>
+              <w:rPr>
+                <w:rFonts w:ascii="Times New Roman" w:hAnsi="Times New Roman" w:cs="Times New Roman"/>
+                <w:b/>
+                <w:bCs/>
+              </w:rPr>
+              <w:t>Connect Frontend to API</w:t>
+            </w:r>
+          </w:p>
+          <w:p>
+            <w:pPr>
+              <w:pStyle w:val="ListParagraph"/>
+              <w:numPr>
+                <w:ilvl w:val="0"/>
+                <w:numId w:val="34"/>
+              </w:numPr>
+              <w:ind w:left="711"/>
+              <w:rPr>
+                <w:rFonts w:ascii="Times New Roman" w:hAnsi="Times New Roman" w:cs="Times New Roman"/>
+              </w:rPr>
+            </w:pPr>
+            <w:r>
+              <w:rPr>
+                <w:rFonts w:ascii="Times New Roman" w:hAnsi="Times New Roman" w:cs="Times New Roman"/>
+              </w:rPr>
+              <w:t>Replace dummy data with fetch/</w:t>
+            </w:r>
+            <w:proofErr w:type="spellStart"/>
+            <w:r>
+              <w:rPr>
+                <w:rFonts w:ascii="Times New Roman" w:hAnsi="Times New Roman" w:cs="Times New Roman"/>
+              </w:rPr>
+              <w:t>axios</w:t>
+            </w:r>
+            <w:proofErr w:type="spellEnd"/>
+            <w:r>
+              <w:rPr>
+                <w:rFonts w:ascii="Times New Roman" w:hAnsi="Times New Roman" w:cs="Times New Roman"/>
+              </w:rPr>
+              <w:t xml:space="preserve"> calls</w:t>
+            </w:r>
+          </w:p>
+          <w:p>
+            <w:pPr>
+              <w:pStyle w:val="ListParagraph"/>
+              <w:numPr>
+                <w:ilvl w:val="0"/>
+                <w:numId w:val="34"/>
+              </w:numPr>
+              <w:ind w:left="711"/>
+              <w:rPr>
+                <w:rFonts w:ascii="Times New Roman" w:hAnsi="Times New Roman" w:cs="Times New Roman"/>
+              </w:rPr>
+            </w:pPr>
+            <w:r>
+              <w:rPr>
+                <w:rFonts w:ascii="Times New Roman" w:hAnsi="Times New Roman" w:cs="Times New Roman"/>
+              </w:rPr>
+              <w:t>Implement file upload: POST /</w:t>
+            </w:r>
+            <w:proofErr w:type="spellStart"/>
+            <w:r>
+              <w:rPr>
+                <w:rFonts w:ascii="Times New Roman" w:hAnsi="Times New Roman" w:cs="Times New Roman"/>
+              </w:rPr>
+              <w:t>api</w:t>
+            </w:r>
+            <w:proofErr w:type="spellEnd"/>
+            <w:r>
+              <w:rPr>
+                <w:rFonts w:ascii="Times New Roman" w:hAnsi="Times New Roman" w:cs="Times New Roman"/>
+              </w:rPr>
+              <w:t xml:space="preserve">/upload with </w:t>
+            </w:r>
+            <w:proofErr w:type="spellStart"/>
+            <w:r>
+              <w:rPr>
+                <w:rFonts w:ascii="Times New Roman" w:hAnsi="Times New Roman" w:cs="Times New Roman"/>
+              </w:rPr>
+              <w:t>FormData</w:t>
+            </w:r>
+            <w:proofErr w:type="spellEnd"/>
+          </w:p>
+          <w:p>
+            <w:pPr>
+              <w:pStyle w:val="ListParagraph"/>
+              <w:numPr>
+                <w:ilvl w:val="0"/>
+                <w:numId w:val="34"/>
+              </w:numPr>
+              <w:ind w:left="711"/>
+              <w:rPr>
+                <w:rFonts w:ascii="Times New Roman" w:hAnsi="Times New Roman" w:cs="Times New Roman"/>
+              </w:rPr>
+            </w:pPr>
+            <w:r>
+              <w:rPr>
+                <w:rFonts w:ascii="Times New Roman" w:hAnsi="Times New Roman" w:cs="Times New Roman"/>
+              </w:rPr>
+              <w:t>Fetch and display logs: GET /</w:t>
+            </w:r>
+            <w:proofErr w:type="spellStart"/>
+            <w:r>
+              <w:rPr>
+                <w:rFonts w:ascii="Times New Roman" w:hAnsi="Times New Roman" w:cs="Times New Roman"/>
+              </w:rPr>
+              <w:t>api</w:t>
+            </w:r>
+            <w:proofErr w:type="spellEnd"/>
+            <w:r>
+              <w:rPr>
+                <w:rFonts w:ascii="Times New Roman" w:hAnsi="Times New Roman" w:cs="Times New Roman"/>
+              </w:rPr>
+              <w:t xml:space="preserve">/logs? level = </w:t>
+            </w:r>
+            <w:proofErr w:type="spellStart"/>
+            <w:r>
+              <w:rPr>
+                <w:rFonts w:ascii="Times New Roman" w:hAnsi="Times New Roman" w:cs="Times New Roman"/>
+              </w:rPr>
+              <w:t>ERROR&amp;search</w:t>
+            </w:r>
+            <w:proofErr w:type="spellEnd"/>
+            <w:r>
+              <w:rPr>
+                <w:rFonts w:ascii="Times New Roman" w:hAnsi="Times New Roman" w:cs="Times New Roman"/>
+              </w:rPr>
+              <w:t>=keyword</w:t>
+            </w:r>
+          </w:p>
+          <w:p>
+            <w:pPr>
+              <w:numPr>
+                <w:ilvl w:val="0"/>
+                <w:numId w:val="4"/>
+              </w:numPr>
+              <w:rPr>
+                <w:rFonts w:ascii="Times New Roman" w:hAnsi="Times New Roman" w:cs="Times New Roman"/>
+                <w:b/>
+                <w:bCs/>
+              </w:rPr>
+            </w:pPr>
+            <w:r>
+              <w:rPr>
+                <w:rFonts w:ascii="Times New Roman" w:hAnsi="Times New Roman" w:cs="Times New Roman"/>
+                <w:b/>
+                <w:bCs/>
+              </w:rPr>
+              <w:t>UI/UX Updates</w:t>
+            </w:r>
+          </w:p>
+          <w:p>
+            <w:pPr>
+              <w:pStyle w:val="ListParagraph"/>
+              <w:numPr>
+                <w:ilvl w:val="0"/>
+                <w:numId w:val="35"/>
+              </w:numPr>
+              <w:ind w:left="711"/>
+              <w:rPr>
+                <w:rFonts w:ascii="Times New Roman" w:hAnsi="Times New Roman" w:cs="Times New Roman"/>
+              </w:rPr>
+            </w:pPr>
+            <w:r>
+              <w:rPr>
+                <w:rFonts w:ascii="Times New Roman" w:hAnsi="Times New Roman" w:cs="Times New Roman"/>
+              </w:rPr>
+              <w:t>Add loading spinner while fetching logs</w:t>
+            </w:r>
+          </w:p>
+          <w:p>
+            <w:pPr>
+              <w:pStyle w:val="ListParagraph"/>
+              <w:numPr>
+                <w:ilvl w:val="0"/>
+                <w:numId w:val="35"/>
+              </w:numPr>
+              <w:ind w:left="711"/>
+              <w:rPr>
+                <w:rFonts w:ascii="Times New Roman" w:hAnsi="Times New Roman" w:cs="Times New Roman"/>
+              </w:rPr>
+            </w:pPr>
+            <w:r>
+              <w:rPr>
+                <w:rFonts w:ascii="Times New Roman" w:hAnsi="Times New Roman" w:cs="Times New Roman"/>
+              </w:rPr>
+              <w:t>Add error handling + toast notifications for API failures</w:t>
+            </w:r>
+          </w:p>
+          <w:p>
+            <w:pPr>
+              <w:pStyle w:val="ListParagraph"/>
+              <w:numPr>
+                <w:ilvl w:val="0"/>
+                <w:numId w:val="35"/>
+              </w:numPr>
+              <w:ind w:left="711"/>
+              <w:rPr>
+                <w:rFonts w:ascii="Times New Roman" w:hAnsi="Times New Roman" w:cs="Times New Roman"/>
+              </w:rPr>
+            </w:pPr>
+            <w:r>
+              <w:rPr>
+                <w:rFonts w:ascii="Times New Roman" w:hAnsi="Times New Roman" w:cs="Times New Roman"/>
+              </w:rPr>
+              <w:t>Make filter + search work with backend query params</w:t>
+            </w:r>
+          </w:p>
+          <w:p>
+            <w:pPr>
+              <w:numPr>
+                <w:ilvl w:val="0"/>
+                <w:numId w:val="4"/>
+              </w:numPr>
+              <w:rPr>
+                <w:rFonts w:ascii="Times New Roman" w:hAnsi="Times New Roman" w:cs="Times New Roman"/>
+                <w:b/>
+                <w:bCs/>
+              </w:rPr>
+            </w:pPr>
+            <w:r>
+              <w:rPr>
+                <w:rFonts w:ascii="Times New Roman" w:hAnsi="Times New Roman" w:cs="Times New Roman"/>
+                <w:b/>
+                <w:bCs/>
+              </w:rPr>
+              <w:t>New Features</w:t>
+            </w:r>
+          </w:p>
+          <w:p>
+            <w:pPr>
+              <w:pStyle w:val="ListParagraph"/>
+              <w:numPr>
+                <w:ilvl w:val="0"/>
+                <w:numId w:val="36"/>
+              </w:numPr>
+              <w:ind w:left="711"/>
+              <w:rPr>
+                <w:rFonts w:ascii="Times New Roman" w:hAnsi="Times New Roman" w:cs="Times New Roman"/>
+              </w:rPr>
+            </w:pPr>
+            <w:r>
+              <w:rPr>
+                <w:rFonts w:ascii="Times New Roman" w:hAnsi="Times New Roman" w:cs="Times New Roman"/>
+              </w:rPr>
+              <w:t>Add pagination for large log files</w:t>
+            </w:r>
+          </w:p>
+          <w:p>
+            <w:pPr>
+              <w:pStyle w:val="ListParagraph"/>
+              <w:numPr>
+                <w:ilvl w:val="0"/>
+                <w:numId w:val="36"/>
+              </w:numPr>
+              <w:ind w:left="711"/>
+              <w:rPr>
+                <w:rFonts w:ascii="Times New Roman" w:hAnsi="Times New Roman" w:cs="Times New Roman"/>
+              </w:rPr>
+            </w:pPr>
+            <w:r>
+              <w:rPr>
+                <w:rFonts w:ascii="Times New Roman" w:hAnsi="Times New Roman" w:cs="Times New Roman"/>
+              </w:rPr>
+              <w:t>Add “Error Trends” chart using Recharts/Chart.js</w:t>
+            </w:r>
+          </w:p>
+          <w:p>
+            <w:pPr>
+              <w:pStyle w:val="ListParagraph"/>
+              <w:numPr>
+                <w:ilvl w:val="0"/>
+                <w:numId w:val="36"/>
+              </w:numPr>
+              <w:ind w:left="711"/>
+              <w:rPr>
+                <w:rFonts w:ascii="Times New Roman" w:hAnsi="Times New Roman" w:cs="Times New Roman"/>
+              </w:rPr>
+            </w:pPr>
+            <w:r>
+              <w:rPr>
+                <w:rFonts w:ascii="Times New Roman" w:hAnsi="Times New Roman" w:cs="Times New Roman"/>
+              </w:rPr>
+              <w:t>Enable “Download CSV” on filtered API results</w:t>
+            </w:r>
+          </w:p>
+          <w:p>
+            <w:pPr>
+              <w:numPr>
+                <w:ilvl w:val="0"/>
+                <w:numId w:val="4"/>
+              </w:numPr>
+              <w:rPr>
+                <w:rFonts w:ascii="Times New Roman" w:hAnsi="Times New Roman" w:cs="Times New Roman"/>
+                <w:b/>
+                <w:bCs/>
+              </w:rPr>
+            </w:pPr>
+            <w:r>
+              <w:rPr>
+                <w:rFonts w:ascii="Times New Roman" w:hAnsi="Times New Roman" w:cs="Times New Roman"/>
+                <w:b/>
+                <w:bCs/>
+              </w:rPr>
+              <w:t>Git</w:t>
+            </w:r>
+            <w:r>
+              <w:rPr>
+                <w:rFonts w:ascii="Times New Roman" w:hAnsi="Times New Roman" w:cs="Times New Roman"/>
+                <w:b/>
+                <w:bCs/>
+              </w:rPr>
+              <w:t xml:space="preserve"> &amp; Docs</w:t>
+            </w:r>
+          </w:p>
+          <w:p>
+            <w:pPr>
+              <w:pStyle w:val="ListParagraph"/>
+              <w:numPr>
+                <w:ilvl w:val="0"/>
+                <w:numId w:val="37"/>
+              </w:numPr>
+              <w:ind w:left="711"/>
+              <w:rPr>
+                <w:rFonts w:ascii="Times New Roman" w:hAnsi="Times New Roman" w:cs="Times New Roman"/>
+              </w:rPr>
+            </w:pPr>
+            <w:r>
+              <w:rPr>
+                <w:rFonts w:ascii="Times New Roman" w:hAnsi="Times New Roman" w:cs="Times New Roman"/>
+              </w:rPr>
+              <w:t>Commit: feat: integrate frontend with backend APIs</w:t>
+            </w:r>
+          </w:p>
+          <w:p>
+            <w:pPr>
+              <w:pStyle w:val="ListParagraph"/>
+              <w:numPr>
+                <w:ilvl w:val="0"/>
+                <w:numId w:val="37"/>
+              </w:numPr>
+              <w:ind w:left="711"/>
+              <w:rPr>
+                <w:rFonts w:ascii="Times New Roman" w:hAnsi="Times New Roman" w:cs="Times New Roman"/>
+              </w:rPr>
+            </w:pPr>
+            <w:r>
+              <w:rPr>
+                <w:rFonts w:ascii="Times New Roman" w:hAnsi="Times New Roman" w:cs="Times New Roman"/>
+              </w:rPr>
+              <w:t>Update README with API endpoints section</w:t>
+            </w:r>
+          </w:p>
+          <w:p>
+            <w:pPr>
+              <w:pStyle w:val="ListParagraph"/>
+              <w:numPr>
+                <w:ilvl w:val="0"/>
+                <w:numId w:val="37"/>
+              </w:numPr>
+              <w:ind w:left="711"/>
+              <w:rPr>
+                <w:rFonts w:ascii="Times New Roman" w:hAnsi="Times New Roman" w:cs="Times New Roman"/>
+              </w:rPr>
+            </w:pPr>
+            <w:r>
+              <w:rPr>
+                <w:rFonts w:ascii="Times New Roman" w:hAnsi="Times New Roman" w:cs="Times New Roman"/>
+              </w:rPr>
+              <w:t xml:space="preserve">Push to </w:t>
+            </w:r>
+            <w:proofErr w:type="spellStart"/>
+            <w:r>
+              <w:rPr>
+                <w:rFonts w:ascii="Times New Roman" w:hAnsi="Times New Roman" w:cs="Times New Roman"/>
+              </w:rPr>
+              <w:t>Github</w:t>
+            </w:r>
+            <w:proofErr w:type="spellEnd"/>
           </w:p>
         </w:tc>
         <w:tc>
           <w:tcPr>
-            <w:tcW w:w="4253" w:type="dxa"/>
+            <w:tcW w:w="4310" w:type="dxa"/>
             <w:tcBorders>
               <w:top w:val="nil"/>
               <w:left w:val="nil"/>
@@ -6687,16 +7142,364 @@
               </w:rPr>
               <w:t xml:space="preserve"> </w:t>
             </w:r>
+            <w:r>
+              <w:rPr>
+                <w:rFonts w:ascii="Times New Roman" w:hAnsi="Times New Roman" w:cs="Times New Roman"/>
+                <w:b/>
+                <w:bCs/>
+              </w:rPr>
+              <w:t xml:space="preserve">Add Pagination to </w:t>
+            </w:r>
+            <w:proofErr w:type="spellStart"/>
+            <w:r>
+              <w:rPr>
+                <w:rFonts w:ascii="Times New Roman" w:hAnsi="Times New Roman" w:cs="Times New Roman"/>
+                <w:b/>
+                <w:bCs/>
+              </w:rPr>
+              <w:t>LogTable</w:t>
+            </w:r>
+            <w:proofErr w:type="spellEnd"/>
+          </w:p>
+          <w:p>
+            <w:pPr>
+              <w:pStyle w:val="ListParagraph"/>
+              <w:numPr>
+                <w:ilvl w:val="0"/>
+                <w:numId w:val="38"/>
+              </w:numPr>
+              <w:ind w:left="848"/>
+              <w:rPr>
+                <w:rFonts w:ascii="Times New Roman" w:hAnsi="Times New Roman" w:cs="Times New Roman"/>
+              </w:rPr>
+            </w:pPr>
+            <w:r>
+              <w:rPr>
+                <w:rFonts w:ascii="Times New Roman" w:hAnsi="Times New Roman" w:cs="Times New Roman"/>
+              </w:rPr>
+              <w:t>Update GET /</w:t>
+            </w:r>
+            <w:proofErr w:type="spellStart"/>
+            <w:r>
+              <w:rPr>
+                <w:rFonts w:ascii="Times New Roman" w:hAnsi="Times New Roman" w:cs="Times New Roman"/>
+              </w:rPr>
+              <w:t>api</w:t>
+            </w:r>
+            <w:proofErr w:type="spellEnd"/>
+            <w:r>
+              <w:rPr>
+                <w:rFonts w:ascii="Times New Roman" w:hAnsi="Times New Roman" w:cs="Times New Roman"/>
+              </w:rPr>
+              <w:t xml:space="preserve">/logs to </w:t>
+            </w:r>
+            <w:proofErr w:type="gramStart"/>
+            <w:r>
+              <w:rPr>
+                <w:rFonts w:ascii="Times New Roman" w:hAnsi="Times New Roman" w:cs="Times New Roman"/>
+              </w:rPr>
+              <w:t>accept ?</w:t>
+            </w:r>
+            <w:proofErr w:type="gramEnd"/>
+            <w:r>
+              <w:rPr>
+                <w:rFonts w:ascii="Times New Roman" w:hAnsi="Times New Roman" w:cs="Times New Roman"/>
+              </w:rPr>
+              <w:t xml:space="preserve"> page = </w:t>
+            </w:r>
+            <w:proofErr w:type="gramStart"/>
+            <w:r>
+              <w:rPr>
+                <w:rFonts w:ascii="Times New Roman" w:hAnsi="Times New Roman" w:cs="Times New Roman"/>
+              </w:rPr>
+              <w:t>and ?</w:t>
+            </w:r>
+            <w:proofErr w:type="gramEnd"/>
+            <w:r>
+              <w:rPr>
+                <w:rFonts w:ascii="Times New Roman" w:hAnsi="Times New Roman" w:cs="Times New Roman"/>
+              </w:rPr>
+              <w:t xml:space="preserve"> limit =</w:t>
+            </w:r>
+          </w:p>
+          <w:p>
+            <w:pPr>
+              <w:pStyle w:val="ListParagraph"/>
+              <w:numPr>
+                <w:ilvl w:val="0"/>
+                <w:numId w:val="38"/>
+              </w:numPr>
+              <w:ind w:left="848"/>
+              <w:rPr>
+                <w:rFonts w:ascii="Times New Roman" w:hAnsi="Times New Roman" w:cs="Times New Roman"/>
+              </w:rPr>
+            </w:pPr>
+            <w:r>
+              <w:rPr>
+                <w:rFonts w:ascii="Times New Roman" w:hAnsi="Times New Roman" w:cs="Times New Roman"/>
+              </w:rPr>
+              <w:t>Add “Previous” and “Next” buttons below the table</w:t>
+            </w:r>
+          </w:p>
+          <w:p>
+            <w:pPr>
+              <w:numPr>
+                <w:ilvl w:val="0"/>
+                <w:numId w:val="5"/>
+              </w:numPr>
+              <w:rPr>
+                <w:rFonts w:ascii="Times New Roman" w:hAnsi="Times New Roman" w:cs="Times New Roman"/>
+                <w:b/>
+                <w:bCs/>
+              </w:rPr>
+            </w:pPr>
+            <w:r>
+              <w:rPr>
+                <w:rFonts w:ascii="Times New Roman" w:hAnsi="Times New Roman" w:cs="Times New Roman"/>
+                <w:b/>
+                <w:bCs/>
+              </w:rPr>
+              <w:t>Implement Infinite Scroll</w:t>
+            </w:r>
+          </w:p>
+          <w:p>
+            <w:pPr>
+              <w:pStyle w:val="ListParagraph"/>
+              <w:numPr>
+                <w:ilvl w:val="0"/>
+                <w:numId w:val="39"/>
+              </w:numPr>
+              <w:ind w:left="848"/>
+              <w:rPr>
+                <w:rFonts w:ascii="Times New Roman" w:hAnsi="Times New Roman" w:cs="Times New Roman"/>
+              </w:rPr>
+            </w:pPr>
+            <w:r>
+              <w:rPr>
+                <w:rFonts w:ascii="Times New Roman" w:hAnsi="Times New Roman" w:cs="Times New Roman"/>
+              </w:rPr>
+              <w:t>Install react-infinite-scroll-component</w:t>
+            </w:r>
+          </w:p>
+          <w:p>
+            <w:pPr>
+              <w:pStyle w:val="ListParagraph"/>
+              <w:numPr>
+                <w:ilvl w:val="0"/>
+                <w:numId w:val="39"/>
+              </w:numPr>
+              <w:ind w:left="848"/>
+              <w:rPr>
+                <w:rFonts w:ascii="Times New Roman" w:hAnsi="Times New Roman" w:cs="Times New Roman"/>
+              </w:rPr>
+            </w:pPr>
+            <w:r>
+              <w:rPr>
+                <w:rFonts w:ascii="Times New Roman" w:hAnsi="Times New Roman" w:cs="Times New Roman"/>
+              </w:rPr>
+              <w:t>Load next page automatically when user scrolls to bottom</w:t>
+            </w:r>
+          </w:p>
+          <w:p>
+            <w:pPr>
+              <w:numPr>
+                <w:ilvl w:val="0"/>
+                <w:numId w:val="5"/>
+              </w:numPr>
+              <w:rPr>
+                <w:rFonts w:ascii="Times New Roman" w:hAnsi="Times New Roman" w:cs="Times New Roman"/>
+                <w:b/>
+                <w:bCs/>
+              </w:rPr>
+            </w:pPr>
+            <w:r>
+              <w:rPr>
+                <w:rFonts w:ascii="Times New Roman" w:hAnsi="Times New Roman" w:cs="Times New Roman"/>
+                <w:b/>
+                <w:bCs/>
+              </w:rPr>
+              <w:t>Manage loading states</w:t>
+            </w:r>
+          </w:p>
+          <w:p>
+            <w:pPr>
+              <w:pStyle w:val="ListParagraph"/>
+              <w:numPr>
+                <w:ilvl w:val="0"/>
+                <w:numId w:val="40"/>
+              </w:numPr>
+              <w:ind w:left="848"/>
+              <w:rPr>
+                <w:rFonts w:ascii="Times New Roman" w:hAnsi="Times New Roman" w:cs="Times New Roman"/>
+              </w:rPr>
+            </w:pPr>
+            <w:r>
+              <w:rPr>
+                <w:rFonts w:ascii="Times New Roman" w:hAnsi="Times New Roman" w:cs="Times New Roman"/>
+              </w:rPr>
+              <w:t>Add loading spinner while fetching more logs</w:t>
+            </w:r>
+          </w:p>
+          <w:p>
+            <w:pPr>
+              <w:pStyle w:val="ListParagraph"/>
+              <w:numPr>
+                <w:ilvl w:val="0"/>
+                <w:numId w:val="40"/>
+              </w:numPr>
+              <w:ind w:left="848"/>
+              <w:rPr>
+                <w:rFonts w:ascii="Times New Roman" w:hAnsi="Times New Roman" w:cs="Times New Roman"/>
+              </w:rPr>
+            </w:pPr>
+            <w:r>
+              <w:rPr>
+                <w:rFonts w:ascii="Times New Roman" w:hAnsi="Times New Roman" w:cs="Times New Roman"/>
+              </w:rPr>
+              <w:t xml:space="preserve">Track </w:t>
+            </w:r>
+            <w:proofErr w:type="spellStart"/>
+            <w:r>
+              <w:rPr>
+                <w:rFonts w:ascii="Times New Roman" w:hAnsi="Times New Roman" w:cs="Times New Roman"/>
+              </w:rPr>
+              <w:t>hasMore</w:t>
+            </w:r>
+            <w:proofErr w:type="spellEnd"/>
+            <w:r>
+              <w:rPr>
+                <w:rFonts w:ascii="Times New Roman" w:hAnsi="Times New Roman" w:cs="Times New Roman"/>
+              </w:rPr>
+              <w:t xml:space="preserve"> to stop fetching when no more logs</w:t>
+            </w:r>
+          </w:p>
+          <w:p>
+            <w:pPr>
+              <w:numPr>
+                <w:ilvl w:val="0"/>
+                <w:numId w:val="5"/>
+              </w:numPr>
+              <w:rPr>
+                <w:rFonts w:ascii="Times New Roman" w:hAnsi="Times New Roman" w:cs="Times New Roman"/>
+                <w:b/>
+                <w:bCs/>
+              </w:rPr>
+            </w:pPr>
+            <w:r>
+              <w:rPr>
+                <w:rFonts w:ascii="Times New Roman" w:hAnsi="Times New Roman" w:cs="Times New Roman"/>
+                <w:b/>
+                <w:bCs/>
+              </w:rPr>
+              <w:t>Optimize performance</w:t>
+            </w:r>
+          </w:p>
+          <w:p>
+            <w:pPr>
+              <w:pStyle w:val="ListParagraph"/>
+              <w:numPr>
+                <w:ilvl w:val="0"/>
+                <w:numId w:val="41"/>
+              </w:numPr>
+              <w:ind w:left="848"/>
+              <w:rPr>
+                <w:rFonts w:ascii="Times New Roman" w:hAnsi="Times New Roman" w:cs="Times New Roman"/>
+              </w:rPr>
+            </w:pPr>
+            <w:r>
+              <w:rPr>
+                <w:rFonts w:ascii="Times New Roman" w:hAnsi="Times New Roman" w:cs="Times New Roman"/>
+              </w:rPr>
+              <w:t>Test with large log files 10k+ rows</w:t>
+            </w:r>
+          </w:p>
+          <w:p>
+            <w:pPr>
+              <w:pStyle w:val="ListParagraph"/>
+              <w:numPr>
+                <w:ilvl w:val="0"/>
+                <w:numId w:val="41"/>
+              </w:numPr>
+              <w:ind w:left="848"/>
+              <w:rPr>
+                <w:rFonts w:ascii="Times New Roman" w:hAnsi="Times New Roman" w:cs="Times New Roman"/>
+              </w:rPr>
+            </w:pPr>
+            <w:r>
+              <w:rPr>
+                <w:rFonts w:ascii="Times New Roman" w:hAnsi="Times New Roman" w:cs="Times New Roman"/>
+              </w:rPr>
+              <w:t>Make sure filter + search work with pagination</w:t>
+            </w:r>
+          </w:p>
+          <w:p>
+            <w:pPr>
+              <w:numPr>
+                <w:ilvl w:val="0"/>
+                <w:numId w:val="5"/>
+              </w:numPr>
+              <w:rPr>
+                <w:rFonts w:ascii="Times New Roman" w:hAnsi="Times New Roman" w:cs="Times New Roman"/>
+                <w:b/>
+                <w:bCs/>
+              </w:rPr>
+            </w:pPr>
+            <w:r>
+              <w:rPr>
+                <w:rFonts w:ascii="Times New Roman" w:hAnsi="Times New Roman" w:cs="Times New Roman"/>
+                <w:b/>
+                <w:bCs/>
+              </w:rPr>
+              <w:t>Update UI/UX</w:t>
+            </w:r>
+          </w:p>
+          <w:p>
+            <w:pPr>
+              <w:pStyle w:val="ListParagraph"/>
+              <w:numPr>
+                <w:ilvl w:val="0"/>
+                <w:numId w:val="42"/>
+              </w:numPr>
+              <w:ind w:left="848"/>
+              <w:rPr>
+                <w:rFonts w:ascii="Times New Roman" w:hAnsi="Times New Roman" w:cs="Times New Roman"/>
+              </w:rPr>
+            </w:pPr>
+            <w:r>
+              <w:rPr>
+                <w:rFonts w:ascii="Times New Roman" w:hAnsi="Times New Roman" w:cs="Times New Roman"/>
+              </w:rPr>
+              <w:t>Show “Showing 1-50 of 1200 logs” text</w:t>
+            </w:r>
+          </w:p>
+          <w:p>
+            <w:pPr>
+              <w:pStyle w:val="ListParagraph"/>
+              <w:numPr>
+                <w:ilvl w:val="0"/>
+                <w:numId w:val="42"/>
+              </w:numPr>
+              <w:ind w:left="848"/>
+              <w:rPr>
+                <w:rFonts w:ascii="Times New Roman" w:hAnsi="Times New Roman" w:cs="Times New Roman"/>
+              </w:rPr>
+            </w:pPr>
+            <w:r>
+              <w:rPr>
+                <w:rFonts w:ascii="Times New Roman" w:hAnsi="Times New Roman" w:cs="Times New Roman"/>
+              </w:rPr>
+              <w:t>Disable buttons when on first/last page</w:t>
+            </w:r>
           </w:p>
         </w:tc>
       </w:tr>
       <w:tr>
         <w:trPr>
-          <w:trHeight w:val="163"/>
+          <w:trHeight w:val="114"/>
         </w:trPr>
         <w:tc>
           <w:tcPr>
-            <w:tcW w:w="10490" w:type="dxa"/>
+            <w:tcW w:w="10632" w:type="dxa"/>
             <w:gridSpan w:val="3"/>
             <w:tcBorders>
               <w:top w:val="nil"/>
@@ -6724,6 +7527,7 @@
                 <w:b/>
                 <w:bCs/>
               </w:rPr>
+              <w:lastRenderedPageBreak/>
               <w:t xml:space="preserve">Outputs and Descriptions </w:t>
             </w:r>
           </w:p>
@@ -6732,8 +7536,9 @@
     </w:tbl>
     <w:p>
       <w:pPr>
-        <w:rPr>
-          <w:rFonts w:ascii="Times New Roman" w:eastAsia="MS Gothic" w:hAnsi="Times New Roman" w:cs="Times New Roman"/>
+        <w:jc w:val="both"/>
+        <w:rPr>
+          <w:rFonts w:ascii="Times New Roman" w:hAnsi="Times New Roman" w:cs="Times New Roman"/>
         </w:rPr>
       </w:pPr>
       <w:r>
@@ -6748,14 +7553,671 @@
         <w:rPr>
           <w:rFonts w:ascii="Times New Roman" w:hAnsi="Times New Roman" w:cs="Times New Roman"/>
         </w:rPr>
-        <w:t xml:space="preserve"> Project initialized, and files created. Basic project structure established.</w:t>
+        <w:t xml:space="preserve"> </w:t>
+      </w:r>
+      <w:r>
+        <w:rPr>
+          <w:rFonts w:ascii="Times New Roman" w:hAnsi="Times New Roman" w:cs="Times New Roman"/>
+        </w:rPr>
+        <w:t xml:space="preserve">LOGGUARD AI dashboard showing log analytics with 26 critical errors, 297ms </w:t>
+      </w:r>
+      <w:proofErr w:type="spellStart"/>
+      <w:r>
+        <w:rPr>
+          <w:rFonts w:ascii="Times New Roman" w:hAnsi="Times New Roman" w:cs="Times New Roman"/>
+        </w:rPr>
+        <w:t>avg</w:t>
+      </w:r>
+      <w:proofErr w:type="spellEnd"/>
+      <w:r>
+        <w:rPr>
+          <w:rFonts w:ascii="Times New Roman" w:hAnsi="Times New Roman" w:cs="Times New Roman"/>
+        </w:rPr>
+        <w:t xml:space="preserve"> response time, log upload section, and a table of system errors and warnings</w:t>
       </w:r>
     </w:p>
     <w:p>
       <w:pPr>
+        <w:rPr>
+          <w:rFonts w:ascii="Times New Roman" w:eastAsia="MS Gothic" w:hAnsi="Times New Roman" w:cs="Times New Roman"/>
+        </w:rPr>
+      </w:pPr>
+      <w:r>
+        <w:rPr>
+          <w:rFonts w:ascii="Times New Roman" w:eastAsia="MS Gothic" w:hAnsi="Times New Roman" w:cs="Times New Roman"/>
+        </w:rPr>
+        <w:drawing>
+          <wp:inline distT="0" distB="0" distL="0" distR="0" wp14:anchorId="529BAF2F" wp14:editId="6A806771">
+            <wp:extent cx="6645910" cy="3460115"/>
+            <wp:effectExtent l="0" t="0" r="2540" b="6985"/>
+            <wp:docPr id="1291592205" name="Picture 1"/>
+            <wp:cNvGraphicFramePr>
+              <a:graphicFrameLocks xmlns:a="http://schemas.openxmlformats.org/drawingml/2006/main" noChangeAspect="1"/>
+            </wp:cNvGraphicFramePr>
+            <a:graphic xmlns:a="http://schemas.openxmlformats.org/drawingml/2006/main">
+              <a:graphicData uri="http://schemas.openxmlformats.org/drawingml/2006/picture">
+                <pic:pic xmlns:pic="http://schemas.openxmlformats.org/drawingml/2006/picture">
+                  <pic:nvPicPr>
+                    <pic:cNvPr id="1291592205" name=""/>
+                    <pic:cNvPicPr/>
+                  </pic:nvPicPr>
+                  <pic:blipFill>
+                    <a:blip r:embed="rId15"/>
+                    <a:stretch>
+                      <a:fillRect/>
+                    </a:stretch>
+                  </pic:blipFill>
+                  <pic:spPr>
+                    <a:xfrm>
+                      <a:off x="0" y="0"/>
+                      <a:ext cx="6645910" cy="3460115"/>
+                    </a:xfrm>
+                    <a:prstGeom prst="rect">
+                      <a:avLst/>
+                    </a:prstGeom>
+                  </pic:spPr>
+                </pic:pic>
+              </a:graphicData>
+            </a:graphic>
+          </wp:inline>
+        </w:drawing>
+      </w:r>
+    </w:p>
+    <w:p>
+      <w:pPr>
         <w:jc w:val="both"/>
         <w:rPr>
           <w:rFonts w:ascii="Times New Roman" w:hAnsi="Times New Roman" w:cs="Times New Roman"/>
+          <w:b/>
+          <w:bCs/>
+        </w:rPr>
+      </w:pPr>
+      <w:r>
+        <w:rPr>
+          <w:rFonts w:ascii="Times New Roman" w:hAnsi="Times New Roman" w:cs="Times New Roman"/>
+        </w:rPr>
+        <w:drawing>
+          <wp:inline distT="0" distB="0" distL="0" distR="0" wp14:anchorId="12CB5EFD" wp14:editId="453F55C4">
+            <wp:extent cx="6645910" cy="3519170"/>
+            <wp:effectExtent l="0" t="0" r="2540" b="5080"/>
+            <wp:docPr id="1449485316" name="Picture 1"/>
+            <wp:cNvGraphicFramePr>
+              <a:graphicFrameLocks xmlns:a="http://schemas.openxmlformats.org/drawingml/2006/main" noChangeAspect="1"/>
+            </wp:cNvGraphicFramePr>
+            <a:graphic xmlns:a="http://schemas.openxmlformats.org/drawingml/2006/main">
+              <a:graphicData uri="http://schemas.openxmlformats.org/drawingml/2006/picture">
+                <pic:pic xmlns:pic="http://schemas.openxmlformats.org/drawingml/2006/picture">
+                  <pic:nvPicPr>
+                    <pic:cNvPr id="1449485316" name=""/>
+                    <pic:cNvPicPr/>
+                  </pic:nvPicPr>
+                  <pic:blipFill>
+                    <a:blip r:embed="rId16"/>
+                    <a:stretch>
+                      <a:fillRect/>
+                    </a:stretch>
+                  </pic:blipFill>
+                  <pic:spPr>
+                    <a:xfrm>
+                      <a:off x="0" y="0"/>
+                      <a:ext cx="6645910" cy="3519170"/>
+                    </a:xfrm>
+                    <a:prstGeom prst="rect">
+                      <a:avLst/>
+                    </a:prstGeom>
+                  </pic:spPr>
+                </pic:pic>
+              </a:graphicData>
+            </a:graphic>
+          </wp:inline>
+        </w:drawing>
+      </w:r>
+    </w:p>
+    <w:p>
+      <w:pPr>
+        <w:jc w:val="both"/>
+        <w:rPr>
+          <w:rFonts w:ascii="Times New Roman" w:hAnsi="Times New Roman" w:cs="Times New Roman"/>
+          <w:bCs/>
+        </w:rPr>
+      </w:pPr>
+      <w:r>
+        <w:rPr>
+          <w:rFonts w:ascii="Times New Roman" w:hAnsi="Times New Roman" w:cs="Times New Roman"/>
+        </w:rPr>
+        <w:drawing>
+          <wp:inline distT="0" distB="0" distL="0" distR="0" wp14:anchorId="71E3395C" wp14:editId="333BD9FC">
+            <wp:extent cx="6645910" cy="745490"/>
+            <wp:effectExtent l="0" t="0" r="2540" b="0"/>
+            <wp:docPr id="1158706987" name="Picture 1"/>
+            <wp:cNvGraphicFramePr>
+              <a:graphicFrameLocks xmlns:a="http://schemas.openxmlformats.org/drawingml/2006/main" noChangeAspect="1"/>
+            </wp:cNvGraphicFramePr>
+            <a:graphic xmlns:a="http://schemas.openxmlformats.org/drawingml/2006/main">
+              <a:graphicData uri="http://schemas.openxmlformats.org/drawingml/2006/picture">
+                <pic:pic xmlns:pic="http://schemas.openxmlformats.org/drawingml/2006/picture">
+                  <pic:nvPicPr>
+                    <pic:cNvPr id="1158706987" name=""/>
+                    <pic:cNvPicPr/>
+                  </pic:nvPicPr>
+                  <pic:blipFill>
+                    <a:blip r:embed="rId17"/>
+                    <a:stretch>
+                      <a:fillRect/>
+                    </a:stretch>
+                  </pic:blipFill>
+                  <pic:spPr>
+                    <a:xfrm>
+                      <a:off x="0" y="0"/>
+                      <a:ext cx="6645910" cy="745490"/>
+                    </a:xfrm>
+                    <a:prstGeom prst="rect">
+                      <a:avLst/>
+                    </a:prstGeom>
+                  </pic:spPr>
+                </pic:pic>
+              </a:graphicData>
+            </a:graphic>
+          </wp:inline>
+        </w:drawing>
+      </w:r>
+      <w:r>
+        <w:rPr>
+          <w:rFonts w:ascii="Times New Roman" w:hAnsi="Times New Roman" w:cs="Times New Roman"/>
+        </w:rPr>
+        <w:br/>
+      </w:r>
+      <w:r>
+        <w:rPr>
+          <w:rFonts w:ascii="Times New Roman" w:hAnsi="Times New Roman" w:cs="Times New Roman"/>
+          <w:b/>
+          <w:bCs/>
+        </w:rPr>
+        <w:t>Description:</w:t>
+      </w:r>
+      <w:r>
+        <w:rPr>
+          <w:rFonts w:ascii="Times New Roman" w:hAnsi="Times New Roman" w:cs="Times New Roman"/>
+        </w:rPr>
+        <w:t xml:space="preserve"> </w:t>
+      </w:r>
+      <w:r>
+        <w:rPr>
+          <w:rFonts w:ascii="Times New Roman" w:hAnsi="Times New Roman" w:cs="Times New Roman"/>
+        </w:rPr>
+        <w:t xml:space="preserve">The screenshot shows the </w:t>
+      </w:r>
+      <w:r>
+        <w:rPr>
+          <w:rFonts w:ascii="Times New Roman" w:hAnsi="Times New Roman" w:cs="Times New Roman"/>
+          <w:b/>
+        </w:rPr>
+        <w:t>LOGGUARD AI</w:t>
+      </w:r>
+      <w:r>
+        <w:rPr>
+          <w:rFonts w:ascii="Times New Roman" w:hAnsi="Times New Roman" w:cs="Times New Roman"/>
+          <w:bCs/>
+        </w:rPr>
+        <w:t xml:space="preserve"> dashboard, a dark-themed web application designed for log monitoring and analysis. At the top, the title “LOOGUARD AI” appears with the tagline “Detect and Resolve Issues Within Seconds”. Below that are 3 key metrics cards: </w:t>
+      </w:r>
+      <w:r>
+        <w:rPr>
+          <w:rFonts w:ascii="Times New Roman" w:hAnsi="Times New Roman" w:cs="Times New Roman"/>
+          <w:b/>
+        </w:rPr>
+        <w:t xml:space="preserve">Critical Errors: 26, </w:t>
+      </w:r>
+      <w:proofErr w:type="spellStart"/>
+      <w:r>
+        <w:rPr>
+          <w:rFonts w:ascii="Times New Roman" w:hAnsi="Times New Roman" w:cs="Times New Roman"/>
+          <w:b/>
+        </w:rPr>
+        <w:t>Avg</w:t>
+      </w:r>
+      <w:proofErr w:type="spellEnd"/>
+      <w:r>
+        <w:rPr>
+          <w:rFonts w:ascii="Times New Roman" w:hAnsi="Times New Roman" w:cs="Times New Roman"/>
+          <w:b/>
+        </w:rPr>
+        <w:t xml:space="preserve"> Response Time: 297ms, </w:t>
+      </w:r>
+      <w:r>
+        <w:rPr>
+          <w:rFonts w:ascii="Times New Roman" w:hAnsi="Times New Roman" w:cs="Times New Roman"/>
+          <w:bCs/>
+        </w:rPr>
+        <w:t>and</w:t>
+      </w:r>
+      <w:r>
+        <w:rPr>
+          <w:rFonts w:ascii="Times New Roman" w:hAnsi="Times New Roman" w:cs="Times New Roman"/>
+          <w:b/>
+        </w:rPr>
+        <w:t xml:space="preserve"> System Health: 95%</w:t>
+      </w:r>
+      <w:r>
+        <w:rPr>
+          <w:rFonts w:ascii="Times New Roman" w:hAnsi="Times New Roman" w:cs="Times New Roman"/>
+          <w:bCs/>
+        </w:rPr>
+        <w:t>.</w:t>
+      </w:r>
+    </w:p>
+    <w:p>
+      <w:pPr>
+        <w:jc w:val="both"/>
+        <w:rPr>
+          <w:rFonts w:ascii="Times New Roman" w:hAnsi="Times New Roman" w:cs="Times New Roman"/>
+          <w:bCs/>
+        </w:rPr>
+      </w:pPr>
+      <w:r>
+        <w:rPr>
+          <w:rFonts w:ascii="Times New Roman" w:hAnsi="Times New Roman" w:cs="Times New Roman"/>
+          <w:bCs/>
+        </w:rPr>
+        <w:lastRenderedPageBreak/>
+        <w:t xml:space="preserve">In the </w:t>
+      </w:r>
+      <w:proofErr w:type="spellStart"/>
+      <w:r>
+        <w:rPr>
+          <w:rFonts w:ascii="Times New Roman" w:hAnsi="Times New Roman" w:cs="Times New Roman"/>
+          <w:bCs/>
+        </w:rPr>
+        <w:t>center</w:t>
+      </w:r>
+      <w:proofErr w:type="spellEnd"/>
+      <w:r>
+        <w:rPr>
+          <w:rFonts w:ascii="Times New Roman" w:hAnsi="Times New Roman" w:cs="Times New Roman"/>
+          <w:bCs/>
+        </w:rPr>
+        <w:t xml:space="preserve"> there is an *"Upload Log File"* section with instructions to drag &amp; drop or select .log, .txt, .zip files up to 50GB, and a blue "Select File" button. Below that are filter controls: a dropdown set to "Filter: ALL", a search bar, "Clear Filters" button, and a green "Download CSV" button.</w:t>
+      </w:r>
+    </w:p>
+    <w:p>
+      <w:pPr>
+        <w:jc w:val="both"/>
+        <w:rPr>
+          <w:rFonts w:ascii="Times New Roman" w:hAnsi="Times New Roman" w:cs="Times New Roman"/>
+          <w:bCs/>
+        </w:rPr>
+      </w:pPr>
+      <w:r>
+        <w:rPr>
+          <w:rFonts w:ascii="Times New Roman" w:hAnsi="Times New Roman" w:cs="Times New Roman"/>
+          <w:bCs/>
+        </w:rPr>
+        <w:t>The main section is a log table with columns *Time, Level, Message*. It currently lists 3 entries:</w:t>
+      </w:r>
+    </w:p>
+    <w:p>
+      <w:pPr>
+        <w:pStyle w:val="ListParagraph"/>
+        <w:numPr>
+          <w:ilvl w:val="0"/>
+          <w:numId w:val="44"/>
+        </w:numPr>
+        <w:jc w:val="both"/>
+        <w:rPr>
+          <w:rFonts w:ascii="Times New Roman" w:hAnsi="Times New Roman" w:cs="Times New Roman"/>
+          <w:bCs/>
+        </w:rPr>
+      </w:pPr>
+      <w:r>
+        <w:rPr>
+          <w:rFonts w:ascii="Times New Roman" w:hAnsi="Times New Roman" w:cs="Times New Roman"/>
+          <w:bCs/>
+        </w:rPr>
+        <w:t>`10:32:11 ERROR` - Database connection failed - highlighted in red</w:t>
+      </w:r>
+    </w:p>
+    <w:p>
+      <w:pPr>
+        <w:pStyle w:val="ListParagraph"/>
+        <w:numPr>
+          <w:ilvl w:val="0"/>
+          <w:numId w:val="44"/>
+        </w:numPr>
+        <w:jc w:val="both"/>
+        <w:rPr>
+          <w:rFonts w:ascii="Times New Roman" w:hAnsi="Times New Roman" w:cs="Times New Roman"/>
+          <w:bCs/>
+        </w:rPr>
+      </w:pPr>
+      <w:r>
+        <w:rPr>
+          <w:rFonts w:ascii="Times New Roman" w:hAnsi="Times New Roman" w:cs="Times New Roman"/>
+          <w:bCs/>
+        </w:rPr>
+        <w:t xml:space="preserve">`10:31:45 WARN` - High memory usage detected - highlighted in orange </w:t>
+      </w:r>
+    </w:p>
+    <w:p>
+      <w:pPr>
+        <w:pStyle w:val="ListParagraph"/>
+        <w:numPr>
+          <w:ilvl w:val="0"/>
+          <w:numId w:val="44"/>
+        </w:numPr>
+        <w:jc w:val="both"/>
+        <w:rPr>
+          <w:rFonts w:ascii="Times New Roman" w:hAnsi="Times New Roman" w:cs="Times New Roman"/>
+          <w:bCs/>
+        </w:rPr>
+      </w:pPr>
+      <w:r>
+        <w:rPr>
+          <w:rFonts w:ascii="Times New Roman" w:hAnsi="Times New Roman" w:cs="Times New Roman"/>
+          <w:bCs/>
+        </w:rPr>
+        <w:t>`10:30:02 ERROR` - API timeout on /user/login - highlighted in red</w:t>
+      </w:r>
+    </w:p>
+    <w:p>
+      <w:pPr>
+        <w:jc w:val="both"/>
+        <w:rPr>
+          <w:rFonts w:ascii="Times New Roman" w:hAnsi="Times New Roman" w:cs="Times New Roman"/>
+          <w:bCs/>
+        </w:rPr>
+      </w:pPr>
+      <w:r>
+        <w:rPr>
+          <w:rFonts w:ascii="Times New Roman" w:hAnsi="Times New Roman" w:cs="Times New Roman"/>
+          <w:bCs/>
+        </w:rPr>
+        <w:t xml:space="preserve">In one of the </w:t>
+      </w:r>
+      <w:proofErr w:type="gramStart"/>
+      <w:r>
+        <w:rPr>
+          <w:rFonts w:ascii="Times New Roman" w:hAnsi="Times New Roman" w:cs="Times New Roman"/>
+          <w:bCs/>
+        </w:rPr>
+        <w:t>frames</w:t>
+      </w:r>
+      <w:proofErr w:type="gramEnd"/>
+      <w:r>
+        <w:rPr>
+          <w:rFonts w:ascii="Times New Roman" w:hAnsi="Times New Roman" w:cs="Times New Roman"/>
+          <w:bCs/>
+        </w:rPr>
+        <w:t xml:space="preserve"> it also shows "Processing file... Analysing logs" indicating a file upload is in progress. The overall UI is built for developers to quickly upload server logs and identify errors, warnings, and system health </w:t>
+      </w:r>
+      <w:proofErr w:type="gramStart"/>
+      <w:r>
+        <w:rPr>
+          <w:rFonts w:ascii="Times New Roman" w:hAnsi="Times New Roman" w:cs="Times New Roman"/>
+          <w:bCs/>
+        </w:rPr>
+        <w:t>at a glance</w:t>
+      </w:r>
+      <w:proofErr w:type="gramEnd"/>
+      <w:r>
+        <w:rPr>
+          <w:rFonts w:ascii="Times New Roman" w:hAnsi="Times New Roman" w:cs="Times New Roman"/>
+          <w:bCs/>
+        </w:rPr>
+        <w:t>.</w:t>
+      </w:r>
+    </w:p>
+    <w:tbl>
+      <w:tblPr>
+        <w:tblW w:w="10445" w:type="dxa"/>
+        <w:tblCellMar>
+          <w:left w:w="10" w:type="dxa"/>
+          <w:right w:w="10" w:type="dxa"/>
+        </w:tblCellMar>
+        <w:tblLook w:val="04A0" w:firstRow="1" w:lastRow="0" w:firstColumn="1" w:lastColumn="0" w:noHBand="0" w:noVBand="1"/>
+      </w:tblPr>
+      <w:tblGrid>
+        <w:gridCol w:w="2610"/>
+        <w:gridCol w:w="3916"/>
+        <w:gridCol w:w="3919"/>
+      </w:tblGrid>
+      <w:tr>
+        <w:trPr>
+          <w:trHeight w:val="2140"/>
+        </w:trPr>
+        <w:tc>
+          <w:tcPr>
+            <w:tcW w:w="2610" w:type="dxa"/>
+            <w:tcBorders>
+              <w:top w:val="nil"/>
+              <w:left w:val="nil"/>
+              <w:bottom w:val="nil"/>
+              <w:right w:val="nil"/>
+            </w:tcBorders>
+            <w:tcMar>
+              <w:top w:w="0" w:type="dxa"/>
+              <w:left w:w="0" w:type="dxa"/>
+              <w:bottom w:w="0" w:type="dxa"/>
+              <w:right w:w="0" w:type="dxa"/>
+            </w:tcMar>
+            <w:hideMark/>
+          </w:tcPr>
+          <w:p>
+            <w:pPr>
+              <w:rPr>
+                <w:rFonts w:ascii="Times New Roman" w:hAnsi="Times New Roman" w:cs="Times New Roman"/>
+              </w:rPr>
+            </w:pPr>
+            <w:r>
+              <w:rPr>
+                <w:rFonts w:ascii="Times New Roman" w:hAnsi="Times New Roman" w:cs="Times New Roman"/>
+              </w:rPr>
+              <w:t>2</w:t>
+            </w:r>
+            <w:r>
+              <w:rPr>
+                <w:rFonts w:ascii="Times New Roman" w:hAnsi="Times New Roman" w:cs="Times New Roman"/>
+              </w:rPr>
+              <w:t>9</w:t>
+            </w:r>
+            <w:r>
+              <w:rPr>
+                <w:rFonts w:ascii="Times New Roman" w:hAnsi="Times New Roman" w:cs="Times New Roman"/>
+              </w:rPr>
+              <w:t xml:space="preserve"> July 2026</w:t>
+            </w:r>
+          </w:p>
+          <w:p>
+            <w:pPr>
+              <w:ind w:left="400"/>
+              <w:rPr>
+                <w:rFonts w:ascii="Times New Roman" w:hAnsi="Times New Roman" w:cs="Times New Roman"/>
+              </w:rPr>
+            </w:pPr>
+            <w:r>
+              <w:rPr>
+                <w:rFonts w:ascii="Times New Roman" w:hAnsi="Times New Roman" w:cs="Times New Roman"/>
+              </w:rPr>
+              <w:t xml:space="preserve">Day </w:t>
+            </w:r>
+            <w:r>
+              <w:rPr>
+                <w:rFonts w:ascii="Times New Roman" w:hAnsi="Times New Roman" w:cs="Times New Roman"/>
+              </w:rPr>
+              <w:t>7</w:t>
+            </w:r>
+          </w:p>
+        </w:tc>
+        <w:tc>
+          <w:tcPr>
+            <w:tcW w:w="3916" w:type="dxa"/>
+            <w:tcBorders>
+              <w:top w:val="nil"/>
+              <w:left w:val="nil"/>
+              <w:bottom w:val="nil"/>
+              <w:right w:val="nil"/>
+            </w:tcBorders>
+            <w:tcMar>
+              <w:top w:w="0" w:type="dxa"/>
+              <w:left w:w="0" w:type="dxa"/>
+              <w:bottom w:w="0" w:type="dxa"/>
+              <w:right w:w="0" w:type="dxa"/>
+            </w:tcMar>
+            <w:hideMark/>
+          </w:tcPr>
+          <w:p>
+            <w:pPr>
+              <w:rPr>
+                <w:rFonts w:ascii="Times New Roman" w:hAnsi="Times New Roman" w:cs="Times New Roman"/>
+                <w:b/>
+                <w:bCs/>
+              </w:rPr>
+            </w:pPr>
+            <w:r>
+              <w:rPr>
+                <w:rFonts w:ascii="Times New Roman" w:hAnsi="Times New Roman" w:cs="Times New Roman"/>
+                <w:b/>
+                <w:bCs/>
+              </w:rPr>
+              <w:t xml:space="preserve">Today's Activities </w:t>
+            </w:r>
+          </w:p>
+          <w:p>
+            <w:pPr>
+              <w:numPr>
+                <w:ilvl w:val="0"/>
+                <w:numId w:val="4"/>
+              </w:numPr>
+              <w:rPr>
+                <w:rFonts w:ascii="Times New Roman" w:hAnsi="Times New Roman" w:cs="Times New Roman"/>
+                <w:b/>
+                <w:bCs/>
+              </w:rPr>
+            </w:pPr>
+            <w:r>
+              <w:rPr>
+                <w:rFonts w:ascii="Times New Roman" w:hAnsi="Times New Roman" w:cs="Times New Roman"/>
+                <w:b/>
+                <w:bCs/>
+              </w:rPr>
+              <w:t xml:space="preserve"> </w:t>
+            </w:r>
+          </w:p>
+        </w:tc>
+        <w:tc>
+          <w:tcPr>
+            <w:tcW w:w="3918" w:type="dxa"/>
+            <w:tcBorders>
+              <w:top w:val="nil"/>
+              <w:left w:val="nil"/>
+              <w:bottom w:val="nil"/>
+              <w:right w:val="nil"/>
+            </w:tcBorders>
+            <w:tcMar>
+              <w:top w:w="0" w:type="dxa"/>
+              <w:left w:w="0" w:type="dxa"/>
+              <w:bottom w:w="0" w:type="dxa"/>
+              <w:right w:w="0" w:type="dxa"/>
+            </w:tcMar>
+            <w:hideMark/>
+          </w:tcPr>
+          <w:p>
+            <w:pPr>
+              <w:rPr>
+                <w:rFonts w:ascii="Times New Roman" w:hAnsi="Times New Roman" w:cs="Times New Roman"/>
+              </w:rPr>
+            </w:pPr>
+            <w:r>
+              <w:rPr>
+                <w:rFonts w:ascii="Times New Roman" w:hAnsi="Times New Roman" w:cs="Times New Roman"/>
+                <w:b/>
+                <w:bCs/>
+              </w:rPr>
+              <w:t xml:space="preserve">Tomorrow's Plans </w:t>
+            </w:r>
+          </w:p>
+          <w:p>
+            <w:pPr>
+              <w:numPr>
+                <w:ilvl w:val="0"/>
+                <w:numId w:val="5"/>
+              </w:numPr>
+              <w:rPr>
+                <w:rFonts w:ascii="Times New Roman" w:hAnsi="Times New Roman" w:cs="Times New Roman"/>
+                <w:b/>
+                <w:bCs/>
+              </w:rPr>
+            </w:pPr>
+          </w:p>
+        </w:tc>
+      </w:tr>
+      <w:tr>
+        <w:trPr>
+          <w:trHeight w:val="163"/>
+        </w:trPr>
+        <w:tc>
+          <w:tcPr>
+            <w:tcW w:w="10445" w:type="dxa"/>
+            <w:gridSpan w:val="3"/>
+            <w:tcBorders>
+              <w:top w:val="nil"/>
+              <w:left w:val="nil"/>
+              <w:bottom w:val="nil"/>
+              <w:right w:val="nil"/>
+            </w:tcBorders>
+            <w:tcMar>
+              <w:top w:w="0" w:type="dxa"/>
+              <w:left w:w="0" w:type="dxa"/>
+              <w:bottom w:w="0" w:type="dxa"/>
+              <w:right w:w="0" w:type="dxa"/>
+            </w:tcMar>
+            <w:hideMark/>
+          </w:tcPr>
+          <w:p>
+            <w:pPr>
+              <w:rPr>
+                <w:rFonts w:ascii="Times New Roman" w:hAnsi="Times New Roman" w:cs="Times New Roman"/>
+              </w:rPr>
+            </w:pPr>
+            <w:r>
+              <w:rPr>
+                <w:rFonts w:ascii="Times New Roman" w:hAnsi="Times New Roman" w:cs="Times New Roman"/>
+                <w:b/>
+                <w:bCs/>
+              </w:rPr>
+              <w:t xml:space="preserve">Outputs and Descriptions </w:t>
+            </w:r>
+          </w:p>
+        </w:tc>
+      </w:tr>
+    </w:tbl>
+    <w:p>
+      <w:pPr>
+        <w:jc w:val="both"/>
+        <w:rPr>
+          <w:rFonts w:ascii="Times New Roman" w:eastAsia="MS Gothic" w:hAnsi="Times New Roman" w:cs="Times New Roman"/>
+        </w:rPr>
+      </w:pPr>
+      <w:r>
+        <w:rPr>
+          <w:rFonts w:ascii="Times New Roman" w:hAnsi="Times New Roman" w:cs="Times New Roman"/>
+          <w:b/>
+          <w:bCs/>
+        </w:rPr>
+        <w:t>Output:</w:t>
+      </w:r>
+      <w:r>
+        <w:rPr>
+          <w:rFonts w:ascii="Times New Roman" w:hAnsi="Times New Roman" w:cs="Times New Roman"/>
+        </w:rPr>
+        <w:t xml:space="preserve"> </w:t>
+      </w:r>
+    </w:p>
+    <w:p>
+      <w:pPr>
+        <w:jc w:val="both"/>
+        <w:rPr>
+          <w:rFonts w:ascii="Times New Roman" w:hAnsi="Times New Roman" w:cs="Times New Roman"/>
+          <w:bCs/>
         </w:rPr>
       </w:pPr>
       <w:r>
@@ -6808,6 +8270,119 @@
 <file path=word/numbering.xml><?xml version="1.0" encoding="utf-8"?>
 <w:numbering xmlns:wpc="http://schemas.microsoft.com/office/word/2010/wordprocessingCanvas" xmlns:cx="http://schemas.microsoft.com/office/drawing/2014/chartex" xmlns:cx1="http://schemas.microsoft.com/office/drawing/2015/9/8/chartex" xmlns:cx2="http://schemas.microsoft.com/office/drawing/2015/10/21/chartex" xmlns:cx3="http://schemas.microsoft.com/office/drawing/2016/5/9/chartex" xmlns:cx4="http://schemas.microsoft.com/office/drawing/2016/5/10/chartex" xmlns:cx5="http://schemas.microsoft.com/office/drawing/2016/5/11/chartex" xmlns:cx6="http://schemas.microsoft.com/office/drawing/2016/5/12/chartex" xmlns:cx7="http://schemas.microsoft.com/office/drawing/2016/5/13/chartex" xmlns:cx8="http://schemas.microsoft.com/office/drawing/2016/5/14/chartex" xmlns:mc="http://schemas.openxmlformats.org/markup-compatibility/2006" xmlns:aink="http://schemas.microsoft.com/office/drawing/2016/ink" xmlns:am3d="http://schemas.microsoft.com/office/drawing/2017/model3d" xmlns:o="urn:schemas-microsoft-com:office:office" xmlns:oel="http://schemas.microsoft.com/office/2019/extlst" xmlns:r="http://schemas.openxmlformats.org/officeDocument/2006/relationships" xmlns:m="http://schemas.openxmlformats.org/officeDocument/2006/math" xmlns:v="urn:schemas-microsoft-com:vml" xmlns:wp14="http://schemas.microsoft.com/office/word/2010/wordprocessingDrawing" xmlns:wp="http://schemas.openxmlformats.org/drawingml/2006/wordprocessingDrawing" xmlns:w10="urn:schemas-microsoft-com:office:word" xmlns:w="http://schemas.openxmlformats.org/wordprocessingml/2006/main" xmlns:w14="http://schemas.microsoft.com/office/word/2010/wordml" xmlns:w15="http://schemas.microsoft.com/office/word/2012/wordml" xmlns:w16cex="http://schemas.microsoft.com/office/word/2018/wordml/cex" xmlns:w16cid="http://schemas.microsoft.com/office/word/2016/wordml/cid" xmlns:w16="http://schemas.microsoft.com/office/word/2018/wordml" xmlns:w16du="http://schemas.microsoft.com/office/word/2023/wordml/word16du" xmlns:w16sdtdh="http://schemas.microsoft.com/office/word/2020/wordml/sdtdatahash" xmlns:w16sdtfl="http://schemas.microsoft.com/office/word/2024/wordml/sdtformatlock" xmlns:w16se="http://schemas.microsoft.com/office/word/2015/wordml/symex" xmlns:wpg="http://schemas.microsoft.com/office/word/2010/wordprocessingGroup" xmlns:wpi="http://schemas.microsoft.com/office/word/2010/wordprocessingInk" xmlns:wne="http://schemas.microsoft.com/office/word/2006/wordml" xmlns:wps="http://schemas.microsoft.com/office/word/2010/wordprocessingShape" mc:Ignorable="w14 w15 w16se w16cid w16 w16cex w16sdtdh w16sdtfl w16du wp14">
   <w:abstractNum w:abstractNumId="0" w15:restartNumberingAfterBreak="0">
+    <w:nsid w:val="02CE5738"/>
+    <w:multiLevelType w:val="hybridMultilevel"/>
+    <w:tmpl w:val="B5B2F706"/>
+    <w:lvl w:ilvl="0" w:tplc="4009000B">
+      <w:start w:val="1"/>
+      <w:numFmt w:val="bullet"/>
+      <w:lvlText w:val=""/>
+      <w:lvlJc w:val="left"/>
+      <w:pPr>
+        <w:ind w:left="1120" w:hanging="360"/>
+      </w:pPr>
+      <w:rPr>
+        <w:rFonts w:ascii="Wingdings" w:hAnsi="Wingdings" w:hint="default"/>
+      </w:rPr>
+    </w:lvl>
+    <w:lvl w:ilvl="1" w:tplc="40090003" w:tentative="1">
+      <w:start w:val="1"/>
+      <w:numFmt w:val="bullet"/>
+      <w:lvlText w:val="o"/>
+      <w:lvlJc w:val="left"/>
+      <w:pPr>
+        <w:ind w:left="1840" w:hanging="360"/>
+      </w:pPr>
+      <w:rPr>
+        <w:rFonts w:ascii="Courier New" w:hAnsi="Courier New" w:cs="Courier New" w:hint="default"/>
+      </w:rPr>
+    </w:lvl>
+    <w:lvl w:ilvl="2" w:tplc="40090005" w:tentative="1">
+      <w:start w:val="1"/>
+      <w:numFmt w:val="bullet"/>
+      <w:lvlText w:val=""/>
+      <w:lvlJc w:val="left"/>
+      <w:pPr>
+        <w:ind w:left="2560" w:hanging="360"/>
+      </w:pPr>
+      <w:rPr>
+        <w:rFonts w:ascii="Wingdings" w:hAnsi="Wingdings" w:hint="default"/>
+      </w:rPr>
+    </w:lvl>
+    <w:lvl w:ilvl="3" w:tplc="40090001" w:tentative="1">
+      <w:start w:val="1"/>
+      <w:numFmt w:val="bullet"/>
+      <w:lvlText w:val=""/>
+      <w:lvlJc w:val="left"/>
+      <w:pPr>
+        <w:ind w:left="3280" w:hanging="360"/>
+      </w:pPr>
+      <w:rPr>
+        <w:rFonts w:ascii="Symbol" w:hAnsi="Symbol" w:hint="default"/>
+      </w:rPr>
+    </w:lvl>
+    <w:lvl w:ilvl="4" w:tplc="40090003" w:tentative="1">
+      <w:start w:val="1"/>
+      <w:numFmt w:val="bullet"/>
+      <w:lvlText w:val="o"/>
+      <w:lvlJc w:val="left"/>
+      <w:pPr>
+        <w:ind w:left="4000" w:hanging="360"/>
+      </w:pPr>
+      <w:rPr>
+        <w:rFonts w:ascii="Courier New" w:hAnsi="Courier New" w:cs="Courier New" w:hint="default"/>
+      </w:rPr>
+    </w:lvl>
+    <w:lvl w:ilvl="5" w:tplc="40090005" w:tentative="1">
+      <w:start w:val="1"/>
+      <w:numFmt w:val="bullet"/>
+      <w:lvlText w:val=""/>
+      <w:lvlJc w:val="left"/>
+      <w:pPr>
+        <w:ind w:left="4720" w:hanging="360"/>
+      </w:pPr>
+      <w:rPr>
+        <w:rFonts w:ascii="Wingdings" w:hAnsi="Wingdings" w:hint="default"/>
+      </w:rPr>
+    </w:lvl>
+    <w:lvl w:ilvl="6" w:tplc="40090001" w:tentative="1">
+      <w:start w:val="1"/>
+      <w:numFmt w:val="bullet"/>
+      <w:lvlText w:val=""/>
+      <w:lvlJc w:val="left"/>
+      <w:pPr>
+        <w:ind w:left="5440" w:hanging="360"/>
+      </w:pPr>
+      <w:rPr>
+        <w:rFonts w:ascii="Symbol" w:hAnsi="Symbol" w:hint="default"/>
+      </w:rPr>
+    </w:lvl>
+    <w:lvl w:ilvl="7" w:tplc="40090003" w:tentative="1">
+      <w:start w:val="1"/>
+      <w:numFmt w:val="bullet"/>
+      <w:lvlText w:val="o"/>
+      <w:lvlJc w:val="left"/>
+      <w:pPr>
+        <w:ind w:left="6160" w:hanging="360"/>
+      </w:pPr>
+      <w:rPr>
+        <w:rFonts w:ascii="Courier New" w:hAnsi="Courier New" w:cs="Courier New" w:hint="default"/>
+      </w:rPr>
+    </w:lvl>
+    <w:lvl w:ilvl="8" w:tplc="40090005" w:tentative="1">
+      <w:start w:val="1"/>
+      <w:numFmt w:val="bullet"/>
+      <w:lvlText w:val=""/>
+      <w:lvlJc w:val="left"/>
+      <w:pPr>
+        <w:ind w:left="6880" w:hanging="360"/>
+      </w:pPr>
+      <w:rPr>
+        <w:rFonts w:ascii="Wingdings" w:hAnsi="Wingdings" w:hint="default"/>
+      </w:rPr>
+    </w:lvl>
+  </w:abstractNum>
+  <w:abstractNum w:abstractNumId="1" w15:restartNumberingAfterBreak="0">
     <w:nsid w:val="06133A7A"/>
     <w:multiLevelType w:val="hybridMultilevel"/>
     <w:tmpl w:val="53788F08"/>
@@ -6916,7 +8491,7 @@
       </w:pPr>
     </w:lvl>
   </w:abstractNum>
-  <w:abstractNum w:abstractNumId="1" w15:restartNumberingAfterBreak="0">
+  <w:abstractNum w:abstractNumId="2" w15:restartNumberingAfterBreak="0">
     <w:nsid w:val="06FB0E20"/>
     <w:multiLevelType w:val="hybridMultilevel"/>
     <w:tmpl w:val="4E80FA84"/>
@@ -7029,7 +8604,7 @@
       </w:rPr>
     </w:lvl>
   </w:abstractNum>
-  <w:abstractNum w:abstractNumId="2" w15:restartNumberingAfterBreak="0">
+  <w:abstractNum w:abstractNumId="3" w15:restartNumberingAfterBreak="0">
     <w:nsid w:val="0B0622F2"/>
     <w:multiLevelType w:val="hybridMultilevel"/>
     <w:tmpl w:val="A134C850"/>
@@ -7142,7 +8717,7 @@
       </w:rPr>
     </w:lvl>
   </w:abstractNum>
-  <w:abstractNum w:abstractNumId="3" w15:restartNumberingAfterBreak="0">
+  <w:abstractNum w:abstractNumId="4" w15:restartNumberingAfterBreak="0">
     <w:nsid w:val="0D743D1F"/>
     <w:multiLevelType w:val="hybridMultilevel"/>
     <w:tmpl w:val="2DB280B0"/>
@@ -7251,7 +8826,7 @@
       </w:pPr>
     </w:lvl>
   </w:abstractNum>
-  <w:abstractNum w:abstractNumId="4" w15:restartNumberingAfterBreak="0">
+  <w:abstractNum w:abstractNumId="5" w15:restartNumberingAfterBreak="0">
     <w:nsid w:val="0F7D6AA2"/>
     <w:multiLevelType w:val="hybridMultilevel"/>
     <w:tmpl w:val="1E34183E"/>
@@ -7364,7 +8939,7 @@
       </w:rPr>
     </w:lvl>
   </w:abstractNum>
-  <w:abstractNum w:abstractNumId="5" w15:restartNumberingAfterBreak="0">
+  <w:abstractNum w:abstractNumId="6" w15:restartNumberingAfterBreak="0">
     <w:nsid w:val="11E40B49"/>
     <w:multiLevelType w:val="hybridMultilevel"/>
     <w:tmpl w:val="3B14F05C"/>
@@ -7477,7 +9052,7 @@
       </w:rPr>
     </w:lvl>
   </w:abstractNum>
-  <w:abstractNum w:abstractNumId="6" w15:restartNumberingAfterBreak="0">
+  <w:abstractNum w:abstractNumId="7" w15:restartNumberingAfterBreak="0">
     <w:nsid w:val="12D534F3"/>
     <w:multiLevelType w:val="hybridMultilevel"/>
     <w:tmpl w:val="6D9A2CFE"/>
@@ -7590,7 +9165,7 @@
       </w:rPr>
     </w:lvl>
   </w:abstractNum>
-  <w:abstractNum w:abstractNumId="7" w15:restartNumberingAfterBreak="0">
+  <w:abstractNum w:abstractNumId="8" w15:restartNumberingAfterBreak="0">
     <w:nsid w:val="14175B67"/>
     <w:multiLevelType w:val="hybridMultilevel"/>
     <w:tmpl w:val="776493DA"/>
@@ -7699,7 +9274,120 @@
       </w:pPr>
     </w:lvl>
   </w:abstractNum>
-  <w:abstractNum w:abstractNumId="8" w15:restartNumberingAfterBreak="0">
+  <w:abstractNum w:abstractNumId="9" w15:restartNumberingAfterBreak="0">
+    <w:nsid w:val="191168A3"/>
+    <w:multiLevelType w:val="hybridMultilevel"/>
+    <w:tmpl w:val="0DB2DA64"/>
+    <w:lvl w:ilvl="0" w:tplc="4009000B">
+      <w:start w:val="1"/>
+      <w:numFmt w:val="bullet"/>
+      <w:lvlText w:val=""/>
+      <w:lvlJc w:val="left"/>
+      <w:pPr>
+        <w:ind w:left="1120" w:hanging="360"/>
+      </w:pPr>
+      <w:rPr>
+        <w:rFonts w:ascii="Wingdings" w:hAnsi="Wingdings" w:hint="default"/>
+      </w:rPr>
+    </w:lvl>
+    <w:lvl w:ilvl="1" w:tplc="40090003" w:tentative="1">
+      <w:start w:val="1"/>
+      <w:numFmt w:val="bullet"/>
+      <w:lvlText w:val="o"/>
+      <w:lvlJc w:val="left"/>
+      <w:pPr>
+        <w:ind w:left="1840" w:hanging="360"/>
+      </w:pPr>
+      <w:rPr>
+        <w:rFonts w:ascii="Courier New" w:hAnsi="Courier New" w:cs="Courier New" w:hint="default"/>
+      </w:rPr>
+    </w:lvl>
+    <w:lvl w:ilvl="2" w:tplc="40090005" w:tentative="1">
+      <w:start w:val="1"/>
+      <w:numFmt w:val="bullet"/>
+      <w:lvlText w:val=""/>
+      <w:lvlJc w:val="left"/>
+      <w:pPr>
+        <w:ind w:left="2560" w:hanging="360"/>
+      </w:pPr>
+      <w:rPr>
+        <w:rFonts w:ascii="Wingdings" w:hAnsi="Wingdings" w:hint="default"/>
+      </w:rPr>
+    </w:lvl>
+    <w:lvl w:ilvl="3" w:tplc="40090001" w:tentative="1">
+      <w:start w:val="1"/>
+      <w:numFmt w:val="bullet"/>
+      <w:lvlText w:val=""/>
+      <w:lvlJc w:val="left"/>
+      <w:pPr>
+        <w:ind w:left="3280" w:hanging="360"/>
+      </w:pPr>
+      <w:rPr>
+        <w:rFonts w:ascii="Symbol" w:hAnsi="Symbol" w:hint="default"/>
+      </w:rPr>
+    </w:lvl>
+    <w:lvl w:ilvl="4" w:tplc="40090003" w:tentative="1">
+      <w:start w:val="1"/>
+      <w:numFmt w:val="bullet"/>
+      <w:lvlText w:val="o"/>
+      <w:lvlJc w:val="left"/>
+      <w:pPr>
+        <w:ind w:left="4000" w:hanging="360"/>
+      </w:pPr>
+      <w:rPr>
+        <w:rFonts w:ascii="Courier New" w:hAnsi="Courier New" w:cs="Courier New" w:hint="default"/>
+      </w:rPr>
+    </w:lvl>
+    <w:lvl w:ilvl="5" w:tplc="40090005" w:tentative="1">
+      <w:start w:val="1"/>
+      <w:numFmt w:val="bullet"/>
+      <w:lvlText w:val=""/>
+      <w:lvlJc w:val="left"/>
+      <w:pPr>
+        <w:ind w:left="4720" w:hanging="360"/>
+      </w:pPr>
+      <w:rPr>
+        <w:rFonts w:ascii="Wingdings" w:hAnsi="Wingdings" w:hint="default"/>
+      </w:rPr>
+    </w:lvl>
+    <w:lvl w:ilvl="6" w:tplc="40090001" w:tentative="1">
+      <w:start w:val="1"/>
+      <w:numFmt w:val="bullet"/>
+      <w:lvlText w:val=""/>
+      <w:lvlJc w:val="left"/>
+      <w:pPr>
+        <w:ind w:left="5440" w:hanging="360"/>
+      </w:pPr>
+      <w:rPr>
+        <w:rFonts w:ascii="Symbol" w:hAnsi="Symbol" w:hint="default"/>
+      </w:rPr>
+    </w:lvl>
+    <w:lvl w:ilvl="7" w:tplc="40090003" w:tentative="1">
+      <w:start w:val="1"/>
+      <w:numFmt w:val="bullet"/>
+      <w:lvlText w:val="o"/>
+      <w:lvlJc w:val="left"/>
+      <w:pPr>
+        <w:ind w:left="6160" w:hanging="360"/>
+      </w:pPr>
+      <w:rPr>
+        <w:rFonts w:ascii="Courier New" w:hAnsi="Courier New" w:cs="Courier New" w:hint="default"/>
+      </w:rPr>
+    </w:lvl>
+    <w:lvl w:ilvl="8" w:tplc="40090005" w:tentative="1">
+      <w:start w:val="1"/>
+      <w:numFmt w:val="bullet"/>
+      <w:lvlText w:val=""/>
+      <w:lvlJc w:val="left"/>
+      <w:pPr>
+        <w:ind w:left="6880" w:hanging="360"/>
+      </w:pPr>
+      <w:rPr>
+        <w:rFonts w:ascii="Wingdings" w:hAnsi="Wingdings" w:hint="default"/>
+      </w:rPr>
+    </w:lvl>
+  </w:abstractNum>
+  <w:abstractNum w:abstractNumId="10" w15:restartNumberingAfterBreak="0">
     <w:nsid w:val="1CA516B8"/>
     <w:multiLevelType w:val="hybridMultilevel"/>
     <w:tmpl w:val="9A042BF6"/>
@@ -7812,7 +9500,7 @@
       </w:rPr>
     </w:lvl>
   </w:abstractNum>
-  <w:abstractNum w:abstractNumId="9" w15:restartNumberingAfterBreak="0">
+  <w:abstractNum w:abstractNumId="11" w15:restartNumberingAfterBreak="0">
     <w:nsid w:val="22DB65EA"/>
     <w:multiLevelType w:val="hybridMultilevel"/>
     <w:tmpl w:val="0F7C5664"/>
@@ -7925,7 +9613,7 @@
       </w:rPr>
     </w:lvl>
   </w:abstractNum>
-  <w:abstractNum w:abstractNumId="10" w15:restartNumberingAfterBreak="0">
+  <w:abstractNum w:abstractNumId="12" w15:restartNumberingAfterBreak="0">
     <w:nsid w:val="232628BC"/>
     <w:multiLevelType w:val="hybridMultilevel"/>
     <w:tmpl w:val="BB22A51E"/>
@@ -8038,7 +9726,7 @@
       </w:rPr>
     </w:lvl>
   </w:abstractNum>
-  <w:abstractNum w:abstractNumId="11" w15:restartNumberingAfterBreak="0">
+  <w:abstractNum w:abstractNumId="13" w15:restartNumberingAfterBreak="0">
     <w:nsid w:val="252E7E14"/>
     <w:multiLevelType w:val="hybridMultilevel"/>
     <w:tmpl w:val="1BA610EE"/>
@@ -8151,7 +9839,120 @@
       </w:rPr>
     </w:lvl>
   </w:abstractNum>
-  <w:abstractNum w:abstractNumId="12" w15:restartNumberingAfterBreak="0">
+  <w:abstractNum w:abstractNumId="14" w15:restartNumberingAfterBreak="0">
+    <w:nsid w:val="260B2D54"/>
+    <w:multiLevelType w:val="hybridMultilevel"/>
+    <w:tmpl w:val="3B3CBCFA"/>
+    <w:lvl w:ilvl="0" w:tplc="4009000B">
+      <w:start w:val="1"/>
+      <w:numFmt w:val="bullet"/>
+      <w:lvlText w:val=""/>
+      <w:lvlJc w:val="left"/>
+      <w:pPr>
+        <w:ind w:left="1120" w:hanging="360"/>
+      </w:pPr>
+      <w:rPr>
+        <w:rFonts w:ascii="Wingdings" w:hAnsi="Wingdings" w:hint="default"/>
+      </w:rPr>
+    </w:lvl>
+    <w:lvl w:ilvl="1" w:tplc="40090003" w:tentative="1">
+      <w:start w:val="1"/>
+      <w:numFmt w:val="bullet"/>
+      <w:lvlText w:val="o"/>
+      <w:lvlJc w:val="left"/>
+      <w:pPr>
+        <w:ind w:left="1840" w:hanging="360"/>
+      </w:pPr>
+      <w:rPr>
+        <w:rFonts w:ascii="Courier New" w:hAnsi="Courier New" w:cs="Courier New" w:hint="default"/>
+      </w:rPr>
+    </w:lvl>
+    <w:lvl w:ilvl="2" w:tplc="40090005" w:tentative="1">
+      <w:start w:val="1"/>
+      <w:numFmt w:val="bullet"/>
+      <w:lvlText w:val=""/>
+      <w:lvlJc w:val="left"/>
+      <w:pPr>
+        <w:ind w:left="2560" w:hanging="360"/>
+      </w:pPr>
+      <w:rPr>
+        <w:rFonts w:ascii="Wingdings" w:hAnsi="Wingdings" w:hint="default"/>
+      </w:rPr>
+    </w:lvl>
+    <w:lvl w:ilvl="3" w:tplc="40090001" w:tentative="1">
+      <w:start w:val="1"/>
+      <w:numFmt w:val="bullet"/>
+      <w:lvlText w:val=""/>
+      <w:lvlJc w:val="left"/>
+      <w:pPr>
+        <w:ind w:left="3280" w:hanging="360"/>
+      </w:pPr>
+      <w:rPr>
+        <w:rFonts w:ascii="Symbol" w:hAnsi="Symbol" w:hint="default"/>
+      </w:rPr>
+    </w:lvl>
+    <w:lvl w:ilvl="4" w:tplc="40090003" w:tentative="1">
+      <w:start w:val="1"/>
+      <w:numFmt w:val="bullet"/>
+      <w:lvlText w:val="o"/>
+      <w:lvlJc w:val="left"/>
+      <w:pPr>
+        <w:ind w:left="4000" w:hanging="360"/>
+      </w:pPr>
+      <w:rPr>
+        <w:rFonts w:ascii="Courier New" w:hAnsi="Courier New" w:cs="Courier New" w:hint="default"/>
+      </w:rPr>
+    </w:lvl>
+    <w:lvl w:ilvl="5" w:tplc="40090005" w:tentative="1">
+      <w:start w:val="1"/>
+      <w:numFmt w:val="bullet"/>
+      <w:lvlText w:val=""/>
+      <w:lvlJc w:val="left"/>
+      <w:pPr>
+        <w:ind w:left="4720" w:hanging="360"/>
+      </w:pPr>
+      <w:rPr>
+        <w:rFonts w:ascii="Wingdings" w:hAnsi="Wingdings" w:hint="default"/>
+      </w:rPr>
+    </w:lvl>
+    <w:lvl w:ilvl="6" w:tplc="40090001" w:tentative="1">
+      <w:start w:val="1"/>
+      <w:numFmt w:val="bullet"/>
+      <w:lvlText w:val=""/>
+      <w:lvlJc w:val="left"/>
+      <w:pPr>
+        <w:ind w:left="5440" w:hanging="360"/>
+      </w:pPr>
+      <w:rPr>
+        <w:rFonts w:ascii="Symbol" w:hAnsi="Symbol" w:hint="default"/>
+      </w:rPr>
+    </w:lvl>
+    <w:lvl w:ilvl="7" w:tplc="40090003" w:tentative="1">
+      <w:start w:val="1"/>
+      <w:numFmt w:val="bullet"/>
+      <w:lvlText w:val="o"/>
+      <w:lvlJc w:val="left"/>
+      <w:pPr>
+        <w:ind w:left="6160" w:hanging="360"/>
+      </w:pPr>
+      <w:rPr>
+        <w:rFonts w:ascii="Courier New" w:hAnsi="Courier New" w:cs="Courier New" w:hint="default"/>
+      </w:rPr>
+    </w:lvl>
+    <w:lvl w:ilvl="8" w:tplc="40090005" w:tentative="1">
+      <w:start w:val="1"/>
+      <w:numFmt w:val="bullet"/>
+      <w:lvlText w:val=""/>
+      <w:lvlJc w:val="left"/>
+      <w:pPr>
+        <w:ind w:left="6880" w:hanging="360"/>
+      </w:pPr>
+      <w:rPr>
+        <w:rFonts w:ascii="Wingdings" w:hAnsi="Wingdings" w:hint="default"/>
+      </w:rPr>
+    </w:lvl>
+  </w:abstractNum>
+  <w:abstractNum w:abstractNumId="15" w15:restartNumberingAfterBreak="0">
     <w:nsid w:val="264859EB"/>
     <w:multiLevelType w:val="hybridMultilevel"/>
     <w:tmpl w:val="9976F274"/>
@@ -8264,7 +10065,120 @@
       </w:rPr>
     </w:lvl>
   </w:abstractNum>
-  <w:abstractNum w:abstractNumId="13" w15:restartNumberingAfterBreak="0">
+  <w:abstractNum w:abstractNumId="16" w15:restartNumberingAfterBreak="0">
+    <w:nsid w:val="2CD07219"/>
+    <w:multiLevelType w:val="hybridMultilevel"/>
+    <w:tmpl w:val="F028F0C2"/>
+    <w:lvl w:ilvl="0" w:tplc="4009000B">
+      <w:start w:val="1"/>
+      <w:numFmt w:val="bullet"/>
+      <w:lvlText w:val=""/>
+      <w:lvlJc w:val="left"/>
+      <w:pPr>
+        <w:ind w:left="1120" w:hanging="360"/>
+      </w:pPr>
+      <w:rPr>
+        <w:rFonts w:ascii="Wingdings" w:hAnsi="Wingdings" w:hint="default"/>
+      </w:rPr>
+    </w:lvl>
+    <w:lvl w:ilvl="1" w:tplc="40090003" w:tentative="1">
+      <w:start w:val="1"/>
+      <w:numFmt w:val="bullet"/>
+      <w:lvlText w:val="o"/>
+      <w:lvlJc w:val="left"/>
+      <w:pPr>
+        <w:ind w:left="1840" w:hanging="360"/>
+      </w:pPr>
+      <w:rPr>
+        <w:rFonts w:ascii="Courier New" w:hAnsi="Courier New" w:cs="Courier New" w:hint="default"/>
+      </w:rPr>
+    </w:lvl>
+    <w:lvl w:ilvl="2" w:tplc="40090005" w:tentative="1">
+      <w:start w:val="1"/>
+      <w:numFmt w:val="bullet"/>
+      <w:lvlText w:val=""/>
+      <w:lvlJc w:val="left"/>
+      <w:pPr>
+        <w:ind w:left="2560" w:hanging="360"/>
+      </w:pPr>
+      <w:rPr>
+        <w:rFonts w:ascii="Wingdings" w:hAnsi="Wingdings" w:hint="default"/>
+      </w:rPr>
+    </w:lvl>
+    <w:lvl w:ilvl="3" w:tplc="40090001" w:tentative="1">
+      <w:start w:val="1"/>
+      <w:numFmt w:val="bullet"/>
+      <w:lvlText w:val=""/>
+      <w:lvlJc w:val="left"/>
+      <w:pPr>
+        <w:ind w:left="3280" w:hanging="360"/>
+      </w:pPr>
+      <w:rPr>
+        <w:rFonts w:ascii="Symbol" w:hAnsi="Symbol" w:hint="default"/>
+      </w:rPr>
+    </w:lvl>
+    <w:lvl w:ilvl="4" w:tplc="40090003" w:tentative="1">
+      <w:start w:val="1"/>
+      <w:numFmt w:val="bullet"/>
+      <w:lvlText w:val="o"/>
+      <w:lvlJc w:val="left"/>
+      <w:pPr>
+        <w:ind w:left="4000" w:hanging="360"/>
+      </w:pPr>
+      <w:rPr>
+        <w:rFonts w:ascii="Courier New" w:hAnsi="Courier New" w:cs="Courier New" w:hint="default"/>
+      </w:rPr>
+    </w:lvl>
+    <w:lvl w:ilvl="5" w:tplc="40090005" w:tentative="1">
+      <w:start w:val="1"/>
+      <w:numFmt w:val="bullet"/>
+      <w:lvlText w:val=""/>
+      <w:lvlJc w:val="left"/>
+      <w:pPr>
+        <w:ind w:left="4720" w:hanging="360"/>
+      </w:pPr>
+      <w:rPr>
+        <w:rFonts w:ascii="Wingdings" w:hAnsi="Wingdings" w:hint="default"/>
+      </w:rPr>
+    </w:lvl>
+    <w:lvl w:ilvl="6" w:tplc="40090001" w:tentative="1">
+      <w:start w:val="1"/>
+      <w:numFmt w:val="bullet"/>
+      <w:lvlText w:val=""/>
+      <w:lvlJc w:val="left"/>
+      <w:pPr>
+        <w:ind w:left="5440" w:hanging="360"/>
+      </w:pPr>
+      <w:rPr>
+        <w:rFonts w:ascii="Symbol" w:hAnsi="Symbol" w:hint="default"/>
+      </w:rPr>
+    </w:lvl>
+    <w:lvl w:ilvl="7" w:tplc="40090003" w:tentative="1">
+      <w:start w:val="1"/>
+      <w:numFmt w:val="bullet"/>
+      <w:lvlText w:val="o"/>
+      <w:lvlJc w:val="left"/>
+      <w:pPr>
+        <w:ind w:left="6160" w:hanging="360"/>
+      </w:pPr>
+      <w:rPr>
+        <w:rFonts w:ascii="Courier New" w:hAnsi="Courier New" w:cs="Courier New" w:hint="default"/>
+      </w:rPr>
+    </w:lvl>
+    <w:lvl w:ilvl="8" w:tplc="40090005" w:tentative="1">
+      <w:start w:val="1"/>
+      <w:numFmt w:val="bullet"/>
+      <w:lvlText w:val=""/>
+      <w:lvlJc w:val="left"/>
+      <w:pPr>
+        <w:ind w:left="6880" w:hanging="360"/>
+      </w:pPr>
+      <w:rPr>
+        <w:rFonts w:ascii="Wingdings" w:hAnsi="Wingdings" w:hint="default"/>
+      </w:rPr>
+    </w:lvl>
+  </w:abstractNum>
+  <w:abstractNum w:abstractNumId="17" w15:restartNumberingAfterBreak="0">
     <w:nsid w:val="2FFC261B"/>
     <w:multiLevelType w:val="hybridMultilevel"/>
     <w:tmpl w:val="0B82D880"/>
@@ -8373,7 +10287,7 @@
       </w:pPr>
     </w:lvl>
   </w:abstractNum>
-  <w:abstractNum w:abstractNumId="14" w15:restartNumberingAfterBreak="0">
+  <w:abstractNum w:abstractNumId="18" w15:restartNumberingAfterBreak="0">
     <w:nsid w:val="322A262F"/>
     <w:multiLevelType w:val="hybridMultilevel"/>
     <w:tmpl w:val="327C07E0"/>
@@ -8486,7 +10400,7 @@
       </w:rPr>
     </w:lvl>
   </w:abstractNum>
-  <w:abstractNum w:abstractNumId="15" w15:restartNumberingAfterBreak="0">
+  <w:abstractNum w:abstractNumId="19" w15:restartNumberingAfterBreak="0">
     <w:nsid w:val="39582E41"/>
     <w:multiLevelType w:val="hybridMultilevel"/>
     <w:tmpl w:val="6EA8BB26"/>
@@ -8599,7 +10513,7 @@
       </w:rPr>
     </w:lvl>
   </w:abstractNum>
-  <w:abstractNum w:abstractNumId="16" w15:restartNumberingAfterBreak="0">
+  <w:abstractNum w:abstractNumId="20" w15:restartNumberingAfterBreak="0">
     <w:nsid w:val="39A6604F"/>
     <w:multiLevelType w:val="hybridMultilevel"/>
     <w:tmpl w:val="E4B8291E"/>
@@ -8712,7 +10626,7 @@
       </w:rPr>
     </w:lvl>
   </w:abstractNum>
-  <w:abstractNum w:abstractNumId="17" w15:restartNumberingAfterBreak="0">
+  <w:abstractNum w:abstractNumId="21" w15:restartNumberingAfterBreak="0">
     <w:nsid w:val="3AF506B1"/>
     <w:multiLevelType w:val="hybridMultilevel"/>
     <w:tmpl w:val="02606EF8"/>
@@ -8825,7 +10739,7 @@
       </w:rPr>
     </w:lvl>
   </w:abstractNum>
-  <w:abstractNum w:abstractNumId="18" w15:restartNumberingAfterBreak="0">
+  <w:abstractNum w:abstractNumId="22" w15:restartNumberingAfterBreak="0">
     <w:nsid w:val="41866BD7"/>
     <w:multiLevelType w:val="hybridMultilevel"/>
     <w:tmpl w:val="A628F052"/>
@@ -8938,7 +10852,7 @@
       </w:rPr>
     </w:lvl>
   </w:abstractNum>
-  <w:abstractNum w:abstractNumId="19" w15:restartNumberingAfterBreak="0">
+  <w:abstractNum w:abstractNumId="23" w15:restartNumberingAfterBreak="0">
     <w:nsid w:val="41F21485"/>
     <w:multiLevelType w:val="hybridMultilevel"/>
     <w:tmpl w:val="BEF2DB6E"/>
@@ -9051,7 +10965,120 @@
       </w:rPr>
     </w:lvl>
   </w:abstractNum>
-  <w:abstractNum w:abstractNumId="20" w15:restartNumberingAfterBreak="0">
+  <w:abstractNum w:abstractNumId="24" w15:restartNumberingAfterBreak="0">
+    <w:nsid w:val="43F66481"/>
+    <w:multiLevelType w:val="hybridMultilevel"/>
+    <w:tmpl w:val="0D5AA074"/>
+    <w:lvl w:ilvl="0" w:tplc="4009000B">
+      <w:start w:val="1"/>
+      <w:numFmt w:val="bullet"/>
+      <w:lvlText w:val=""/>
+      <w:lvlJc w:val="left"/>
+      <w:pPr>
+        <w:ind w:left="1120" w:hanging="360"/>
+      </w:pPr>
+      <w:rPr>
+        <w:rFonts w:ascii="Wingdings" w:hAnsi="Wingdings" w:hint="default"/>
+      </w:rPr>
+    </w:lvl>
+    <w:lvl w:ilvl="1" w:tplc="40090003" w:tentative="1">
+      <w:start w:val="1"/>
+      <w:numFmt w:val="bullet"/>
+      <w:lvlText w:val="o"/>
+      <w:lvlJc w:val="left"/>
+      <w:pPr>
+        <w:ind w:left="1840" w:hanging="360"/>
+      </w:pPr>
+      <w:rPr>
+        <w:rFonts w:ascii="Courier New" w:hAnsi="Courier New" w:cs="Courier New" w:hint="default"/>
+      </w:rPr>
+    </w:lvl>
+    <w:lvl w:ilvl="2" w:tplc="40090005" w:tentative="1">
+      <w:start w:val="1"/>
+      <w:numFmt w:val="bullet"/>
+      <w:lvlText w:val=""/>
+      <w:lvlJc w:val="left"/>
+      <w:pPr>
+        <w:ind w:left="2560" w:hanging="360"/>
+      </w:pPr>
+      <w:rPr>
+        <w:rFonts w:ascii="Wingdings" w:hAnsi="Wingdings" w:hint="default"/>
+      </w:rPr>
+    </w:lvl>
+    <w:lvl w:ilvl="3" w:tplc="40090001" w:tentative="1">
+      <w:start w:val="1"/>
+      <w:numFmt w:val="bullet"/>
+      <w:lvlText w:val=""/>
+      <w:lvlJc w:val="left"/>
+      <w:pPr>
+        <w:ind w:left="3280" w:hanging="360"/>
+      </w:pPr>
+      <w:rPr>
+        <w:rFonts w:ascii="Symbol" w:hAnsi="Symbol" w:hint="default"/>
+      </w:rPr>
+    </w:lvl>
+    <w:lvl w:ilvl="4" w:tplc="40090003" w:tentative="1">
+      <w:start w:val="1"/>
+      <w:numFmt w:val="bullet"/>
+      <w:lvlText w:val="o"/>
+      <w:lvlJc w:val="left"/>
+      <w:pPr>
+        <w:ind w:left="4000" w:hanging="360"/>
+      </w:pPr>
+      <w:rPr>
+        <w:rFonts w:ascii="Courier New" w:hAnsi="Courier New" w:cs="Courier New" w:hint="default"/>
+      </w:rPr>
+    </w:lvl>
+    <w:lvl w:ilvl="5" w:tplc="40090005" w:tentative="1">
+      <w:start w:val="1"/>
+      <w:numFmt w:val="bullet"/>
+      <w:lvlText w:val=""/>
+      <w:lvlJc w:val="left"/>
+      <w:pPr>
+        <w:ind w:left="4720" w:hanging="360"/>
+      </w:pPr>
+      <w:rPr>
+        <w:rFonts w:ascii="Wingdings" w:hAnsi="Wingdings" w:hint="default"/>
+      </w:rPr>
+    </w:lvl>
+    <w:lvl w:ilvl="6" w:tplc="40090001" w:tentative="1">
+      <w:start w:val="1"/>
+      <w:numFmt w:val="bullet"/>
+      <w:lvlText w:val=""/>
+      <w:lvlJc w:val="left"/>
+      <w:pPr>
+        <w:ind w:left="5440" w:hanging="360"/>
+      </w:pPr>
+      <w:rPr>
+        <w:rFonts w:ascii="Symbol" w:hAnsi="Symbol" w:hint="default"/>
+      </w:rPr>
+    </w:lvl>
+    <w:lvl w:ilvl="7" w:tplc="40090003" w:tentative="1">
+      <w:start w:val="1"/>
+      <w:numFmt w:val="bullet"/>
+      <w:lvlText w:val="o"/>
+      <w:lvlJc w:val="left"/>
+      <w:pPr>
+        <w:ind w:left="6160" w:hanging="360"/>
+      </w:pPr>
+      <w:rPr>
+        <w:rFonts w:ascii="Courier New" w:hAnsi="Courier New" w:cs="Courier New" w:hint="default"/>
+      </w:rPr>
+    </w:lvl>
+    <w:lvl w:ilvl="8" w:tplc="40090005" w:tentative="1">
+      <w:start w:val="1"/>
+      <w:numFmt w:val="bullet"/>
+      <w:lvlText w:val=""/>
+      <w:lvlJc w:val="left"/>
+      <w:pPr>
+        <w:ind w:left="6880" w:hanging="360"/>
+      </w:pPr>
+      <w:rPr>
+        <w:rFonts w:ascii="Wingdings" w:hAnsi="Wingdings" w:hint="default"/>
+      </w:rPr>
+    </w:lvl>
+  </w:abstractNum>
+  <w:abstractNum w:abstractNumId="25" w15:restartNumberingAfterBreak="0">
     <w:nsid w:val="475F4735"/>
     <w:multiLevelType w:val="hybridMultilevel"/>
     <w:tmpl w:val="FA029FFA"/>
@@ -9164,7 +11191,7 @@
       </w:rPr>
     </w:lvl>
   </w:abstractNum>
-  <w:abstractNum w:abstractNumId="21" w15:restartNumberingAfterBreak="0">
+  <w:abstractNum w:abstractNumId="26" w15:restartNumberingAfterBreak="0">
     <w:nsid w:val="4815038B"/>
     <w:multiLevelType w:val="hybridMultilevel"/>
     <w:tmpl w:val="1578EFD0"/>
@@ -9277,7 +11304,7 @@
       </w:rPr>
     </w:lvl>
   </w:abstractNum>
-  <w:abstractNum w:abstractNumId="22" w15:restartNumberingAfterBreak="0">
+  <w:abstractNum w:abstractNumId="27" w15:restartNumberingAfterBreak="0">
     <w:nsid w:val="4A0B4D1E"/>
     <w:multiLevelType w:val="hybridMultilevel"/>
     <w:tmpl w:val="5BAA098A"/>
@@ -9390,7 +11417,233 @@
       </w:rPr>
     </w:lvl>
   </w:abstractNum>
-  <w:abstractNum w:abstractNumId="23" w15:restartNumberingAfterBreak="0">
+  <w:abstractNum w:abstractNumId="28" w15:restartNumberingAfterBreak="0">
+    <w:nsid w:val="4C342B25"/>
+    <w:multiLevelType w:val="hybridMultilevel"/>
+    <w:tmpl w:val="B91CD8D8"/>
+    <w:lvl w:ilvl="0" w:tplc="4009000B">
+      <w:start w:val="1"/>
+      <w:numFmt w:val="bullet"/>
+      <w:lvlText w:val=""/>
+      <w:lvlJc w:val="left"/>
+      <w:pPr>
+        <w:ind w:left="1120" w:hanging="360"/>
+      </w:pPr>
+      <w:rPr>
+        <w:rFonts w:ascii="Wingdings" w:hAnsi="Wingdings" w:hint="default"/>
+      </w:rPr>
+    </w:lvl>
+    <w:lvl w:ilvl="1" w:tplc="40090003" w:tentative="1">
+      <w:start w:val="1"/>
+      <w:numFmt w:val="bullet"/>
+      <w:lvlText w:val="o"/>
+      <w:lvlJc w:val="left"/>
+      <w:pPr>
+        <w:ind w:left="1840" w:hanging="360"/>
+      </w:pPr>
+      <w:rPr>
+        <w:rFonts w:ascii="Courier New" w:hAnsi="Courier New" w:cs="Courier New" w:hint="default"/>
+      </w:rPr>
+    </w:lvl>
+    <w:lvl w:ilvl="2" w:tplc="40090005" w:tentative="1">
+      <w:start w:val="1"/>
+      <w:numFmt w:val="bullet"/>
+      <w:lvlText w:val=""/>
+      <w:lvlJc w:val="left"/>
+      <w:pPr>
+        <w:ind w:left="2560" w:hanging="360"/>
+      </w:pPr>
+      <w:rPr>
+        <w:rFonts w:ascii="Wingdings" w:hAnsi="Wingdings" w:hint="default"/>
+      </w:rPr>
+    </w:lvl>
+    <w:lvl w:ilvl="3" w:tplc="40090001" w:tentative="1">
+      <w:start w:val="1"/>
+      <w:numFmt w:val="bullet"/>
+      <w:lvlText w:val=""/>
+      <w:lvlJc w:val="left"/>
+      <w:pPr>
+        <w:ind w:left="3280" w:hanging="360"/>
+      </w:pPr>
+      <w:rPr>
+        <w:rFonts w:ascii="Symbol" w:hAnsi="Symbol" w:hint="default"/>
+      </w:rPr>
+    </w:lvl>
+    <w:lvl w:ilvl="4" w:tplc="40090003" w:tentative="1">
+      <w:start w:val="1"/>
+      <w:numFmt w:val="bullet"/>
+      <w:lvlText w:val="o"/>
+      <w:lvlJc w:val="left"/>
+      <w:pPr>
+        <w:ind w:left="4000" w:hanging="360"/>
+      </w:pPr>
+      <w:rPr>
+        <w:rFonts w:ascii="Courier New" w:hAnsi="Courier New" w:cs="Courier New" w:hint="default"/>
+      </w:rPr>
+    </w:lvl>
+    <w:lvl w:ilvl="5" w:tplc="40090005" w:tentative="1">
+      <w:start w:val="1"/>
+      <w:numFmt w:val="bullet"/>
+      <w:lvlText w:val=""/>
+      <w:lvlJc w:val="left"/>
+      <w:pPr>
+        <w:ind w:left="4720" w:hanging="360"/>
+      </w:pPr>
+      <w:rPr>
+        <w:rFonts w:ascii="Wingdings" w:hAnsi="Wingdings" w:hint="default"/>
+      </w:rPr>
+    </w:lvl>
+    <w:lvl w:ilvl="6" w:tplc="40090001" w:tentative="1">
+      <w:start w:val="1"/>
+      <w:numFmt w:val="bullet"/>
+      <w:lvlText w:val=""/>
+      <w:lvlJc w:val="left"/>
+      <w:pPr>
+        <w:ind w:left="5440" w:hanging="360"/>
+      </w:pPr>
+      <w:rPr>
+        <w:rFonts w:ascii="Symbol" w:hAnsi="Symbol" w:hint="default"/>
+      </w:rPr>
+    </w:lvl>
+    <w:lvl w:ilvl="7" w:tplc="40090003" w:tentative="1">
+      <w:start w:val="1"/>
+      <w:numFmt w:val="bullet"/>
+      <w:lvlText w:val="o"/>
+      <w:lvlJc w:val="left"/>
+      <w:pPr>
+        <w:ind w:left="6160" w:hanging="360"/>
+      </w:pPr>
+      <w:rPr>
+        <w:rFonts w:ascii="Courier New" w:hAnsi="Courier New" w:cs="Courier New" w:hint="default"/>
+      </w:rPr>
+    </w:lvl>
+    <w:lvl w:ilvl="8" w:tplc="40090005" w:tentative="1">
+      <w:start w:val="1"/>
+      <w:numFmt w:val="bullet"/>
+      <w:lvlText w:val=""/>
+      <w:lvlJc w:val="left"/>
+      <w:pPr>
+        <w:ind w:left="6880" w:hanging="360"/>
+      </w:pPr>
+      <w:rPr>
+        <w:rFonts w:ascii="Wingdings" w:hAnsi="Wingdings" w:hint="default"/>
+      </w:rPr>
+    </w:lvl>
+  </w:abstractNum>
+  <w:abstractNum w:abstractNumId="29" w15:restartNumberingAfterBreak="0">
+    <w:nsid w:val="50E81B93"/>
+    <w:multiLevelType w:val="hybridMultilevel"/>
+    <w:tmpl w:val="FE8AB98C"/>
+    <w:lvl w:ilvl="0" w:tplc="4009000B">
+      <w:start w:val="1"/>
+      <w:numFmt w:val="bullet"/>
+      <w:lvlText w:val=""/>
+      <w:lvlJc w:val="left"/>
+      <w:pPr>
+        <w:ind w:left="1120" w:hanging="360"/>
+      </w:pPr>
+      <w:rPr>
+        <w:rFonts w:ascii="Wingdings" w:hAnsi="Wingdings" w:hint="default"/>
+      </w:rPr>
+    </w:lvl>
+    <w:lvl w:ilvl="1" w:tplc="40090003" w:tentative="1">
+      <w:start w:val="1"/>
+      <w:numFmt w:val="bullet"/>
+      <w:lvlText w:val="o"/>
+      <w:lvlJc w:val="left"/>
+      <w:pPr>
+        <w:ind w:left="1840" w:hanging="360"/>
+      </w:pPr>
+      <w:rPr>
+        <w:rFonts w:ascii="Courier New" w:hAnsi="Courier New" w:cs="Courier New" w:hint="default"/>
+      </w:rPr>
+    </w:lvl>
+    <w:lvl w:ilvl="2" w:tplc="40090005" w:tentative="1">
+      <w:start w:val="1"/>
+      <w:numFmt w:val="bullet"/>
+      <w:lvlText w:val=""/>
+      <w:lvlJc w:val="left"/>
+      <w:pPr>
+        <w:ind w:left="2560" w:hanging="360"/>
+      </w:pPr>
+      <w:rPr>
+        <w:rFonts w:ascii="Wingdings" w:hAnsi="Wingdings" w:hint="default"/>
+      </w:rPr>
+    </w:lvl>
+    <w:lvl w:ilvl="3" w:tplc="40090001" w:tentative="1">
+      <w:start w:val="1"/>
+      <w:numFmt w:val="bullet"/>
+      <w:lvlText w:val=""/>
+      <w:lvlJc w:val="left"/>
+      <w:pPr>
+        <w:ind w:left="3280" w:hanging="360"/>
+      </w:pPr>
+      <w:rPr>
+        <w:rFonts w:ascii="Symbol" w:hAnsi="Symbol" w:hint="default"/>
+      </w:rPr>
+    </w:lvl>
+    <w:lvl w:ilvl="4" w:tplc="40090003" w:tentative="1">
+      <w:start w:val="1"/>
+      <w:numFmt w:val="bullet"/>
+      <w:lvlText w:val="o"/>
+      <w:lvlJc w:val="left"/>
+      <w:pPr>
+        <w:ind w:left="4000" w:hanging="360"/>
+      </w:pPr>
+      <w:rPr>
+        <w:rFonts w:ascii="Courier New" w:hAnsi="Courier New" w:cs="Courier New" w:hint="default"/>
+      </w:rPr>
+    </w:lvl>
+    <w:lvl w:ilvl="5" w:tplc="40090005" w:tentative="1">
+      <w:start w:val="1"/>
+      <w:numFmt w:val="bullet"/>
+      <w:lvlText w:val=""/>
+      <w:lvlJc w:val="left"/>
+      <w:pPr>
+        <w:ind w:left="4720" w:hanging="360"/>
+      </w:pPr>
+      <w:rPr>
+        <w:rFonts w:ascii="Wingdings" w:hAnsi="Wingdings" w:hint="default"/>
+      </w:rPr>
+    </w:lvl>
+    <w:lvl w:ilvl="6" w:tplc="40090001" w:tentative="1">
+      <w:start w:val="1"/>
+      <w:numFmt w:val="bullet"/>
+      <w:lvlText w:val=""/>
+      <w:lvlJc w:val="left"/>
+      <w:pPr>
+        <w:ind w:left="5440" w:hanging="360"/>
+      </w:pPr>
+      <w:rPr>
+        <w:rFonts w:ascii="Symbol" w:hAnsi="Symbol" w:hint="default"/>
+      </w:rPr>
+    </w:lvl>
+    <w:lvl w:ilvl="7" w:tplc="40090003" w:tentative="1">
+      <w:start w:val="1"/>
+      <w:numFmt w:val="bullet"/>
+      <w:lvlText w:val="o"/>
+      <w:lvlJc w:val="left"/>
+      <w:pPr>
+        <w:ind w:left="6160" w:hanging="360"/>
+      </w:pPr>
+      <w:rPr>
+        <w:rFonts w:ascii="Courier New" w:hAnsi="Courier New" w:cs="Courier New" w:hint="default"/>
+      </w:rPr>
+    </w:lvl>
+    <w:lvl w:ilvl="8" w:tplc="40090005" w:tentative="1">
+      <w:start w:val="1"/>
+      <w:numFmt w:val="bullet"/>
+      <w:lvlText w:val=""/>
+      <w:lvlJc w:val="left"/>
+      <w:pPr>
+        <w:ind w:left="6880" w:hanging="360"/>
+      </w:pPr>
+      <w:rPr>
+        <w:rFonts w:ascii="Wingdings" w:hAnsi="Wingdings" w:hint="default"/>
+      </w:rPr>
+    </w:lvl>
+  </w:abstractNum>
+  <w:abstractNum w:abstractNumId="30" w15:restartNumberingAfterBreak="0">
     <w:nsid w:val="52E2024D"/>
     <w:multiLevelType w:val="hybridMultilevel"/>
     <w:tmpl w:val="DABA967C"/>
@@ -9503,7 +11756,7 @@
       </w:rPr>
     </w:lvl>
   </w:abstractNum>
-  <w:abstractNum w:abstractNumId="24" w15:restartNumberingAfterBreak="0">
+  <w:abstractNum w:abstractNumId="31" w15:restartNumberingAfterBreak="0">
     <w:nsid w:val="54BF6151"/>
     <w:multiLevelType w:val="hybridMultilevel"/>
     <w:tmpl w:val="F4D635F4"/>
@@ -9612,7 +11865,7 @@
       </w:pPr>
     </w:lvl>
   </w:abstractNum>
-  <w:abstractNum w:abstractNumId="25" w15:restartNumberingAfterBreak="0">
+  <w:abstractNum w:abstractNumId="32" w15:restartNumberingAfterBreak="0">
     <w:nsid w:val="5BE47E43"/>
     <w:multiLevelType w:val="hybridMultilevel"/>
     <w:tmpl w:val="EF3EAED2"/>
@@ -9725,7 +11978,7 @@
       </w:rPr>
     </w:lvl>
   </w:abstractNum>
-  <w:abstractNum w:abstractNumId="26" w15:restartNumberingAfterBreak="0">
+  <w:abstractNum w:abstractNumId="33" w15:restartNumberingAfterBreak="0">
     <w:nsid w:val="5C0D2947"/>
     <w:multiLevelType w:val="hybridMultilevel"/>
     <w:tmpl w:val="8CAAD732"/>
@@ -9838,7 +12091,7 @@
       </w:rPr>
     </w:lvl>
   </w:abstractNum>
-  <w:abstractNum w:abstractNumId="27" w15:restartNumberingAfterBreak="0">
+  <w:abstractNum w:abstractNumId="34" w15:restartNumberingAfterBreak="0">
     <w:nsid w:val="5D4D2BDD"/>
     <w:multiLevelType w:val="hybridMultilevel"/>
     <w:tmpl w:val="14A8EAC6"/>
@@ -9951,7 +12204,120 @@
       </w:rPr>
     </w:lvl>
   </w:abstractNum>
-  <w:abstractNum w:abstractNumId="28" w15:restartNumberingAfterBreak="0">
+  <w:abstractNum w:abstractNumId="35" w15:restartNumberingAfterBreak="0">
+    <w:nsid w:val="61E56073"/>
+    <w:multiLevelType w:val="hybridMultilevel"/>
+    <w:tmpl w:val="B394BB44"/>
+    <w:lvl w:ilvl="0" w:tplc="4009000B">
+      <w:start w:val="1"/>
+      <w:numFmt w:val="bullet"/>
+      <w:lvlText w:val=""/>
+      <w:lvlJc w:val="left"/>
+      <w:pPr>
+        <w:ind w:left="1120" w:hanging="360"/>
+      </w:pPr>
+      <w:rPr>
+        <w:rFonts w:ascii="Wingdings" w:hAnsi="Wingdings" w:hint="default"/>
+      </w:rPr>
+    </w:lvl>
+    <w:lvl w:ilvl="1" w:tplc="40090003" w:tentative="1">
+      <w:start w:val="1"/>
+      <w:numFmt w:val="bullet"/>
+      <w:lvlText w:val="o"/>
+      <w:lvlJc w:val="left"/>
+      <w:pPr>
+        <w:ind w:left="1840" w:hanging="360"/>
+      </w:pPr>
+      <w:rPr>
+        <w:rFonts w:ascii="Courier New" w:hAnsi="Courier New" w:cs="Courier New" w:hint="default"/>
+      </w:rPr>
+    </w:lvl>
+    <w:lvl w:ilvl="2" w:tplc="40090005" w:tentative="1">
+      <w:start w:val="1"/>
+      <w:numFmt w:val="bullet"/>
+      <w:lvlText w:val=""/>
+      <w:lvlJc w:val="left"/>
+      <w:pPr>
+        <w:ind w:left="2560" w:hanging="360"/>
+      </w:pPr>
+      <w:rPr>
+        <w:rFonts w:ascii="Wingdings" w:hAnsi="Wingdings" w:hint="default"/>
+      </w:rPr>
+    </w:lvl>
+    <w:lvl w:ilvl="3" w:tplc="40090001" w:tentative="1">
+      <w:start w:val="1"/>
+      <w:numFmt w:val="bullet"/>
+      <w:lvlText w:val=""/>
+      <w:lvlJc w:val="left"/>
+      <w:pPr>
+        <w:ind w:left="3280" w:hanging="360"/>
+      </w:pPr>
+      <w:rPr>
+        <w:rFonts w:ascii="Symbol" w:hAnsi="Symbol" w:hint="default"/>
+      </w:rPr>
+    </w:lvl>
+    <w:lvl w:ilvl="4" w:tplc="40090003" w:tentative="1">
+      <w:start w:val="1"/>
+      <w:numFmt w:val="bullet"/>
+      <w:lvlText w:val="o"/>
+      <w:lvlJc w:val="left"/>
+      <w:pPr>
+        <w:ind w:left="4000" w:hanging="360"/>
+      </w:pPr>
+      <w:rPr>
+        <w:rFonts w:ascii="Courier New" w:hAnsi="Courier New" w:cs="Courier New" w:hint="default"/>
+      </w:rPr>
+    </w:lvl>
+    <w:lvl w:ilvl="5" w:tplc="40090005" w:tentative="1">
+      <w:start w:val="1"/>
+      <w:numFmt w:val="bullet"/>
+      <w:lvlText w:val=""/>
+      <w:lvlJc w:val="left"/>
+      <w:pPr>
+        <w:ind w:left="4720" w:hanging="360"/>
+      </w:pPr>
+      <w:rPr>
+        <w:rFonts w:ascii="Wingdings" w:hAnsi="Wingdings" w:hint="default"/>
+      </w:rPr>
+    </w:lvl>
+    <w:lvl w:ilvl="6" w:tplc="40090001" w:tentative="1">
+      <w:start w:val="1"/>
+      <w:numFmt w:val="bullet"/>
+      <w:lvlText w:val=""/>
+      <w:lvlJc w:val="left"/>
+      <w:pPr>
+        <w:ind w:left="5440" w:hanging="360"/>
+      </w:pPr>
+      <w:rPr>
+        <w:rFonts w:ascii="Symbol" w:hAnsi="Symbol" w:hint="default"/>
+      </w:rPr>
+    </w:lvl>
+    <w:lvl w:ilvl="7" w:tplc="40090003" w:tentative="1">
+      <w:start w:val="1"/>
+      <w:numFmt w:val="bullet"/>
+      <w:lvlText w:val="o"/>
+      <w:lvlJc w:val="left"/>
+      <w:pPr>
+        <w:ind w:left="6160" w:hanging="360"/>
+      </w:pPr>
+      <w:rPr>
+        <w:rFonts w:ascii="Courier New" w:hAnsi="Courier New" w:cs="Courier New" w:hint="default"/>
+      </w:rPr>
+    </w:lvl>
+    <w:lvl w:ilvl="8" w:tplc="40090005" w:tentative="1">
+      <w:start w:val="1"/>
+      <w:numFmt w:val="bullet"/>
+      <w:lvlText w:val=""/>
+      <w:lvlJc w:val="left"/>
+      <w:pPr>
+        <w:ind w:left="6880" w:hanging="360"/>
+      </w:pPr>
+      <w:rPr>
+        <w:rFonts w:ascii="Wingdings" w:hAnsi="Wingdings" w:hint="default"/>
+      </w:rPr>
+    </w:lvl>
+  </w:abstractNum>
+  <w:abstractNum w:abstractNumId="36" w15:restartNumberingAfterBreak="0">
     <w:nsid w:val="6C1238A2"/>
     <w:multiLevelType w:val="hybridMultilevel"/>
     <w:tmpl w:val="C16E1150"/>
@@ -10064,7 +12430,93 @@
       </w:rPr>
     </w:lvl>
   </w:abstractNum>
-  <w:abstractNum w:abstractNumId="29" w15:restartNumberingAfterBreak="0">
+  <w:abstractNum w:abstractNumId="37" w15:restartNumberingAfterBreak="0">
+    <w:nsid w:val="6E5F7AAF"/>
+    <w:multiLevelType w:val="hybridMultilevel"/>
+    <w:tmpl w:val="BF92D5CC"/>
+    <w:lvl w:ilvl="0" w:tplc="4009000F">
+      <w:start w:val="1"/>
+      <w:numFmt w:val="decimal"/>
+      <w:lvlText w:val="%1."/>
+      <w:lvlJc w:val="left"/>
+      <w:pPr>
+        <w:ind w:left="720" w:hanging="360"/>
+      </w:pPr>
+    </w:lvl>
+    <w:lvl w:ilvl="1" w:tplc="40090019" w:tentative="1">
+      <w:start w:val="1"/>
+      <w:numFmt w:val="lowerLetter"/>
+      <w:lvlText w:val="%2."/>
+      <w:lvlJc w:val="left"/>
+      <w:pPr>
+        <w:ind w:left="1440" w:hanging="360"/>
+      </w:pPr>
+    </w:lvl>
+    <w:lvl w:ilvl="2" w:tplc="4009001B" w:tentative="1">
+      <w:start w:val="1"/>
+      <w:numFmt w:val="lowerRoman"/>
+      <w:lvlText w:val="%3."/>
+      <w:lvlJc w:val="right"/>
+      <w:pPr>
+        <w:ind w:left="2160" w:hanging="180"/>
+      </w:pPr>
+    </w:lvl>
+    <w:lvl w:ilvl="3" w:tplc="4009000F" w:tentative="1">
+      <w:start w:val="1"/>
+      <w:numFmt w:val="decimal"/>
+      <w:lvlText w:val="%4."/>
+      <w:lvlJc w:val="left"/>
+      <w:pPr>
+        <w:ind w:left="2880" w:hanging="360"/>
+      </w:pPr>
+    </w:lvl>
+    <w:lvl w:ilvl="4" w:tplc="40090019" w:tentative="1">
+      <w:start w:val="1"/>
+      <w:numFmt w:val="lowerLetter"/>
+      <w:lvlText w:val="%5."/>
+      <w:lvlJc w:val="left"/>
+      <w:pPr>
+        <w:ind w:left="3600" w:hanging="360"/>
+      </w:pPr>
+    </w:lvl>
+    <w:lvl w:ilvl="5" w:tplc="4009001B" w:tentative="1">
+      <w:start w:val="1"/>
+      <w:numFmt w:val="lowerRoman"/>
+      <w:lvlText w:val="%6."/>
+      <w:lvlJc w:val="right"/>
+      <w:pPr>
+        <w:ind w:left="4320" w:hanging="180"/>
+      </w:pPr>
+    </w:lvl>
+    <w:lvl w:ilvl="6" w:tplc="4009000F" w:tentative="1">
+      <w:start w:val="1"/>
+      <w:numFmt w:val="decimal"/>
+      <w:lvlText w:val="%7."/>
+      <w:lvlJc w:val="left"/>
+      <w:pPr>
+        <w:ind w:left="5040" w:hanging="360"/>
+      </w:pPr>
+    </w:lvl>
+    <w:lvl w:ilvl="7" w:tplc="40090019" w:tentative="1">
+      <w:start w:val="1"/>
+      <w:numFmt w:val="lowerLetter"/>
+      <w:lvlText w:val="%8."/>
+      <w:lvlJc w:val="left"/>
+      <w:pPr>
+        <w:ind w:left="5760" w:hanging="360"/>
+      </w:pPr>
+    </w:lvl>
+    <w:lvl w:ilvl="8" w:tplc="4009001B" w:tentative="1">
+      <w:start w:val="1"/>
+      <w:numFmt w:val="lowerRoman"/>
+      <w:lvlText w:val="%9."/>
+      <w:lvlJc w:val="right"/>
+      <w:pPr>
+        <w:ind w:left="6480" w:hanging="180"/>
+      </w:pPr>
+    </w:lvl>
+  </w:abstractNum>
+  <w:abstractNum w:abstractNumId="38" w15:restartNumberingAfterBreak="0">
     <w:nsid w:val="6EFF7CF0"/>
     <w:multiLevelType w:val="hybridMultilevel"/>
     <w:tmpl w:val="8D48AE6A"/>
@@ -10177,7 +12629,7 @@
       </w:rPr>
     </w:lvl>
   </w:abstractNum>
-  <w:abstractNum w:abstractNumId="30" w15:restartNumberingAfterBreak="0">
+  <w:abstractNum w:abstractNumId="39" w15:restartNumberingAfterBreak="0">
     <w:nsid w:val="785F26EB"/>
     <w:multiLevelType w:val="hybridMultilevel"/>
     <w:tmpl w:val="519AFBF0"/>
@@ -10290,7 +12742,7 @@
       </w:rPr>
     </w:lvl>
   </w:abstractNum>
-  <w:abstractNum w:abstractNumId="31" w15:restartNumberingAfterBreak="0">
+  <w:abstractNum w:abstractNumId="40" w15:restartNumberingAfterBreak="0">
     <w:nsid w:val="78D4407D"/>
     <w:multiLevelType w:val="hybridMultilevel"/>
     <w:tmpl w:val="9C6A39B8"/>
@@ -10403,101 +12855,476 @@
       </w:rPr>
     </w:lvl>
   </w:abstractNum>
+  <w:abstractNum w:abstractNumId="41" w15:restartNumberingAfterBreak="0">
+    <w:nsid w:val="78FF1992"/>
+    <w:multiLevelType w:val="hybridMultilevel"/>
+    <w:tmpl w:val="3E304C16"/>
+    <w:lvl w:ilvl="0" w:tplc="4009000B">
+      <w:start w:val="1"/>
+      <w:numFmt w:val="bullet"/>
+      <w:lvlText w:val=""/>
+      <w:lvlJc w:val="left"/>
+      <w:pPr>
+        <w:ind w:left="1120" w:hanging="360"/>
+      </w:pPr>
+      <w:rPr>
+        <w:rFonts w:ascii="Wingdings" w:hAnsi="Wingdings" w:hint="default"/>
+      </w:rPr>
+    </w:lvl>
+    <w:lvl w:ilvl="1" w:tplc="40090003" w:tentative="1">
+      <w:start w:val="1"/>
+      <w:numFmt w:val="bullet"/>
+      <w:lvlText w:val="o"/>
+      <w:lvlJc w:val="left"/>
+      <w:pPr>
+        <w:ind w:left="1840" w:hanging="360"/>
+      </w:pPr>
+      <w:rPr>
+        <w:rFonts w:ascii="Courier New" w:hAnsi="Courier New" w:cs="Courier New" w:hint="default"/>
+      </w:rPr>
+    </w:lvl>
+    <w:lvl w:ilvl="2" w:tplc="40090005" w:tentative="1">
+      <w:start w:val="1"/>
+      <w:numFmt w:val="bullet"/>
+      <w:lvlText w:val=""/>
+      <w:lvlJc w:val="left"/>
+      <w:pPr>
+        <w:ind w:left="2560" w:hanging="360"/>
+      </w:pPr>
+      <w:rPr>
+        <w:rFonts w:ascii="Wingdings" w:hAnsi="Wingdings" w:hint="default"/>
+      </w:rPr>
+    </w:lvl>
+    <w:lvl w:ilvl="3" w:tplc="40090001" w:tentative="1">
+      <w:start w:val="1"/>
+      <w:numFmt w:val="bullet"/>
+      <w:lvlText w:val=""/>
+      <w:lvlJc w:val="left"/>
+      <w:pPr>
+        <w:ind w:left="3280" w:hanging="360"/>
+      </w:pPr>
+      <w:rPr>
+        <w:rFonts w:ascii="Symbol" w:hAnsi="Symbol" w:hint="default"/>
+      </w:rPr>
+    </w:lvl>
+    <w:lvl w:ilvl="4" w:tplc="40090003" w:tentative="1">
+      <w:start w:val="1"/>
+      <w:numFmt w:val="bullet"/>
+      <w:lvlText w:val="o"/>
+      <w:lvlJc w:val="left"/>
+      <w:pPr>
+        <w:ind w:left="4000" w:hanging="360"/>
+      </w:pPr>
+      <w:rPr>
+        <w:rFonts w:ascii="Courier New" w:hAnsi="Courier New" w:cs="Courier New" w:hint="default"/>
+      </w:rPr>
+    </w:lvl>
+    <w:lvl w:ilvl="5" w:tplc="40090005" w:tentative="1">
+      <w:start w:val="1"/>
+      <w:numFmt w:val="bullet"/>
+      <w:lvlText w:val=""/>
+      <w:lvlJc w:val="left"/>
+      <w:pPr>
+        <w:ind w:left="4720" w:hanging="360"/>
+      </w:pPr>
+      <w:rPr>
+        <w:rFonts w:ascii="Wingdings" w:hAnsi="Wingdings" w:hint="default"/>
+      </w:rPr>
+    </w:lvl>
+    <w:lvl w:ilvl="6" w:tplc="40090001" w:tentative="1">
+      <w:start w:val="1"/>
+      <w:numFmt w:val="bullet"/>
+      <w:lvlText w:val=""/>
+      <w:lvlJc w:val="left"/>
+      <w:pPr>
+        <w:ind w:left="5440" w:hanging="360"/>
+      </w:pPr>
+      <w:rPr>
+        <w:rFonts w:ascii="Symbol" w:hAnsi="Symbol" w:hint="default"/>
+      </w:rPr>
+    </w:lvl>
+    <w:lvl w:ilvl="7" w:tplc="40090003" w:tentative="1">
+      <w:start w:val="1"/>
+      <w:numFmt w:val="bullet"/>
+      <w:lvlText w:val="o"/>
+      <w:lvlJc w:val="left"/>
+      <w:pPr>
+        <w:ind w:left="6160" w:hanging="360"/>
+      </w:pPr>
+      <w:rPr>
+        <w:rFonts w:ascii="Courier New" w:hAnsi="Courier New" w:cs="Courier New" w:hint="default"/>
+      </w:rPr>
+    </w:lvl>
+    <w:lvl w:ilvl="8" w:tplc="40090005" w:tentative="1">
+      <w:start w:val="1"/>
+      <w:numFmt w:val="bullet"/>
+      <w:lvlText w:val=""/>
+      <w:lvlJc w:val="left"/>
+      <w:pPr>
+        <w:ind w:left="6880" w:hanging="360"/>
+      </w:pPr>
+      <w:rPr>
+        <w:rFonts w:ascii="Wingdings" w:hAnsi="Wingdings" w:hint="default"/>
+      </w:rPr>
+    </w:lvl>
+  </w:abstractNum>
+  <w:abstractNum w:abstractNumId="42" w15:restartNumberingAfterBreak="0">
+    <w:nsid w:val="7A9E48D1"/>
+    <w:multiLevelType w:val="hybridMultilevel"/>
+    <w:tmpl w:val="7C2C2C78"/>
+    <w:lvl w:ilvl="0" w:tplc="4009000B">
+      <w:start w:val="1"/>
+      <w:numFmt w:val="bullet"/>
+      <w:lvlText w:val=""/>
+      <w:lvlJc w:val="left"/>
+      <w:pPr>
+        <w:ind w:left="1120" w:hanging="360"/>
+      </w:pPr>
+      <w:rPr>
+        <w:rFonts w:ascii="Wingdings" w:hAnsi="Wingdings" w:hint="default"/>
+      </w:rPr>
+    </w:lvl>
+    <w:lvl w:ilvl="1" w:tplc="40090003" w:tentative="1">
+      <w:start w:val="1"/>
+      <w:numFmt w:val="bullet"/>
+      <w:lvlText w:val="o"/>
+      <w:lvlJc w:val="left"/>
+      <w:pPr>
+        <w:ind w:left="1840" w:hanging="360"/>
+      </w:pPr>
+      <w:rPr>
+        <w:rFonts w:ascii="Courier New" w:hAnsi="Courier New" w:cs="Courier New" w:hint="default"/>
+      </w:rPr>
+    </w:lvl>
+    <w:lvl w:ilvl="2" w:tplc="40090005" w:tentative="1">
+      <w:start w:val="1"/>
+      <w:numFmt w:val="bullet"/>
+      <w:lvlText w:val=""/>
+      <w:lvlJc w:val="left"/>
+      <w:pPr>
+        <w:ind w:left="2560" w:hanging="360"/>
+      </w:pPr>
+      <w:rPr>
+        <w:rFonts w:ascii="Wingdings" w:hAnsi="Wingdings" w:hint="default"/>
+      </w:rPr>
+    </w:lvl>
+    <w:lvl w:ilvl="3" w:tplc="40090001" w:tentative="1">
+      <w:start w:val="1"/>
+      <w:numFmt w:val="bullet"/>
+      <w:lvlText w:val=""/>
+      <w:lvlJc w:val="left"/>
+      <w:pPr>
+        <w:ind w:left="3280" w:hanging="360"/>
+      </w:pPr>
+      <w:rPr>
+        <w:rFonts w:ascii="Symbol" w:hAnsi="Symbol" w:hint="default"/>
+      </w:rPr>
+    </w:lvl>
+    <w:lvl w:ilvl="4" w:tplc="40090003" w:tentative="1">
+      <w:start w:val="1"/>
+      <w:numFmt w:val="bullet"/>
+      <w:lvlText w:val="o"/>
+      <w:lvlJc w:val="left"/>
+      <w:pPr>
+        <w:ind w:left="4000" w:hanging="360"/>
+      </w:pPr>
+      <w:rPr>
+        <w:rFonts w:ascii="Courier New" w:hAnsi="Courier New" w:cs="Courier New" w:hint="default"/>
+      </w:rPr>
+    </w:lvl>
+    <w:lvl w:ilvl="5" w:tplc="40090005" w:tentative="1">
+      <w:start w:val="1"/>
+      <w:numFmt w:val="bullet"/>
+      <w:lvlText w:val=""/>
+      <w:lvlJc w:val="left"/>
+      <w:pPr>
+        <w:ind w:left="4720" w:hanging="360"/>
+      </w:pPr>
+      <w:rPr>
+        <w:rFonts w:ascii="Wingdings" w:hAnsi="Wingdings" w:hint="default"/>
+      </w:rPr>
+    </w:lvl>
+    <w:lvl w:ilvl="6" w:tplc="40090001" w:tentative="1">
+      <w:start w:val="1"/>
+      <w:numFmt w:val="bullet"/>
+      <w:lvlText w:val=""/>
+      <w:lvlJc w:val="left"/>
+      <w:pPr>
+        <w:ind w:left="5440" w:hanging="360"/>
+      </w:pPr>
+      <w:rPr>
+        <w:rFonts w:ascii="Symbol" w:hAnsi="Symbol" w:hint="default"/>
+      </w:rPr>
+    </w:lvl>
+    <w:lvl w:ilvl="7" w:tplc="40090003" w:tentative="1">
+      <w:start w:val="1"/>
+      <w:numFmt w:val="bullet"/>
+      <w:lvlText w:val="o"/>
+      <w:lvlJc w:val="left"/>
+      <w:pPr>
+        <w:ind w:left="6160" w:hanging="360"/>
+      </w:pPr>
+      <w:rPr>
+        <w:rFonts w:ascii="Courier New" w:hAnsi="Courier New" w:cs="Courier New" w:hint="default"/>
+      </w:rPr>
+    </w:lvl>
+    <w:lvl w:ilvl="8" w:tplc="40090005" w:tentative="1">
+      <w:start w:val="1"/>
+      <w:numFmt w:val="bullet"/>
+      <w:lvlText w:val=""/>
+      <w:lvlJc w:val="left"/>
+      <w:pPr>
+        <w:ind w:left="6880" w:hanging="360"/>
+      </w:pPr>
+      <w:rPr>
+        <w:rFonts w:ascii="Wingdings" w:hAnsi="Wingdings" w:hint="default"/>
+      </w:rPr>
+    </w:lvl>
+  </w:abstractNum>
+  <w:abstractNum w:abstractNumId="43" w15:restartNumberingAfterBreak="0">
+    <w:nsid w:val="7E1711BB"/>
+    <w:multiLevelType w:val="hybridMultilevel"/>
+    <w:tmpl w:val="EBD83B5A"/>
+    <w:lvl w:ilvl="0" w:tplc="4009000B">
+      <w:start w:val="1"/>
+      <w:numFmt w:val="bullet"/>
+      <w:lvlText w:val=""/>
+      <w:lvlJc w:val="left"/>
+      <w:pPr>
+        <w:ind w:left="1120" w:hanging="360"/>
+      </w:pPr>
+      <w:rPr>
+        <w:rFonts w:ascii="Wingdings" w:hAnsi="Wingdings" w:hint="default"/>
+      </w:rPr>
+    </w:lvl>
+    <w:lvl w:ilvl="1" w:tplc="40090003" w:tentative="1">
+      <w:start w:val="1"/>
+      <w:numFmt w:val="bullet"/>
+      <w:lvlText w:val="o"/>
+      <w:lvlJc w:val="left"/>
+      <w:pPr>
+        <w:ind w:left="1840" w:hanging="360"/>
+      </w:pPr>
+      <w:rPr>
+        <w:rFonts w:ascii="Courier New" w:hAnsi="Courier New" w:cs="Courier New" w:hint="default"/>
+      </w:rPr>
+    </w:lvl>
+    <w:lvl w:ilvl="2" w:tplc="40090005" w:tentative="1">
+      <w:start w:val="1"/>
+      <w:numFmt w:val="bullet"/>
+      <w:lvlText w:val=""/>
+      <w:lvlJc w:val="left"/>
+      <w:pPr>
+        <w:ind w:left="2560" w:hanging="360"/>
+      </w:pPr>
+      <w:rPr>
+        <w:rFonts w:ascii="Wingdings" w:hAnsi="Wingdings" w:hint="default"/>
+      </w:rPr>
+    </w:lvl>
+    <w:lvl w:ilvl="3" w:tplc="40090001" w:tentative="1">
+      <w:start w:val="1"/>
+      <w:numFmt w:val="bullet"/>
+      <w:lvlText w:val=""/>
+      <w:lvlJc w:val="left"/>
+      <w:pPr>
+        <w:ind w:left="3280" w:hanging="360"/>
+      </w:pPr>
+      <w:rPr>
+        <w:rFonts w:ascii="Symbol" w:hAnsi="Symbol" w:hint="default"/>
+      </w:rPr>
+    </w:lvl>
+    <w:lvl w:ilvl="4" w:tplc="40090003" w:tentative="1">
+      <w:start w:val="1"/>
+      <w:numFmt w:val="bullet"/>
+      <w:lvlText w:val="o"/>
+      <w:lvlJc w:val="left"/>
+      <w:pPr>
+        <w:ind w:left="4000" w:hanging="360"/>
+      </w:pPr>
+      <w:rPr>
+        <w:rFonts w:ascii="Courier New" w:hAnsi="Courier New" w:cs="Courier New" w:hint="default"/>
+      </w:rPr>
+    </w:lvl>
+    <w:lvl w:ilvl="5" w:tplc="40090005" w:tentative="1">
+      <w:start w:val="1"/>
+      <w:numFmt w:val="bullet"/>
+      <w:lvlText w:val=""/>
+      <w:lvlJc w:val="left"/>
+      <w:pPr>
+        <w:ind w:left="4720" w:hanging="360"/>
+      </w:pPr>
+      <w:rPr>
+        <w:rFonts w:ascii="Wingdings" w:hAnsi="Wingdings" w:hint="default"/>
+      </w:rPr>
+    </w:lvl>
+    <w:lvl w:ilvl="6" w:tplc="40090001" w:tentative="1">
+      <w:start w:val="1"/>
+      <w:numFmt w:val="bullet"/>
+      <w:lvlText w:val=""/>
+      <w:lvlJc w:val="left"/>
+      <w:pPr>
+        <w:ind w:left="5440" w:hanging="360"/>
+      </w:pPr>
+      <w:rPr>
+        <w:rFonts w:ascii="Symbol" w:hAnsi="Symbol" w:hint="default"/>
+      </w:rPr>
+    </w:lvl>
+    <w:lvl w:ilvl="7" w:tplc="40090003" w:tentative="1">
+      <w:start w:val="1"/>
+      <w:numFmt w:val="bullet"/>
+      <w:lvlText w:val="o"/>
+      <w:lvlJc w:val="left"/>
+      <w:pPr>
+        <w:ind w:left="6160" w:hanging="360"/>
+      </w:pPr>
+      <w:rPr>
+        <w:rFonts w:ascii="Courier New" w:hAnsi="Courier New" w:cs="Courier New" w:hint="default"/>
+      </w:rPr>
+    </w:lvl>
+    <w:lvl w:ilvl="8" w:tplc="40090005" w:tentative="1">
+      <w:start w:val="1"/>
+      <w:numFmt w:val="bullet"/>
+      <w:lvlText w:val=""/>
+      <w:lvlJc w:val="left"/>
+      <w:pPr>
+        <w:ind w:left="6880" w:hanging="360"/>
+      </w:pPr>
+      <w:rPr>
+        <w:rFonts w:ascii="Wingdings" w:hAnsi="Wingdings" w:hint="default"/>
+      </w:rPr>
+    </w:lvl>
+  </w:abstractNum>
   <w:num w:numId="1" w16cid:durableId="234126080">
+    <w:abstractNumId w:val="31"/>
+  </w:num>
+  <w:num w:numId="2" w16cid:durableId="1827168422">
+    <w:abstractNumId w:val="8"/>
+  </w:num>
+  <w:num w:numId="3" w16cid:durableId="703215078">
+    <w:abstractNumId w:val="17"/>
+  </w:num>
+  <w:num w:numId="4" w16cid:durableId="645551749">
+    <w:abstractNumId w:val="1"/>
+  </w:num>
+  <w:num w:numId="5" w16cid:durableId="984048638">
+    <w:abstractNumId w:val="4"/>
+  </w:num>
+  <w:num w:numId="6" w16cid:durableId="2053652926">
+    <w:abstractNumId w:val="25"/>
+  </w:num>
+  <w:num w:numId="7" w16cid:durableId="1828979683">
+    <w:abstractNumId w:val="22"/>
+  </w:num>
+  <w:num w:numId="8" w16cid:durableId="120808992">
+    <w:abstractNumId w:val="11"/>
+  </w:num>
+  <w:num w:numId="9" w16cid:durableId="1196692114">
+    <w:abstractNumId w:val="10"/>
+  </w:num>
+  <w:num w:numId="10" w16cid:durableId="446656441">
+    <w:abstractNumId w:val="33"/>
+  </w:num>
+  <w:num w:numId="11" w16cid:durableId="663431927">
+    <w:abstractNumId w:val="39"/>
+  </w:num>
+  <w:num w:numId="12" w16cid:durableId="1099373786">
+    <w:abstractNumId w:val="2"/>
+  </w:num>
+  <w:num w:numId="13" w16cid:durableId="1124467095">
+    <w:abstractNumId w:val="13"/>
+  </w:num>
+  <w:num w:numId="14" w16cid:durableId="287900318">
+    <w:abstractNumId w:val="3"/>
+  </w:num>
+  <w:num w:numId="15" w16cid:durableId="2022782090">
+    <w:abstractNumId w:val="27"/>
+  </w:num>
+  <w:num w:numId="16" w16cid:durableId="1513762770">
+    <w:abstractNumId w:val="21"/>
+  </w:num>
+  <w:num w:numId="17" w16cid:durableId="1851211161">
+    <w:abstractNumId w:val="26"/>
+  </w:num>
+  <w:num w:numId="18" w16cid:durableId="698819531">
+    <w:abstractNumId w:val="34"/>
+  </w:num>
+  <w:num w:numId="19" w16cid:durableId="1527332008">
+    <w:abstractNumId w:val="23"/>
+  </w:num>
+  <w:num w:numId="20" w16cid:durableId="1770158062">
+    <w:abstractNumId w:val="15"/>
+  </w:num>
+  <w:num w:numId="21" w16cid:durableId="839471443">
+    <w:abstractNumId w:val="6"/>
+  </w:num>
+  <w:num w:numId="22" w16cid:durableId="1625767979">
+    <w:abstractNumId w:val="40"/>
+  </w:num>
+  <w:num w:numId="23" w16cid:durableId="712922381">
+    <w:abstractNumId w:val="7"/>
+  </w:num>
+  <w:num w:numId="24" w16cid:durableId="1509248443">
+    <w:abstractNumId w:val="18"/>
+  </w:num>
+  <w:num w:numId="25" w16cid:durableId="1388600950">
+    <w:abstractNumId w:val="5"/>
+  </w:num>
+  <w:num w:numId="26" w16cid:durableId="63383461">
+    <w:abstractNumId w:val="12"/>
+  </w:num>
+  <w:num w:numId="27" w16cid:durableId="1959605983">
+    <w:abstractNumId w:val="19"/>
+  </w:num>
+  <w:num w:numId="28" w16cid:durableId="1251352226">
+    <w:abstractNumId w:val="30"/>
+  </w:num>
+  <w:num w:numId="29" w16cid:durableId="1579706643">
+    <w:abstractNumId w:val="32"/>
+  </w:num>
+  <w:num w:numId="30" w16cid:durableId="616908098">
+    <w:abstractNumId w:val="20"/>
+  </w:num>
+  <w:num w:numId="31" w16cid:durableId="1590456493">
+    <w:abstractNumId w:val="38"/>
+  </w:num>
+  <w:num w:numId="32" w16cid:durableId="1853490051">
+    <w:abstractNumId w:val="36"/>
+  </w:num>
+  <w:num w:numId="33" w16cid:durableId="489753068">
     <w:abstractNumId w:val="24"/>
   </w:num>
-  <w:num w:numId="2" w16cid:durableId="1827168422">
-    <w:abstractNumId w:val="7"/>
+  <w:num w:numId="34" w16cid:durableId="470750842">
+    <w:abstractNumId w:val="43"/>
   </w:num>
-  <w:num w:numId="3" w16cid:durableId="703215078">
-    <w:abstractNumId w:val="13"/>
+  <w:num w:numId="35" w16cid:durableId="1286622340">
+    <w:abstractNumId w:val="16"/>
   </w:num>
-  <w:num w:numId="4" w16cid:durableId="645551749">
+  <w:num w:numId="36" w16cid:durableId="675691640">
+    <w:abstractNumId w:val="9"/>
+  </w:num>
+  <w:num w:numId="37" w16cid:durableId="942416099">
+    <w:abstractNumId w:val="28"/>
+  </w:num>
+  <w:num w:numId="38" w16cid:durableId="354500318">
+    <w:abstractNumId w:val="42"/>
+  </w:num>
+  <w:num w:numId="39" w16cid:durableId="555707672">
+    <w:abstractNumId w:val="41"/>
+  </w:num>
+  <w:num w:numId="40" w16cid:durableId="1227456296">
     <w:abstractNumId w:val="0"/>
   </w:num>
-  <w:num w:numId="5" w16cid:durableId="984048638">
-    <w:abstractNumId w:val="3"/>
-  </w:num>
-  <w:num w:numId="6" w16cid:durableId="2053652926">
-    <w:abstractNumId w:val="20"/>
-  </w:num>
-  <w:num w:numId="7" w16cid:durableId="1828979683">
-    <w:abstractNumId w:val="18"/>
-  </w:num>
-  <w:num w:numId="8" w16cid:durableId="120808992">
-    <w:abstractNumId w:val="9"/>
-  </w:num>
-  <w:num w:numId="9" w16cid:durableId="1196692114">
-    <w:abstractNumId w:val="8"/>
-  </w:num>
-  <w:num w:numId="10" w16cid:durableId="446656441">
-    <w:abstractNumId w:val="26"/>
-  </w:num>
-  <w:num w:numId="11" w16cid:durableId="663431927">
-    <w:abstractNumId w:val="30"/>
-  </w:num>
-  <w:num w:numId="12" w16cid:durableId="1099373786">
-    <w:abstractNumId w:val="1"/>
-  </w:num>
-  <w:num w:numId="13" w16cid:durableId="1124467095">
-    <w:abstractNumId w:val="11"/>
-  </w:num>
-  <w:num w:numId="14" w16cid:durableId="287900318">
-    <w:abstractNumId w:val="2"/>
-  </w:num>
-  <w:num w:numId="15" w16cid:durableId="2022782090">
-    <w:abstractNumId w:val="22"/>
-  </w:num>
-  <w:num w:numId="16" w16cid:durableId="1513762770">
-    <w:abstractNumId w:val="17"/>
-  </w:num>
-  <w:num w:numId="17" w16cid:durableId="1851211161">
-    <w:abstractNumId w:val="21"/>
-  </w:num>
-  <w:num w:numId="18" w16cid:durableId="698819531">
-    <w:abstractNumId w:val="27"/>
-  </w:num>
-  <w:num w:numId="19" w16cid:durableId="1527332008">
-    <w:abstractNumId w:val="19"/>
-  </w:num>
-  <w:num w:numId="20" w16cid:durableId="1770158062">
-    <w:abstractNumId w:val="12"/>
-  </w:num>
-  <w:num w:numId="21" w16cid:durableId="839471443">
-    <w:abstractNumId w:val="5"/>
-  </w:num>
-  <w:num w:numId="22" w16cid:durableId="1625767979">
-    <w:abstractNumId w:val="31"/>
-  </w:num>
-  <w:num w:numId="23" w16cid:durableId="712922381">
-    <w:abstractNumId w:val="6"/>
-  </w:num>
-  <w:num w:numId="24" w16cid:durableId="1509248443">
+  <w:num w:numId="41" w16cid:durableId="241791814">
     <w:abstractNumId w:val="14"/>
   </w:num>
-  <w:num w:numId="25" w16cid:durableId="1388600950">
-    <w:abstractNumId w:val="4"/>
-  </w:num>
-  <w:num w:numId="26" w16cid:durableId="63383461">
-    <w:abstractNumId w:val="10"/>
-  </w:num>
-  <w:num w:numId="27" w16cid:durableId="1959605983">
-    <w:abstractNumId w:val="15"/>
-  </w:num>
-  <w:num w:numId="28" w16cid:durableId="1251352226">
-    <w:abstractNumId w:val="23"/>
-  </w:num>
-  <w:num w:numId="29" w16cid:durableId="1579706643">
-    <w:abstractNumId w:val="25"/>
-  </w:num>
-  <w:num w:numId="30" w16cid:durableId="616908098">
-    <w:abstractNumId w:val="16"/>
-  </w:num>
-  <w:num w:numId="31" w16cid:durableId="1590456493">
+  <w:num w:numId="42" w16cid:durableId="297877559">
     <w:abstractNumId w:val="29"/>
   </w:num>
-  <w:num w:numId="32" w16cid:durableId="1853490051">
-    <w:abstractNumId w:val="28"/>
+  <w:num w:numId="43" w16cid:durableId="29691970">
+    <w:abstractNumId w:val="35"/>
+  </w:num>
+  <w:num w:numId="44" w16cid:durableId="1954240346">
+    <w:abstractNumId w:val="37"/>
   </w:num>
 </w:numbering>
 </file>

</xml_diff>

<commit_message>
Add real-time logs with Socket.io, filter buttons, and improved UI
</commit_message>
<xml_diff>
--- a/Daily Report of Project.docx
+++ b/Daily Report of Project.docx
@@ -12887,6 +12887,7 @@
       <w:r>
         <w:rPr>
           <w:rFonts w:ascii="Times New Roman" w:hAnsi="Times New Roman" w:cs="Times New Roman"/>
+          <w:noProof/>
         </w:rPr>
         <w:drawing>
           <wp:inline distT="0" distB="0" distL="0" distR="0" wp14:anchorId="3AB0B9B1" wp14:editId="13567A62">
@@ -12944,6 +12945,7 @@
       <w:r>
         <w:rPr>
           <w:rFonts w:ascii="Times New Roman" w:hAnsi="Times New Roman" w:cs="Times New Roman"/>
+          <w:noProof/>
         </w:rPr>
         <w:lastRenderedPageBreak/>
         <w:drawing>
@@ -13120,7 +13122,7 @@
     </w:p>
     <w:tbl>
       <w:tblPr>
-        <w:tblW w:w="10445" w:type="dxa"/>
+        <w:tblW w:w="10296" w:type="dxa"/>
         <w:tblCellMar>
           <w:left w:w="10" w:type="dxa"/>
           <w:right w:w="10" w:type="dxa"/>
@@ -13128,9 +13130,9 @@
         <w:tblLook w:val="04A0" w:firstRow="1" w:lastRow="0" w:firstColumn="1" w:lastColumn="0" w:noHBand="0" w:noVBand="1"/>
       </w:tblPr>
       <w:tblGrid>
-        <w:gridCol w:w="2610"/>
-        <w:gridCol w:w="3916"/>
-        <w:gridCol w:w="3919"/>
+        <w:gridCol w:w="1560"/>
+        <w:gridCol w:w="4677"/>
+        <w:gridCol w:w="4059"/>
       </w:tblGrid>
       <w:tr>
         <w:trPr>
@@ -13138,7 +13140,7 @@
         </w:trPr>
         <w:tc>
           <w:tcPr>
-            <w:tcW w:w="2610" w:type="dxa"/>
+            <w:tcW w:w="1560" w:type="dxa"/>
             <w:tcBorders>
               <w:top w:val="nil"/>
               <w:left w:val="nil"/>
@@ -13163,19 +13165,7 @@
               <w:rPr>
                 <w:rFonts w:ascii="Times New Roman" w:hAnsi="Times New Roman" w:cs="Times New Roman"/>
               </w:rPr>
-              <w:t xml:space="preserve">1 </w:t>
-            </w:r>
-            <w:r>
-              <w:rPr>
-                <w:rFonts w:ascii="Times New Roman" w:hAnsi="Times New Roman" w:cs="Times New Roman"/>
-              </w:rPr>
-              <w:t>August</w:t>
-            </w:r>
-            <w:r>
-              <w:rPr>
-                <w:rFonts w:ascii="Times New Roman" w:hAnsi="Times New Roman" w:cs="Times New Roman"/>
-              </w:rPr>
-              <w:t xml:space="preserve"> 2026</w:t>
+              <w:t>1 August 2026</w:t>
             </w:r>
           </w:p>
           <w:p>
@@ -13201,7 +13191,7 @@
         </w:tc>
         <w:tc>
           <w:tcPr>
-            <w:tcW w:w="3916" w:type="dxa"/>
+            <w:tcW w:w="4677" w:type="dxa"/>
             <w:tcBorders>
               <w:top w:val="nil"/>
               <w:left w:val="nil"/>
@@ -13251,13 +13241,401 @@
                 <w:b/>
                 <w:bCs/>
               </w:rPr>
+              <w:t>Make it Real-Time with Socket.io</w:t>
+            </w:r>
+          </w:p>
+          <w:p>
+            <w:pPr>
+              <w:pStyle w:val="ListParagraph"/>
+              <w:numPr>
+                <w:ilvl w:val="0"/>
+                <w:numId w:val="64"/>
+              </w:numPr>
+              <w:ind w:left="790"/>
+              <w:rPr>
+                <w:rFonts w:ascii="Times New Roman" w:hAnsi="Times New Roman" w:cs="Times New Roman"/>
+                <w:b/>
+                <w:bCs/>
+              </w:rPr>
+            </w:pPr>
+            <w:r>
+              <w:rPr>
+                <w:rFonts w:ascii="Times New Roman" w:hAnsi="Times New Roman" w:cs="Times New Roman"/>
+                <w:b/>
+                <w:bCs/>
+              </w:rPr>
+              <w:t>Goal:</w:t>
+            </w:r>
+            <w:r>
+              <w:rPr>
+                <w:rFonts w:ascii="Times New Roman" w:hAnsi="Times New Roman" w:cs="Times New Roman"/>
+              </w:rPr>
+              <w:t xml:space="preserve"> New logs appear instantly without refresh</w:t>
+            </w:r>
+          </w:p>
+          <w:p>
+            <w:pPr>
+              <w:pStyle w:val="ListParagraph"/>
+              <w:numPr>
+                <w:ilvl w:val="0"/>
+                <w:numId w:val="64"/>
+              </w:numPr>
+              <w:ind w:left="790"/>
+              <w:rPr>
+                <w:rFonts w:ascii="Times New Roman" w:hAnsi="Times New Roman" w:cs="Times New Roman"/>
+                <w:b/>
+                <w:bCs/>
+              </w:rPr>
+            </w:pPr>
+            <w:r>
+              <w:rPr>
+                <w:rFonts w:ascii="Times New Roman" w:hAnsi="Times New Roman" w:cs="Times New Roman"/>
+                <w:b/>
+                <w:bCs/>
+              </w:rPr>
+              <w:t xml:space="preserve">Backend: </w:t>
+            </w:r>
+            <w:r>
+              <w:rPr>
+                <w:rFonts w:ascii="Times New Roman" w:hAnsi="Times New Roman" w:cs="Times New Roman"/>
+              </w:rPr>
+              <w:t xml:space="preserve">Emit </w:t>
+            </w:r>
+            <w:proofErr w:type="spellStart"/>
+            <w:r>
+              <w:rPr>
+                <w:rFonts w:ascii="Times New Roman" w:hAnsi="Times New Roman" w:cs="Times New Roman"/>
+              </w:rPr>
+              <w:t>newLog</w:t>
+            </w:r>
+            <w:proofErr w:type="spellEnd"/>
+            <w:r>
+              <w:rPr>
+                <w:rFonts w:ascii="Times New Roman" w:hAnsi="Times New Roman" w:cs="Times New Roman"/>
+              </w:rPr>
+              <w:t xml:space="preserve"> event when file is uploaded</w:t>
+            </w:r>
+          </w:p>
+          <w:p>
+            <w:pPr>
+              <w:pStyle w:val="ListParagraph"/>
+              <w:numPr>
+                <w:ilvl w:val="0"/>
+                <w:numId w:val="64"/>
+              </w:numPr>
+              <w:ind w:left="790"/>
+              <w:rPr>
+                <w:rFonts w:ascii="Times New Roman" w:hAnsi="Times New Roman" w:cs="Times New Roman"/>
+                <w:b/>
+                <w:bCs/>
+              </w:rPr>
+            </w:pPr>
+            <w:r>
+              <w:rPr>
+                <w:rFonts w:ascii="Times New Roman" w:hAnsi="Times New Roman" w:cs="Times New Roman"/>
+                <w:b/>
+                <w:bCs/>
+              </w:rPr>
+              <w:t>Frontend:</w:t>
+            </w:r>
+            <w:r>
+              <w:rPr>
+                <w:rFonts w:ascii="Times New Roman" w:hAnsi="Times New Roman" w:cs="Times New Roman"/>
+              </w:rPr>
+              <w:t xml:space="preserve"> Listen to socket and push new log to top of table </w:t>
+            </w:r>
+          </w:p>
+          <w:p>
+            <w:pPr>
+              <w:numPr>
+                <w:ilvl w:val="0"/>
+                <w:numId w:val="3"/>
+              </w:numPr>
+              <w:rPr>
+                <w:rFonts w:ascii="Times New Roman" w:hAnsi="Times New Roman" w:cs="Times New Roman"/>
+                <w:b/>
+                <w:bCs/>
+              </w:rPr>
+            </w:pPr>
+            <w:r>
+              <w:rPr>
+                <w:rFonts w:ascii="Times New Roman" w:hAnsi="Times New Roman" w:cs="Times New Roman"/>
+                <w:b/>
+                <w:bCs/>
+              </w:rPr>
+              <w:t xml:space="preserve">Add Log Filters </w:t>
+            </w:r>
+            <w:r>
+              <w:rPr>
+                <w:rFonts w:ascii="Segoe UI Emoji" w:hAnsi="Segoe UI Emoji" w:cs="Segoe UI Emoji"/>
+                <w:b/>
+                <w:bCs/>
+              </w:rPr>
+              <w:t>✅</w:t>
+            </w:r>
+            <w:r>
+              <w:rPr>
+                <w:rFonts w:ascii="Times New Roman" w:hAnsi="Times New Roman" w:cs="Times New Roman"/>
+                <w:b/>
+                <w:bCs/>
+              </w:rPr>
+              <w:t xml:space="preserve"> you just did</w:t>
+            </w:r>
+            <w:r>
+              <w:rPr>
+                <w:rFonts w:ascii="Times New Roman" w:hAnsi="Times New Roman" w:cs="Times New Roman"/>
+                <w:b/>
+                <w:bCs/>
+              </w:rPr>
               <w:t xml:space="preserve"> </w:t>
+            </w:r>
+            <w:r>
+              <w:rPr>
+                <w:rFonts w:ascii="Times New Roman" w:hAnsi="Times New Roman" w:cs="Times New Roman"/>
+                <w:b/>
+                <w:bCs/>
+              </w:rPr>
+              <w:t>this</w:t>
+            </w:r>
+          </w:p>
+          <w:p>
+            <w:pPr>
+              <w:pStyle w:val="ListParagraph"/>
+              <w:numPr>
+                <w:ilvl w:val="0"/>
+                <w:numId w:val="66"/>
+              </w:numPr>
+              <w:ind w:left="865"/>
+              <w:rPr>
+                <w:rFonts w:ascii="Times New Roman" w:hAnsi="Times New Roman" w:cs="Times New Roman"/>
+              </w:rPr>
+            </w:pPr>
+            <w:r>
+              <w:rPr>
+                <w:rFonts w:ascii="Times New Roman" w:hAnsi="Times New Roman" w:cs="Times New Roman"/>
+              </w:rPr>
+              <w:t>Filter buttons: ALL, INFO, WARNING, ERROR, CRITICAL</w:t>
+            </w:r>
+          </w:p>
+          <w:p>
+            <w:pPr>
+              <w:pStyle w:val="ListParagraph"/>
+              <w:numPr>
+                <w:ilvl w:val="0"/>
+                <w:numId w:val="66"/>
+              </w:numPr>
+              <w:ind w:left="865"/>
+              <w:rPr>
+                <w:rFonts w:ascii="Times New Roman" w:hAnsi="Times New Roman" w:cs="Times New Roman"/>
+              </w:rPr>
+            </w:pPr>
+            <w:r>
+              <w:rPr>
+                <w:rFonts w:ascii="Times New Roman" w:hAnsi="Times New Roman" w:cs="Times New Roman"/>
+              </w:rPr>
+              <w:t>Highlight ERROR/CRITICAL rows in red</w:t>
+            </w:r>
+          </w:p>
+          <w:p>
+            <w:pPr>
+              <w:numPr>
+                <w:ilvl w:val="0"/>
+                <w:numId w:val="3"/>
+              </w:numPr>
+              <w:rPr>
+                <w:rFonts w:ascii="Times New Roman" w:hAnsi="Times New Roman" w:cs="Times New Roman"/>
+                <w:b/>
+                <w:bCs/>
+              </w:rPr>
+            </w:pPr>
+            <w:r>
+              <w:rPr>
+                <w:rFonts w:ascii="Times New Roman" w:hAnsi="Times New Roman" w:cs="Times New Roman"/>
+                <w:b/>
+                <w:bCs/>
+              </w:rPr>
+              <w:t>Upgrade Dashboard Cards</w:t>
+            </w:r>
+          </w:p>
+          <w:p>
+            <w:pPr>
+              <w:pStyle w:val="ListParagraph"/>
+              <w:numPr>
+                <w:ilvl w:val="0"/>
+                <w:numId w:val="67"/>
+              </w:numPr>
+              <w:ind w:left="865"/>
+              <w:rPr>
+                <w:rFonts w:ascii="Times New Roman" w:hAnsi="Times New Roman" w:cs="Times New Roman"/>
+              </w:rPr>
+            </w:pPr>
+            <w:r>
+              <w:rPr>
+                <w:rFonts w:ascii="Times New Roman" w:hAnsi="Times New Roman" w:cs="Times New Roman"/>
+              </w:rPr>
+              <w:t>Make Critical Errors, System Health calculate from live logs state</w:t>
+            </w:r>
+          </w:p>
+          <w:p>
+            <w:pPr>
+              <w:pStyle w:val="ListParagraph"/>
+              <w:numPr>
+                <w:ilvl w:val="0"/>
+                <w:numId w:val="67"/>
+              </w:numPr>
+              <w:ind w:left="865"/>
+              <w:rPr>
+                <w:rFonts w:ascii="Times New Roman" w:hAnsi="Times New Roman" w:cs="Times New Roman"/>
+              </w:rPr>
+            </w:pPr>
+            <w:r>
+              <w:rPr>
+                <w:rFonts w:ascii="Times New Roman" w:hAnsi="Times New Roman" w:cs="Times New Roman"/>
+              </w:rPr>
+              <w:t>Add animation when numbers change</w:t>
+            </w:r>
+          </w:p>
+          <w:p>
+            <w:pPr>
+              <w:numPr>
+                <w:ilvl w:val="0"/>
+                <w:numId w:val="3"/>
+              </w:numPr>
+              <w:rPr>
+                <w:rFonts w:ascii="Times New Roman" w:hAnsi="Times New Roman" w:cs="Times New Roman"/>
+                <w:b/>
+                <w:bCs/>
+              </w:rPr>
+            </w:pPr>
+            <w:r>
+              <w:rPr>
+                <w:rFonts w:ascii="Times New Roman" w:hAnsi="Times New Roman" w:cs="Times New Roman"/>
+                <w:b/>
+                <w:bCs/>
+              </w:rPr>
+              <w:t>Test Critical Alert Button</w:t>
+            </w:r>
+          </w:p>
+          <w:p>
+            <w:pPr>
+              <w:pStyle w:val="ListParagraph"/>
+              <w:numPr>
+                <w:ilvl w:val="0"/>
+                <w:numId w:val="68"/>
+              </w:numPr>
+              <w:ind w:left="865"/>
+              <w:rPr>
+                <w:rFonts w:ascii="Times New Roman" w:hAnsi="Times New Roman" w:cs="Times New Roman"/>
+              </w:rPr>
+            </w:pPr>
+            <w:r>
+              <w:rPr>
+                <w:rFonts w:ascii="Times New Roman" w:hAnsi="Times New Roman" w:cs="Times New Roman"/>
+              </w:rPr>
+              <w:t>Click → sends fake CRITICAL log to backend → shows instantly in table</w:t>
+            </w:r>
+          </w:p>
+          <w:p>
+            <w:pPr>
+              <w:pStyle w:val="ListParagraph"/>
+              <w:numPr>
+                <w:ilvl w:val="0"/>
+                <w:numId w:val="68"/>
+              </w:numPr>
+              <w:ind w:left="865"/>
+              <w:rPr>
+                <w:rFonts w:ascii="Times New Roman" w:hAnsi="Times New Roman" w:cs="Times New Roman"/>
+              </w:rPr>
+            </w:pPr>
+            <w:r>
+              <w:rPr>
+                <w:rFonts w:ascii="Times New Roman" w:hAnsi="Times New Roman" w:cs="Times New Roman"/>
+              </w:rPr>
+              <w:t>Badge should turn red immediately</w:t>
+            </w:r>
+          </w:p>
+          <w:p>
+            <w:pPr>
+              <w:numPr>
+                <w:ilvl w:val="0"/>
+                <w:numId w:val="3"/>
+              </w:numPr>
+              <w:rPr>
+                <w:rFonts w:ascii="Times New Roman" w:hAnsi="Times New Roman" w:cs="Times New Roman"/>
+                <w:b/>
+                <w:bCs/>
+              </w:rPr>
+            </w:pPr>
+            <w:r>
+              <w:rPr>
+                <w:rFonts w:ascii="Times New Roman" w:hAnsi="Times New Roman" w:cs="Times New Roman"/>
+                <w:b/>
+                <w:bCs/>
+              </w:rPr>
+              <w:t>Polish UI</w:t>
+            </w:r>
+          </w:p>
+          <w:p>
+            <w:pPr>
+              <w:pStyle w:val="ListParagraph"/>
+              <w:numPr>
+                <w:ilvl w:val="0"/>
+                <w:numId w:val="69"/>
+              </w:numPr>
+              <w:ind w:left="797"/>
+              <w:rPr>
+                <w:rFonts w:ascii="Times New Roman" w:hAnsi="Times New Roman" w:cs="Times New Roman"/>
+              </w:rPr>
+            </w:pPr>
+            <w:r>
+              <w:rPr>
+                <w:rFonts w:ascii="Times New Roman" w:hAnsi="Times New Roman" w:cs="Times New Roman"/>
+              </w:rPr>
+              <w:t>Add “2s ago” relative timestamps instead of raw ISO</w:t>
+            </w:r>
+          </w:p>
+          <w:p>
+            <w:pPr>
+              <w:pStyle w:val="ListParagraph"/>
+              <w:numPr>
+                <w:ilvl w:val="0"/>
+                <w:numId w:val="69"/>
+              </w:numPr>
+              <w:ind w:left="797"/>
+              <w:rPr>
+                <w:rFonts w:ascii="Times New Roman" w:hAnsi="Times New Roman" w:cs="Times New Roman"/>
+              </w:rPr>
+            </w:pPr>
+            <w:r>
+              <w:rPr>
+                <w:rFonts w:ascii="Times New Roman" w:hAnsi="Times New Roman" w:cs="Times New Roman"/>
+              </w:rPr>
+              <w:t>Add auto-scroll to newest log</w:t>
+            </w:r>
+          </w:p>
+          <w:p>
+            <w:pPr>
+              <w:pStyle w:val="ListParagraph"/>
+              <w:numPr>
+                <w:ilvl w:val="0"/>
+                <w:numId w:val="69"/>
+              </w:numPr>
+              <w:ind w:left="797"/>
+              <w:rPr>
+                <w:rFonts w:ascii="Times New Roman" w:hAnsi="Times New Roman" w:cs="Times New Roman"/>
+              </w:rPr>
+            </w:pPr>
+            <w:r>
+              <w:rPr>
+                <w:rFonts w:ascii="Times New Roman" w:hAnsi="Times New Roman" w:cs="Times New Roman"/>
+              </w:rPr>
+              <w:t>Add empty state: “Waiting for logs…”</w:t>
             </w:r>
           </w:p>
         </w:tc>
         <w:tc>
           <w:tcPr>
-            <w:tcW w:w="3918" w:type="dxa"/>
+            <w:tcW w:w="4058" w:type="dxa"/>
             <w:tcBorders>
               <w:top w:val="nil"/>
               <w:left w:val="nil"/>
@@ -13299,6 +13677,521 @@
                 <w:bCs/>
               </w:rPr>
             </w:pPr>
+            <w:r>
+              <w:rPr>
+                <w:rFonts w:ascii="Times New Roman" w:hAnsi="Times New Roman" w:cs="Times New Roman"/>
+                <w:b/>
+                <w:bCs/>
+              </w:rPr>
+              <w:t>AI Anomaly Detection</w:t>
+            </w:r>
+          </w:p>
+          <w:p>
+            <w:pPr>
+              <w:pStyle w:val="ListParagraph"/>
+              <w:numPr>
+                <w:ilvl w:val="0"/>
+                <w:numId w:val="70"/>
+              </w:numPr>
+              <w:ind w:left="779"/>
+              <w:rPr>
+                <w:rFonts w:ascii="Times New Roman" w:hAnsi="Times New Roman" w:cs="Times New Roman"/>
+                <w:b/>
+                <w:bCs/>
+              </w:rPr>
+            </w:pPr>
+            <w:r>
+              <w:rPr>
+                <w:rFonts w:ascii="Times New Roman" w:hAnsi="Times New Roman" w:cs="Times New Roman"/>
+                <w:b/>
+                <w:bCs/>
+              </w:rPr>
+              <w:t>Goal:</w:t>
+            </w:r>
+            <w:r>
+              <w:rPr>
+                <w:rFonts w:ascii="Times New Roman" w:hAnsi="Times New Roman" w:cs="Times New Roman"/>
+              </w:rPr>
+              <w:t xml:space="preserve"> Backend auto-detects weird patterns in logs</w:t>
+            </w:r>
+          </w:p>
+          <w:p>
+            <w:pPr>
+              <w:pStyle w:val="ListParagraph"/>
+              <w:numPr>
+                <w:ilvl w:val="0"/>
+                <w:numId w:val="70"/>
+              </w:numPr>
+              <w:ind w:left="779"/>
+              <w:rPr>
+                <w:rFonts w:ascii="Times New Roman" w:hAnsi="Times New Roman" w:cs="Times New Roman"/>
+                <w:b/>
+                <w:bCs/>
+              </w:rPr>
+            </w:pPr>
+            <w:r>
+              <w:rPr>
+                <w:rFonts w:ascii="Times New Roman" w:hAnsi="Times New Roman" w:cs="Times New Roman"/>
+              </w:rPr>
+              <w:t>Detect: 5+ ERRORs in 1 minute = Spike Alert</w:t>
+            </w:r>
+          </w:p>
+          <w:p>
+            <w:pPr>
+              <w:pStyle w:val="ListParagraph"/>
+              <w:numPr>
+                <w:ilvl w:val="0"/>
+                <w:numId w:val="70"/>
+              </w:numPr>
+              <w:ind w:left="779"/>
+              <w:rPr>
+                <w:rFonts w:ascii="Times New Roman" w:hAnsi="Times New Roman" w:cs="Times New Roman"/>
+                <w:b/>
+                <w:bCs/>
+              </w:rPr>
+            </w:pPr>
+            <w:r>
+              <w:rPr>
+                <w:rFonts w:ascii="Times New Roman" w:hAnsi="Times New Roman" w:cs="Times New Roman"/>
+              </w:rPr>
+              <w:t>Detect: CRITICAL keyword = Instant Alert</w:t>
+            </w:r>
+          </w:p>
+          <w:p>
+            <w:pPr>
+              <w:pStyle w:val="ListParagraph"/>
+              <w:numPr>
+                <w:ilvl w:val="0"/>
+                <w:numId w:val="70"/>
+              </w:numPr>
+              <w:ind w:left="779"/>
+              <w:rPr>
+                <w:rFonts w:ascii="Times New Roman" w:hAnsi="Times New Roman" w:cs="Times New Roman"/>
+                <w:b/>
+                <w:bCs/>
+              </w:rPr>
+            </w:pPr>
+            <w:r>
+              <w:rPr>
+                <w:rFonts w:ascii="Times New Roman" w:hAnsi="Times New Roman" w:cs="Times New Roman"/>
+                <w:bCs/>
+              </w:rPr>
+              <w:t>Return: anomalies: […] in /</w:t>
+            </w:r>
+            <w:proofErr w:type="spellStart"/>
+            <w:r>
+              <w:rPr>
+                <w:rFonts w:ascii="Times New Roman" w:hAnsi="Times New Roman" w:cs="Times New Roman"/>
+                <w:bCs/>
+              </w:rPr>
+              <w:t>api</w:t>
+            </w:r>
+            <w:proofErr w:type="spellEnd"/>
+            <w:r>
+              <w:rPr>
+                <w:rFonts w:ascii="Times New Roman" w:hAnsi="Times New Roman" w:cs="Times New Roman"/>
+                <w:bCs/>
+              </w:rPr>
+              <w:t>/upload response</w:t>
+            </w:r>
+          </w:p>
+          <w:p>
+            <w:pPr>
+              <w:numPr>
+                <w:ilvl w:val="0"/>
+                <w:numId w:val="4"/>
+              </w:numPr>
+              <w:rPr>
+                <w:rFonts w:ascii="Times New Roman" w:hAnsi="Times New Roman" w:cs="Times New Roman"/>
+                <w:b/>
+                <w:bCs/>
+              </w:rPr>
+            </w:pPr>
+            <w:r>
+              <w:rPr>
+                <w:rFonts w:ascii="Times New Roman" w:hAnsi="Times New Roman" w:cs="Times New Roman"/>
+                <w:b/>
+                <w:bCs/>
+              </w:rPr>
+              <w:t>Anomaly Alert Banner</w:t>
+            </w:r>
+          </w:p>
+          <w:p>
+            <w:pPr>
+              <w:pStyle w:val="ListParagraph"/>
+              <w:numPr>
+                <w:ilvl w:val="0"/>
+                <w:numId w:val="71"/>
+              </w:numPr>
+              <w:ind w:left="833"/>
+              <w:rPr>
+                <w:rFonts w:ascii="Times New Roman" w:hAnsi="Times New Roman" w:cs="Times New Roman"/>
+                <w:b/>
+                <w:bCs/>
+              </w:rPr>
+            </w:pPr>
+            <w:r>
+              <w:rPr>
+                <w:rFonts w:ascii="Times New Roman" w:hAnsi="Times New Roman" w:cs="Times New Roman"/>
+                <w:b/>
+                <w:bCs/>
+              </w:rPr>
+              <w:t>Frontend:</w:t>
+            </w:r>
+            <w:r>
+              <w:rPr>
+                <w:rFonts w:ascii="Times New Roman" w:hAnsi="Times New Roman" w:cs="Times New Roman"/>
+              </w:rPr>
+              <w:t xml:space="preserve"> New component &lt;</w:t>
+            </w:r>
+            <w:proofErr w:type="spellStart"/>
+            <w:r>
+              <w:rPr>
+                <w:rFonts w:ascii="Times New Roman" w:hAnsi="Times New Roman" w:cs="Times New Roman"/>
+              </w:rPr>
+              <w:t>AnomalyBanner</w:t>
+            </w:r>
+            <w:proofErr w:type="spellEnd"/>
+            <w:r>
+              <w:rPr>
+                <w:rFonts w:ascii="Times New Roman" w:hAnsi="Times New Roman" w:cs="Times New Roman"/>
+              </w:rPr>
+              <w:t xml:space="preserve"> /&gt;</w:t>
+            </w:r>
+          </w:p>
+          <w:p>
+            <w:pPr>
+              <w:pStyle w:val="ListParagraph"/>
+              <w:numPr>
+                <w:ilvl w:val="0"/>
+                <w:numId w:val="71"/>
+              </w:numPr>
+              <w:ind w:left="833"/>
+              <w:rPr>
+                <w:rFonts w:ascii="Times New Roman" w:hAnsi="Times New Roman" w:cs="Times New Roman"/>
+                <w:b/>
+                <w:bCs/>
+              </w:rPr>
+            </w:pPr>
+            <w:r>
+              <w:rPr>
+                <w:rFonts w:ascii="Times New Roman" w:hAnsi="Times New Roman" w:cs="Times New Roman"/>
+              </w:rPr>
+              <w:t xml:space="preserve">Shows: </w:t>
+            </w:r>
+            <w:r>
+              <w:rPr>
+                <mc:AlternateContent>
+                  <mc:Choice Requires="w16se">
+                    <w:rFonts w:ascii="Times New Roman" w:hAnsi="Times New Roman" w:cs="Times New Roman"/>
+                  </mc:Choice>
+                  <mc:Fallback>
+                    <w:rFonts w:ascii="Segoe UI Emoji" w:eastAsia="Segoe UI Emoji" w:hAnsi="Segoe UI Emoji" w:cs="Segoe UI Emoji"/>
+                  </mc:Fallback>
+                </mc:AlternateContent>
+                <w:b/>
+                <w:bCs/>
+              </w:rPr>
+              <mc:AlternateContent>
+                <mc:Choice Requires="w16se">
+                  <w16se:symEx w16se:font="Segoe UI Emoji" w16se:char="26A0"/>
+                </mc:Choice>
+                <mc:Fallback>
+                  <w:t>⚠</w:t>
+                </mc:Fallback>
+              </mc:AlternateContent>
+            </w:r>
+            <w:r>
+              <w:rPr>
+                <w:rFonts w:ascii="Times New Roman" w:hAnsi="Times New Roman" w:cs="Times New Roman"/>
+              </w:rPr>
+              <w:t>️ 7 Errors detected in last 60s</w:t>
+            </w:r>
+          </w:p>
+          <w:p>
+            <w:pPr>
+              <w:pStyle w:val="ListParagraph"/>
+              <w:numPr>
+                <w:ilvl w:val="0"/>
+                <w:numId w:val="71"/>
+              </w:numPr>
+              <w:ind w:left="833"/>
+              <w:rPr>
+                <w:rFonts w:ascii="Times New Roman" w:hAnsi="Times New Roman" w:cs="Times New Roman"/>
+                <w:b/>
+                <w:bCs/>
+              </w:rPr>
+            </w:pPr>
+            <w:r>
+              <w:rPr>
+                <w:rFonts w:ascii="Times New Roman" w:hAnsi="Times New Roman" w:cs="Times New Roman"/>
+              </w:rPr>
+              <w:t>Red flashing banner at top when anomaly found</w:t>
+            </w:r>
+          </w:p>
+          <w:p>
+            <w:pPr>
+              <w:numPr>
+                <w:ilvl w:val="0"/>
+                <w:numId w:val="4"/>
+              </w:numPr>
+              <w:rPr>
+                <w:rFonts w:ascii="Times New Roman" w:hAnsi="Times New Roman" w:cs="Times New Roman"/>
+                <w:b/>
+                <w:bCs/>
+              </w:rPr>
+            </w:pPr>
+            <w:r>
+              <w:rPr>
+                <w:rFonts w:ascii="Times New Roman" w:hAnsi="Times New Roman" w:cs="Times New Roman"/>
+                <w:b/>
+                <w:bCs/>
+              </w:rPr>
+              <w:t>Charts with Recharts</w:t>
+            </w:r>
+          </w:p>
+          <w:p>
+            <w:pPr>
+              <w:pStyle w:val="ListParagraph"/>
+              <w:numPr>
+                <w:ilvl w:val="0"/>
+                <w:numId w:val="72"/>
+              </w:numPr>
+              <w:ind w:left="757"/>
+              <w:rPr>
+                <w:rFonts w:ascii="Times New Roman" w:hAnsi="Times New Roman" w:cs="Times New Roman"/>
+                <w:b/>
+                <w:bCs/>
+              </w:rPr>
+            </w:pPr>
+            <w:r>
+              <w:rPr>
+                <w:rFonts w:ascii="Times New Roman" w:hAnsi="Times New Roman" w:cs="Times New Roman"/>
+                <w:b/>
+                <w:bCs/>
+              </w:rPr>
+              <w:t>Goal:</w:t>
+            </w:r>
+            <w:r>
+              <w:rPr>
+                <w:rFonts w:ascii="Times New Roman" w:hAnsi="Times New Roman" w:cs="Times New Roman"/>
+              </w:rPr>
+              <w:t xml:space="preserve"> Visualize log data</w:t>
+            </w:r>
+          </w:p>
+          <w:p>
+            <w:pPr>
+              <w:pStyle w:val="ListParagraph"/>
+              <w:numPr>
+                <w:ilvl w:val="0"/>
+                <w:numId w:val="72"/>
+              </w:numPr>
+              <w:ind w:left="757"/>
+              <w:rPr>
+                <w:rFonts w:ascii="Times New Roman" w:hAnsi="Times New Roman" w:cs="Times New Roman"/>
+                <w:b/>
+                <w:bCs/>
+              </w:rPr>
+            </w:pPr>
+            <w:r>
+              <w:rPr>
+                <w:rFonts w:ascii="Times New Roman" w:hAnsi="Times New Roman" w:cs="Times New Roman"/>
+              </w:rPr>
+              <w:t>Chart 1: Errors per minute line chart</w:t>
+            </w:r>
+          </w:p>
+          <w:p>
+            <w:pPr>
+              <w:pStyle w:val="ListParagraph"/>
+              <w:numPr>
+                <w:ilvl w:val="0"/>
+                <w:numId w:val="72"/>
+              </w:numPr>
+              <w:ind w:left="757"/>
+              <w:rPr>
+                <w:rFonts w:ascii="Times New Roman" w:hAnsi="Times New Roman" w:cs="Times New Roman"/>
+                <w:b/>
+                <w:bCs/>
+              </w:rPr>
+            </w:pPr>
+            <w:r>
+              <w:rPr>
+                <w:rFonts w:ascii="Times New Roman" w:hAnsi="Times New Roman" w:cs="Times New Roman"/>
+              </w:rPr>
+              <w:t>Chart 2: Log Level Distribution pie chart</w:t>
+            </w:r>
+          </w:p>
+          <w:p>
+            <w:pPr>
+              <w:pStyle w:val="ListParagraph"/>
+              <w:numPr>
+                <w:ilvl w:val="0"/>
+                <w:numId w:val="72"/>
+              </w:numPr>
+              <w:ind w:left="757"/>
+              <w:rPr>
+                <w:rFonts w:ascii="Times New Roman" w:hAnsi="Times New Roman" w:cs="Times New Roman"/>
+                <w:b/>
+                <w:bCs/>
+              </w:rPr>
+            </w:pPr>
+            <w:r>
+              <w:rPr>
+                <w:rFonts w:ascii="Times New Roman" w:hAnsi="Times New Roman" w:cs="Times New Roman"/>
+              </w:rPr>
+              <w:t xml:space="preserve">Install: </w:t>
+            </w:r>
+            <w:proofErr w:type="spellStart"/>
+            <w:r>
+              <w:rPr>
+                <w:rFonts w:ascii="Times New Roman" w:hAnsi="Times New Roman" w:cs="Times New Roman"/>
+              </w:rPr>
+              <w:t>npm</w:t>
+            </w:r>
+            <w:proofErr w:type="spellEnd"/>
+            <w:r>
+              <w:rPr>
+                <w:rFonts w:ascii="Times New Roman" w:hAnsi="Times New Roman" w:cs="Times New Roman"/>
+              </w:rPr>
+              <w:t xml:space="preserve"> install recharts</w:t>
+            </w:r>
+          </w:p>
+          <w:p>
+            <w:pPr>
+              <w:numPr>
+                <w:ilvl w:val="0"/>
+                <w:numId w:val="4"/>
+              </w:numPr>
+              <w:rPr>
+                <w:rFonts w:ascii="Times New Roman" w:hAnsi="Times New Roman" w:cs="Times New Roman"/>
+                <w:b/>
+                <w:bCs/>
+              </w:rPr>
+            </w:pPr>
+            <w:r>
+              <w:rPr>
+                <w:rFonts w:ascii="Times New Roman" w:hAnsi="Times New Roman" w:cs="Times New Roman"/>
+                <w:b/>
+                <w:bCs/>
+              </w:rPr>
+              <w:t>Search Bar for Logs</w:t>
+            </w:r>
+          </w:p>
+          <w:p>
+            <w:pPr>
+              <w:pStyle w:val="ListParagraph"/>
+              <w:numPr>
+                <w:ilvl w:val="0"/>
+                <w:numId w:val="73"/>
+              </w:numPr>
+              <w:ind w:left="757"/>
+              <w:rPr>
+                <w:rFonts w:ascii="Times New Roman" w:hAnsi="Times New Roman" w:cs="Times New Roman"/>
+              </w:rPr>
+            </w:pPr>
+            <w:r>
+              <w:rPr>
+                <w:rFonts w:ascii="Times New Roman" w:hAnsi="Times New Roman" w:cs="Times New Roman"/>
+              </w:rPr>
+              <w:t>Add search input above table</w:t>
+            </w:r>
+          </w:p>
+          <w:p>
+            <w:pPr>
+              <w:pStyle w:val="ListParagraph"/>
+              <w:numPr>
+                <w:ilvl w:val="0"/>
+                <w:numId w:val="73"/>
+              </w:numPr>
+              <w:ind w:left="757"/>
+              <w:rPr>
+                <w:rFonts w:ascii="Times New Roman" w:hAnsi="Times New Roman" w:cs="Times New Roman"/>
+              </w:rPr>
+            </w:pPr>
+            <w:r>
+              <w:rPr>
+                <w:rFonts w:ascii="Times New Roman" w:hAnsi="Times New Roman" w:cs="Times New Roman"/>
+              </w:rPr>
+              <w:t>Filter logs by keyword in message</w:t>
+            </w:r>
+          </w:p>
+          <w:p>
+            <w:pPr>
+              <w:pStyle w:val="ListParagraph"/>
+              <w:numPr>
+                <w:ilvl w:val="0"/>
+                <w:numId w:val="73"/>
+              </w:numPr>
+              <w:ind w:left="757"/>
+              <w:rPr>
+                <w:rFonts w:ascii="Times New Roman" w:hAnsi="Times New Roman" w:cs="Times New Roman"/>
+              </w:rPr>
+            </w:pPr>
+            <w:r>
+              <w:rPr>
+                <w:rFonts w:ascii="Times New Roman" w:hAnsi="Times New Roman" w:cs="Times New Roman"/>
+              </w:rPr>
+              <w:t>Example: search “database” → only show DB logs</w:t>
+            </w:r>
+          </w:p>
+          <w:p>
+            <w:pPr>
+              <w:numPr>
+                <w:ilvl w:val="0"/>
+                <w:numId w:val="4"/>
+              </w:numPr>
+              <w:rPr>
+                <w:rFonts w:ascii="Times New Roman" w:hAnsi="Times New Roman" w:cs="Times New Roman"/>
+                <w:b/>
+                <w:bCs/>
+              </w:rPr>
+            </w:pPr>
+            <w:r>
+              <w:rPr>
+                <w:rFonts w:ascii="Times New Roman" w:hAnsi="Times New Roman" w:cs="Times New Roman"/>
+                <w:b/>
+                <w:bCs/>
+              </w:rPr>
+              <w:t>Export Logs</w:t>
+            </w:r>
+          </w:p>
+          <w:p>
+            <w:pPr>
+              <w:pStyle w:val="ListParagraph"/>
+              <w:numPr>
+                <w:ilvl w:val="0"/>
+                <w:numId w:val="74"/>
+              </w:numPr>
+              <w:ind w:left="781"/>
+              <w:rPr>
+                <w:rFonts w:ascii="Times New Roman" w:hAnsi="Times New Roman" w:cs="Times New Roman"/>
+              </w:rPr>
+            </w:pPr>
+            <w:r>
+              <w:rPr>
+                <w:rFonts w:ascii="Times New Roman" w:hAnsi="Times New Roman" w:cs="Times New Roman"/>
+              </w:rPr>
+              <w:t>Button: Export CSV</w:t>
+            </w:r>
+          </w:p>
+          <w:p>
+            <w:pPr>
+              <w:pStyle w:val="ListParagraph"/>
+              <w:numPr>
+                <w:ilvl w:val="0"/>
+                <w:numId w:val="74"/>
+              </w:numPr>
+              <w:ind w:left="781"/>
+              <w:rPr>
+                <w:rFonts w:ascii="Times New Roman" w:hAnsi="Times New Roman" w:cs="Times New Roman"/>
+              </w:rPr>
+            </w:pPr>
+            <w:r>
+              <w:rPr>
+                <w:rFonts w:ascii="Times New Roman" w:hAnsi="Times New Roman" w:cs="Times New Roman"/>
+              </w:rPr>
+              <w:t>Download current filtered logs as .csv file</w:t>
+            </w:r>
           </w:p>
         </w:tc>
       </w:tr>
@@ -13308,7 +14201,7 @@
         </w:trPr>
         <w:tc>
           <w:tcPr>
-            <w:tcW w:w="10445" w:type="dxa"/>
+            <w:tcW w:w="10296" w:type="dxa"/>
             <w:gridSpan w:val="3"/>
             <w:tcBorders>
               <w:top w:val="nil"/>
@@ -13363,27 +14256,385 @@
         </w:rPr>
         <w:t xml:space="preserve"> </w:t>
       </w:r>
+      <w:r>
+        <w:rPr>
+          <w:rFonts w:ascii="Times New Roman" w:hAnsi="Times New Roman" w:cs="Times New Roman"/>
+        </w:rPr>
+        <w:t>Demo of LOGGUARD AI dashboard showing backend running, log file upload, live logs display, and critical error metrics with alert system.</w:t>
+      </w:r>
     </w:p>
     <w:p>
       <w:pPr>
         <w:jc w:val="both"/>
         <w:rPr>
           <w:rFonts w:ascii="Times New Roman" w:hAnsi="Times New Roman" w:cs="Times New Roman"/>
-          <w:bCs/>
-        </w:rPr>
-      </w:pPr>
-      <w:r>
-        <w:rPr>
-          <w:rFonts w:ascii="Times New Roman" w:hAnsi="Times New Roman" w:cs="Times New Roman"/>
-        </w:rPr>
-        <w:br/>
-      </w:r>
-      <w:r>
-        <w:rPr>
-          <w:rFonts w:ascii="Times New Roman" w:hAnsi="Times New Roman" w:cs="Times New Roman"/>
           <w:b/>
           <w:bCs/>
         </w:rPr>
+      </w:pPr>
+      <w:r>
+        <w:rPr>
+          <w:rFonts w:ascii="Times New Roman" w:hAnsi="Times New Roman" w:cs="Times New Roman"/>
+        </w:rPr>
+        <w:lastRenderedPageBreak/>
+        <w:drawing>
+          <wp:inline distT="0" distB="0" distL="0" distR="0" wp14:anchorId="28A07609" wp14:editId="269EE2BE">
+            <wp:extent cx="4854722" cy="997773"/>
+            <wp:effectExtent l="0" t="0" r="3175" b="0"/>
+            <wp:docPr id="1677623380" name="Picture 1"/>
+            <wp:cNvGraphicFramePr>
+              <a:graphicFrameLocks xmlns:a="http://schemas.openxmlformats.org/drawingml/2006/main" noChangeAspect="1"/>
+            </wp:cNvGraphicFramePr>
+            <a:graphic xmlns:a="http://schemas.openxmlformats.org/drawingml/2006/main">
+              <a:graphicData uri="http://schemas.openxmlformats.org/drawingml/2006/picture">
+                <pic:pic xmlns:pic="http://schemas.openxmlformats.org/drawingml/2006/picture">
+                  <pic:nvPicPr>
+                    <pic:cNvPr id="1677623380" name=""/>
+                    <pic:cNvPicPr/>
+                  </pic:nvPicPr>
+                  <pic:blipFill rotWithShape="1">
+                    <a:blip r:embed="rId29"/>
+                    <a:srcRect l="-13" t="3200" r="13" b="18170"/>
+                    <a:stretch>
+                      <a:fillRect/>
+                    </a:stretch>
+                  </pic:blipFill>
+                  <pic:spPr bwMode="auto">
+                    <a:xfrm>
+                      <a:off x="0" y="0"/>
+                      <a:ext cx="4902097" cy="1007510"/>
+                    </a:xfrm>
+                    <a:prstGeom prst="rect">
+                      <a:avLst/>
+                    </a:prstGeom>
+                    <a:ln>
+                      <a:noFill/>
+                    </a:ln>
+                    <a:extLst>
+                      <a:ext uri="{53640926-AAD7-44D8-BBD7-CCE9431645EC}">
+                        <a14:shadowObscured xmlns:a14="http://schemas.microsoft.com/office/drawing/2010/main"/>
+                      </a:ext>
+                    </a:extLst>
+                  </pic:spPr>
+                </pic:pic>
+              </a:graphicData>
+            </a:graphic>
+          </wp:inline>
+        </w:drawing>
+      </w:r>
+    </w:p>
+    <w:p>
+      <w:pPr>
+        <w:jc w:val="both"/>
+        <w:rPr>
+          <w:rFonts w:ascii="Times New Roman" w:hAnsi="Times New Roman" w:cs="Times New Roman"/>
+          <w:b/>
+          <w:bCs/>
+        </w:rPr>
+      </w:pPr>
+      <w:r>
+        <w:rPr>
+          <w:rFonts w:ascii="Times New Roman" w:hAnsi="Times New Roman" w:cs="Times New Roman"/>
+        </w:rPr>
+        <w:drawing>
+          <wp:inline distT="0" distB="0" distL="0" distR="0" wp14:anchorId="44B29AE3" wp14:editId="238D3542">
+            <wp:extent cx="6142215" cy="1694303"/>
+            <wp:effectExtent l="0" t="0" r="0" b="1270"/>
+            <wp:docPr id="623984000" name="Picture 1"/>
+            <wp:cNvGraphicFramePr>
+              <a:graphicFrameLocks xmlns:a="http://schemas.openxmlformats.org/drawingml/2006/main" noChangeAspect="1"/>
+            </wp:cNvGraphicFramePr>
+            <a:graphic xmlns:a="http://schemas.openxmlformats.org/drawingml/2006/main">
+              <a:graphicData uri="http://schemas.openxmlformats.org/drawingml/2006/picture">
+                <pic:pic xmlns:pic="http://schemas.openxmlformats.org/drawingml/2006/picture">
+                  <pic:nvPicPr>
+                    <pic:cNvPr id="623984000" name=""/>
+                    <pic:cNvPicPr/>
+                  </pic:nvPicPr>
+                  <pic:blipFill>
+                    <a:blip r:embed="rId30"/>
+                    <a:stretch>
+                      <a:fillRect/>
+                    </a:stretch>
+                  </pic:blipFill>
+                  <pic:spPr>
+                    <a:xfrm>
+                      <a:off x="0" y="0"/>
+                      <a:ext cx="6151000" cy="1696726"/>
+                    </a:xfrm>
+                    <a:prstGeom prst="rect">
+                      <a:avLst/>
+                    </a:prstGeom>
+                  </pic:spPr>
+                </pic:pic>
+              </a:graphicData>
+            </a:graphic>
+          </wp:inline>
+        </w:drawing>
+      </w:r>
+    </w:p>
+    <w:p>
+      <w:pPr>
+        <w:jc w:val="both"/>
+        <w:rPr>
+          <w:rFonts w:ascii="Times New Roman" w:hAnsi="Times New Roman" w:cs="Times New Roman"/>
+          <w:b/>
+          <w:bCs/>
+        </w:rPr>
+      </w:pPr>
+      <w:r>
+        <w:rPr>
+          <w:rFonts w:ascii="Times New Roman" w:hAnsi="Times New Roman" w:cs="Times New Roman"/>
+        </w:rPr>
+        <w:drawing>
+          <wp:inline distT="0" distB="0" distL="0" distR="0" wp14:anchorId="2350FAFB" wp14:editId="05912331">
+            <wp:extent cx="6083192" cy="5947765"/>
+            <wp:effectExtent l="0" t="0" r="0" b="0"/>
+            <wp:docPr id="577279755" name="Picture 1"/>
+            <wp:cNvGraphicFramePr>
+              <a:graphicFrameLocks xmlns:a="http://schemas.openxmlformats.org/drawingml/2006/main" noChangeAspect="1"/>
+            </wp:cNvGraphicFramePr>
+            <a:graphic xmlns:a="http://schemas.openxmlformats.org/drawingml/2006/main">
+              <a:graphicData uri="http://schemas.openxmlformats.org/drawingml/2006/picture">
+                <pic:pic xmlns:pic="http://schemas.openxmlformats.org/drawingml/2006/picture">
+                  <pic:nvPicPr>
+                    <pic:cNvPr id="577279755" name=""/>
+                    <pic:cNvPicPr/>
+                  </pic:nvPicPr>
+                  <pic:blipFill>
+                    <a:blip r:embed="rId31"/>
+                    <a:stretch>
+                      <a:fillRect/>
+                    </a:stretch>
+                  </pic:blipFill>
+                  <pic:spPr>
+                    <a:xfrm>
+                      <a:off x="0" y="0"/>
+                      <a:ext cx="6090369" cy="5954782"/>
+                    </a:xfrm>
+                    <a:prstGeom prst="rect">
+                      <a:avLst/>
+                    </a:prstGeom>
+                  </pic:spPr>
+                </pic:pic>
+              </a:graphicData>
+            </a:graphic>
+          </wp:inline>
+        </w:drawing>
+      </w:r>
+    </w:p>
+    <w:p>
+      <w:pPr>
+        <w:jc w:val="both"/>
+        <w:rPr>
+          <w:rFonts w:ascii="Times New Roman" w:hAnsi="Times New Roman" w:cs="Times New Roman"/>
+          <w:b/>
+          <w:bCs/>
+        </w:rPr>
+      </w:pPr>
+      <w:r>
+        <w:rPr>
+          <w:rFonts w:ascii="Times New Roman" w:hAnsi="Times New Roman" w:cs="Times New Roman"/>
+        </w:rPr>
+        <w:lastRenderedPageBreak/>
+        <w:drawing>
+          <wp:inline distT="0" distB="0" distL="0" distR="0" wp14:anchorId="78901038" wp14:editId="38D2F93A">
+            <wp:extent cx="5825081" cy="5664232"/>
+            <wp:effectExtent l="0" t="0" r="4445" b="0"/>
+            <wp:docPr id="1181218220" name="Picture 1"/>
+            <wp:cNvGraphicFramePr>
+              <a:graphicFrameLocks xmlns:a="http://schemas.openxmlformats.org/drawingml/2006/main" noChangeAspect="1"/>
+            </wp:cNvGraphicFramePr>
+            <a:graphic xmlns:a="http://schemas.openxmlformats.org/drawingml/2006/main">
+              <a:graphicData uri="http://schemas.openxmlformats.org/drawingml/2006/picture">
+                <pic:pic xmlns:pic="http://schemas.openxmlformats.org/drawingml/2006/picture">
+                  <pic:nvPicPr>
+                    <pic:cNvPr id="1181218220" name=""/>
+                    <pic:cNvPicPr/>
+                  </pic:nvPicPr>
+                  <pic:blipFill>
+                    <a:blip r:embed="rId32"/>
+                    <a:stretch>
+                      <a:fillRect/>
+                    </a:stretch>
+                  </pic:blipFill>
+                  <pic:spPr>
+                    <a:xfrm>
+                      <a:off x="0" y="0"/>
+                      <a:ext cx="5831573" cy="5670545"/>
+                    </a:xfrm>
+                    <a:prstGeom prst="rect">
+                      <a:avLst/>
+                    </a:prstGeom>
+                  </pic:spPr>
+                </pic:pic>
+              </a:graphicData>
+            </a:graphic>
+          </wp:inline>
+        </w:drawing>
+      </w:r>
+    </w:p>
+    <w:p>
+      <w:pPr>
+        <w:jc w:val="both"/>
+        <w:rPr>
+          <w:rFonts w:ascii="Times New Roman" w:hAnsi="Times New Roman" w:cs="Times New Roman"/>
+          <w:b/>
+          <w:bCs/>
+        </w:rPr>
+      </w:pPr>
+      <w:r>
+        <w:rPr>
+          <w:rFonts w:ascii="Times New Roman" w:hAnsi="Times New Roman" w:cs="Times New Roman"/>
+        </w:rPr>
+        <w:lastRenderedPageBreak/>
+        <w:drawing>
+          <wp:inline distT="0" distB="0" distL="0" distR="0" wp14:anchorId="1975EA29" wp14:editId="7ED33A1F">
+            <wp:extent cx="5908377" cy="5276667"/>
+            <wp:effectExtent l="0" t="0" r="0" b="635"/>
+            <wp:docPr id="1723313413" name="Picture 1"/>
+            <wp:cNvGraphicFramePr>
+              <a:graphicFrameLocks xmlns:a="http://schemas.openxmlformats.org/drawingml/2006/main" noChangeAspect="1"/>
+            </wp:cNvGraphicFramePr>
+            <a:graphic xmlns:a="http://schemas.openxmlformats.org/drawingml/2006/main">
+              <a:graphicData uri="http://schemas.openxmlformats.org/drawingml/2006/picture">
+                <pic:pic xmlns:pic="http://schemas.openxmlformats.org/drawingml/2006/picture">
+                  <pic:nvPicPr>
+                    <pic:cNvPr id="1723313413" name=""/>
+                    <pic:cNvPicPr/>
+                  </pic:nvPicPr>
+                  <pic:blipFill>
+                    <a:blip r:embed="rId33"/>
+                    <a:stretch>
+                      <a:fillRect/>
+                    </a:stretch>
+                  </pic:blipFill>
+                  <pic:spPr>
+                    <a:xfrm>
+                      <a:off x="0" y="0"/>
+                      <a:ext cx="5912775" cy="5280594"/>
+                    </a:xfrm>
+                    <a:prstGeom prst="rect">
+                      <a:avLst/>
+                    </a:prstGeom>
+                  </pic:spPr>
+                </pic:pic>
+              </a:graphicData>
+            </a:graphic>
+          </wp:inline>
+        </w:drawing>
+      </w:r>
+    </w:p>
+    <w:p>
+      <w:pPr>
+        <w:jc w:val="both"/>
+        <w:rPr>
+          <w:rFonts w:ascii="Times New Roman" w:hAnsi="Times New Roman" w:cs="Times New Roman"/>
+          <w:b/>
+          <w:bCs/>
+        </w:rPr>
+      </w:pPr>
+      <w:r>
+        <w:rPr>
+          <w:rFonts w:ascii="Times New Roman" w:hAnsi="Times New Roman" w:cs="Times New Roman"/>
+        </w:rPr>
+        <w:drawing>
+          <wp:inline distT="0" distB="0" distL="0" distR="0" wp14:anchorId="5D022112" wp14:editId="12BE1AEC">
+            <wp:extent cx="3866342" cy="1275143"/>
+            <wp:effectExtent l="0" t="0" r="1270" b="1270"/>
+            <wp:docPr id="772589395" name="Picture 1"/>
+            <wp:cNvGraphicFramePr>
+              <a:graphicFrameLocks xmlns:a="http://schemas.openxmlformats.org/drawingml/2006/main" noChangeAspect="1"/>
+            </wp:cNvGraphicFramePr>
+            <a:graphic xmlns:a="http://schemas.openxmlformats.org/drawingml/2006/main">
+              <a:graphicData uri="http://schemas.openxmlformats.org/drawingml/2006/picture">
+                <pic:pic xmlns:pic="http://schemas.openxmlformats.org/drawingml/2006/picture">
+                  <pic:nvPicPr>
+                    <pic:cNvPr id="772589395" name=""/>
+                    <pic:cNvPicPr/>
+                  </pic:nvPicPr>
+                  <pic:blipFill>
+                    <a:blip r:embed="rId34"/>
+                    <a:stretch>
+                      <a:fillRect/>
+                    </a:stretch>
+                  </pic:blipFill>
+                  <pic:spPr>
+                    <a:xfrm>
+                      <a:off x="0" y="0"/>
+                      <a:ext cx="3881209" cy="1280046"/>
+                    </a:xfrm>
+                    <a:prstGeom prst="rect">
+                      <a:avLst/>
+                    </a:prstGeom>
+                  </pic:spPr>
+                </pic:pic>
+              </a:graphicData>
+            </a:graphic>
+          </wp:inline>
+        </w:drawing>
+      </w:r>
+    </w:p>
+    <w:p>
+      <w:pPr>
+        <w:jc w:val="both"/>
+        <w:rPr>
+          <w:rFonts w:ascii="Times New Roman" w:hAnsi="Times New Roman" w:cs="Times New Roman"/>
+          <w:bCs/>
+        </w:rPr>
+      </w:pPr>
+      <w:r>
+        <w:rPr>
+          <w:rFonts w:ascii="Times New Roman" w:hAnsi="Times New Roman" w:cs="Times New Roman"/>
+        </w:rPr>
+        <w:drawing>
+          <wp:inline distT="0" distB="0" distL="0" distR="0" wp14:anchorId="4DA9EAEB" wp14:editId="497E3471">
+            <wp:extent cx="5971734" cy="1843557"/>
+            <wp:effectExtent l="0" t="0" r="0" b="4445"/>
+            <wp:docPr id="1105814512" name="Picture 1"/>
+            <wp:cNvGraphicFramePr>
+              <a:graphicFrameLocks xmlns:a="http://schemas.openxmlformats.org/drawingml/2006/main" noChangeAspect="1"/>
+            </wp:cNvGraphicFramePr>
+            <a:graphic xmlns:a="http://schemas.openxmlformats.org/drawingml/2006/main">
+              <a:graphicData uri="http://schemas.openxmlformats.org/drawingml/2006/picture">
+                <pic:pic xmlns:pic="http://schemas.openxmlformats.org/drawingml/2006/picture">
+                  <pic:nvPicPr>
+                    <pic:cNvPr id="1105814512" name=""/>
+                    <pic:cNvPicPr/>
+                  </pic:nvPicPr>
+                  <pic:blipFill>
+                    <a:blip r:embed="rId35"/>
+                    <a:stretch>
+                      <a:fillRect/>
+                    </a:stretch>
+                  </pic:blipFill>
+                  <pic:spPr>
+                    <a:xfrm>
+                      <a:off x="0" y="0"/>
+                      <a:ext cx="5983723" cy="1847258"/>
+                    </a:xfrm>
+                    <a:prstGeom prst="rect">
+                      <a:avLst/>
+                    </a:prstGeom>
+                  </pic:spPr>
+                </pic:pic>
+              </a:graphicData>
+            </a:graphic>
+          </wp:inline>
+        </w:drawing>
+      </w:r>
+      <w:r>
+        <w:rPr>
+          <w:rFonts w:ascii="Times New Roman" w:hAnsi="Times New Roman" w:cs="Times New Roman"/>
+        </w:rPr>
+        <w:br/>
+      </w:r>
+      <w:r>
+        <w:rPr>
+          <w:rFonts w:ascii="Times New Roman" w:hAnsi="Times New Roman" w:cs="Times New Roman"/>
+          <w:b/>
+          <w:bCs/>
+        </w:rPr>
         <w:t>Description:</w:t>
       </w:r>
       <w:r>
@@ -13391,6 +14642,79 @@
           <w:rFonts w:ascii="Times New Roman" w:hAnsi="Times New Roman" w:cs="Times New Roman"/>
         </w:rPr>
         <w:t xml:space="preserve"> </w:t>
+      </w:r>
+      <w:r>
+        <w:rPr>
+          <w:rFonts w:ascii="Times New Roman" w:hAnsi="Times New Roman" w:cs="Times New Roman"/>
+        </w:rPr>
+        <w:t>Day 10 I have</w:t>
+      </w:r>
+      <w:r>
+        <w:rPr>
+          <w:rFonts w:ascii="Times New Roman" w:hAnsi="Times New Roman" w:cs="Times New Roman"/>
+        </w:rPr>
+        <w:t xml:space="preserve"> mak</w:t>
+      </w:r>
+      <w:r>
+        <w:rPr>
+          <w:rFonts w:ascii="Times New Roman" w:hAnsi="Times New Roman" w:cs="Times New Roman"/>
+        </w:rPr>
+        <w:t>e</w:t>
+      </w:r>
+      <w:r>
+        <w:rPr>
+          <w:rFonts w:ascii="Times New Roman" w:hAnsi="Times New Roman" w:cs="Times New Roman"/>
+        </w:rPr>
+        <w:t xml:space="preserve"> LOGGUARD real-time. The goal is to stop refreshing and start streaming. First, we’ll connect the frontend and backend with Socket.io so that the moment a new log is uploaded or a test alert is triggered, it instantly appears at the top of the table without reloading the page. We already added the filter buttons and </w:t>
+      </w:r>
+      <w:proofErr w:type="spellStart"/>
+      <w:r>
+        <w:rPr>
+          <w:rFonts w:ascii="Times New Roman" w:hAnsi="Times New Roman" w:cs="Times New Roman"/>
+        </w:rPr>
+        <w:t>colored</w:t>
+      </w:r>
+      <w:proofErr w:type="spellEnd"/>
+      <w:r>
+        <w:rPr>
+          <w:rFonts w:ascii="Times New Roman" w:hAnsi="Times New Roman" w:cs="Times New Roman"/>
+        </w:rPr>
+        <w:t xml:space="preserve"> badges yesterday, so now we’ll make those filters work on the live incoming logs too. Next, we’ll upgrade the Dashboard cards so "Critical Errors" and "System Health" automatically </w:t>
+      </w:r>
+      <w:r>
+        <w:rPr>
+          <w:rFonts w:ascii="Times New Roman" w:hAnsi="Times New Roman" w:cs="Times New Roman"/>
+        </w:rPr>
+        <w:lastRenderedPageBreak/>
+        <w:t>recalculate whenever a new log comes in, with a small animation to show the number change. We’ll also polish the UX by switching timestamps from raw ISO to "2s ago" format and adding auto-</w:t>
+      </w:r>
+      <w:proofErr w:type="gramStart"/>
+      <w:r>
+        <w:rPr>
+          <w:rFonts w:ascii="Times New Roman" w:hAnsi="Times New Roman" w:cs="Times New Roman"/>
+        </w:rPr>
+        <w:t>scroll</w:t>
+      </w:r>
+      <w:proofErr w:type="gramEnd"/>
+      <w:r>
+        <w:rPr>
+          <w:rFonts w:ascii="Times New Roman" w:hAnsi="Times New Roman" w:cs="Times New Roman"/>
+        </w:rPr>
+        <w:t xml:space="preserve"> so the newest log is always visible. By the end of today, your dashboard will feel like Datadog or Sentry — live, reactive, and </w:t>
+      </w:r>
+      <w:proofErr w:type="gramStart"/>
+      <w:r>
+        <w:rPr>
+          <w:rFonts w:ascii="Times New Roman" w:hAnsi="Times New Roman" w:cs="Times New Roman"/>
+        </w:rPr>
+        <w:t>actually watching</w:t>
+      </w:r>
+      <w:proofErr w:type="gramEnd"/>
+      <w:r>
+        <w:rPr>
+          <w:rFonts w:ascii="Times New Roman" w:hAnsi="Times New Roman" w:cs="Times New Roman"/>
+        </w:rPr>
+        <w:t xml:space="preserve"> your system in real time.</w:t>
       </w:r>
     </w:p>
     <w:p>
@@ -13754,6 +15078,119 @@
     </w:lvl>
   </w:abstractNum>
   <w:abstractNum w:abstractNumId="3" w15:restartNumberingAfterBreak="0">
+    <w:nsid w:val="052177F5"/>
+    <w:multiLevelType w:val="hybridMultilevel"/>
+    <w:tmpl w:val="64547DC4"/>
+    <w:lvl w:ilvl="0" w:tplc="4009000B">
+      <w:start w:val="1"/>
+      <w:numFmt w:val="bullet"/>
+      <w:lvlText w:val=""/>
+      <w:lvlJc w:val="left"/>
+      <w:pPr>
+        <w:ind w:left="1120" w:hanging="360"/>
+      </w:pPr>
+      <w:rPr>
+        <w:rFonts w:ascii="Wingdings" w:hAnsi="Wingdings" w:hint="default"/>
+      </w:rPr>
+    </w:lvl>
+    <w:lvl w:ilvl="1" w:tplc="40090003" w:tentative="1">
+      <w:start w:val="1"/>
+      <w:numFmt w:val="bullet"/>
+      <w:lvlText w:val="o"/>
+      <w:lvlJc w:val="left"/>
+      <w:pPr>
+        <w:ind w:left="1840" w:hanging="360"/>
+      </w:pPr>
+      <w:rPr>
+        <w:rFonts w:ascii="Courier New" w:hAnsi="Courier New" w:cs="Courier New" w:hint="default"/>
+      </w:rPr>
+    </w:lvl>
+    <w:lvl w:ilvl="2" w:tplc="40090005" w:tentative="1">
+      <w:start w:val="1"/>
+      <w:numFmt w:val="bullet"/>
+      <w:lvlText w:val=""/>
+      <w:lvlJc w:val="left"/>
+      <w:pPr>
+        <w:ind w:left="2560" w:hanging="360"/>
+      </w:pPr>
+      <w:rPr>
+        <w:rFonts w:ascii="Wingdings" w:hAnsi="Wingdings" w:hint="default"/>
+      </w:rPr>
+    </w:lvl>
+    <w:lvl w:ilvl="3" w:tplc="40090001" w:tentative="1">
+      <w:start w:val="1"/>
+      <w:numFmt w:val="bullet"/>
+      <w:lvlText w:val=""/>
+      <w:lvlJc w:val="left"/>
+      <w:pPr>
+        <w:ind w:left="3280" w:hanging="360"/>
+      </w:pPr>
+      <w:rPr>
+        <w:rFonts w:ascii="Symbol" w:hAnsi="Symbol" w:hint="default"/>
+      </w:rPr>
+    </w:lvl>
+    <w:lvl w:ilvl="4" w:tplc="40090003" w:tentative="1">
+      <w:start w:val="1"/>
+      <w:numFmt w:val="bullet"/>
+      <w:lvlText w:val="o"/>
+      <w:lvlJc w:val="left"/>
+      <w:pPr>
+        <w:ind w:left="4000" w:hanging="360"/>
+      </w:pPr>
+      <w:rPr>
+        <w:rFonts w:ascii="Courier New" w:hAnsi="Courier New" w:cs="Courier New" w:hint="default"/>
+      </w:rPr>
+    </w:lvl>
+    <w:lvl w:ilvl="5" w:tplc="40090005" w:tentative="1">
+      <w:start w:val="1"/>
+      <w:numFmt w:val="bullet"/>
+      <w:lvlText w:val=""/>
+      <w:lvlJc w:val="left"/>
+      <w:pPr>
+        <w:ind w:left="4720" w:hanging="360"/>
+      </w:pPr>
+      <w:rPr>
+        <w:rFonts w:ascii="Wingdings" w:hAnsi="Wingdings" w:hint="default"/>
+      </w:rPr>
+    </w:lvl>
+    <w:lvl w:ilvl="6" w:tplc="40090001" w:tentative="1">
+      <w:start w:val="1"/>
+      <w:numFmt w:val="bullet"/>
+      <w:lvlText w:val=""/>
+      <w:lvlJc w:val="left"/>
+      <w:pPr>
+        <w:ind w:left="5440" w:hanging="360"/>
+      </w:pPr>
+      <w:rPr>
+        <w:rFonts w:ascii="Symbol" w:hAnsi="Symbol" w:hint="default"/>
+      </w:rPr>
+    </w:lvl>
+    <w:lvl w:ilvl="7" w:tplc="40090003" w:tentative="1">
+      <w:start w:val="1"/>
+      <w:numFmt w:val="bullet"/>
+      <w:lvlText w:val="o"/>
+      <w:lvlJc w:val="left"/>
+      <w:pPr>
+        <w:ind w:left="6160" w:hanging="360"/>
+      </w:pPr>
+      <w:rPr>
+        <w:rFonts w:ascii="Courier New" w:hAnsi="Courier New" w:cs="Courier New" w:hint="default"/>
+      </w:rPr>
+    </w:lvl>
+    <w:lvl w:ilvl="8" w:tplc="40090005" w:tentative="1">
+      <w:start w:val="1"/>
+      <w:numFmt w:val="bullet"/>
+      <w:lvlText w:val=""/>
+      <w:lvlJc w:val="left"/>
+      <w:pPr>
+        <w:ind w:left="6880" w:hanging="360"/>
+      </w:pPr>
+      <w:rPr>
+        <w:rFonts w:ascii="Wingdings" w:hAnsi="Wingdings" w:hint="default"/>
+      </w:rPr>
+    </w:lvl>
+  </w:abstractNum>
+  <w:abstractNum w:abstractNumId="4" w15:restartNumberingAfterBreak="0">
     <w:nsid w:val="05456703"/>
     <w:multiLevelType w:val="hybridMultilevel"/>
     <w:tmpl w:val="CC321F82"/>
@@ -13866,7 +15303,7 @@
       </w:rPr>
     </w:lvl>
   </w:abstractNum>
-  <w:abstractNum w:abstractNumId="4" w15:restartNumberingAfterBreak="0">
+  <w:abstractNum w:abstractNumId="5" w15:restartNumberingAfterBreak="0">
     <w:nsid w:val="054E4236"/>
     <w:multiLevelType w:val="hybridMultilevel"/>
     <w:tmpl w:val="A824F1FE"/>
@@ -13979,7 +15416,7 @@
       </w:rPr>
     </w:lvl>
   </w:abstractNum>
-  <w:abstractNum w:abstractNumId="5" w15:restartNumberingAfterBreak="0">
+  <w:abstractNum w:abstractNumId="6" w15:restartNumberingAfterBreak="0">
     <w:nsid w:val="06133A7A"/>
     <w:multiLevelType w:val="hybridMultilevel"/>
     <w:tmpl w:val="53788F08"/>
@@ -14088,7 +15525,7 @@
       </w:pPr>
     </w:lvl>
   </w:abstractNum>
-  <w:abstractNum w:abstractNumId="6" w15:restartNumberingAfterBreak="0">
+  <w:abstractNum w:abstractNumId="7" w15:restartNumberingAfterBreak="0">
     <w:nsid w:val="080A1290"/>
     <w:multiLevelType w:val="hybridMultilevel"/>
     <w:tmpl w:val="A330DFE0"/>
@@ -14201,7 +15638,120 @@
       </w:rPr>
     </w:lvl>
   </w:abstractNum>
-  <w:abstractNum w:abstractNumId="7" w15:restartNumberingAfterBreak="0">
+  <w:abstractNum w:abstractNumId="8" w15:restartNumberingAfterBreak="0">
+    <w:nsid w:val="0A52183A"/>
+    <w:multiLevelType w:val="hybridMultilevel"/>
+    <w:tmpl w:val="5FB29E90"/>
+    <w:lvl w:ilvl="0" w:tplc="4009000B">
+      <w:start w:val="1"/>
+      <w:numFmt w:val="bullet"/>
+      <w:lvlText w:val=""/>
+      <w:lvlJc w:val="left"/>
+      <w:pPr>
+        <w:ind w:left="1120" w:hanging="360"/>
+      </w:pPr>
+      <w:rPr>
+        <w:rFonts w:ascii="Wingdings" w:hAnsi="Wingdings" w:hint="default"/>
+      </w:rPr>
+    </w:lvl>
+    <w:lvl w:ilvl="1" w:tplc="40090003" w:tentative="1">
+      <w:start w:val="1"/>
+      <w:numFmt w:val="bullet"/>
+      <w:lvlText w:val="o"/>
+      <w:lvlJc w:val="left"/>
+      <w:pPr>
+        <w:ind w:left="1840" w:hanging="360"/>
+      </w:pPr>
+      <w:rPr>
+        <w:rFonts w:ascii="Courier New" w:hAnsi="Courier New" w:cs="Courier New" w:hint="default"/>
+      </w:rPr>
+    </w:lvl>
+    <w:lvl w:ilvl="2" w:tplc="40090005" w:tentative="1">
+      <w:start w:val="1"/>
+      <w:numFmt w:val="bullet"/>
+      <w:lvlText w:val=""/>
+      <w:lvlJc w:val="left"/>
+      <w:pPr>
+        <w:ind w:left="2560" w:hanging="360"/>
+      </w:pPr>
+      <w:rPr>
+        <w:rFonts w:ascii="Wingdings" w:hAnsi="Wingdings" w:hint="default"/>
+      </w:rPr>
+    </w:lvl>
+    <w:lvl w:ilvl="3" w:tplc="40090001" w:tentative="1">
+      <w:start w:val="1"/>
+      <w:numFmt w:val="bullet"/>
+      <w:lvlText w:val=""/>
+      <w:lvlJc w:val="left"/>
+      <w:pPr>
+        <w:ind w:left="3280" w:hanging="360"/>
+      </w:pPr>
+      <w:rPr>
+        <w:rFonts w:ascii="Symbol" w:hAnsi="Symbol" w:hint="default"/>
+      </w:rPr>
+    </w:lvl>
+    <w:lvl w:ilvl="4" w:tplc="40090003" w:tentative="1">
+      <w:start w:val="1"/>
+      <w:numFmt w:val="bullet"/>
+      <w:lvlText w:val="o"/>
+      <w:lvlJc w:val="left"/>
+      <w:pPr>
+        <w:ind w:left="4000" w:hanging="360"/>
+      </w:pPr>
+      <w:rPr>
+        <w:rFonts w:ascii="Courier New" w:hAnsi="Courier New" w:cs="Courier New" w:hint="default"/>
+      </w:rPr>
+    </w:lvl>
+    <w:lvl w:ilvl="5" w:tplc="40090005" w:tentative="1">
+      <w:start w:val="1"/>
+      <w:numFmt w:val="bullet"/>
+      <w:lvlText w:val=""/>
+      <w:lvlJc w:val="left"/>
+      <w:pPr>
+        <w:ind w:left="4720" w:hanging="360"/>
+      </w:pPr>
+      <w:rPr>
+        <w:rFonts w:ascii="Wingdings" w:hAnsi="Wingdings" w:hint="default"/>
+      </w:rPr>
+    </w:lvl>
+    <w:lvl w:ilvl="6" w:tplc="40090001" w:tentative="1">
+      <w:start w:val="1"/>
+      <w:numFmt w:val="bullet"/>
+      <w:lvlText w:val=""/>
+      <w:lvlJc w:val="left"/>
+      <w:pPr>
+        <w:ind w:left="5440" w:hanging="360"/>
+      </w:pPr>
+      <w:rPr>
+        <w:rFonts w:ascii="Symbol" w:hAnsi="Symbol" w:hint="default"/>
+      </w:rPr>
+    </w:lvl>
+    <w:lvl w:ilvl="7" w:tplc="40090003" w:tentative="1">
+      <w:start w:val="1"/>
+      <w:numFmt w:val="bullet"/>
+      <w:lvlText w:val="o"/>
+      <w:lvlJc w:val="left"/>
+      <w:pPr>
+        <w:ind w:left="6160" w:hanging="360"/>
+      </w:pPr>
+      <w:rPr>
+        <w:rFonts w:ascii="Courier New" w:hAnsi="Courier New" w:cs="Courier New" w:hint="default"/>
+      </w:rPr>
+    </w:lvl>
+    <w:lvl w:ilvl="8" w:tplc="40090005" w:tentative="1">
+      <w:start w:val="1"/>
+      <w:numFmt w:val="bullet"/>
+      <w:lvlText w:val=""/>
+      <w:lvlJc w:val="left"/>
+      <w:pPr>
+        <w:ind w:left="6880" w:hanging="360"/>
+      </w:pPr>
+      <w:rPr>
+        <w:rFonts w:ascii="Wingdings" w:hAnsi="Wingdings" w:hint="default"/>
+      </w:rPr>
+    </w:lvl>
+  </w:abstractNum>
+  <w:abstractNum w:abstractNumId="9" w15:restartNumberingAfterBreak="0">
     <w:nsid w:val="0CA9725A"/>
     <w:multiLevelType w:val="hybridMultilevel"/>
     <w:tmpl w:val="4DBED244"/>
@@ -14314,10 +15864,10 @@
       </w:rPr>
     </w:lvl>
   </w:abstractNum>
-  <w:abstractNum w:abstractNumId="8" w15:restartNumberingAfterBreak="0">
+  <w:abstractNum w:abstractNumId="10" w15:restartNumberingAfterBreak="0">
     <w:nsid w:val="0D743D1F"/>
     <w:multiLevelType w:val="hybridMultilevel"/>
-    <w:tmpl w:val="2DB280B0"/>
+    <w:tmpl w:val="A1F855A6"/>
     <w:lvl w:ilvl="0" w:tplc="63844C74">
       <w:start w:val="1"/>
       <w:numFmt w:val="bullet"/>
@@ -14423,7 +15973,7 @@
       </w:pPr>
     </w:lvl>
   </w:abstractNum>
-  <w:abstractNum w:abstractNumId="9" w15:restartNumberingAfterBreak="0">
+  <w:abstractNum w:abstractNumId="11" w15:restartNumberingAfterBreak="0">
     <w:nsid w:val="0ED41A8C"/>
     <w:multiLevelType w:val="hybridMultilevel"/>
     <w:tmpl w:val="39BE9BB4"/>
@@ -14536,7 +16086,7 @@
       </w:rPr>
     </w:lvl>
   </w:abstractNum>
-  <w:abstractNum w:abstractNumId="10" w15:restartNumberingAfterBreak="0">
+  <w:abstractNum w:abstractNumId="12" w15:restartNumberingAfterBreak="0">
     <w:nsid w:val="0F7D6AA2"/>
     <w:multiLevelType w:val="hybridMultilevel"/>
     <w:tmpl w:val="1E34183E"/>
@@ -14649,7 +16199,7 @@
       </w:rPr>
     </w:lvl>
   </w:abstractNum>
-  <w:abstractNum w:abstractNumId="11" w15:restartNumberingAfterBreak="0">
+  <w:abstractNum w:abstractNumId="13" w15:restartNumberingAfterBreak="0">
     <w:nsid w:val="10E977AF"/>
     <w:multiLevelType w:val="hybridMultilevel"/>
     <w:tmpl w:val="A91AFD52"/>
@@ -14762,7 +16312,7 @@
       </w:rPr>
     </w:lvl>
   </w:abstractNum>
-  <w:abstractNum w:abstractNumId="12" w15:restartNumberingAfterBreak="0">
+  <w:abstractNum w:abstractNumId="14" w15:restartNumberingAfterBreak="0">
     <w:nsid w:val="110C1F0A"/>
     <w:multiLevelType w:val="hybridMultilevel"/>
     <w:tmpl w:val="12800908"/>
@@ -14875,7 +16425,7 @@
       </w:rPr>
     </w:lvl>
   </w:abstractNum>
-  <w:abstractNum w:abstractNumId="13" w15:restartNumberingAfterBreak="0">
+  <w:abstractNum w:abstractNumId="15" w15:restartNumberingAfterBreak="0">
     <w:nsid w:val="11E40B49"/>
     <w:multiLevelType w:val="hybridMultilevel"/>
     <w:tmpl w:val="3B14F05C"/>
@@ -14988,7 +16538,7 @@
       </w:rPr>
     </w:lvl>
   </w:abstractNum>
-  <w:abstractNum w:abstractNumId="14" w15:restartNumberingAfterBreak="0">
+  <w:abstractNum w:abstractNumId="16" w15:restartNumberingAfterBreak="0">
     <w:nsid w:val="12D534F3"/>
     <w:multiLevelType w:val="hybridMultilevel"/>
     <w:tmpl w:val="6D9A2CFE"/>
@@ -15101,7 +16651,7 @@
       </w:rPr>
     </w:lvl>
   </w:abstractNum>
-  <w:abstractNum w:abstractNumId="15" w15:restartNumberingAfterBreak="0">
+  <w:abstractNum w:abstractNumId="17" w15:restartNumberingAfterBreak="0">
     <w:nsid w:val="13AA0395"/>
     <w:multiLevelType w:val="hybridMultilevel"/>
     <w:tmpl w:val="41421288"/>
@@ -15214,7 +16764,7 @@
       </w:rPr>
     </w:lvl>
   </w:abstractNum>
-  <w:abstractNum w:abstractNumId="16" w15:restartNumberingAfterBreak="0">
+  <w:abstractNum w:abstractNumId="18" w15:restartNumberingAfterBreak="0">
     <w:nsid w:val="14175B67"/>
     <w:multiLevelType w:val="hybridMultilevel"/>
     <w:tmpl w:val="776493DA"/>
@@ -15323,7 +16873,120 @@
       </w:pPr>
     </w:lvl>
   </w:abstractNum>
-  <w:abstractNum w:abstractNumId="17" w15:restartNumberingAfterBreak="0">
+  <w:abstractNum w:abstractNumId="19" w15:restartNumberingAfterBreak="0">
+    <w:nsid w:val="17096475"/>
+    <w:multiLevelType w:val="hybridMultilevel"/>
+    <w:tmpl w:val="577CBEB0"/>
+    <w:lvl w:ilvl="0" w:tplc="4009000B">
+      <w:start w:val="1"/>
+      <w:numFmt w:val="bullet"/>
+      <w:lvlText w:val=""/>
+      <w:lvlJc w:val="left"/>
+      <w:pPr>
+        <w:ind w:left="1120" w:hanging="360"/>
+      </w:pPr>
+      <w:rPr>
+        <w:rFonts w:ascii="Wingdings" w:hAnsi="Wingdings" w:hint="default"/>
+      </w:rPr>
+    </w:lvl>
+    <w:lvl w:ilvl="1" w:tplc="40090003" w:tentative="1">
+      <w:start w:val="1"/>
+      <w:numFmt w:val="bullet"/>
+      <w:lvlText w:val="o"/>
+      <w:lvlJc w:val="left"/>
+      <w:pPr>
+        <w:ind w:left="1840" w:hanging="360"/>
+      </w:pPr>
+      <w:rPr>
+        <w:rFonts w:ascii="Courier New" w:hAnsi="Courier New" w:cs="Courier New" w:hint="default"/>
+      </w:rPr>
+    </w:lvl>
+    <w:lvl w:ilvl="2" w:tplc="40090005" w:tentative="1">
+      <w:start w:val="1"/>
+      <w:numFmt w:val="bullet"/>
+      <w:lvlText w:val=""/>
+      <w:lvlJc w:val="left"/>
+      <w:pPr>
+        <w:ind w:left="2560" w:hanging="360"/>
+      </w:pPr>
+      <w:rPr>
+        <w:rFonts w:ascii="Wingdings" w:hAnsi="Wingdings" w:hint="default"/>
+      </w:rPr>
+    </w:lvl>
+    <w:lvl w:ilvl="3" w:tplc="40090001" w:tentative="1">
+      <w:start w:val="1"/>
+      <w:numFmt w:val="bullet"/>
+      <w:lvlText w:val=""/>
+      <w:lvlJc w:val="left"/>
+      <w:pPr>
+        <w:ind w:left="3280" w:hanging="360"/>
+      </w:pPr>
+      <w:rPr>
+        <w:rFonts w:ascii="Symbol" w:hAnsi="Symbol" w:hint="default"/>
+      </w:rPr>
+    </w:lvl>
+    <w:lvl w:ilvl="4" w:tplc="40090003" w:tentative="1">
+      <w:start w:val="1"/>
+      <w:numFmt w:val="bullet"/>
+      <w:lvlText w:val="o"/>
+      <w:lvlJc w:val="left"/>
+      <w:pPr>
+        <w:ind w:left="4000" w:hanging="360"/>
+      </w:pPr>
+      <w:rPr>
+        <w:rFonts w:ascii="Courier New" w:hAnsi="Courier New" w:cs="Courier New" w:hint="default"/>
+      </w:rPr>
+    </w:lvl>
+    <w:lvl w:ilvl="5" w:tplc="40090005" w:tentative="1">
+      <w:start w:val="1"/>
+      <w:numFmt w:val="bullet"/>
+      <w:lvlText w:val=""/>
+      <w:lvlJc w:val="left"/>
+      <w:pPr>
+        <w:ind w:left="4720" w:hanging="360"/>
+      </w:pPr>
+      <w:rPr>
+        <w:rFonts w:ascii="Wingdings" w:hAnsi="Wingdings" w:hint="default"/>
+      </w:rPr>
+    </w:lvl>
+    <w:lvl w:ilvl="6" w:tplc="40090001" w:tentative="1">
+      <w:start w:val="1"/>
+      <w:numFmt w:val="bullet"/>
+      <w:lvlText w:val=""/>
+      <w:lvlJc w:val="left"/>
+      <w:pPr>
+        <w:ind w:left="5440" w:hanging="360"/>
+      </w:pPr>
+      <w:rPr>
+        <w:rFonts w:ascii="Symbol" w:hAnsi="Symbol" w:hint="default"/>
+      </w:rPr>
+    </w:lvl>
+    <w:lvl w:ilvl="7" w:tplc="40090003" w:tentative="1">
+      <w:start w:val="1"/>
+      <w:numFmt w:val="bullet"/>
+      <w:lvlText w:val="o"/>
+      <w:lvlJc w:val="left"/>
+      <w:pPr>
+        <w:ind w:left="6160" w:hanging="360"/>
+      </w:pPr>
+      <w:rPr>
+        <w:rFonts w:ascii="Courier New" w:hAnsi="Courier New" w:cs="Courier New" w:hint="default"/>
+      </w:rPr>
+    </w:lvl>
+    <w:lvl w:ilvl="8" w:tplc="40090005" w:tentative="1">
+      <w:start w:val="1"/>
+      <w:numFmt w:val="bullet"/>
+      <w:lvlText w:val=""/>
+      <w:lvlJc w:val="left"/>
+      <w:pPr>
+        <w:ind w:left="6880" w:hanging="360"/>
+      </w:pPr>
+      <w:rPr>
+        <w:rFonts w:ascii="Wingdings" w:hAnsi="Wingdings" w:hint="default"/>
+      </w:rPr>
+    </w:lvl>
+  </w:abstractNum>
+  <w:abstractNum w:abstractNumId="20" w15:restartNumberingAfterBreak="0">
     <w:nsid w:val="191168A3"/>
     <w:multiLevelType w:val="hybridMultilevel"/>
     <w:tmpl w:val="0DB2DA64"/>
@@ -15436,7 +17099,7 @@
       </w:rPr>
     </w:lvl>
   </w:abstractNum>
-  <w:abstractNum w:abstractNumId="18" w15:restartNumberingAfterBreak="0">
+  <w:abstractNum w:abstractNumId="21" w15:restartNumberingAfterBreak="0">
     <w:nsid w:val="1CA516B8"/>
     <w:multiLevelType w:val="hybridMultilevel"/>
     <w:tmpl w:val="9A042BF6"/>
@@ -15549,7 +17212,120 @@
       </w:rPr>
     </w:lvl>
   </w:abstractNum>
-  <w:abstractNum w:abstractNumId="19" w15:restartNumberingAfterBreak="0">
+  <w:abstractNum w:abstractNumId="22" w15:restartNumberingAfterBreak="0">
+    <w:nsid w:val="1D644E5C"/>
+    <w:multiLevelType w:val="hybridMultilevel"/>
+    <w:tmpl w:val="A7BC5C5E"/>
+    <w:lvl w:ilvl="0" w:tplc="4009000B">
+      <w:start w:val="1"/>
+      <w:numFmt w:val="bullet"/>
+      <w:lvlText w:val=""/>
+      <w:lvlJc w:val="left"/>
+      <w:pPr>
+        <w:ind w:left="1120" w:hanging="360"/>
+      </w:pPr>
+      <w:rPr>
+        <w:rFonts w:ascii="Wingdings" w:hAnsi="Wingdings" w:hint="default"/>
+      </w:rPr>
+    </w:lvl>
+    <w:lvl w:ilvl="1" w:tplc="40090003" w:tentative="1">
+      <w:start w:val="1"/>
+      <w:numFmt w:val="bullet"/>
+      <w:lvlText w:val="o"/>
+      <w:lvlJc w:val="left"/>
+      <w:pPr>
+        <w:ind w:left="1840" w:hanging="360"/>
+      </w:pPr>
+      <w:rPr>
+        <w:rFonts w:ascii="Courier New" w:hAnsi="Courier New" w:cs="Courier New" w:hint="default"/>
+      </w:rPr>
+    </w:lvl>
+    <w:lvl w:ilvl="2" w:tplc="40090005" w:tentative="1">
+      <w:start w:val="1"/>
+      <w:numFmt w:val="bullet"/>
+      <w:lvlText w:val=""/>
+      <w:lvlJc w:val="left"/>
+      <w:pPr>
+        <w:ind w:left="2560" w:hanging="360"/>
+      </w:pPr>
+      <w:rPr>
+        <w:rFonts w:ascii="Wingdings" w:hAnsi="Wingdings" w:hint="default"/>
+      </w:rPr>
+    </w:lvl>
+    <w:lvl w:ilvl="3" w:tplc="40090001" w:tentative="1">
+      <w:start w:val="1"/>
+      <w:numFmt w:val="bullet"/>
+      <w:lvlText w:val=""/>
+      <w:lvlJc w:val="left"/>
+      <w:pPr>
+        <w:ind w:left="3280" w:hanging="360"/>
+      </w:pPr>
+      <w:rPr>
+        <w:rFonts w:ascii="Symbol" w:hAnsi="Symbol" w:hint="default"/>
+      </w:rPr>
+    </w:lvl>
+    <w:lvl w:ilvl="4" w:tplc="40090003" w:tentative="1">
+      <w:start w:val="1"/>
+      <w:numFmt w:val="bullet"/>
+      <w:lvlText w:val="o"/>
+      <w:lvlJc w:val="left"/>
+      <w:pPr>
+        <w:ind w:left="4000" w:hanging="360"/>
+      </w:pPr>
+      <w:rPr>
+        <w:rFonts w:ascii="Courier New" w:hAnsi="Courier New" w:cs="Courier New" w:hint="default"/>
+      </w:rPr>
+    </w:lvl>
+    <w:lvl w:ilvl="5" w:tplc="40090005" w:tentative="1">
+      <w:start w:val="1"/>
+      <w:numFmt w:val="bullet"/>
+      <w:lvlText w:val=""/>
+      <w:lvlJc w:val="left"/>
+      <w:pPr>
+        <w:ind w:left="4720" w:hanging="360"/>
+      </w:pPr>
+      <w:rPr>
+        <w:rFonts w:ascii="Wingdings" w:hAnsi="Wingdings" w:hint="default"/>
+      </w:rPr>
+    </w:lvl>
+    <w:lvl w:ilvl="6" w:tplc="40090001" w:tentative="1">
+      <w:start w:val="1"/>
+      <w:numFmt w:val="bullet"/>
+      <w:lvlText w:val=""/>
+      <w:lvlJc w:val="left"/>
+      <w:pPr>
+        <w:ind w:left="5440" w:hanging="360"/>
+      </w:pPr>
+      <w:rPr>
+        <w:rFonts w:ascii="Symbol" w:hAnsi="Symbol" w:hint="default"/>
+      </w:rPr>
+    </w:lvl>
+    <w:lvl w:ilvl="7" w:tplc="40090003" w:tentative="1">
+      <w:start w:val="1"/>
+      <w:numFmt w:val="bullet"/>
+      <w:lvlText w:val="o"/>
+      <w:lvlJc w:val="left"/>
+      <w:pPr>
+        <w:ind w:left="6160" w:hanging="360"/>
+      </w:pPr>
+      <w:rPr>
+        <w:rFonts w:ascii="Courier New" w:hAnsi="Courier New" w:cs="Courier New" w:hint="default"/>
+      </w:rPr>
+    </w:lvl>
+    <w:lvl w:ilvl="8" w:tplc="40090005" w:tentative="1">
+      <w:start w:val="1"/>
+      <w:numFmt w:val="bullet"/>
+      <w:lvlText w:val=""/>
+      <w:lvlJc w:val="left"/>
+      <w:pPr>
+        <w:ind w:left="6880" w:hanging="360"/>
+      </w:pPr>
+      <w:rPr>
+        <w:rFonts w:ascii="Wingdings" w:hAnsi="Wingdings" w:hint="default"/>
+      </w:rPr>
+    </w:lvl>
+  </w:abstractNum>
+  <w:abstractNum w:abstractNumId="23" w15:restartNumberingAfterBreak="0">
     <w:nsid w:val="22DB65EA"/>
     <w:multiLevelType w:val="hybridMultilevel"/>
     <w:tmpl w:val="0F7C5664"/>
@@ -15662,7 +17438,7 @@
       </w:rPr>
     </w:lvl>
   </w:abstractNum>
-  <w:abstractNum w:abstractNumId="20" w15:restartNumberingAfterBreak="0">
+  <w:abstractNum w:abstractNumId="24" w15:restartNumberingAfterBreak="0">
     <w:nsid w:val="232628BC"/>
     <w:multiLevelType w:val="hybridMultilevel"/>
     <w:tmpl w:val="BB22A51E"/>
@@ -15775,7 +17551,120 @@
       </w:rPr>
     </w:lvl>
   </w:abstractNum>
-  <w:abstractNum w:abstractNumId="21" w15:restartNumberingAfterBreak="0">
+  <w:abstractNum w:abstractNumId="25" w15:restartNumberingAfterBreak="0">
+    <w:nsid w:val="23F9362A"/>
+    <w:multiLevelType w:val="hybridMultilevel"/>
+    <w:tmpl w:val="52B691FA"/>
+    <w:lvl w:ilvl="0" w:tplc="4009000B">
+      <w:start w:val="1"/>
+      <w:numFmt w:val="bullet"/>
+      <w:lvlText w:val=""/>
+      <w:lvlJc w:val="left"/>
+      <w:pPr>
+        <w:ind w:left="1120" w:hanging="360"/>
+      </w:pPr>
+      <w:rPr>
+        <w:rFonts w:ascii="Wingdings" w:hAnsi="Wingdings" w:hint="default"/>
+      </w:rPr>
+    </w:lvl>
+    <w:lvl w:ilvl="1" w:tplc="40090003" w:tentative="1">
+      <w:start w:val="1"/>
+      <w:numFmt w:val="bullet"/>
+      <w:lvlText w:val="o"/>
+      <w:lvlJc w:val="left"/>
+      <w:pPr>
+        <w:ind w:left="1840" w:hanging="360"/>
+      </w:pPr>
+      <w:rPr>
+        <w:rFonts w:ascii="Courier New" w:hAnsi="Courier New" w:cs="Courier New" w:hint="default"/>
+      </w:rPr>
+    </w:lvl>
+    <w:lvl w:ilvl="2" w:tplc="40090005" w:tentative="1">
+      <w:start w:val="1"/>
+      <w:numFmt w:val="bullet"/>
+      <w:lvlText w:val=""/>
+      <w:lvlJc w:val="left"/>
+      <w:pPr>
+        <w:ind w:left="2560" w:hanging="360"/>
+      </w:pPr>
+      <w:rPr>
+        <w:rFonts w:ascii="Wingdings" w:hAnsi="Wingdings" w:hint="default"/>
+      </w:rPr>
+    </w:lvl>
+    <w:lvl w:ilvl="3" w:tplc="40090001" w:tentative="1">
+      <w:start w:val="1"/>
+      <w:numFmt w:val="bullet"/>
+      <w:lvlText w:val=""/>
+      <w:lvlJc w:val="left"/>
+      <w:pPr>
+        <w:ind w:left="3280" w:hanging="360"/>
+      </w:pPr>
+      <w:rPr>
+        <w:rFonts w:ascii="Symbol" w:hAnsi="Symbol" w:hint="default"/>
+      </w:rPr>
+    </w:lvl>
+    <w:lvl w:ilvl="4" w:tplc="40090003" w:tentative="1">
+      <w:start w:val="1"/>
+      <w:numFmt w:val="bullet"/>
+      <w:lvlText w:val="o"/>
+      <w:lvlJc w:val="left"/>
+      <w:pPr>
+        <w:ind w:left="4000" w:hanging="360"/>
+      </w:pPr>
+      <w:rPr>
+        <w:rFonts w:ascii="Courier New" w:hAnsi="Courier New" w:cs="Courier New" w:hint="default"/>
+      </w:rPr>
+    </w:lvl>
+    <w:lvl w:ilvl="5" w:tplc="40090005" w:tentative="1">
+      <w:start w:val="1"/>
+      <w:numFmt w:val="bullet"/>
+      <w:lvlText w:val=""/>
+      <w:lvlJc w:val="left"/>
+      <w:pPr>
+        <w:ind w:left="4720" w:hanging="360"/>
+      </w:pPr>
+      <w:rPr>
+        <w:rFonts w:ascii="Wingdings" w:hAnsi="Wingdings" w:hint="default"/>
+      </w:rPr>
+    </w:lvl>
+    <w:lvl w:ilvl="6" w:tplc="40090001" w:tentative="1">
+      <w:start w:val="1"/>
+      <w:numFmt w:val="bullet"/>
+      <w:lvlText w:val=""/>
+      <w:lvlJc w:val="left"/>
+      <w:pPr>
+        <w:ind w:left="5440" w:hanging="360"/>
+      </w:pPr>
+      <w:rPr>
+        <w:rFonts w:ascii="Symbol" w:hAnsi="Symbol" w:hint="default"/>
+      </w:rPr>
+    </w:lvl>
+    <w:lvl w:ilvl="7" w:tplc="40090003" w:tentative="1">
+      <w:start w:val="1"/>
+      <w:numFmt w:val="bullet"/>
+      <w:lvlText w:val="o"/>
+      <w:lvlJc w:val="left"/>
+      <w:pPr>
+        <w:ind w:left="6160" w:hanging="360"/>
+      </w:pPr>
+      <w:rPr>
+        <w:rFonts w:ascii="Courier New" w:hAnsi="Courier New" w:cs="Courier New" w:hint="default"/>
+      </w:rPr>
+    </w:lvl>
+    <w:lvl w:ilvl="8" w:tplc="40090005" w:tentative="1">
+      <w:start w:val="1"/>
+      <w:numFmt w:val="bullet"/>
+      <w:lvlText w:val=""/>
+      <w:lvlJc w:val="left"/>
+      <w:pPr>
+        <w:ind w:left="6880" w:hanging="360"/>
+      </w:pPr>
+      <w:rPr>
+        <w:rFonts w:ascii="Wingdings" w:hAnsi="Wingdings" w:hint="default"/>
+      </w:rPr>
+    </w:lvl>
+  </w:abstractNum>
+  <w:abstractNum w:abstractNumId="26" w15:restartNumberingAfterBreak="0">
     <w:nsid w:val="244E0056"/>
     <w:multiLevelType w:val="hybridMultilevel"/>
     <w:tmpl w:val="0DFAAEE2"/>
@@ -15888,7 +17777,7 @@
       </w:rPr>
     </w:lvl>
   </w:abstractNum>
-  <w:abstractNum w:abstractNumId="22" w15:restartNumberingAfterBreak="0">
+  <w:abstractNum w:abstractNumId="27" w15:restartNumberingAfterBreak="0">
     <w:nsid w:val="260B2D54"/>
     <w:multiLevelType w:val="hybridMultilevel"/>
     <w:tmpl w:val="3B3CBCFA"/>
@@ -16001,7 +17890,7 @@
       </w:rPr>
     </w:lvl>
   </w:abstractNum>
-  <w:abstractNum w:abstractNumId="23" w15:restartNumberingAfterBreak="0">
+  <w:abstractNum w:abstractNumId="28" w15:restartNumberingAfterBreak="0">
     <w:nsid w:val="264859EB"/>
     <w:multiLevelType w:val="hybridMultilevel"/>
     <w:tmpl w:val="9976F274"/>
@@ -16114,7 +18003,7 @@
       </w:rPr>
     </w:lvl>
   </w:abstractNum>
-  <w:abstractNum w:abstractNumId="24" w15:restartNumberingAfterBreak="0">
+  <w:abstractNum w:abstractNumId="29" w15:restartNumberingAfterBreak="0">
     <w:nsid w:val="2CD07219"/>
     <w:multiLevelType w:val="hybridMultilevel"/>
     <w:tmpl w:val="F028F0C2"/>
@@ -16227,7 +18116,7 @@
       </w:rPr>
     </w:lvl>
   </w:abstractNum>
-  <w:abstractNum w:abstractNumId="25" w15:restartNumberingAfterBreak="0">
+  <w:abstractNum w:abstractNumId="30" w15:restartNumberingAfterBreak="0">
     <w:nsid w:val="2E5E01CB"/>
     <w:multiLevelType w:val="hybridMultilevel"/>
     <w:tmpl w:val="4E80DCB4"/>
@@ -16340,7 +18229,7 @@
       </w:rPr>
     </w:lvl>
   </w:abstractNum>
-  <w:abstractNum w:abstractNumId="26" w15:restartNumberingAfterBreak="0">
+  <w:abstractNum w:abstractNumId="31" w15:restartNumberingAfterBreak="0">
     <w:nsid w:val="2F325EA5"/>
     <w:multiLevelType w:val="hybridMultilevel"/>
     <w:tmpl w:val="4880CD62"/>
@@ -16453,7 +18342,120 @@
       </w:rPr>
     </w:lvl>
   </w:abstractNum>
-  <w:abstractNum w:abstractNumId="27" w15:restartNumberingAfterBreak="0">
+  <w:abstractNum w:abstractNumId="32" w15:restartNumberingAfterBreak="0">
+    <w:nsid w:val="30B71602"/>
+    <w:multiLevelType w:val="hybridMultilevel"/>
+    <w:tmpl w:val="034275AE"/>
+    <w:lvl w:ilvl="0" w:tplc="4009000B">
+      <w:start w:val="1"/>
+      <w:numFmt w:val="bullet"/>
+      <w:lvlText w:val=""/>
+      <w:lvlJc w:val="left"/>
+      <w:pPr>
+        <w:ind w:left="1120" w:hanging="360"/>
+      </w:pPr>
+      <w:rPr>
+        <w:rFonts w:ascii="Wingdings" w:hAnsi="Wingdings" w:hint="default"/>
+      </w:rPr>
+    </w:lvl>
+    <w:lvl w:ilvl="1" w:tplc="40090003" w:tentative="1">
+      <w:start w:val="1"/>
+      <w:numFmt w:val="bullet"/>
+      <w:lvlText w:val="o"/>
+      <w:lvlJc w:val="left"/>
+      <w:pPr>
+        <w:ind w:left="1840" w:hanging="360"/>
+      </w:pPr>
+      <w:rPr>
+        <w:rFonts w:ascii="Courier New" w:hAnsi="Courier New" w:cs="Courier New" w:hint="default"/>
+      </w:rPr>
+    </w:lvl>
+    <w:lvl w:ilvl="2" w:tplc="40090005" w:tentative="1">
+      <w:start w:val="1"/>
+      <w:numFmt w:val="bullet"/>
+      <w:lvlText w:val=""/>
+      <w:lvlJc w:val="left"/>
+      <w:pPr>
+        <w:ind w:left="2560" w:hanging="360"/>
+      </w:pPr>
+      <w:rPr>
+        <w:rFonts w:ascii="Wingdings" w:hAnsi="Wingdings" w:hint="default"/>
+      </w:rPr>
+    </w:lvl>
+    <w:lvl w:ilvl="3" w:tplc="40090001" w:tentative="1">
+      <w:start w:val="1"/>
+      <w:numFmt w:val="bullet"/>
+      <w:lvlText w:val=""/>
+      <w:lvlJc w:val="left"/>
+      <w:pPr>
+        <w:ind w:left="3280" w:hanging="360"/>
+      </w:pPr>
+      <w:rPr>
+        <w:rFonts w:ascii="Symbol" w:hAnsi="Symbol" w:hint="default"/>
+      </w:rPr>
+    </w:lvl>
+    <w:lvl w:ilvl="4" w:tplc="40090003" w:tentative="1">
+      <w:start w:val="1"/>
+      <w:numFmt w:val="bullet"/>
+      <w:lvlText w:val="o"/>
+      <w:lvlJc w:val="left"/>
+      <w:pPr>
+        <w:ind w:left="4000" w:hanging="360"/>
+      </w:pPr>
+      <w:rPr>
+        <w:rFonts w:ascii="Courier New" w:hAnsi="Courier New" w:cs="Courier New" w:hint="default"/>
+      </w:rPr>
+    </w:lvl>
+    <w:lvl w:ilvl="5" w:tplc="40090005" w:tentative="1">
+      <w:start w:val="1"/>
+      <w:numFmt w:val="bullet"/>
+      <w:lvlText w:val=""/>
+      <w:lvlJc w:val="left"/>
+      <w:pPr>
+        <w:ind w:left="4720" w:hanging="360"/>
+      </w:pPr>
+      <w:rPr>
+        <w:rFonts w:ascii="Wingdings" w:hAnsi="Wingdings" w:hint="default"/>
+      </w:rPr>
+    </w:lvl>
+    <w:lvl w:ilvl="6" w:tplc="40090001" w:tentative="1">
+      <w:start w:val="1"/>
+      <w:numFmt w:val="bullet"/>
+      <w:lvlText w:val=""/>
+      <w:lvlJc w:val="left"/>
+      <w:pPr>
+        <w:ind w:left="5440" w:hanging="360"/>
+      </w:pPr>
+      <w:rPr>
+        <w:rFonts w:ascii="Symbol" w:hAnsi="Symbol" w:hint="default"/>
+      </w:rPr>
+    </w:lvl>
+    <w:lvl w:ilvl="7" w:tplc="40090003" w:tentative="1">
+      <w:start w:val="1"/>
+      <w:numFmt w:val="bullet"/>
+      <w:lvlText w:val="o"/>
+      <w:lvlJc w:val="left"/>
+      <w:pPr>
+        <w:ind w:left="6160" w:hanging="360"/>
+      </w:pPr>
+      <w:rPr>
+        <w:rFonts w:ascii="Courier New" w:hAnsi="Courier New" w:cs="Courier New" w:hint="default"/>
+      </w:rPr>
+    </w:lvl>
+    <w:lvl w:ilvl="8" w:tplc="40090005" w:tentative="1">
+      <w:start w:val="1"/>
+      <w:numFmt w:val="bullet"/>
+      <w:lvlText w:val=""/>
+      <w:lvlJc w:val="left"/>
+      <w:pPr>
+        <w:ind w:left="6880" w:hanging="360"/>
+      </w:pPr>
+      <w:rPr>
+        <w:rFonts w:ascii="Wingdings" w:hAnsi="Wingdings" w:hint="default"/>
+      </w:rPr>
+    </w:lvl>
+  </w:abstractNum>
+  <w:abstractNum w:abstractNumId="33" w15:restartNumberingAfterBreak="0">
     <w:nsid w:val="322A262F"/>
     <w:multiLevelType w:val="hybridMultilevel"/>
     <w:tmpl w:val="327C07E0"/>
@@ -16566,7 +18568,7 @@
       </w:rPr>
     </w:lvl>
   </w:abstractNum>
-  <w:abstractNum w:abstractNumId="28" w15:restartNumberingAfterBreak="0">
+  <w:abstractNum w:abstractNumId="34" w15:restartNumberingAfterBreak="0">
     <w:nsid w:val="32C32B4A"/>
     <w:multiLevelType w:val="hybridMultilevel"/>
     <w:tmpl w:val="01CAE6DC"/>
@@ -16679,7 +18681,7 @@
       </w:rPr>
     </w:lvl>
   </w:abstractNum>
-  <w:abstractNum w:abstractNumId="29" w15:restartNumberingAfterBreak="0">
+  <w:abstractNum w:abstractNumId="35" w15:restartNumberingAfterBreak="0">
     <w:nsid w:val="35553CF3"/>
     <w:multiLevelType w:val="hybridMultilevel"/>
     <w:tmpl w:val="DA50D502"/>
@@ -16792,7 +18794,7 @@
       </w:rPr>
     </w:lvl>
   </w:abstractNum>
-  <w:abstractNum w:abstractNumId="30" w15:restartNumberingAfterBreak="0">
+  <w:abstractNum w:abstractNumId="36" w15:restartNumberingAfterBreak="0">
     <w:nsid w:val="39582E41"/>
     <w:multiLevelType w:val="hybridMultilevel"/>
     <w:tmpl w:val="6EA8BB26"/>
@@ -16905,7 +18907,7 @@
       </w:rPr>
     </w:lvl>
   </w:abstractNum>
-  <w:abstractNum w:abstractNumId="31" w15:restartNumberingAfterBreak="0">
+  <w:abstractNum w:abstractNumId="37" w15:restartNumberingAfterBreak="0">
     <w:nsid w:val="39A6604F"/>
     <w:multiLevelType w:val="hybridMultilevel"/>
     <w:tmpl w:val="E4B8291E"/>
@@ -17018,7 +19020,7 @@
       </w:rPr>
     </w:lvl>
   </w:abstractNum>
-  <w:abstractNum w:abstractNumId="32" w15:restartNumberingAfterBreak="0">
+  <w:abstractNum w:abstractNumId="38" w15:restartNumberingAfterBreak="0">
     <w:nsid w:val="41DC4A8F"/>
     <w:multiLevelType w:val="hybridMultilevel"/>
     <w:tmpl w:val="19CE7D6E"/>
@@ -17131,7 +19133,7 @@
       </w:rPr>
     </w:lvl>
   </w:abstractNum>
-  <w:abstractNum w:abstractNumId="33" w15:restartNumberingAfterBreak="0">
+  <w:abstractNum w:abstractNumId="39" w15:restartNumberingAfterBreak="0">
     <w:nsid w:val="41F21485"/>
     <w:multiLevelType w:val="hybridMultilevel"/>
     <w:tmpl w:val="BEF2DB6E"/>
@@ -17244,7 +19246,7 @@
       </w:rPr>
     </w:lvl>
   </w:abstractNum>
-  <w:abstractNum w:abstractNumId="34" w15:restartNumberingAfterBreak="0">
+  <w:abstractNum w:abstractNumId="40" w15:restartNumberingAfterBreak="0">
     <w:nsid w:val="43F66481"/>
     <w:multiLevelType w:val="hybridMultilevel"/>
     <w:tmpl w:val="0D5AA074"/>
@@ -17357,7 +19359,7 @@
       </w:rPr>
     </w:lvl>
   </w:abstractNum>
-  <w:abstractNum w:abstractNumId="35" w15:restartNumberingAfterBreak="0">
+  <w:abstractNum w:abstractNumId="41" w15:restartNumberingAfterBreak="0">
     <w:nsid w:val="45CF465D"/>
     <w:multiLevelType w:val="hybridMultilevel"/>
     <w:tmpl w:val="3D904BB4"/>
@@ -17470,7 +19472,7 @@
       </w:rPr>
     </w:lvl>
   </w:abstractNum>
-  <w:abstractNum w:abstractNumId="36" w15:restartNumberingAfterBreak="0">
+  <w:abstractNum w:abstractNumId="42" w15:restartNumberingAfterBreak="0">
     <w:nsid w:val="475F4735"/>
     <w:multiLevelType w:val="hybridMultilevel"/>
     <w:tmpl w:val="FA029FFA"/>
@@ -17583,7 +19585,7 @@
       </w:rPr>
     </w:lvl>
   </w:abstractNum>
-  <w:abstractNum w:abstractNumId="37" w15:restartNumberingAfterBreak="0">
+  <w:abstractNum w:abstractNumId="43" w15:restartNumberingAfterBreak="0">
     <w:nsid w:val="4BD208CD"/>
     <w:multiLevelType w:val="hybridMultilevel"/>
     <w:tmpl w:val="A53A1180"/>
@@ -17696,7 +19698,7 @@
       </w:rPr>
     </w:lvl>
   </w:abstractNum>
-  <w:abstractNum w:abstractNumId="38" w15:restartNumberingAfterBreak="0">
+  <w:abstractNum w:abstractNumId="44" w15:restartNumberingAfterBreak="0">
     <w:nsid w:val="4C342B25"/>
     <w:multiLevelType w:val="hybridMultilevel"/>
     <w:tmpl w:val="B91CD8D8"/>
@@ -17809,7 +19811,7 @@
       </w:rPr>
     </w:lvl>
   </w:abstractNum>
-  <w:abstractNum w:abstractNumId="39" w15:restartNumberingAfterBreak="0">
+  <w:abstractNum w:abstractNumId="45" w15:restartNumberingAfterBreak="0">
     <w:nsid w:val="4CAF2742"/>
     <w:multiLevelType w:val="hybridMultilevel"/>
     <w:tmpl w:val="9B382BEA"/>
@@ -17922,7 +19924,7 @@
       </w:rPr>
     </w:lvl>
   </w:abstractNum>
-  <w:abstractNum w:abstractNumId="40" w15:restartNumberingAfterBreak="0">
+  <w:abstractNum w:abstractNumId="46" w15:restartNumberingAfterBreak="0">
     <w:nsid w:val="4CB9119F"/>
     <w:multiLevelType w:val="hybridMultilevel"/>
     <w:tmpl w:val="76365076"/>
@@ -18035,7 +20037,120 @@
       </w:rPr>
     </w:lvl>
   </w:abstractNum>
-  <w:abstractNum w:abstractNumId="41" w15:restartNumberingAfterBreak="0">
+  <w:abstractNum w:abstractNumId="47" w15:restartNumberingAfterBreak="0">
+    <w:nsid w:val="4F17655D"/>
+    <w:multiLevelType w:val="hybridMultilevel"/>
+    <w:tmpl w:val="BE60F5B4"/>
+    <w:lvl w:ilvl="0" w:tplc="4009000B">
+      <w:start w:val="1"/>
+      <w:numFmt w:val="bullet"/>
+      <w:lvlText w:val=""/>
+      <w:lvlJc w:val="left"/>
+      <w:pPr>
+        <w:ind w:left="1120" w:hanging="360"/>
+      </w:pPr>
+      <w:rPr>
+        <w:rFonts w:ascii="Wingdings" w:hAnsi="Wingdings" w:hint="default"/>
+      </w:rPr>
+    </w:lvl>
+    <w:lvl w:ilvl="1" w:tplc="40090003" w:tentative="1">
+      <w:start w:val="1"/>
+      <w:numFmt w:val="bullet"/>
+      <w:lvlText w:val="o"/>
+      <w:lvlJc w:val="left"/>
+      <w:pPr>
+        <w:ind w:left="1840" w:hanging="360"/>
+      </w:pPr>
+      <w:rPr>
+        <w:rFonts w:ascii="Courier New" w:hAnsi="Courier New" w:cs="Courier New" w:hint="default"/>
+      </w:rPr>
+    </w:lvl>
+    <w:lvl w:ilvl="2" w:tplc="40090005" w:tentative="1">
+      <w:start w:val="1"/>
+      <w:numFmt w:val="bullet"/>
+      <w:lvlText w:val=""/>
+      <w:lvlJc w:val="left"/>
+      <w:pPr>
+        <w:ind w:left="2560" w:hanging="360"/>
+      </w:pPr>
+      <w:rPr>
+        <w:rFonts w:ascii="Wingdings" w:hAnsi="Wingdings" w:hint="default"/>
+      </w:rPr>
+    </w:lvl>
+    <w:lvl w:ilvl="3" w:tplc="40090001" w:tentative="1">
+      <w:start w:val="1"/>
+      <w:numFmt w:val="bullet"/>
+      <w:lvlText w:val=""/>
+      <w:lvlJc w:val="left"/>
+      <w:pPr>
+        <w:ind w:left="3280" w:hanging="360"/>
+      </w:pPr>
+      <w:rPr>
+        <w:rFonts w:ascii="Symbol" w:hAnsi="Symbol" w:hint="default"/>
+      </w:rPr>
+    </w:lvl>
+    <w:lvl w:ilvl="4" w:tplc="40090003" w:tentative="1">
+      <w:start w:val="1"/>
+      <w:numFmt w:val="bullet"/>
+      <w:lvlText w:val="o"/>
+      <w:lvlJc w:val="left"/>
+      <w:pPr>
+        <w:ind w:left="4000" w:hanging="360"/>
+      </w:pPr>
+      <w:rPr>
+        <w:rFonts w:ascii="Courier New" w:hAnsi="Courier New" w:cs="Courier New" w:hint="default"/>
+      </w:rPr>
+    </w:lvl>
+    <w:lvl w:ilvl="5" w:tplc="40090005" w:tentative="1">
+      <w:start w:val="1"/>
+      <w:numFmt w:val="bullet"/>
+      <w:lvlText w:val=""/>
+      <w:lvlJc w:val="left"/>
+      <w:pPr>
+        <w:ind w:left="4720" w:hanging="360"/>
+      </w:pPr>
+      <w:rPr>
+        <w:rFonts w:ascii="Wingdings" w:hAnsi="Wingdings" w:hint="default"/>
+      </w:rPr>
+    </w:lvl>
+    <w:lvl w:ilvl="6" w:tplc="40090001" w:tentative="1">
+      <w:start w:val="1"/>
+      <w:numFmt w:val="bullet"/>
+      <w:lvlText w:val=""/>
+      <w:lvlJc w:val="left"/>
+      <w:pPr>
+        <w:ind w:left="5440" w:hanging="360"/>
+      </w:pPr>
+      <w:rPr>
+        <w:rFonts w:ascii="Symbol" w:hAnsi="Symbol" w:hint="default"/>
+      </w:rPr>
+    </w:lvl>
+    <w:lvl w:ilvl="7" w:tplc="40090003" w:tentative="1">
+      <w:start w:val="1"/>
+      <w:numFmt w:val="bullet"/>
+      <w:lvlText w:val="o"/>
+      <w:lvlJc w:val="left"/>
+      <w:pPr>
+        <w:ind w:left="6160" w:hanging="360"/>
+      </w:pPr>
+      <w:rPr>
+        <w:rFonts w:ascii="Courier New" w:hAnsi="Courier New" w:cs="Courier New" w:hint="default"/>
+      </w:rPr>
+    </w:lvl>
+    <w:lvl w:ilvl="8" w:tplc="40090005" w:tentative="1">
+      <w:start w:val="1"/>
+      <w:numFmt w:val="bullet"/>
+      <w:lvlText w:val=""/>
+      <w:lvlJc w:val="left"/>
+      <w:pPr>
+        <w:ind w:left="6880" w:hanging="360"/>
+      </w:pPr>
+      <w:rPr>
+        <w:rFonts w:ascii="Wingdings" w:hAnsi="Wingdings" w:hint="default"/>
+      </w:rPr>
+    </w:lvl>
+  </w:abstractNum>
+  <w:abstractNum w:abstractNumId="48" w15:restartNumberingAfterBreak="0">
     <w:nsid w:val="50E81B93"/>
     <w:multiLevelType w:val="hybridMultilevel"/>
     <w:tmpl w:val="FE8AB98C"/>
@@ -18148,7 +20263,7 @@
       </w:rPr>
     </w:lvl>
   </w:abstractNum>
-  <w:abstractNum w:abstractNumId="42" w15:restartNumberingAfterBreak="0">
+  <w:abstractNum w:abstractNumId="49" w15:restartNumberingAfterBreak="0">
     <w:nsid w:val="5207196C"/>
     <w:multiLevelType w:val="hybridMultilevel"/>
     <w:tmpl w:val="04101D70"/>
@@ -18261,7 +20376,7 @@
       </w:rPr>
     </w:lvl>
   </w:abstractNum>
-  <w:abstractNum w:abstractNumId="43" w15:restartNumberingAfterBreak="0">
+  <w:abstractNum w:abstractNumId="50" w15:restartNumberingAfterBreak="0">
     <w:nsid w:val="52E2024D"/>
     <w:multiLevelType w:val="hybridMultilevel"/>
     <w:tmpl w:val="DABA967C"/>
@@ -18374,7 +20489,7 @@
       </w:rPr>
     </w:lvl>
   </w:abstractNum>
-  <w:abstractNum w:abstractNumId="44" w15:restartNumberingAfterBreak="0">
+  <w:abstractNum w:abstractNumId="51" w15:restartNumberingAfterBreak="0">
     <w:nsid w:val="54BF6151"/>
     <w:multiLevelType w:val="hybridMultilevel"/>
     <w:tmpl w:val="F4D635F4"/>
@@ -18483,7 +20598,7 @@
       </w:pPr>
     </w:lvl>
   </w:abstractNum>
-  <w:abstractNum w:abstractNumId="45" w15:restartNumberingAfterBreak="0">
+  <w:abstractNum w:abstractNumId="52" w15:restartNumberingAfterBreak="0">
     <w:nsid w:val="5BE47E43"/>
     <w:multiLevelType w:val="hybridMultilevel"/>
     <w:tmpl w:val="EF3EAED2"/>
@@ -18596,7 +20711,7 @@
       </w:rPr>
     </w:lvl>
   </w:abstractNum>
-  <w:abstractNum w:abstractNumId="46" w15:restartNumberingAfterBreak="0">
+  <w:abstractNum w:abstractNumId="53" w15:restartNumberingAfterBreak="0">
     <w:nsid w:val="5C0D2947"/>
     <w:multiLevelType w:val="hybridMultilevel"/>
     <w:tmpl w:val="8CAAD732"/>
@@ -18709,7 +20824,7 @@
       </w:rPr>
     </w:lvl>
   </w:abstractNum>
-  <w:abstractNum w:abstractNumId="47" w15:restartNumberingAfterBreak="0">
+  <w:abstractNum w:abstractNumId="54" w15:restartNumberingAfterBreak="0">
     <w:nsid w:val="5D4D2BDD"/>
     <w:multiLevelType w:val="hybridMultilevel"/>
     <w:tmpl w:val="14A8EAC6"/>
@@ -18822,7 +20937,7 @@
       </w:rPr>
     </w:lvl>
   </w:abstractNum>
-  <w:abstractNum w:abstractNumId="48" w15:restartNumberingAfterBreak="0">
+  <w:abstractNum w:abstractNumId="55" w15:restartNumberingAfterBreak="0">
     <w:nsid w:val="620D5486"/>
     <w:multiLevelType w:val="hybridMultilevel"/>
     <w:tmpl w:val="728869EC"/>
@@ -18935,7 +21050,233 @@
       </w:rPr>
     </w:lvl>
   </w:abstractNum>
-  <w:abstractNum w:abstractNumId="49" w15:restartNumberingAfterBreak="0">
+  <w:abstractNum w:abstractNumId="56" w15:restartNumberingAfterBreak="0">
+    <w:nsid w:val="663A7E4C"/>
+    <w:multiLevelType w:val="hybridMultilevel"/>
+    <w:tmpl w:val="14463E10"/>
+    <w:lvl w:ilvl="0" w:tplc="4009000B">
+      <w:start w:val="1"/>
+      <w:numFmt w:val="bullet"/>
+      <w:lvlText w:val=""/>
+      <w:lvlJc w:val="left"/>
+      <w:pPr>
+        <w:ind w:left="1120" w:hanging="360"/>
+      </w:pPr>
+      <w:rPr>
+        <w:rFonts w:ascii="Wingdings" w:hAnsi="Wingdings" w:hint="default"/>
+      </w:rPr>
+    </w:lvl>
+    <w:lvl w:ilvl="1" w:tplc="40090003" w:tentative="1">
+      <w:start w:val="1"/>
+      <w:numFmt w:val="bullet"/>
+      <w:lvlText w:val="o"/>
+      <w:lvlJc w:val="left"/>
+      <w:pPr>
+        <w:ind w:left="1840" w:hanging="360"/>
+      </w:pPr>
+      <w:rPr>
+        <w:rFonts w:ascii="Courier New" w:hAnsi="Courier New" w:cs="Courier New" w:hint="default"/>
+      </w:rPr>
+    </w:lvl>
+    <w:lvl w:ilvl="2" w:tplc="40090005" w:tentative="1">
+      <w:start w:val="1"/>
+      <w:numFmt w:val="bullet"/>
+      <w:lvlText w:val=""/>
+      <w:lvlJc w:val="left"/>
+      <w:pPr>
+        <w:ind w:left="2560" w:hanging="360"/>
+      </w:pPr>
+      <w:rPr>
+        <w:rFonts w:ascii="Wingdings" w:hAnsi="Wingdings" w:hint="default"/>
+      </w:rPr>
+    </w:lvl>
+    <w:lvl w:ilvl="3" w:tplc="40090001" w:tentative="1">
+      <w:start w:val="1"/>
+      <w:numFmt w:val="bullet"/>
+      <w:lvlText w:val=""/>
+      <w:lvlJc w:val="left"/>
+      <w:pPr>
+        <w:ind w:left="3280" w:hanging="360"/>
+      </w:pPr>
+      <w:rPr>
+        <w:rFonts w:ascii="Symbol" w:hAnsi="Symbol" w:hint="default"/>
+      </w:rPr>
+    </w:lvl>
+    <w:lvl w:ilvl="4" w:tplc="40090003" w:tentative="1">
+      <w:start w:val="1"/>
+      <w:numFmt w:val="bullet"/>
+      <w:lvlText w:val="o"/>
+      <w:lvlJc w:val="left"/>
+      <w:pPr>
+        <w:ind w:left="4000" w:hanging="360"/>
+      </w:pPr>
+      <w:rPr>
+        <w:rFonts w:ascii="Courier New" w:hAnsi="Courier New" w:cs="Courier New" w:hint="default"/>
+      </w:rPr>
+    </w:lvl>
+    <w:lvl w:ilvl="5" w:tplc="40090005" w:tentative="1">
+      <w:start w:val="1"/>
+      <w:numFmt w:val="bullet"/>
+      <w:lvlText w:val=""/>
+      <w:lvlJc w:val="left"/>
+      <w:pPr>
+        <w:ind w:left="4720" w:hanging="360"/>
+      </w:pPr>
+      <w:rPr>
+        <w:rFonts w:ascii="Wingdings" w:hAnsi="Wingdings" w:hint="default"/>
+      </w:rPr>
+    </w:lvl>
+    <w:lvl w:ilvl="6" w:tplc="40090001" w:tentative="1">
+      <w:start w:val="1"/>
+      <w:numFmt w:val="bullet"/>
+      <w:lvlText w:val=""/>
+      <w:lvlJc w:val="left"/>
+      <w:pPr>
+        <w:ind w:left="5440" w:hanging="360"/>
+      </w:pPr>
+      <w:rPr>
+        <w:rFonts w:ascii="Symbol" w:hAnsi="Symbol" w:hint="default"/>
+      </w:rPr>
+    </w:lvl>
+    <w:lvl w:ilvl="7" w:tplc="40090003" w:tentative="1">
+      <w:start w:val="1"/>
+      <w:numFmt w:val="bullet"/>
+      <w:lvlText w:val="o"/>
+      <w:lvlJc w:val="left"/>
+      <w:pPr>
+        <w:ind w:left="6160" w:hanging="360"/>
+      </w:pPr>
+      <w:rPr>
+        <w:rFonts w:ascii="Courier New" w:hAnsi="Courier New" w:cs="Courier New" w:hint="default"/>
+      </w:rPr>
+    </w:lvl>
+    <w:lvl w:ilvl="8" w:tplc="40090005" w:tentative="1">
+      <w:start w:val="1"/>
+      <w:numFmt w:val="bullet"/>
+      <w:lvlText w:val=""/>
+      <w:lvlJc w:val="left"/>
+      <w:pPr>
+        <w:ind w:left="6880" w:hanging="360"/>
+      </w:pPr>
+      <w:rPr>
+        <w:rFonts w:ascii="Wingdings" w:hAnsi="Wingdings" w:hint="default"/>
+      </w:rPr>
+    </w:lvl>
+  </w:abstractNum>
+  <w:abstractNum w:abstractNumId="57" w15:restartNumberingAfterBreak="0">
+    <w:nsid w:val="666E6981"/>
+    <w:multiLevelType w:val="hybridMultilevel"/>
+    <w:tmpl w:val="7B527FA6"/>
+    <w:lvl w:ilvl="0" w:tplc="4009000B">
+      <w:start w:val="1"/>
+      <w:numFmt w:val="bullet"/>
+      <w:lvlText w:val=""/>
+      <w:lvlJc w:val="left"/>
+      <w:pPr>
+        <w:ind w:left="1120" w:hanging="360"/>
+      </w:pPr>
+      <w:rPr>
+        <w:rFonts w:ascii="Wingdings" w:hAnsi="Wingdings" w:hint="default"/>
+      </w:rPr>
+    </w:lvl>
+    <w:lvl w:ilvl="1" w:tplc="40090003" w:tentative="1">
+      <w:start w:val="1"/>
+      <w:numFmt w:val="bullet"/>
+      <w:lvlText w:val="o"/>
+      <w:lvlJc w:val="left"/>
+      <w:pPr>
+        <w:ind w:left="1840" w:hanging="360"/>
+      </w:pPr>
+      <w:rPr>
+        <w:rFonts w:ascii="Courier New" w:hAnsi="Courier New" w:cs="Courier New" w:hint="default"/>
+      </w:rPr>
+    </w:lvl>
+    <w:lvl w:ilvl="2" w:tplc="40090005" w:tentative="1">
+      <w:start w:val="1"/>
+      <w:numFmt w:val="bullet"/>
+      <w:lvlText w:val=""/>
+      <w:lvlJc w:val="left"/>
+      <w:pPr>
+        <w:ind w:left="2560" w:hanging="360"/>
+      </w:pPr>
+      <w:rPr>
+        <w:rFonts w:ascii="Wingdings" w:hAnsi="Wingdings" w:hint="default"/>
+      </w:rPr>
+    </w:lvl>
+    <w:lvl w:ilvl="3" w:tplc="40090001" w:tentative="1">
+      <w:start w:val="1"/>
+      <w:numFmt w:val="bullet"/>
+      <w:lvlText w:val=""/>
+      <w:lvlJc w:val="left"/>
+      <w:pPr>
+        <w:ind w:left="3280" w:hanging="360"/>
+      </w:pPr>
+      <w:rPr>
+        <w:rFonts w:ascii="Symbol" w:hAnsi="Symbol" w:hint="default"/>
+      </w:rPr>
+    </w:lvl>
+    <w:lvl w:ilvl="4" w:tplc="40090003" w:tentative="1">
+      <w:start w:val="1"/>
+      <w:numFmt w:val="bullet"/>
+      <w:lvlText w:val="o"/>
+      <w:lvlJc w:val="left"/>
+      <w:pPr>
+        <w:ind w:left="4000" w:hanging="360"/>
+      </w:pPr>
+      <w:rPr>
+        <w:rFonts w:ascii="Courier New" w:hAnsi="Courier New" w:cs="Courier New" w:hint="default"/>
+      </w:rPr>
+    </w:lvl>
+    <w:lvl w:ilvl="5" w:tplc="40090005" w:tentative="1">
+      <w:start w:val="1"/>
+      <w:numFmt w:val="bullet"/>
+      <w:lvlText w:val=""/>
+      <w:lvlJc w:val="left"/>
+      <w:pPr>
+        <w:ind w:left="4720" w:hanging="360"/>
+      </w:pPr>
+      <w:rPr>
+        <w:rFonts w:ascii="Wingdings" w:hAnsi="Wingdings" w:hint="default"/>
+      </w:rPr>
+    </w:lvl>
+    <w:lvl w:ilvl="6" w:tplc="40090001" w:tentative="1">
+      <w:start w:val="1"/>
+      <w:numFmt w:val="bullet"/>
+      <w:lvlText w:val=""/>
+      <w:lvlJc w:val="left"/>
+      <w:pPr>
+        <w:ind w:left="5440" w:hanging="360"/>
+      </w:pPr>
+      <w:rPr>
+        <w:rFonts w:ascii="Symbol" w:hAnsi="Symbol" w:hint="default"/>
+      </w:rPr>
+    </w:lvl>
+    <w:lvl w:ilvl="7" w:tplc="40090003" w:tentative="1">
+      <w:start w:val="1"/>
+      <w:numFmt w:val="bullet"/>
+      <w:lvlText w:val="o"/>
+      <w:lvlJc w:val="left"/>
+      <w:pPr>
+        <w:ind w:left="6160" w:hanging="360"/>
+      </w:pPr>
+      <w:rPr>
+        <w:rFonts w:ascii="Courier New" w:hAnsi="Courier New" w:cs="Courier New" w:hint="default"/>
+      </w:rPr>
+    </w:lvl>
+    <w:lvl w:ilvl="8" w:tplc="40090005" w:tentative="1">
+      <w:start w:val="1"/>
+      <w:numFmt w:val="bullet"/>
+      <w:lvlText w:val=""/>
+      <w:lvlJc w:val="left"/>
+      <w:pPr>
+        <w:ind w:left="6880" w:hanging="360"/>
+      </w:pPr>
+      <w:rPr>
+        <w:rFonts w:ascii="Wingdings" w:hAnsi="Wingdings" w:hint="default"/>
+      </w:rPr>
+    </w:lvl>
+  </w:abstractNum>
+  <w:abstractNum w:abstractNumId="58" w15:restartNumberingAfterBreak="0">
     <w:nsid w:val="66B62DBB"/>
     <w:multiLevelType w:val="hybridMultilevel"/>
     <w:tmpl w:val="10D04886"/>
@@ -19048,7 +21389,7 @@
       </w:rPr>
     </w:lvl>
   </w:abstractNum>
-  <w:abstractNum w:abstractNumId="50" w15:restartNumberingAfterBreak="0">
+  <w:abstractNum w:abstractNumId="59" w15:restartNumberingAfterBreak="0">
     <w:nsid w:val="68E44562"/>
     <w:multiLevelType w:val="hybridMultilevel"/>
     <w:tmpl w:val="0952F2F2"/>
@@ -19161,7 +21502,7 @@
       </w:rPr>
     </w:lvl>
   </w:abstractNum>
-  <w:abstractNum w:abstractNumId="51" w15:restartNumberingAfterBreak="0">
+  <w:abstractNum w:abstractNumId="60" w15:restartNumberingAfterBreak="0">
     <w:nsid w:val="6C1238A2"/>
     <w:multiLevelType w:val="hybridMultilevel"/>
     <w:tmpl w:val="6BB2EB5C"/>
@@ -19274,7 +21615,7 @@
       </w:rPr>
     </w:lvl>
   </w:abstractNum>
-  <w:abstractNum w:abstractNumId="52" w15:restartNumberingAfterBreak="0">
+  <w:abstractNum w:abstractNumId="61" w15:restartNumberingAfterBreak="0">
     <w:nsid w:val="6E5F7AAF"/>
     <w:multiLevelType w:val="hybridMultilevel"/>
     <w:tmpl w:val="BF92D5CC"/>
@@ -19360,7 +21701,7 @@
       </w:pPr>
     </w:lvl>
   </w:abstractNum>
-  <w:abstractNum w:abstractNumId="53" w15:restartNumberingAfterBreak="0">
+  <w:abstractNum w:abstractNumId="62" w15:restartNumberingAfterBreak="0">
     <w:nsid w:val="6EA169CE"/>
     <w:multiLevelType w:val="hybridMultilevel"/>
     <w:tmpl w:val="9FC6F552"/>
@@ -19473,7 +21814,7 @@
       </w:rPr>
     </w:lvl>
   </w:abstractNum>
-  <w:abstractNum w:abstractNumId="54" w15:restartNumberingAfterBreak="0">
+  <w:abstractNum w:abstractNumId="63" w15:restartNumberingAfterBreak="0">
     <w:nsid w:val="6EFF7CF0"/>
     <w:multiLevelType w:val="hybridMultilevel"/>
     <w:tmpl w:val="8D48AE6A"/>
@@ -19586,7 +21927,7 @@
       </w:rPr>
     </w:lvl>
   </w:abstractNum>
-  <w:abstractNum w:abstractNumId="55" w15:restartNumberingAfterBreak="0">
+  <w:abstractNum w:abstractNumId="64" w15:restartNumberingAfterBreak="0">
     <w:nsid w:val="70390210"/>
     <w:multiLevelType w:val="hybridMultilevel"/>
     <w:tmpl w:val="90EC57DC"/>
@@ -19699,7 +22040,7 @@
       </w:rPr>
     </w:lvl>
   </w:abstractNum>
-  <w:abstractNum w:abstractNumId="56" w15:restartNumberingAfterBreak="0">
+  <w:abstractNum w:abstractNumId="65" w15:restartNumberingAfterBreak="0">
     <w:nsid w:val="75BB5B9A"/>
     <w:multiLevelType w:val="hybridMultilevel"/>
     <w:tmpl w:val="E1D66F90"/>
@@ -19812,7 +22153,7 @@
       </w:rPr>
     </w:lvl>
   </w:abstractNum>
-  <w:abstractNum w:abstractNumId="57" w15:restartNumberingAfterBreak="0">
+  <w:abstractNum w:abstractNumId="66" w15:restartNumberingAfterBreak="0">
     <w:nsid w:val="76F26BA8"/>
     <w:multiLevelType w:val="hybridMultilevel"/>
     <w:tmpl w:val="916EB77C"/>
@@ -19925,7 +22266,7 @@
       </w:rPr>
     </w:lvl>
   </w:abstractNum>
-  <w:abstractNum w:abstractNumId="58" w15:restartNumberingAfterBreak="0">
+  <w:abstractNum w:abstractNumId="67" w15:restartNumberingAfterBreak="0">
     <w:nsid w:val="78D4407D"/>
     <w:multiLevelType w:val="hybridMultilevel"/>
     <w:tmpl w:val="9C6A39B8"/>
@@ -20038,7 +22379,7 @@
       </w:rPr>
     </w:lvl>
   </w:abstractNum>
-  <w:abstractNum w:abstractNumId="59" w15:restartNumberingAfterBreak="0">
+  <w:abstractNum w:abstractNumId="68" w15:restartNumberingAfterBreak="0">
     <w:nsid w:val="78FF1992"/>
     <w:multiLevelType w:val="hybridMultilevel"/>
     <w:tmpl w:val="3E304C16"/>
@@ -20151,7 +22492,7 @@
       </w:rPr>
     </w:lvl>
   </w:abstractNum>
-  <w:abstractNum w:abstractNumId="60" w15:restartNumberingAfterBreak="0">
+  <w:abstractNum w:abstractNumId="69" w15:restartNumberingAfterBreak="0">
     <w:nsid w:val="7A850844"/>
     <w:multiLevelType w:val="hybridMultilevel"/>
     <w:tmpl w:val="8D24419A"/>
@@ -20264,7 +22605,7 @@
       </w:rPr>
     </w:lvl>
   </w:abstractNum>
-  <w:abstractNum w:abstractNumId="61" w15:restartNumberingAfterBreak="0">
+  <w:abstractNum w:abstractNumId="70" w15:restartNumberingAfterBreak="0">
     <w:nsid w:val="7A9E48D1"/>
     <w:multiLevelType w:val="hybridMultilevel"/>
     <w:tmpl w:val="7C2C2C78"/>
@@ -20377,10 +22718,10 @@
       </w:rPr>
     </w:lvl>
   </w:abstractNum>
-  <w:abstractNum w:abstractNumId="62" w15:restartNumberingAfterBreak="0">
+  <w:abstractNum w:abstractNumId="71" w15:restartNumberingAfterBreak="0">
     <w:nsid w:val="7CA93F11"/>
     <w:multiLevelType w:val="hybridMultilevel"/>
-    <w:tmpl w:val="76E818B8"/>
+    <w:tmpl w:val="52BC6E0A"/>
     <w:lvl w:ilvl="0" w:tplc="4009000B">
       <w:start w:val="1"/>
       <w:numFmt w:val="bullet"/>
@@ -20490,7 +22831,7 @@
       </w:rPr>
     </w:lvl>
   </w:abstractNum>
-  <w:abstractNum w:abstractNumId="63" w15:restartNumberingAfterBreak="0">
+  <w:abstractNum w:abstractNumId="72" w15:restartNumberingAfterBreak="0">
     <w:nsid w:val="7E1711BB"/>
     <w:multiLevelType w:val="hybridMultilevel"/>
     <w:tmpl w:val="EBD83B5A"/>
@@ -20603,7 +22944,7 @@
       </w:rPr>
     </w:lvl>
   </w:abstractNum>
-  <w:abstractNum w:abstractNumId="64" w15:restartNumberingAfterBreak="0">
+  <w:abstractNum w:abstractNumId="73" w15:restartNumberingAfterBreak="0">
     <w:nsid w:val="7E6703BC"/>
     <w:multiLevelType w:val="hybridMultilevel"/>
     <w:tmpl w:val="01347444"/>
@@ -20717,201 +23058,228 @@
     </w:lvl>
   </w:abstractNum>
   <w:num w:numId="1" w16cid:durableId="234126080">
+    <w:abstractNumId w:val="51"/>
+  </w:num>
+  <w:num w:numId="2" w16cid:durableId="1827168422">
+    <w:abstractNumId w:val="18"/>
+  </w:num>
+  <w:num w:numId="3" w16cid:durableId="645551749">
+    <w:abstractNumId w:val="6"/>
+  </w:num>
+  <w:num w:numId="4" w16cid:durableId="984048638">
+    <w:abstractNumId w:val="10"/>
+  </w:num>
+  <w:num w:numId="5" w16cid:durableId="2053652926">
+    <w:abstractNumId w:val="42"/>
+  </w:num>
+  <w:num w:numId="6" w16cid:durableId="120808992">
+    <w:abstractNumId w:val="23"/>
+  </w:num>
+  <w:num w:numId="7" w16cid:durableId="1196692114">
+    <w:abstractNumId w:val="21"/>
+  </w:num>
+  <w:num w:numId="8" w16cid:durableId="446656441">
+    <w:abstractNumId w:val="53"/>
+  </w:num>
+  <w:num w:numId="9" w16cid:durableId="698819531">
+    <w:abstractNumId w:val="54"/>
+  </w:num>
+  <w:num w:numId="10" w16cid:durableId="1527332008">
+    <w:abstractNumId w:val="39"/>
+  </w:num>
+  <w:num w:numId="11" w16cid:durableId="1770158062">
+    <w:abstractNumId w:val="28"/>
+  </w:num>
+  <w:num w:numId="12" w16cid:durableId="839471443">
+    <w:abstractNumId w:val="15"/>
+  </w:num>
+  <w:num w:numId="13" w16cid:durableId="1625767979">
+    <w:abstractNumId w:val="67"/>
+  </w:num>
+  <w:num w:numId="14" w16cid:durableId="712922381">
+    <w:abstractNumId w:val="16"/>
+  </w:num>
+  <w:num w:numId="15" w16cid:durableId="1509248443">
+    <w:abstractNumId w:val="33"/>
+  </w:num>
+  <w:num w:numId="16" w16cid:durableId="1388600950">
+    <w:abstractNumId w:val="12"/>
+  </w:num>
+  <w:num w:numId="17" w16cid:durableId="63383461">
+    <w:abstractNumId w:val="24"/>
+  </w:num>
+  <w:num w:numId="18" w16cid:durableId="1959605983">
+    <w:abstractNumId w:val="36"/>
+  </w:num>
+  <w:num w:numId="19" w16cid:durableId="1251352226">
+    <w:abstractNumId w:val="50"/>
+  </w:num>
+  <w:num w:numId="20" w16cid:durableId="1579706643">
+    <w:abstractNumId w:val="52"/>
+  </w:num>
+  <w:num w:numId="21" w16cid:durableId="616908098">
+    <w:abstractNumId w:val="37"/>
+  </w:num>
+  <w:num w:numId="22" w16cid:durableId="1590456493">
+    <w:abstractNumId w:val="63"/>
+  </w:num>
+  <w:num w:numId="23" w16cid:durableId="1853490051">
+    <w:abstractNumId w:val="60"/>
+  </w:num>
+  <w:num w:numId="24" w16cid:durableId="489753068">
+    <w:abstractNumId w:val="40"/>
+  </w:num>
+  <w:num w:numId="25" w16cid:durableId="470750842">
+    <w:abstractNumId w:val="72"/>
+  </w:num>
+  <w:num w:numId="26" w16cid:durableId="1286622340">
+    <w:abstractNumId w:val="29"/>
+  </w:num>
+  <w:num w:numId="27" w16cid:durableId="675691640">
+    <w:abstractNumId w:val="20"/>
+  </w:num>
+  <w:num w:numId="28" w16cid:durableId="942416099">
     <w:abstractNumId w:val="44"/>
   </w:num>
-  <w:num w:numId="2" w16cid:durableId="1827168422">
-    <w:abstractNumId w:val="16"/>
-  </w:num>
-  <w:num w:numId="3" w16cid:durableId="645551749">
-    <w:abstractNumId w:val="5"/>
-  </w:num>
-  <w:num w:numId="4" w16cid:durableId="984048638">
-    <w:abstractNumId w:val="8"/>
-  </w:num>
-  <w:num w:numId="5" w16cid:durableId="2053652926">
-    <w:abstractNumId w:val="36"/>
-  </w:num>
-  <w:num w:numId="6" w16cid:durableId="120808992">
-    <w:abstractNumId w:val="19"/>
-  </w:num>
-  <w:num w:numId="7" w16cid:durableId="1196692114">
-    <w:abstractNumId w:val="18"/>
-  </w:num>
-  <w:num w:numId="8" w16cid:durableId="446656441">
-    <w:abstractNumId w:val="46"/>
-  </w:num>
-  <w:num w:numId="9" w16cid:durableId="698819531">
-    <w:abstractNumId w:val="47"/>
-  </w:num>
-  <w:num w:numId="10" w16cid:durableId="1527332008">
-    <w:abstractNumId w:val="33"/>
-  </w:num>
-  <w:num w:numId="11" w16cid:durableId="1770158062">
-    <w:abstractNumId w:val="23"/>
-  </w:num>
-  <w:num w:numId="12" w16cid:durableId="839471443">
-    <w:abstractNumId w:val="13"/>
-  </w:num>
-  <w:num w:numId="13" w16cid:durableId="1625767979">
-    <w:abstractNumId w:val="58"/>
-  </w:num>
-  <w:num w:numId="14" w16cid:durableId="712922381">
-    <w:abstractNumId w:val="14"/>
-  </w:num>
-  <w:num w:numId="15" w16cid:durableId="1509248443">
-    <w:abstractNumId w:val="27"/>
-  </w:num>
-  <w:num w:numId="16" w16cid:durableId="1388600950">
-    <w:abstractNumId w:val="10"/>
-  </w:num>
-  <w:num w:numId="17" w16cid:durableId="63383461">
-    <w:abstractNumId w:val="20"/>
-  </w:num>
-  <w:num w:numId="18" w16cid:durableId="1959605983">
-    <w:abstractNumId w:val="30"/>
-  </w:num>
-  <w:num w:numId="19" w16cid:durableId="1251352226">
-    <w:abstractNumId w:val="43"/>
-  </w:num>
-  <w:num w:numId="20" w16cid:durableId="1579706643">
-    <w:abstractNumId w:val="45"/>
-  </w:num>
-  <w:num w:numId="21" w16cid:durableId="616908098">
-    <w:abstractNumId w:val="31"/>
-  </w:num>
-  <w:num w:numId="22" w16cid:durableId="1590456493">
-    <w:abstractNumId w:val="54"/>
-  </w:num>
-  <w:num w:numId="23" w16cid:durableId="1853490051">
-    <w:abstractNumId w:val="51"/>
-  </w:num>
-  <w:num w:numId="24" w16cid:durableId="489753068">
-    <w:abstractNumId w:val="34"/>
-  </w:num>
-  <w:num w:numId="25" w16cid:durableId="470750842">
-    <w:abstractNumId w:val="63"/>
-  </w:num>
-  <w:num w:numId="26" w16cid:durableId="1286622340">
-    <w:abstractNumId w:val="24"/>
-  </w:num>
-  <w:num w:numId="27" w16cid:durableId="675691640">
-    <w:abstractNumId w:val="17"/>
-  </w:num>
-  <w:num w:numId="28" w16cid:durableId="942416099">
-    <w:abstractNumId w:val="38"/>
-  </w:num>
   <w:num w:numId="29" w16cid:durableId="354500318">
-    <w:abstractNumId w:val="61"/>
+    <w:abstractNumId w:val="70"/>
   </w:num>
   <w:num w:numId="30" w16cid:durableId="555707672">
-    <w:abstractNumId w:val="59"/>
+    <w:abstractNumId w:val="68"/>
   </w:num>
   <w:num w:numId="31" w16cid:durableId="1227456296">
     <w:abstractNumId w:val="1"/>
   </w:num>
   <w:num w:numId="32" w16cid:durableId="241791814">
-    <w:abstractNumId w:val="22"/>
+    <w:abstractNumId w:val="27"/>
   </w:num>
   <w:num w:numId="33" w16cid:durableId="297877559">
-    <w:abstractNumId w:val="41"/>
+    <w:abstractNumId w:val="48"/>
   </w:num>
   <w:num w:numId="34" w16cid:durableId="1954240346">
-    <w:abstractNumId w:val="52"/>
+    <w:abstractNumId w:val="61"/>
   </w:num>
   <w:num w:numId="35" w16cid:durableId="1758016530">
-    <w:abstractNumId w:val="42"/>
+    <w:abstractNumId w:val="49"/>
   </w:num>
   <w:num w:numId="36" w16cid:durableId="101455697">
+    <w:abstractNumId w:val="31"/>
+  </w:num>
+  <w:num w:numId="37" w16cid:durableId="2089768025">
+    <w:abstractNumId w:val="14"/>
+  </w:num>
+  <w:num w:numId="38" w16cid:durableId="1312558408">
     <w:abstractNumId w:val="26"/>
   </w:num>
-  <w:num w:numId="37" w16cid:durableId="2089768025">
-    <w:abstractNumId w:val="12"/>
-  </w:num>
-  <w:num w:numId="38" w16cid:durableId="1312558408">
-    <w:abstractNumId w:val="21"/>
-  </w:num>
   <w:num w:numId="39" w16cid:durableId="988555030">
-    <w:abstractNumId w:val="29"/>
+    <w:abstractNumId w:val="35"/>
   </w:num>
   <w:num w:numId="40" w16cid:durableId="497041544">
-    <w:abstractNumId w:val="55"/>
+    <w:abstractNumId w:val="64"/>
   </w:num>
   <w:num w:numId="41" w16cid:durableId="1098863632">
-    <w:abstractNumId w:val="28"/>
+    <w:abstractNumId w:val="34"/>
   </w:num>
   <w:num w:numId="42" w16cid:durableId="2087998300">
-    <w:abstractNumId w:val="32"/>
+    <w:abstractNumId w:val="38"/>
   </w:num>
   <w:num w:numId="43" w16cid:durableId="32077361">
-    <w:abstractNumId w:val="60"/>
+    <w:abstractNumId w:val="69"/>
   </w:num>
   <w:num w:numId="44" w16cid:durableId="195629393">
     <w:abstractNumId w:val="2"/>
   </w:num>
   <w:num w:numId="45" w16cid:durableId="122306412">
-    <w:abstractNumId w:val="35"/>
+    <w:abstractNumId w:val="41"/>
   </w:num>
   <w:num w:numId="46" w16cid:durableId="1157845596">
-    <w:abstractNumId w:val="48"/>
+    <w:abstractNumId w:val="55"/>
   </w:num>
   <w:num w:numId="47" w16cid:durableId="2079740825">
-    <w:abstractNumId w:val="39"/>
+    <w:abstractNumId w:val="45"/>
   </w:num>
   <w:num w:numId="48" w16cid:durableId="825440182">
-    <w:abstractNumId w:val="53"/>
+    <w:abstractNumId w:val="62"/>
   </w:num>
   <w:num w:numId="49" w16cid:durableId="182594935">
-    <w:abstractNumId w:val="57"/>
+    <w:abstractNumId w:val="66"/>
   </w:num>
   <w:num w:numId="50" w16cid:durableId="1308360786">
-    <w:abstractNumId w:val="64"/>
+    <w:abstractNumId w:val="73"/>
   </w:num>
   <w:num w:numId="51" w16cid:durableId="1632978932">
+    <w:abstractNumId w:val="11"/>
+  </w:num>
+  <w:num w:numId="52" w16cid:durableId="391537947">
+    <w:abstractNumId w:val="13"/>
+  </w:num>
+  <w:num w:numId="53" w16cid:durableId="378554586">
     <w:abstractNumId w:val="9"/>
   </w:num>
-  <w:num w:numId="52" w16cid:durableId="391537947">
-    <w:abstractNumId w:val="11"/>
-  </w:num>
-  <w:num w:numId="53" w16cid:durableId="378554586">
-    <w:abstractNumId w:val="7"/>
-  </w:num>
   <w:num w:numId="54" w16cid:durableId="1201436312">
-    <w:abstractNumId w:val="3"/>
+    <w:abstractNumId w:val="4"/>
   </w:num>
   <w:num w:numId="55" w16cid:durableId="1529443842">
-    <w:abstractNumId w:val="56"/>
+    <w:abstractNumId w:val="65"/>
   </w:num>
   <w:num w:numId="56" w16cid:durableId="189415164">
-    <w:abstractNumId w:val="4"/>
+    <w:abstractNumId w:val="5"/>
   </w:num>
   <w:num w:numId="57" w16cid:durableId="1594314221">
-    <w:abstractNumId w:val="40"/>
+    <w:abstractNumId w:val="46"/>
   </w:num>
   <w:num w:numId="58" w16cid:durableId="1226257099">
-    <w:abstractNumId w:val="37"/>
+    <w:abstractNumId w:val="43"/>
   </w:num>
   <w:num w:numId="59" w16cid:durableId="1419328051">
     <w:abstractNumId w:val="0"/>
   </w:num>
   <w:num w:numId="60" w16cid:durableId="1710567223">
-    <w:abstractNumId w:val="15"/>
+    <w:abstractNumId w:val="17"/>
   </w:num>
   <w:num w:numId="61" w16cid:durableId="630017495">
-    <w:abstractNumId w:val="50"/>
+    <w:abstractNumId w:val="59"/>
   </w:num>
   <w:num w:numId="62" w16cid:durableId="1282304201">
+    <w:abstractNumId w:val="30"/>
+  </w:num>
+  <w:num w:numId="63" w16cid:durableId="1717508633">
+    <w:abstractNumId w:val="58"/>
+  </w:num>
+  <w:num w:numId="64" w16cid:durableId="1437024406">
+    <w:abstractNumId w:val="71"/>
+  </w:num>
+  <w:num w:numId="65" w16cid:durableId="1457289484">
+    <w:abstractNumId w:val="7"/>
+  </w:num>
+  <w:num w:numId="66" w16cid:durableId="2044553889">
+    <w:abstractNumId w:val="57"/>
+  </w:num>
+  <w:num w:numId="67" w16cid:durableId="476344594">
+    <w:abstractNumId w:val="19"/>
+  </w:num>
+  <w:num w:numId="68" w16cid:durableId="654841836">
+    <w:abstractNumId w:val="56"/>
+  </w:num>
+  <w:num w:numId="69" w16cid:durableId="65881997">
     <w:abstractNumId w:val="25"/>
   </w:num>
-  <w:num w:numId="63" w16cid:durableId="1717508633">
-    <w:abstractNumId w:val="49"/>
+  <w:num w:numId="70" w16cid:durableId="356779715">
+    <w:abstractNumId w:val="22"/>
   </w:num>
-  <w:num w:numId="64" w16cid:durableId="1437024406">
-    <w:abstractNumId w:val="62"/>
+  <w:num w:numId="71" w16cid:durableId="1630354395">
+    <w:abstractNumId w:val="3"/>
   </w:num>
-  <w:num w:numId="65" w16cid:durableId="1457289484">
-    <w:abstractNumId w:val="6"/>
+  <w:num w:numId="72" w16cid:durableId="760300450">
+    <w:abstractNumId w:val="47"/>
   </w:num>
-  <w:numIdMacAtCleanup w:val="61"/>
+  <w:num w:numId="73" w16cid:durableId="1148521502">
+    <w:abstractNumId w:val="8"/>
+  </w:num>
+  <w:num w:numId="74" w16cid:durableId="1531189807">
+    <w:abstractNumId w:val="32"/>
+  </w:num>
+  <w:numIdMacAtCleanup w:val="74"/>
 </w:numbering>
 </file>
 

</xml_diff>

<commit_message>
Add file upload, persistent storage with logs.json, and analytics dashboard
</commit_message>
<xml_diff>
--- a/Daily Report of Project.docx
+++ b/Daily Report of Project.docx
@@ -14275,6 +14275,7 @@
       <w:r>
         <w:rPr>
           <w:rFonts w:ascii="Times New Roman" w:hAnsi="Times New Roman" w:cs="Times New Roman"/>
+          <w:noProof/>
         </w:rPr>
         <w:lastRenderedPageBreak/>
         <w:drawing>
@@ -14335,6 +14336,7 @@
       <w:r>
         <w:rPr>
           <w:rFonts w:ascii="Times New Roman" w:hAnsi="Times New Roman" w:cs="Times New Roman"/>
+          <w:noProof/>
         </w:rPr>
         <w:drawing>
           <wp:inline distT="0" distB="0" distL="0" distR="0" wp14:anchorId="44B29AE3" wp14:editId="238D3542">
@@ -14385,6 +14387,7 @@
       <w:r>
         <w:rPr>
           <w:rFonts w:ascii="Times New Roman" w:hAnsi="Times New Roman" w:cs="Times New Roman"/>
+          <w:noProof/>
         </w:rPr>
         <w:drawing>
           <wp:inline distT="0" distB="0" distL="0" distR="0" wp14:anchorId="2350FAFB" wp14:editId="05912331">
@@ -14435,6 +14438,7 @@
       <w:r>
         <w:rPr>
           <w:rFonts w:ascii="Times New Roman" w:hAnsi="Times New Roman" w:cs="Times New Roman"/>
+          <w:noProof/>
         </w:rPr>
         <w:lastRenderedPageBreak/>
         <w:drawing>
@@ -14486,6 +14490,7 @@
       <w:r>
         <w:rPr>
           <w:rFonts w:ascii="Times New Roman" w:hAnsi="Times New Roman" w:cs="Times New Roman"/>
+          <w:noProof/>
         </w:rPr>
         <w:lastRenderedPageBreak/>
         <w:drawing>
@@ -14537,6 +14542,7 @@
       <w:r>
         <w:rPr>
           <w:rFonts w:ascii="Times New Roman" w:hAnsi="Times New Roman" w:cs="Times New Roman"/>
+          <w:noProof/>
         </w:rPr>
         <w:drawing>
           <wp:inline distT="0" distB="0" distL="0" distR="0" wp14:anchorId="5D022112" wp14:editId="12BE1AEC">
@@ -14586,6 +14592,7 @@
       <w:r>
         <w:rPr>
           <w:rFonts w:ascii="Times New Roman" w:hAnsi="Times New Roman" w:cs="Times New Roman"/>
+          <w:noProof/>
         </w:rPr>
         <w:drawing>
           <wp:inline distT="0" distB="0" distL="0" distR="0" wp14:anchorId="4DA9EAEB" wp14:editId="497E3471">
@@ -14717,6 +14724,1864 @@
         <w:t xml:space="preserve"> your system in real time.</w:t>
       </w:r>
     </w:p>
+    <w:tbl>
+      <w:tblPr>
+        <w:tblW w:w="10490" w:type="dxa"/>
+        <w:tblCellMar>
+          <w:left w:w="10" w:type="dxa"/>
+          <w:right w:w="10" w:type="dxa"/>
+        </w:tblCellMar>
+        <w:tblLook w:val="04A0" w:firstRow="1" w:lastRow="0" w:firstColumn="1" w:lastColumn="0" w:noHBand="0" w:noVBand="1"/>
+      </w:tblPr>
+      <w:tblGrid>
+        <w:gridCol w:w="1691"/>
+        <w:gridCol w:w="4509"/>
+        <w:gridCol w:w="4290"/>
+      </w:tblGrid>
+      <w:tr>
+        <w:trPr>
+          <w:trHeight w:val="1561"/>
+        </w:trPr>
+        <w:tc>
+          <w:tcPr>
+            <w:tcW w:w="1691" w:type="dxa"/>
+            <w:tcBorders>
+              <w:top w:val="nil"/>
+              <w:left w:val="nil"/>
+              <w:bottom w:val="nil"/>
+              <w:right w:val="nil"/>
+            </w:tcBorders>
+            <w:tcMar>
+              <w:top w:w="0" w:type="dxa"/>
+              <w:left w:w="0" w:type="dxa"/>
+              <w:bottom w:w="0" w:type="dxa"/>
+              <w:right w:w="0" w:type="dxa"/>
+            </w:tcMar>
+            <w:hideMark/>
+          </w:tcPr>
+          <w:p>
+            <w:pPr>
+              <w:rPr>
+                <w:rFonts w:ascii="Times New Roman" w:hAnsi="Times New Roman" w:cs="Times New Roman"/>
+              </w:rPr>
+            </w:pPr>
+            <w:r>
+              <w:rPr>
+                <w:rFonts w:ascii="Times New Roman" w:hAnsi="Times New Roman" w:cs="Times New Roman"/>
+              </w:rPr>
+              <w:t>03 August 2026</w:t>
+            </w:r>
+          </w:p>
+          <w:p>
+            <w:pPr>
+              <w:ind w:left="400"/>
+              <w:rPr>
+                <w:rFonts w:ascii="Times New Roman" w:hAnsi="Times New Roman" w:cs="Times New Roman"/>
+              </w:rPr>
+            </w:pPr>
+            <w:r>
+              <w:rPr>
+                <w:rFonts w:ascii="Times New Roman" w:hAnsi="Times New Roman" w:cs="Times New Roman"/>
+              </w:rPr>
+              <w:t>Day 1</w:t>
+            </w:r>
+            <w:r>
+              <w:rPr>
+                <w:rFonts w:ascii="Times New Roman" w:hAnsi="Times New Roman" w:cs="Times New Roman"/>
+              </w:rPr>
+              <w:t>1</w:t>
+            </w:r>
+            <w:r>
+              <w:rPr>
+                <w:rFonts w:ascii="Times New Roman" w:hAnsi="Times New Roman" w:cs="Times New Roman"/>
+              </w:rPr>
+              <w:t xml:space="preserve"> </w:t>
+            </w:r>
+          </w:p>
+        </w:tc>
+        <w:tc>
+          <w:tcPr>
+            <w:tcW w:w="4509" w:type="dxa"/>
+            <w:tcBorders>
+              <w:top w:val="nil"/>
+              <w:left w:val="nil"/>
+              <w:bottom w:val="nil"/>
+              <w:right w:val="nil"/>
+            </w:tcBorders>
+            <w:tcMar>
+              <w:top w:w="0" w:type="dxa"/>
+              <w:left w:w="0" w:type="dxa"/>
+              <w:bottom w:w="0" w:type="dxa"/>
+              <w:right w:w="0" w:type="dxa"/>
+            </w:tcMar>
+            <w:hideMark/>
+          </w:tcPr>
+          <w:p>
+            <w:pPr>
+              <w:rPr>
+                <w:rFonts w:ascii="Times New Roman" w:hAnsi="Times New Roman" w:cs="Times New Roman"/>
+                <w:b/>
+                <w:bCs/>
+              </w:rPr>
+            </w:pPr>
+            <w:r>
+              <w:rPr>
+                <w:rFonts w:ascii="Times New Roman" w:hAnsi="Times New Roman" w:cs="Times New Roman"/>
+                <w:b/>
+                <w:bCs/>
+              </w:rPr>
+              <w:t xml:space="preserve">Today's Activities </w:t>
+            </w:r>
+          </w:p>
+          <w:p>
+            <w:pPr>
+              <w:numPr>
+                <w:ilvl w:val="0"/>
+                <w:numId w:val="3"/>
+              </w:numPr>
+              <w:rPr>
+                <w:rFonts w:ascii="Times New Roman" w:hAnsi="Times New Roman" w:cs="Times New Roman"/>
+              </w:rPr>
+            </w:pPr>
+            <w:r>
+              <w:rPr>
+                <w:rFonts w:ascii="Times New Roman" w:hAnsi="Times New Roman" w:cs="Times New Roman"/>
+                <w:b/>
+                <w:bCs/>
+              </w:rPr>
+              <w:t>Backend – File Upload + Save</w:t>
+            </w:r>
+          </w:p>
+          <w:p>
+            <w:pPr>
+              <w:pStyle w:val="ListParagraph"/>
+              <w:numPr>
+                <w:ilvl w:val="0"/>
+                <w:numId w:val="75"/>
+              </w:numPr>
+              <w:ind w:left="743"/>
+              <w:rPr>
+                <w:rFonts w:ascii="Times New Roman" w:hAnsi="Times New Roman" w:cs="Times New Roman"/>
+              </w:rPr>
+            </w:pPr>
+            <w:r>
+              <w:rPr>
+                <w:rFonts w:ascii="Times New Roman" w:hAnsi="Times New Roman" w:cs="Times New Roman"/>
+                <w:b/>
+                <w:bCs/>
+              </w:rPr>
+              <w:t xml:space="preserve">Install </w:t>
+            </w:r>
+            <w:proofErr w:type="spellStart"/>
+            <w:r>
+              <w:rPr>
+                <w:rFonts w:ascii="Times New Roman" w:hAnsi="Times New Roman" w:cs="Times New Roman"/>
+                <w:b/>
+                <w:bCs/>
+              </w:rPr>
+              <w:t>multer</w:t>
+            </w:r>
+            <w:proofErr w:type="spellEnd"/>
+            <w:r>
+              <w:rPr>
+                <w:rFonts w:ascii="Times New Roman" w:hAnsi="Times New Roman" w:cs="Times New Roman"/>
+                <w:b/>
+                <w:bCs/>
+              </w:rPr>
+              <w:t>:</w:t>
+            </w:r>
+            <w:r>
+              <w:rPr>
+                <w:rFonts w:ascii="Times New Roman" w:hAnsi="Times New Roman" w:cs="Times New Roman"/>
+              </w:rPr>
+              <w:t xml:space="preserve"> </w:t>
+            </w:r>
+            <w:proofErr w:type="spellStart"/>
+            <w:r>
+              <w:rPr>
+                <w:rFonts w:ascii="Times New Roman" w:hAnsi="Times New Roman" w:cs="Times New Roman"/>
+              </w:rPr>
+              <w:t>npm</w:t>
+            </w:r>
+            <w:proofErr w:type="spellEnd"/>
+            <w:r>
+              <w:rPr>
+                <w:rFonts w:ascii="Times New Roman" w:hAnsi="Times New Roman" w:cs="Times New Roman"/>
+              </w:rPr>
+              <w:t xml:space="preserve"> install </w:t>
+            </w:r>
+            <w:proofErr w:type="spellStart"/>
+            <w:r>
+              <w:rPr>
+                <w:rFonts w:ascii="Times New Roman" w:hAnsi="Times New Roman" w:cs="Times New Roman"/>
+              </w:rPr>
+              <w:t>multer</w:t>
+            </w:r>
+            <w:proofErr w:type="spellEnd"/>
+          </w:p>
+          <w:p>
+            <w:pPr>
+              <w:pStyle w:val="ListParagraph"/>
+              <w:numPr>
+                <w:ilvl w:val="0"/>
+                <w:numId w:val="75"/>
+              </w:numPr>
+              <w:ind w:left="743"/>
+              <w:rPr>
+                <w:rFonts w:ascii="Times New Roman" w:hAnsi="Times New Roman" w:cs="Times New Roman"/>
+              </w:rPr>
+            </w:pPr>
+            <w:r>
+              <w:rPr>
+                <w:rFonts w:ascii="Times New Roman" w:hAnsi="Times New Roman" w:cs="Times New Roman"/>
+                <w:b/>
+                <w:bCs/>
+              </w:rPr>
+              <w:t>Add /</w:t>
+            </w:r>
+            <w:proofErr w:type="spellStart"/>
+            <w:r>
+              <w:rPr>
+                <w:rFonts w:ascii="Times New Roman" w:hAnsi="Times New Roman" w:cs="Times New Roman"/>
+                <w:b/>
+                <w:bCs/>
+              </w:rPr>
+              <w:t>api</w:t>
+            </w:r>
+            <w:proofErr w:type="spellEnd"/>
+            <w:r>
+              <w:rPr>
+                <w:rFonts w:ascii="Times New Roman" w:hAnsi="Times New Roman" w:cs="Times New Roman"/>
+                <w:b/>
+                <w:bCs/>
+              </w:rPr>
+              <w:t>/upload route</w:t>
+            </w:r>
+            <w:r>
+              <w:rPr>
+                <w:rFonts w:ascii="Times New Roman" w:hAnsi="Times New Roman" w:cs="Times New Roman"/>
+                <w:b/>
+                <w:bCs/>
+              </w:rPr>
+              <w:t xml:space="preserve"> in server.js</w:t>
+            </w:r>
+          </w:p>
+          <w:p>
+            <w:pPr>
+              <w:pStyle w:val="ListParagraph"/>
+              <w:numPr>
+                <w:ilvl w:val="0"/>
+                <w:numId w:val="76"/>
+              </w:numPr>
+              <w:ind w:left="1169"/>
+              <w:rPr>
+                <w:rFonts w:ascii="Times New Roman" w:hAnsi="Times New Roman" w:cs="Times New Roman"/>
+              </w:rPr>
+            </w:pPr>
+            <w:r>
+              <w:rPr>
+                <w:rFonts w:ascii="Times New Roman" w:hAnsi="Times New Roman" w:cs="Times New Roman"/>
+              </w:rPr>
+              <w:t>Read uploaded .log file</w:t>
+            </w:r>
+          </w:p>
+          <w:p>
+            <w:pPr>
+              <w:pStyle w:val="ListParagraph"/>
+              <w:numPr>
+                <w:ilvl w:val="0"/>
+                <w:numId w:val="76"/>
+              </w:numPr>
+              <w:ind w:left="1169"/>
+              <w:rPr>
+                <w:rFonts w:ascii="Times New Roman" w:hAnsi="Times New Roman" w:cs="Times New Roman"/>
+              </w:rPr>
+            </w:pPr>
+            <w:r>
+              <w:rPr>
+                <w:rFonts w:ascii="Times New Roman" w:hAnsi="Times New Roman" w:cs="Times New Roman"/>
+              </w:rPr>
+              <w:t>Parse lines into {time, level, message}</w:t>
+            </w:r>
+          </w:p>
+          <w:p>
+            <w:pPr>
+              <w:pStyle w:val="ListParagraph"/>
+              <w:numPr>
+                <w:ilvl w:val="0"/>
+                <w:numId w:val="76"/>
+              </w:numPr>
+              <w:ind w:left="1169"/>
+              <w:rPr>
+                <w:rFonts w:ascii="Times New Roman" w:hAnsi="Times New Roman" w:cs="Times New Roman"/>
+              </w:rPr>
+            </w:pPr>
+            <w:r>
+              <w:rPr>
+                <w:rFonts w:ascii="Times New Roman" w:hAnsi="Times New Roman" w:cs="Times New Roman"/>
+                <w:b/>
+                <w:bCs/>
+              </w:rPr>
+              <w:t xml:space="preserve">Save to </w:t>
+            </w:r>
+            <w:proofErr w:type="spellStart"/>
+            <w:proofErr w:type="gramStart"/>
+            <w:r>
+              <w:rPr>
+                <w:rFonts w:ascii="Times New Roman" w:hAnsi="Times New Roman" w:cs="Times New Roman"/>
+                <w:b/>
+                <w:bCs/>
+              </w:rPr>
+              <w:t>logs.json</w:t>
+            </w:r>
+            <w:proofErr w:type="spellEnd"/>
+            <w:proofErr w:type="gramEnd"/>
+            <w:r>
+              <w:rPr>
+                <w:rFonts w:ascii="Times New Roman" w:hAnsi="Times New Roman" w:cs="Times New Roman"/>
+              </w:rPr>
+              <w:t xml:space="preserve"> so data doesn’t disappear</w:t>
+            </w:r>
+          </w:p>
+          <w:p>
+            <w:pPr>
+              <w:pStyle w:val="ListParagraph"/>
+              <w:numPr>
+                <w:ilvl w:val="0"/>
+                <w:numId w:val="75"/>
+              </w:numPr>
+              <w:ind w:left="743"/>
+              <w:rPr>
+                <w:rFonts w:ascii="Times New Roman" w:hAnsi="Times New Roman" w:cs="Times New Roman"/>
+              </w:rPr>
+            </w:pPr>
+            <w:r>
+              <w:rPr>
+                <w:rFonts w:ascii="Times New Roman" w:hAnsi="Times New Roman" w:cs="Times New Roman"/>
+                <w:b/>
+                <w:bCs/>
+              </w:rPr>
+              <w:t>Add /</w:t>
+            </w:r>
+            <w:proofErr w:type="spellStart"/>
+            <w:r>
+              <w:rPr>
+                <w:rFonts w:ascii="Times New Roman" w:hAnsi="Times New Roman" w:cs="Times New Roman"/>
+                <w:b/>
+                <w:bCs/>
+              </w:rPr>
+              <w:t>api</w:t>
+            </w:r>
+            <w:proofErr w:type="spellEnd"/>
+            <w:r>
+              <w:rPr>
+                <w:rFonts w:ascii="Times New Roman" w:hAnsi="Times New Roman" w:cs="Times New Roman"/>
+                <w:b/>
+                <w:bCs/>
+              </w:rPr>
+              <w:t>/logs/latest route</w:t>
+            </w:r>
+          </w:p>
+          <w:p>
+            <w:pPr>
+              <w:pStyle w:val="ListParagraph"/>
+              <w:numPr>
+                <w:ilvl w:val="0"/>
+                <w:numId w:val="77"/>
+              </w:numPr>
+              <w:ind w:left="1169"/>
+              <w:rPr>
+                <w:rFonts w:ascii="Times New Roman" w:hAnsi="Times New Roman" w:cs="Times New Roman"/>
+              </w:rPr>
+            </w:pPr>
+            <w:r>
+              <w:rPr>
+                <w:rFonts w:ascii="Times New Roman" w:hAnsi="Times New Roman" w:cs="Times New Roman"/>
+              </w:rPr>
+              <w:t xml:space="preserve">Read from </w:t>
+            </w:r>
+            <w:proofErr w:type="spellStart"/>
+            <w:proofErr w:type="gramStart"/>
+            <w:r>
+              <w:rPr>
+                <w:rFonts w:ascii="Times New Roman" w:hAnsi="Times New Roman" w:cs="Times New Roman"/>
+              </w:rPr>
+              <w:t>logs.json</w:t>
+            </w:r>
+            <w:proofErr w:type="spellEnd"/>
+            <w:proofErr w:type="gramEnd"/>
+            <w:r>
+              <w:rPr>
+                <w:rFonts w:ascii="Times New Roman" w:hAnsi="Times New Roman" w:cs="Times New Roman"/>
+              </w:rPr>
+              <w:t xml:space="preserve"> and send to frontend</w:t>
+            </w:r>
+          </w:p>
+          <w:p>
+            <w:pPr>
+              <w:numPr>
+                <w:ilvl w:val="0"/>
+                <w:numId w:val="3"/>
+              </w:numPr>
+              <w:rPr>
+                <w:rFonts w:ascii="Times New Roman" w:hAnsi="Times New Roman" w:cs="Times New Roman"/>
+              </w:rPr>
+            </w:pPr>
+            <w:r>
+              <w:rPr>
+                <w:rFonts w:ascii="Times New Roman" w:hAnsi="Times New Roman" w:cs="Times New Roman"/>
+                <w:b/>
+                <w:bCs/>
+              </w:rPr>
+              <w:t>Backend – Analytics Data</w:t>
+            </w:r>
+          </w:p>
+          <w:p>
+            <w:pPr>
+              <w:pStyle w:val="ListParagraph"/>
+              <w:numPr>
+                <w:ilvl w:val="0"/>
+                <w:numId w:val="75"/>
+              </w:numPr>
+              <w:ind w:left="743"/>
+              <w:rPr>
+                <w:rFonts w:ascii="Times New Roman" w:hAnsi="Times New Roman" w:cs="Times New Roman"/>
+              </w:rPr>
+            </w:pPr>
+            <w:r>
+              <w:rPr>
+                <w:rFonts w:ascii="Times New Roman" w:hAnsi="Times New Roman" w:cs="Times New Roman"/>
+                <w:b/>
+                <w:bCs/>
+              </w:rPr>
+              <w:t>Update /</w:t>
+            </w:r>
+            <w:proofErr w:type="spellStart"/>
+            <w:r>
+              <w:rPr>
+                <w:rFonts w:ascii="Times New Roman" w:hAnsi="Times New Roman" w:cs="Times New Roman"/>
+                <w:b/>
+                <w:bCs/>
+              </w:rPr>
+              <w:t>api</w:t>
+            </w:r>
+            <w:proofErr w:type="spellEnd"/>
+            <w:r>
+              <w:rPr>
+                <w:rFonts w:ascii="Times New Roman" w:hAnsi="Times New Roman" w:cs="Times New Roman"/>
+                <w:b/>
+                <w:bCs/>
+              </w:rPr>
+              <w:t>/analytics/summary</w:t>
+            </w:r>
+          </w:p>
+          <w:p>
+            <w:pPr>
+              <w:pStyle w:val="ListParagraph"/>
+              <w:numPr>
+                <w:ilvl w:val="0"/>
+                <w:numId w:val="77"/>
+              </w:numPr>
+              <w:ind w:left="1169"/>
+              <w:rPr>
+                <w:rFonts w:ascii="Times New Roman" w:hAnsi="Times New Roman" w:cs="Times New Roman"/>
+              </w:rPr>
+            </w:pPr>
+            <w:r>
+              <w:rPr>
+                <w:rFonts w:ascii="Times New Roman" w:hAnsi="Times New Roman" w:cs="Times New Roman"/>
+              </w:rPr>
+              <w:t xml:space="preserve">Read logs from </w:t>
+            </w:r>
+            <w:proofErr w:type="spellStart"/>
+            <w:proofErr w:type="gramStart"/>
+            <w:r>
+              <w:rPr>
+                <w:rFonts w:ascii="Times New Roman" w:hAnsi="Times New Roman" w:cs="Times New Roman"/>
+              </w:rPr>
+              <w:t>logs.json</w:t>
+            </w:r>
+            <w:proofErr w:type="spellEnd"/>
+            <w:proofErr w:type="gramEnd"/>
+          </w:p>
+          <w:p>
+            <w:pPr>
+              <w:pStyle w:val="ListParagraph"/>
+              <w:numPr>
+                <w:ilvl w:val="0"/>
+                <w:numId w:val="77"/>
+              </w:numPr>
+              <w:ind w:left="1169"/>
+              <w:rPr>
+                <w:rFonts w:ascii="Times New Roman" w:hAnsi="Times New Roman" w:cs="Times New Roman"/>
+              </w:rPr>
+            </w:pPr>
+            <w:r>
+              <w:rPr>
+                <w:rFonts w:ascii="Times New Roman" w:hAnsi="Times New Roman" w:cs="Times New Roman"/>
+              </w:rPr>
+              <w:t xml:space="preserve">Return: </w:t>
+            </w:r>
+            <w:proofErr w:type="spellStart"/>
+            <w:r>
+              <w:rPr>
+                <w:rFonts w:ascii="Times New Roman" w:hAnsi="Times New Roman" w:cs="Times New Roman"/>
+              </w:rPr>
+              <w:t>totalLogs</w:t>
+            </w:r>
+            <w:proofErr w:type="spellEnd"/>
+            <w:r>
+              <w:rPr>
+                <w:rFonts w:ascii="Times New Roman" w:hAnsi="Times New Roman" w:cs="Times New Roman"/>
+              </w:rPr>
+              <w:t xml:space="preserve">, errors, </w:t>
+            </w:r>
+            <w:proofErr w:type="spellStart"/>
+            <w:r>
+              <w:rPr>
+                <w:rFonts w:ascii="Times New Roman" w:hAnsi="Times New Roman" w:cs="Times New Roman"/>
+              </w:rPr>
+              <w:t>avgResponse</w:t>
+            </w:r>
+            <w:proofErr w:type="spellEnd"/>
+            <w:r>
+              <w:rPr>
+                <w:rFonts w:ascii="Times New Roman" w:hAnsi="Times New Roman" w:cs="Times New Roman"/>
+              </w:rPr>
+              <w:t>, health</w:t>
+            </w:r>
+          </w:p>
+          <w:p>
+            <w:pPr>
+              <w:pStyle w:val="ListParagraph"/>
+              <w:numPr>
+                <w:ilvl w:val="0"/>
+                <w:numId w:val="75"/>
+              </w:numPr>
+              <w:ind w:left="743"/>
+              <w:rPr>
+                <w:rFonts w:ascii="Times New Roman" w:hAnsi="Times New Roman" w:cs="Times New Roman"/>
+              </w:rPr>
+            </w:pPr>
+            <w:r>
+              <w:rPr>
+                <w:rFonts w:ascii="Times New Roman" w:hAnsi="Times New Roman" w:cs="Times New Roman"/>
+                <w:b/>
+                <w:bCs/>
+              </w:rPr>
+              <w:t>Update /</w:t>
+            </w:r>
+            <w:proofErr w:type="spellStart"/>
+            <w:r>
+              <w:rPr>
+                <w:rFonts w:ascii="Times New Roman" w:hAnsi="Times New Roman" w:cs="Times New Roman"/>
+                <w:b/>
+                <w:bCs/>
+              </w:rPr>
+              <w:t>api</w:t>
+            </w:r>
+            <w:proofErr w:type="spellEnd"/>
+            <w:r>
+              <w:rPr>
+                <w:rFonts w:ascii="Times New Roman" w:hAnsi="Times New Roman" w:cs="Times New Roman"/>
+                <w:b/>
+                <w:bCs/>
+              </w:rPr>
+              <w:t>/analytics/trends</w:t>
+            </w:r>
+          </w:p>
+          <w:p>
+            <w:pPr>
+              <w:pStyle w:val="ListParagraph"/>
+              <w:numPr>
+                <w:ilvl w:val="0"/>
+                <w:numId w:val="78"/>
+              </w:numPr>
+              <w:ind w:left="1169"/>
+              <w:rPr>
+                <w:rFonts w:ascii="Times New Roman" w:hAnsi="Times New Roman" w:cs="Times New Roman"/>
+              </w:rPr>
+            </w:pPr>
+            <w:r>
+              <w:rPr>
+                <w:rFonts w:ascii="Times New Roman" w:hAnsi="Times New Roman" w:cs="Times New Roman"/>
+              </w:rPr>
+              <w:t>Return log count by level for pie chart</w:t>
+            </w:r>
+          </w:p>
+          <w:p>
+            <w:pPr>
+              <w:numPr>
+                <w:ilvl w:val="0"/>
+                <w:numId w:val="3"/>
+              </w:numPr>
+              <w:rPr>
+                <w:rFonts w:ascii="Times New Roman" w:hAnsi="Times New Roman" w:cs="Times New Roman"/>
+              </w:rPr>
+            </w:pPr>
+            <w:r>
+              <w:rPr>
+                <w:rFonts w:ascii="Times New Roman" w:hAnsi="Times New Roman" w:cs="Times New Roman"/>
+                <w:b/>
+                <w:bCs/>
+              </w:rPr>
+              <w:t>Frontend – Dashboard Upload</w:t>
+            </w:r>
+          </w:p>
+          <w:p>
+            <w:pPr>
+              <w:pStyle w:val="ListParagraph"/>
+              <w:numPr>
+                <w:ilvl w:val="0"/>
+                <w:numId w:val="75"/>
+              </w:numPr>
+              <w:ind w:left="743"/>
+              <w:rPr>
+                <w:rFonts w:ascii="Times New Roman" w:hAnsi="Times New Roman" w:cs="Times New Roman"/>
+              </w:rPr>
+            </w:pPr>
+            <w:r>
+              <w:rPr>
+                <w:rFonts w:ascii="Times New Roman" w:hAnsi="Times New Roman" w:cs="Times New Roman"/>
+                <w:b/>
+                <w:bCs/>
+              </w:rPr>
+              <w:t>Connect upload button</w:t>
+            </w:r>
+            <w:r>
+              <w:rPr>
+                <w:rFonts w:ascii="Times New Roman" w:hAnsi="Times New Roman" w:cs="Times New Roman"/>
+              </w:rPr>
+              <w:t xml:space="preserve"> to /</w:t>
+            </w:r>
+            <w:proofErr w:type="spellStart"/>
+            <w:r>
+              <w:rPr>
+                <w:rFonts w:ascii="Times New Roman" w:hAnsi="Times New Roman" w:cs="Times New Roman"/>
+              </w:rPr>
+              <w:t>api</w:t>
+            </w:r>
+            <w:proofErr w:type="spellEnd"/>
+            <w:r>
+              <w:rPr>
+                <w:rFonts w:ascii="Times New Roman" w:hAnsi="Times New Roman" w:cs="Times New Roman"/>
+              </w:rPr>
+              <w:t>/upload</w:t>
+            </w:r>
+          </w:p>
+          <w:p>
+            <w:pPr>
+              <w:pStyle w:val="ListParagraph"/>
+              <w:numPr>
+                <w:ilvl w:val="0"/>
+                <w:numId w:val="75"/>
+              </w:numPr>
+              <w:ind w:left="743"/>
+              <w:rPr>
+                <w:rFonts w:ascii="Times New Roman" w:hAnsi="Times New Roman" w:cs="Times New Roman"/>
+              </w:rPr>
+            </w:pPr>
+            <w:r>
+              <w:rPr>
+                <w:rFonts w:ascii="Times New Roman" w:hAnsi="Times New Roman" w:cs="Times New Roman"/>
+                <w:b/>
+                <w:bCs/>
+              </w:rPr>
+              <w:t>Show alert:</w:t>
+            </w:r>
+            <w:r>
+              <w:rPr>
+                <w:rFonts w:ascii="Times New Roman" w:hAnsi="Times New Roman" w:cs="Times New Roman"/>
+              </w:rPr>
+              <w:t xml:space="preserve"> Loaded X logs after upload</w:t>
+            </w:r>
+          </w:p>
+          <w:p>
+            <w:pPr>
+              <w:pStyle w:val="ListParagraph"/>
+              <w:numPr>
+                <w:ilvl w:val="0"/>
+                <w:numId w:val="75"/>
+              </w:numPr>
+              <w:ind w:left="743"/>
+              <w:rPr>
+                <w:rFonts w:ascii="Times New Roman" w:hAnsi="Times New Roman" w:cs="Times New Roman"/>
+              </w:rPr>
+            </w:pPr>
+            <w:r>
+              <w:rPr>
+                <w:rFonts w:ascii="Times New Roman" w:hAnsi="Times New Roman" w:cs="Times New Roman"/>
+                <w:b/>
+                <w:bCs/>
+              </w:rPr>
+              <w:t xml:space="preserve">Auto-refresh logs table </w:t>
+            </w:r>
+            <w:r>
+              <w:rPr>
+                <w:rFonts w:ascii="Times New Roman" w:hAnsi="Times New Roman" w:cs="Times New Roman"/>
+              </w:rPr>
+              <w:t>after upload</w:t>
+            </w:r>
+          </w:p>
+          <w:p>
+            <w:pPr>
+              <w:numPr>
+                <w:ilvl w:val="0"/>
+                <w:numId w:val="3"/>
+              </w:numPr>
+              <w:rPr>
+                <w:rFonts w:ascii="Times New Roman" w:hAnsi="Times New Roman" w:cs="Times New Roman"/>
+              </w:rPr>
+            </w:pPr>
+            <w:r>
+              <w:rPr>
+                <w:rFonts w:ascii="Times New Roman" w:hAnsi="Times New Roman" w:cs="Times New Roman"/>
+                <w:b/>
+                <w:bCs/>
+              </w:rPr>
+              <w:t>Frontend – Analytics Tab</w:t>
+            </w:r>
+          </w:p>
+          <w:p>
+            <w:pPr>
+              <w:pStyle w:val="ListParagraph"/>
+              <w:numPr>
+                <w:ilvl w:val="0"/>
+                <w:numId w:val="79"/>
+              </w:numPr>
+              <w:ind w:left="743"/>
+              <w:rPr>
+                <w:rFonts w:ascii="Times New Roman" w:hAnsi="Times New Roman" w:cs="Times New Roman"/>
+              </w:rPr>
+            </w:pPr>
+            <w:r>
+              <w:rPr>
+                <w:rFonts w:ascii="Times New Roman" w:hAnsi="Times New Roman" w:cs="Times New Roman"/>
+                <w:b/>
+                <w:bCs/>
+              </w:rPr>
+              <w:t xml:space="preserve">Fix “No Log Data” → </w:t>
+            </w:r>
+            <w:r>
+              <w:rPr>
+                <w:rFonts w:ascii="Times New Roman" w:hAnsi="Times New Roman" w:cs="Times New Roman"/>
+              </w:rPr>
+              <w:t>Call /</w:t>
+            </w:r>
+            <w:proofErr w:type="spellStart"/>
+            <w:r>
+              <w:rPr>
+                <w:rFonts w:ascii="Times New Roman" w:hAnsi="Times New Roman" w:cs="Times New Roman"/>
+              </w:rPr>
+              <w:t>api</w:t>
+            </w:r>
+            <w:proofErr w:type="spellEnd"/>
+            <w:r>
+              <w:rPr>
+                <w:rFonts w:ascii="Times New Roman" w:hAnsi="Times New Roman" w:cs="Times New Roman"/>
+              </w:rPr>
+              <w:t>/logs/latest on tab switch</w:t>
+            </w:r>
+          </w:p>
+          <w:p>
+            <w:pPr>
+              <w:pStyle w:val="ListParagraph"/>
+              <w:numPr>
+                <w:ilvl w:val="0"/>
+                <w:numId w:val="79"/>
+              </w:numPr>
+              <w:ind w:left="743"/>
+              <w:rPr>
+                <w:rFonts w:ascii="Times New Roman" w:hAnsi="Times New Roman" w:cs="Times New Roman"/>
+              </w:rPr>
+            </w:pPr>
+            <w:r>
+              <w:rPr>
+                <w:rFonts w:ascii="Times New Roman" w:hAnsi="Times New Roman" w:cs="Times New Roman"/>
+                <w:b/>
+                <w:bCs/>
+              </w:rPr>
+              <w:t xml:space="preserve">Log Level Distribution Pie → </w:t>
+            </w:r>
+            <w:r>
+              <w:rPr>
+                <w:rFonts w:ascii="Times New Roman" w:hAnsi="Times New Roman" w:cs="Times New Roman"/>
+              </w:rPr>
+              <w:t xml:space="preserve">Show 4 </w:t>
+            </w:r>
+            <w:proofErr w:type="spellStart"/>
+            <w:r>
+              <w:rPr>
+                <w:rFonts w:ascii="Times New Roman" w:hAnsi="Times New Roman" w:cs="Times New Roman"/>
+              </w:rPr>
+              <w:t>colors</w:t>
+            </w:r>
+            <w:proofErr w:type="spellEnd"/>
+            <w:r>
+              <w:rPr>
+                <w:rFonts w:ascii="Times New Roman" w:hAnsi="Times New Roman" w:cs="Times New Roman"/>
+              </w:rPr>
+              <w:t xml:space="preserve"> for INFO/WARN/ERROR/CRITICAL</w:t>
+            </w:r>
+          </w:p>
+          <w:p>
+            <w:pPr>
+              <w:pStyle w:val="ListParagraph"/>
+              <w:numPr>
+                <w:ilvl w:val="0"/>
+                <w:numId w:val="79"/>
+              </w:numPr>
+              <w:ind w:left="743"/>
+              <w:rPr>
+                <w:rFonts w:ascii="Times New Roman" w:hAnsi="Times New Roman" w:cs="Times New Roman"/>
+              </w:rPr>
+            </w:pPr>
+            <w:r>
+              <w:rPr>
+                <w:rFonts w:ascii="Times New Roman" w:hAnsi="Times New Roman" w:cs="Times New Roman"/>
+                <w:b/>
+                <w:bCs/>
+              </w:rPr>
+              <w:t xml:space="preserve">Error Trend + Response Time Charts </w:t>
+            </w:r>
+            <w:r>
+              <w:rPr>
+                <w:rFonts w:ascii="Times New Roman" w:hAnsi="Times New Roman" w:cs="Times New Roman"/>
+                <w:b/>
+                <w:bCs/>
+              </w:rPr>
+              <w:t xml:space="preserve">→ </w:t>
+            </w:r>
+            <w:r>
+              <w:rPr>
+                <w:rFonts w:ascii="Times New Roman" w:hAnsi="Times New Roman" w:cs="Times New Roman"/>
+              </w:rPr>
+              <w:t>Already done</w:t>
+            </w:r>
+          </w:p>
+        </w:tc>
+        <w:tc>
+          <w:tcPr>
+            <w:tcW w:w="4290" w:type="dxa"/>
+            <w:tcBorders>
+              <w:top w:val="nil"/>
+              <w:left w:val="nil"/>
+              <w:bottom w:val="nil"/>
+              <w:right w:val="nil"/>
+            </w:tcBorders>
+            <w:tcMar>
+              <w:top w:w="0" w:type="dxa"/>
+              <w:left w:w="0" w:type="dxa"/>
+              <w:bottom w:w="0" w:type="dxa"/>
+              <w:right w:w="0" w:type="dxa"/>
+            </w:tcMar>
+            <w:hideMark/>
+          </w:tcPr>
+          <w:p>
+            <w:pPr>
+              <w:rPr>
+                <w:rFonts w:ascii="Times New Roman" w:hAnsi="Times New Roman" w:cs="Times New Roman"/>
+              </w:rPr>
+            </w:pPr>
+            <w:r>
+              <w:rPr>
+                <w:rFonts w:ascii="Times New Roman" w:hAnsi="Times New Roman" w:cs="Times New Roman"/>
+                <w:b/>
+                <w:bCs/>
+              </w:rPr>
+              <w:t xml:space="preserve">Tomorrow's Plans </w:t>
+            </w:r>
+          </w:p>
+          <w:p>
+            <w:pPr>
+              <w:numPr>
+                <w:ilvl w:val="0"/>
+                <w:numId w:val="4"/>
+              </w:numPr>
+              <w:rPr>
+                <w:rFonts w:ascii="Times New Roman" w:hAnsi="Times New Roman" w:cs="Times New Roman"/>
+              </w:rPr>
+            </w:pPr>
+            <w:r>
+              <w:rPr>
+                <w:rFonts w:ascii="Times New Roman" w:hAnsi="Times New Roman" w:cs="Times New Roman"/>
+                <w:b/>
+                <w:bCs/>
+              </w:rPr>
+              <w:t>Backend – Anomaly Detection Engine</w:t>
+            </w:r>
+          </w:p>
+          <w:p>
+            <w:pPr>
+              <w:pStyle w:val="ListParagraph"/>
+              <w:numPr>
+                <w:ilvl w:val="0"/>
+                <w:numId w:val="80"/>
+              </w:numPr>
+              <w:ind w:left="841"/>
+              <w:rPr>
+                <w:rFonts w:ascii="Times New Roman" w:hAnsi="Times New Roman" w:cs="Times New Roman"/>
+              </w:rPr>
+            </w:pPr>
+            <w:r>
+              <w:rPr>
+                <w:rFonts w:ascii="Times New Roman" w:hAnsi="Times New Roman" w:cs="Times New Roman"/>
+                <w:b/>
+                <w:bCs/>
+              </w:rPr>
+              <w:t>Install dependencies:</w:t>
+            </w:r>
+            <w:r>
+              <w:rPr>
+                <w:rFonts w:ascii="Times New Roman" w:hAnsi="Times New Roman" w:cs="Times New Roman"/>
+              </w:rPr>
+              <w:t xml:space="preserve"> </w:t>
+            </w:r>
+            <w:proofErr w:type="spellStart"/>
+            <w:r>
+              <w:rPr>
+                <w:rFonts w:ascii="Times New Roman" w:hAnsi="Times New Roman" w:cs="Times New Roman"/>
+              </w:rPr>
+              <w:t>npm</w:t>
+            </w:r>
+            <w:proofErr w:type="spellEnd"/>
+            <w:r>
+              <w:rPr>
+                <w:rFonts w:ascii="Times New Roman" w:hAnsi="Times New Roman" w:cs="Times New Roman"/>
+              </w:rPr>
+              <w:t xml:space="preserve"> install node-</w:t>
+            </w:r>
+            <w:proofErr w:type="spellStart"/>
+            <w:r>
+              <w:rPr>
+                <w:rFonts w:ascii="Times New Roman" w:hAnsi="Times New Roman" w:cs="Times New Roman"/>
+              </w:rPr>
+              <w:t>cron</w:t>
+            </w:r>
+            <w:proofErr w:type="spellEnd"/>
+            <w:r>
+              <w:rPr>
+                <w:rFonts w:ascii="Times New Roman" w:hAnsi="Times New Roman" w:cs="Times New Roman"/>
+              </w:rPr>
+              <w:t xml:space="preserve"> for scheduled checks</w:t>
+            </w:r>
+          </w:p>
+          <w:p>
+            <w:pPr>
+              <w:pStyle w:val="ListParagraph"/>
+              <w:numPr>
+                <w:ilvl w:val="0"/>
+                <w:numId w:val="80"/>
+              </w:numPr>
+              <w:ind w:left="841"/>
+              <w:rPr>
+                <w:rFonts w:ascii="Times New Roman" w:hAnsi="Times New Roman" w:cs="Times New Roman"/>
+              </w:rPr>
+            </w:pPr>
+            <w:r>
+              <w:rPr>
+                <w:rFonts w:ascii="Times New Roman" w:hAnsi="Times New Roman" w:cs="Times New Roman"/>
+                <w:b/>
+                <w:bCs/>
+              </w:rPr>
+              <w:t>Add anomaly detection function in server.js</w:t>
+            </w:r>
+          </w:p>
+          <w:p>
+            <w:pPr>
+              <w:pStyle w:val="ListParagraph"/>
+              <w:numPr>
+                <w:ilvl w:val="0"/>
+                <w:numId w:val="78"/>
+              </w:numPr>
+              <w:ind w:left="1287"/>
+              <w:rPr>
+                <w:rFonts w:ascii="Times New Roman" w:hAnsi="Times New Roman" w:cs="Times New Roman"/>
+              </w:rPr>
+            </w:pPr>
+            <w:r>
+              <w:rPr>
+                <w:rFonts w:ascii="Times New Roman" w:hAnsi="Times New Roman" w:cs="Times New Roman"/>
+              </w:rPr>
+              <w:t>Scan new logs for keywords: CRITICAL, ERROR, failed, crash, timeout, exception</w:t>
+            </w:r>
+          </w:p>
+          <w:p>
+            <w:pPr>
+              <w:pStyle w:val="ListParagraph"/>
+              <w:numPr>
+                <w:ilvl w:val="0"/>
+                <w:numId w:val="78"/>
+              </w:numPr>
+              <w:ind w:left="1287"/>
+              <w:rPr>
+                <w:rFonts w:ascii="Times New Roman" w:hAnsi="Times New Roman" w:cs="Times New Roman"/>
+              </w:rPr>
+            </w:pPr>
+            <w:r>
+              <w:rPr>
+                <w:rFonts w:ascii="Times New Roman" w:hAnsi="Times New Roman" w:cs="Times New Roman"/>
+              </w:rPr>
+              <w:t>Add field: anomaly: true + severity: “high” | “medium”</w:t>
+            </w:r>
+          </w:p>
+          <w:p>
+            <w:pPr>
+              <w:pStyle w:val="ListParagraph"/>
+              <w:numPr>
+                <w:ilvl w:val="0"/>
+                <w:numId w:val="80"/>
+              </w:numPr>
+              <w:ind w:left="841"/>
+              <w:rPr>
+                <w:rFonts w:ascii="Times New Roman" w:hAnsi="Times New Roman" w:cs="Times New Roman"/>
+              </w:rPr>
+            </w:pPr>
+            <w:r>
+              <w:rPr>
+                <w:rFonts w:ascii="Times New Roman" w:hAnsi="Times New Roman" w:cs="Times New Roman"/>
+                <w:b/>
+                <w:bCs/>
+              </w:rPr>
+              <w:t>Create /</w:t>
+            </w:r>
+            <w:proofErr w:type="spellStart"/>
+            <w:r>
+              <w:rPr>
+                <w:rFonts w:ascii="Times New Roman" w:hAnsi="Times New Roman" w:cs="Times New Roman"/>
+                <w:b/>
+                <w:bCs/>
+              </w:rPr>
+              <w:t>api</w:t>
+            </w:r>
+            <w:proofErr w:type="spellEnd"/>
+            <w:r>
+              <w:rPr>
+                <w:rFonts w:ascii="Times New Roman" w:hAnsi="Times New Roman" w:cs="Times New Roman"/>
+                <w:b/>
+                <w:bCs/>
+              </w:rPr>
+              <w:t>/alerts route</w:t>
+            </w:r>
+          </w:p>
+          <w:p>
+            <w:pPr>
+              <w:pStyle w:val="ListParagraph"/>
+              <w:numPr>
+                <w:ilvl w:val="0"/>
+                <w:numId w:val="81"/>
+              </w:numPr>
+              <w:ind w:left="1216"/>
+              <w:rPr>
+                <w:rFonts w:ascii="Times New Roman" w:hAnsi="Times New Roman" w:cs="Times New Roman"/>
+              </w:rPr>
+            </w:pPr>
+            <w:r>
+              <w:rPr>
+                <w:rFonts w:ascii="Times New Roman" w:hAnsi="Times New Roman" w:cs="Times New Roman"/>
+              </w:rPr>
+              <w:t>Return only logs where anomaly: true</w:t>
+            </w:r>
+          </w:p>
+          <w:p>
+            <w:pPr>
+              <w:pStyle w:val="ListParagraph"/>
+              <w:numPr>
+                <w:ilvl w:val="0"/>
+                <w:numId w:val="80"/>
+              </w:numPr>
+              <w:ind w:left="841"/>
+              <w:rPr>
+                <w:rFonts w:ascii="Times New Roman" w:hAnsi="Times New Roman" w:cs="Times New Roman"/>
+              </w:rPr>
+            </w:pPr>
+            <w:r>
+              <w:rPr>
+                <w:rFonts w:ascii="Times New Roman" w:hAnsi="Times New Roman" w:cs="Times New Roman"/>
+                <w:b/>
+                <w:bCs/>
+              </w:rPr>
+              <w:t xml:space="preserve">Save alerts to </w:t>
+            </w:r>
+            <w:proofErr w:type="spellStart"/>
+            <w:proofErr w:type="gramStart"/>
+            <w:r>
+              <w:rPr>
+                <w:rFonts w:ascii="Times New Roman" w:hAnsi="Times New Roman" w:cs="Times New Roman"/>
+                <w:b/>
+                <w:bCs/>
+              </w:rPr>
+              <w:t>alerts.json</w:t>
+            </w:r>
+            <w:proofErr w:type="spellEnd"/>
+            <w:proofErr w:type="gramEnd"/>
+            <w:r>
+              <w:rPr>
+                <w:rFonts w:ascii="Times New Roman" w:hAnsi="Times New Roman" w:cs="Times New Roman"/>
+              </w:rPr>
+              <w:t xml:space="preserve"> so they persist</w:t>
+            </w:r>
+          </w:p>
+          <w:p>
+            <w:pPr>
+              <w:numPr>
+                <w:ilvl w:val="0"/>
+                <w:numId w:val="4"/>
+              </w:numPr>
+              <w:rPr>
+                <w:rFonts w:ascii="Times New Roman" w:hAnsi="Times New Roman" w:cs="Times New Roman"/>
+              </w:rPr>
+            </w:pPr>
+            <w:r>
+              <w:rPr>
+                <w:rFonts w:ascii="Times New Roman" w:hAnsi="Times New Roman" w:cs="Times New Roman"/>
+                <w:b/>
+              </w:rPr>
+              <w:t xml:space="preserve">Frontend – Alert </w:t>
+            </w:r>
+            <w:proofErr w:type="spellStart"/>
+            <w:r>
+              <w:rPr>
+                <w:rFonts w:ascii="Times New Roman" w:hAnsi="Times New Roman" w:cs="Times New Roman"/>
+                <w:b/>
+              </w:rPr>
+              <w:t>Center</w:t>
+            </w:r>
+            <w:proofErr w:type="spellEnd"/>
+            <w:r>
+              <w:rPr>
+                <w:rFonts w:ascii="Times New Roman" w:hAnsi="Times New Roman" w:cs="Times New Roman"/>
+                <w:b/>
+              </w:rPr>
+              <w:t xml:space="preserve"> UI</w:t>
+            </w:r>
+          </w:p>
+          <w:p>
+            <w:pPr>
+              <w:pStyle w:val="ListParagraph"/>
+              <w:numPr>
+                <w:ilvl w:val="0"/>
+                <w:numId w:val="80"/>
+              </w:numPr>
+              <w:ind w:left="791"/>
+              <w:rPr>
+                <w:rFonts w:ascii="Times New Roman" w:hAnsi="Times New Roman" w:cs="Times New Roman"/>
+              </w:rPr>
+            </w:pPr>
+            <w:r>
+              <w:rPr>
+                <w:rFonts w:ascii="Times New Roman" w:hAnsi="Times New Roman" w:cs="Times New Roman"/>
+                <w:b/>
+                <w:bCs/>
+              </w:rPr>
+              <w:t>Add new tab:</w:t>
+            </w:r>
+            <w:r>
+              <w:rPr>
+                <w:rFonts w:ascii="Times New Roman" w:hAnsi="Times New Roman" w:cs="Times New Roman"/>
+              </w:rPr>
+              <w:t xml:space="preserve"> “Alerts” in navbar</w:t>
+            </w:r>
+          </w:p>
+          <w:p>
+            <w:pPr>
+              <w:pStyle w:val="ListParagraph"/>
+              <w:numPr>
+                <w:ilvl w:val="0"/>
+                <w:numId w:val="80"/>
+              </w:numPr>
+              <w:ind w:left="791"/>
+              <w:rPr>
+                <w:rFonts w:ascii="Times New Roman" w:hAnsi="Times New Roman" w:cs="Times New Roman"/>
+              </w:rPr>
+            </w:pPr>
+            <w:r>
+              <w:rPr>
+                <w:rFonts w:ascii="Times New Roman" w:hAnsi="Times New Roman" w:cs="Times New Roman"/>
+                <w:b/>
+                <w:bCs/>
+              </w:rPr>
+              <w:t xml:space="preserve">Build </w:t>
+            </w:r>
+            <w:proofErr w:type="spellStart"/>
+            <w:r>
+              <w:rPr>
+                <w:rFonts w:ascii="Times New Roman" w:hAnsi="Times New Roman" w:cs="Times New Roman"/>
+                <w:b/>
+                <w:bCs/>
+              </w:rPr>
+              <w:t>Alerts.jsx</w:t>
+            </w:r>
+            <w:proofErr w:type="spellEnd"/>
+            <w:r>
+              <w:rPr>
+                <w:rFonts w:ascii="Times New Roman" w:hAnsi="Times New Roman" w:cs="Times New Roman"/>
+                <w:b/>
+                <w:bCs/>
+              </w:rPr>
+              <w:t xml:space="preserve"> component</w:t>
+            </w:r>
+          </w:p>
+          <w:p>
+            <w:pPr>
+              <w:pStyle w:val="ListParagraph"/>
+              <w:numPr>
+                <w:ilvl w:val="0"/>
+                <w:numId w:val="81"/>
+              </w:numPr>
+              <w:ind w:left="1216"/>
+              <w:rPr>
+                <w:rFonts w:ascii="Times New Roman" w:hAnsi="Times New Roman" w:cs="Times New Roman"/>
+              </w:rPr>
+            </w:pPr>
+            <w:r>
+              <w:rPr>
+                <w:rFonts w:ascii="Times New Roman" w:hAnsi="Times New Roman" w:cs="Times New Roman"/>
+              </w:rPr>
+              <w:t>Show red/yellow alert cards with icon, time message</w:t>
+            </w:r>
+          </w:p>
+          <w:p>
+            <w:pPr>
+              <w:pStyle w:val="ListParagraph"/>
+              <w:numPr>
+                <w:ilvl w:val="0"/>
+                <w:numId w:val="81"/>
+              </w:numPr>
+              <w:ind w:left="1216"/>
+              <w:rPr>
+                <w:rFonts w:ascii="Times New Roman" w:hAnsi="Times New Roman" w:cs="Times New Roman"/>
+              </w:rPr>
+            </w:pPr>
+            <w:r>
+              <w:rPr>
+                <w:rFonts w:ascii="Times New Roman" w:hAnsi="Times New Roman" w:cs="Times New Roman"/>
+              </w:rPr>
+              <w:t>Badge count on Alerts tab for new anomalies</w:t>
+            </w:r>
+          </w:p>
+          <w:p>
+            <w:pPr>
+              <w:pStyle w:val="ListParagraph"/>
+              <w:numPr>
+                <w:ilvl w:val="0"/>
+                <w:numId w:val="80"/>
+              </w:numPr>
+              <w:ind w:left="791"/>
+              <w:rPr>
+                <w:rFonts w:ascii="Times New Roman" w:hAnsi="Times New Roman" w:cs="Times New Roman"/>
+              </w:rPr>
+            </w:pPr>
+            <w:r>
+              <w:rPr>
+                <w:rFonts w:ascii="Times New Roman" w:hAnsi="Times New Roman" w:cs="Times New Roman"/>
+                <w:b/>
+                <w:bCs/>
+              </w:rPr>
+              <w:t xml:space="preserve">Add “Dismiss” button </w:t>
+            </w:r>
+            <w:r>
+              <w:rPr>
+                <w:rFonts w:ascii="Times New Roman" w:hAnsi="Times New Roman" w:cs="Times New Roman"/>
+              </w:rPr>
+              <w:t>to clear alerts</w:t>
+            </w:r>
+          </w:p>
+          <w:p>
+            <w:pPr>
+              <w:numPr>
+                <w:ilvl w:val="0"/>
+                <w:numId w:val="4"/>
+              </w:numPr>
+              <w:rPr>
+                <w:rFonts w:ascii="Times New Roman" w:hAnsi="Times New Roman" w:cs="Times New Roman"/>
+              </w:rPr>
+            </w:pPr>
+            <w:r>
+              <w:rPr>
+                <w:rFonts w:ascii="Times New Roman" w:hAnsi="Times New Roman" w:cs="Times New Roman"/>
+                <w:b/>
+              </w:rPr>
+              <w:t>Frontend -Real-time Updates</w:t>
+            </w:r>
+          </w:p>
+          <w:p>
+            <w:pPr>
+              <w:pStyle w:val="ListParagraph"/>
+              <w:numPr>
+                <w:ilvl w:val="0"/>
+                <w:numId w:val="80"/>
+              </w:numPr>
+              <w:ind w:left="791"/>
+              <w:rPr>
+                <w:rFonts w:ascii="Times New Roman" w:hAnsi="Times New Roman" w:cs="Times New Roman"/>
+              </w:rPr>
+            </w:pPr>
+            <w:r>
+              <w:rPr>
+                <w:rFonts w:ascii="Times New Roman" w:hAnsi="Times New Roman" w:cs="Times New Roman"/>
+                <w:b/>
+                <w:bCs/>
+              </w:rPr>
+              <w:t xml:space="preserve">Add auto-refresh </w:t>
+            </w:r>
+            <w:r>
+              <w:rPr>
+                <w:rFonts w:ascii="Times New Roman" w:hAnsi="Times New Roman" w:cs="Times New Roman"/>
+              </w:rPr>
+              <w:t xml:space="preserve">using </w:t>
+            </w:r>
+            <w:proofErr w:type="spellStart"/>
+            <w:r>
+              <w:rPr>
+                <w:rFonts w:ascii="Times New Roman" w:hAnsi="Times New Roman" w:cs="Times New Roman"/>
+              </w:rPr>
+              <w:t>setInterval</w:t>
+            </w:r>
+            <w:proofErr w:type="spellEnd"/>
+            <w:r>
+              <w:rPr>
+                <w:rFonts w:ascii="Times New Roman" w:hAnsi="Times New Roman" w:cs="Times New Roman"/>
+              </w:rPr>
+              <w:t xml:space="preserve"> every 5 seconds</w:t>
+            </w:r>
+          </w:p>
+          <w:p>
+            <w:pPr>
+              <w:pStyle w:val="ListParagraph"/>
+              <w:numPr>
+                <w:ilvl w:val="0"/>
+                <w:numId w:val="82"/>
+              </w:numPr>
+              <w:ind w:left="1216"/>
+              <w:rPr>
+                <w:rFonts w:ascii="Times New Roman" w:hAnsi="Times New Roman" w:cs="Times New Roman"/>
+              </w:rPr>
+            </w:pPr>
+            <w:r>
+              <w:rPr>
+                <w:rFonts w:ascii="Times New Roman" w:hAnsi="Times New Roman" w:cs="Times New Roman"/>
+              </w:rPr>
+              <w:t>Fetch /</w:t>
+            </w:r>
+            <w:proofErr w:type="spellStart"/>
+            <w:r>
+              <w:rPr>
+                <w:rFonts w:ascii="Times New Roman" w:hAnsi="Times New Roman" w:cs="Times New Roman"/>
+              </w:rPr>
+              <w:t>api</w:t>
+            </w:r>
+            <w:proofErr w:type="spellEnd"/>
+            <w:r>
+              <w:rPr>
+                <w:rFonts w:ascii="Times New Roman" w:hAnsi="Times New Roman" w:cs="Times New Roman"/>
+              </w:rPr>
+              <w:t>/logs/latest and /</w:t>
+            </w:r>
+            <w:proofErr w:type="spellStart"/>
+            <w:r>
+              <w:rPr>
+                <w:rFonts w:ascii="Times New Roman" w:hAnsi="Times New Roman" w:cs="Times New Roman"/>
+              </w:rPr>
+              <w:t>api</w:t>
+            </w:r>
+            <w:proofErr w:type="spellEnd"/>
+            <w:r>
+              <w:rPr>
+                <w:rFonts w:ascii="Times New Roman" w:hAnsi="Times New Roman" w:cs="Times New Roman"/>
+              </w:rPr>
+              <w:t>/alerts</w:t>
+            </w:r>
+          </w:p>
+          <w:p>
+            <w:pPr>
+              <w:pStyle w:val="ListParagraph"/>
+              <w:numPr>
+                <w:ilvl w:val="0"/>
+                <w:numId w:val="80"/>
+              </w:numPr>
+              <w:ind w:left="791"/>
+              <w:rPr>
+                <w:rFonts w:ascii="Times New Roman" w:hAnsi="Times New Roman" w:cs="Times New Roman"/>
+              </w:rPr>
+            </w:pPr>
+            <w:r>
+              <w:rPr>
+                <w:rFonts w:ascii="Times New Roman" w:hAnsi="Times New Roman" w:cs="Times New Roman"/>
+                <w:b/>
+                <w:bCs/>
+              </w:rPr>
+              <w:t xml:space="preserve">Show toast notification </w:t>
+            </w:r>
+            <w:r>
+              <w:rPr>
+                <w:rFonts w:ascii="Times New Roman" w:hAnsi="Times New Roman" w:cs="Times New Roman"/>
+              </w:rPr>
+              <w:t>when new</w:t>
+            </w:r>
+            <w:r>
+              <w:rPr>
+                <w:rFonts w:ascii="Times New Roman" w:hAnsi="Times New Roman" w:cs="Times New Roman"/>
+              </w:rPr>
+              <w:t xml:space="preserve"> CRITICAL log comes in</w:t>
+            </w:r>
+          </w:p>
+          <w:p>
+            <w:pPr>
+              <w:numPr>
+                <w:ilvl w:val="0"/>
+                <w:numId w:val="4"/>
+              </w:numPr>
+              <w:rPr>
+                <w:rFonts w:ascii="Times New Roman" w:hAnsi="Times New Roman" w:cs="Times New Roman"/>
+              </w:rPr>
+            </w:pPr>
+            <w:r>
+              <w:rPr>
+                <w:rFonts w:ascii="Times New Roman" w:hAnsi="Times New Roman" w:cs="Times New Roman"/>
+                <w:b/>
+                <w:bCs/>
+              </w:rPr>
+              <w:t>Testing + Polish</w:t>
+            </w:r>
+          </w:p>
+          <w:p>
+            <w:pPr>
+              <w:pStyle w:val="ListParagraph"/>
+              <w:numPr>
+                <w:ilvl w:val="0"/>
+                <w:numId w:val="80"/>
+              </w:numPr>
+              <w:ind w:left="840"/>
+              <w:rPr>
+                <w:rFonts w:ascii="Times New Roman" w:hAnsi="Times New Roman" w:cs="Times New Roman"/>
+              </w:rPr>
+            </w:pPr>
+            <w:r>
+              <w:rPr>
+                <w:rFonts w:ascii="Times New Roman" w:hAnsi="Times New Roman" w:cs="Times New Roman"/>
+                <w:b/>
+                <w:bCs/>
+              </w:rPr>
+              <w:t>Make “Test Critical Alert” button work</w:t>
+            </w:r>
+          </w:p>
+          <w:p>
+            <w:pPr>
+              <w:pStyle w:val="ListParagraph"/>
+              <w:numPr>
+                <w:ilvl w:val="0"/>
+                <w:numId w:val="82"/>
+              </w:numPr>
+              <w:ind w:left="1265"/>
+              <w:rPr>
+                <w:rFonts w:ascii="Times New Roman" w:hAnsi="Times New Roman" w:cs="Times New Roman"/>
+              </w:rPr>
+            </w:pPr>
+            <w:r>
+              <w:rPr>
+                <w:rFonts w:ascii="Times New Roman" w:hAnsi="Times New Roman" w:cs="Times New Roman"/>
+              </w:rPr>
+              <w:t>Inject a fake CRITICAL log to test the flow</w:t>
+            </w:r>
+          </w:p>
+          <w:p>
+            <w:pPr>
+              <w:pStyle w:val="ListParagraph"/>
+              <w:numPr>
+                <w:ilvl w:val="0"/>
+                <w:numId w:val="80"/>
+              </w:numPr>
+              <w:ind w:left="840"/>
+              <w:rPr>
+                <w:rFonts w:ascii="Times New Roman" w:hAnsi="Times New Roman" w:cs="Times New Roman"/>
+              </w:rPr>
+            </w:pPr>
+            <w:r>
+              <w:rPr>
+                <w:rFonts w:ascii="Times New Roman" w:hAnsi="Times New Roman" w:cs="Times New Roman"/>
+                <w:b/>
+                <w:bCs/>
+              </w:rPr>
+              <w:lastRenderedPageBreak/>
+              <w:t>Test Full Flow:</w:t>
+            </w:r>
+            <w:r>
+              <w:rPr>
+                <w:rFonts w:ascii="Times New Roman" w:hAnsi="Times New Roman" w:cs="Times New Roman"/>
+              </w:rPr>
+              <w:t xml:space="preserve"> Upload log with ERROR→ See it in Alerts tab within 5s</w:t>
+            </w:r>
+          </w:p>
+        </w:tc>
+      </w:tr>
+      <w:tr>
+        <w:trPr>
+          <w:trHeight w:val="118"/>
+        </w:trPr>
+        <w:tc>
+          <w:tcPr>
+            <w:tcW w:w="10490" w:type="dxa"/>
+            <w:gridSpan w:val="3"/>
+            <w:tcBorders>
+              <w:top w:val="nil"/>
+              <w:left w:val="nil"/>
+              <w:bottom w:val="nil"/>
+              <w:right w:val="nil"/>
+            </w:tcBorders>
+            <w:tcMar>
+              <w:top w:w="0" w:type="dxa"/>
+              <w:left w:w="0" w:type="dxa"/>
+              <w:bottom w:w="0" w:type="dxa"/>
+              <w:right w:w="0" w:type="dxa"/>
+            </w:tcMar>
+            <w:hideMark/>
+          </w:tcPr>
+          <w:p>
+            <w:pPr>
+              <w:rPr>
+                <w:rFonts w:ascii="Times New Roman" w:hAnsi="Times New Roman" w:cs="Times New Roman"/>
+              </w:rPr>
+            </w:pPr>
+            <w:r>
+              <w:rPr>
+                <w:rFonts w:ascii="Times New Roman" w:hAnsi="Times New Roman" w:cs="Times New Roman"/>
+                <w:b/>
+                <w:bCs/>
+              </w:rPr>
+              <w:lastRenderedPageBreak/>
+              <w:t xml:space="preserve">Outputs and Descriptions </w:t>
+            </w:r>
+          </w:p>
+        </w:tc>
+      </w:tr>
+    </w:tbl>
+    <w:p>
+      <w:pPr>
+        <w:rPr>
+          <w:rFonts w:ascii="Times New Roman" w:hAnsi="Times New Roman" w:cs="Times New Roman"/>
+        </w:rPr>
+      </w:pPr>
+      <w:r>
+        <w:rPr>
+          <w:rFonts w:ascii="Times New Roman" w:hAnsi="Times New Roman" w:cs="Times New Roman"/>
+          <w:b/>
+          <w:bCs/>
+        </w:rPr>
+        <w:t>Output:</w:t>
+      </w:r>
+      <w:r>
+        <w:rPr>
+          <w:rFonts w:ascii="Times New Roman" w:hAnsi="Times New Roman" w:cs="Times New Roman"/>
+        </w:rPr>
+        <w:t xml:space="preserve"> </w:t>
+      </w:r>
+    </w:p>
+    <w:p>
+      <w:pPr>
+        <w:rPr>
+          <w:rFonts w:ascii="Times New Roman" w:hAnsi="Times New Roman" w:cs="Times New Roman"/>
+        </w:rPr>
+      </w:pPr>
+    </w:p>
+    <w:p>
+      <w:pPr>
+        <w:rPr>
+          <w:rFonts w:ascii="Times New Roman" w:hAnsi="Times New Roman" w:cs="Times New Roman"/>
+        </w:rPr>
+      </w:pPr>
+      <w:r>
+        <w:rPr>
+          <w:rFonts w:ascii="Times New Roman" w:hAnsi="Times New Roman" w:cs="Times New Roman"/>
+          <w:b/>
+          <w:bCs/>
+        </w:rPr>
+        <w:t>Description:</w:t>
+      </w:r>
+      <w:r>
+        <w:rPr>
+          <w:rFonts w:ascii="Times New Roman" w:hAnsi="Times New Roman" w:cs="Times New Roman"/>
+        </w:rPr>
+        <w:t xml:space="preserve"> </w:t>
+      </w:r>
+    </w:p>
+    <w:p>
+      <w:pPr>
+        <w:rPr>
+          <w:rFonts w:ascii="Times New Roman" w:eastAsia="MS Gothic" w:hAnsi="Times New Roman" w:cs="Times New Roman"/>
+        </w:rPr>
+      </w:pPr>
+    </w:p>
+    <w:tbl>
+      <w:tblPr>
+        <w:tblW w:w="10701" w:type="dxa"/>
+        <w:tblCellMar>
+          <w:left w:w="10" w:type="dxa"/>
+          <w:right w:w="10" w:type="dxa"/>
+        </w:tblCellMar>
+        <w:tblLook w:val="04A0" w:firstRow="1" w:lastRow="0" w:firstColumn="1" w:lastColumn="0" w:noHBand="0" w:noVBand="1"/>
+      </w:tblPr>
+      <w:tblGrid>
+        <w:gridCol w:w="2674"/>
+        <w:gridCol w:w="4012"/>
+        <w:gridCol w:w="4015"/>
+      </w:tblGrid>
+      <w:tr>
+        <w:trPr>
+          <w:trHeight w:val="2539"/>
+        </w:trPr>
+        <w:tc>
+          <w:tcPr>
+            <w:tcW w:w="2674" w:type="dxa"/>
+            <w:tcBorders>
+              <w:top w:val="nil"/>
+              <w:left w:val="nil"/>
+              <w:bottom w:val="nil"/>
+              <w:right w:val="nil"/>
+            </w:tcBorders>
+            <w:tcMar>
+              <w:top w:w="0" w:type="dxa"/>
+              <w:left w:w="0" w:type="dxa"/>
+              <w:bottom w:w="0" w:type="dxa"/>
+              <w:right w:w="0" w:type="dxa"/>
+            </w:tcMar>
+            <w:hideMark/>
+          </w:tcPr>
+          <w:p>
+            <w:pPr>
+              <w:rPr>
+                <w:rFonts w:ascii="Times New Roman" w:hAnsi="Times New Roman" w:cs="Times New Roman"/>
+              </w:rPr>
+            </w:pPr>
+            <w:r>
+              <w:rPr>
+                <w:rFonts w:ascii="Times New Roman" w:hAnsi="Times New Roman" w:cs="Times New Roman"/>
+              </w:rPr>
+              <w:t>03 August 2026</w:t>
+            </w:r>
+          </w:p>
+          <w:p>
+            <w:pPr>
+              <w:ind w:left="400"/>
+              <w:rPr>
+                <w:rFonts w:ascii="Times New Roman" w:hAnsi="Times New Roman" w:cs="Times New Roman"/>
+              </w:rPr>
+            </w:pPr>
+            <w:r>
+              <w:rPr>
+                <w:rFonts w:ascii="Times New Roman" w:hAnsi="Times New Roman" w:cs="Times New Roman"/>
+              </w:rPr>
+              <w:t>Day 1</w:t>
+            </w:r>
+            <w:r>
+              <w:rPr>
+                <w:rFonts w:ascii="Times New Roman" w:hAnsi="Times New Roman" w:cs="Times New Roman"/>
+              </w:rPr>
+              <w:t>1</w:t>
+            </w:r>
+            <w:r>
+              <w:rPr>
+                <w:rFonts w:ascii="Times New Roman" w:hAnsi="Times New Roman" w:cs="Times New Roman"/>
+              </w:rPr>
+              <w:t xml:space="preserve"> </w:t>
+            </w:r>
+          </w:p>
+        </w:tc>
+        <w:tc>
+          <w:tcPr>
+            <w:tcW w:w="4012" w:type="dxa"/>
+            <w:tcBorders>
+              <w:top w:val="nil"/>
+              <w:left w:val="nil"/>
+              <w:bottom w:val="nil"/>
+              <w:right w:val="nil"/>
+            </w:tcBorders>
+            <w:tcMar>
+              <w:top w:w="0" w:type="dxa"/>
+              <w:left w:w="0" w:type="dxa"/>
+              <w:bottom w:w="0" w:type="dxa"/>
+              <w:right w:w="0" w:type="dxa"/>
+            </w:tcMar>
+            <w:hideMark/>
+          </w:tcPr>
+          <w:p>
+            <w:pPr>
+              <w:rPr>
+                <w:rFonts w:ascii="Times New Roman" w:hAnsi="Times New Roman" w:cs="Times New Roman"/>
+                <w:b/>
+                <w:bCs/>
+              </w:rPr>
+            </w:pPr>
+            <w:r>
+              <w:rPr>
+                <w:rFonts w:ascii="Times New Roman" w:hAnsi="Times New Roman" w:cs="Times New Roman"/>
+                <w:b/>
+                <w:bCs/>
+              </w:rPr>
+              <w:t xml:space="preserve">Today's Activities </w:t>
+            </w:r>
+          </w:p>
+          <w:p>
+            <w:pPr>
+              <w:numPr>
+                <w:ilvl w:val="0"/>
+                <w:numId w:val="3"/>
+              </w:numPr>
+              <w:rPr>
+                <w:rFonts w:ascii="Times New Roman" w:hAnsi="Times New Roman" w:cs="Times New Roman"/>
+              </w:rPr>
+            </w:pPr>
+            <w:r>
+              <w:rPr>
+                <w:rFonts w:ascii="Times New Roman" w:hAnsi="Times New Roman" w:cs="Times New Roman"/>
+                <w:b/>
+                <w:bCs/>
+              </w:rPr>
+              <w:t xml:space="preserve"> </w:t>
+            </w:r>
+          </w:p>
+        </w:tc>
+        <w:tc>
+          <w:tcPr>
+            <w:tcW w:w="4014" w:type="dxa"/>
+            <w:tcBorders>
+              <w:top w:val="nil"/>
+              <w:left w:val="nil"/>
+              <w:bottom w:val="nil"/>
+              <w:right w:val="nil"/>
+            </w:tcBorders>
+            <w:tcMar>
+              <w:top w:w="0" w:type="dxa"/>
+              <w:left w:w="0" w:type="dxa"/>
+              <w:bottom w:w="0" w:type="dxa"/>
+              <w:right w:w="0" w:type="dxa"/>
+            </w:tcMar>
+            <w:hideMark/>
+          </w:tcPr>
+          <w:p>
+            <w:pPr>
+              <w:rPr>
+                <w:rFonts w:ascii="Times New Roman" w:hAnsi="Times New Roman" w:cs="Times New Roman"/>
+              </w:rPr>
+            </w:pPr>
+            <w:r>
+              <w:rPr>
+                <w:rFonts w:ascii="Times New Roman" w:hAnsi="Times New Roman" w:cs="Times New Roman"/>
+                <w:b/>
+                <w:bCs/>
+              </w:rPr>
+              <w:t xml:space="preserve">Tomorrow's Plans </w:t>
+            </w:r>
+          </w:p>
+          <w:p>
+            <w:pPr>
+              <w:numPr>
+                <w:ilvl w:val="0"/>
+                <w:numId w:val="4"/>
+              </w:numPr>
+              <w:rPr>
+                <w:rFonts w:ascii="Times New Roman" w:hAnsi="Times New Roman" w:cs="Times New Roman"/>
+              </w:rPr>
+            </w:pPr>
+          </w:p>
+        </w:tc>
+      </w:tr>
+      <w:tr>
+        <w:trPr>
+          <w:trHeight w:val="193"/>
+        </w:trPr>
+        <w:tc>
+          <w:tcPr>
+            <w:tcW w:w="10701" w:type="dxa"/>
+            <w:gridSpan w:val="3"/>
+            <w:tcBorders>
+              <w:top w:val="nil"/>
+              <w:left w:val="nil"/>
+              <w:bottom w:val="nil"/>
+              <w:right w:val="nil"/>
+            </w:tcBorders>
+            <w:tcMar>
+              <w:top w:w="0" w:type="dxa"/>
+              <w:left w:w="0" w:type="dxa"/>
+              <w:bottom w:w="0" w:type="dxa"/>
+              <w:right w:w="0" w:type="dxa"/>
+            </w:tcMar>
+            <w:hideMark/>
+          </w:tcPr>
+          <w:p>
+            <w:pPr>
+              <w:rPr>
+                <w:rFonts w:ascii="Times New Roman" w:hAnsi="Times New Roman" w:cs="Times New Roman"/>
+              </w:rPr>
+            </w:pPr>
+            <w:r>
+              <w:rPr>
+                <w:rFonts w:ascii="Times New Roman" w:hAnsi="Times New Roman" w:cs="Times New Roman"/>
+                <w:b/>
+                <w:bCs/>
+              </w:rPr>
+              <w:t xml:space="preserve">Outputs and Descriptions </w:t>
+            </w:r>
+          </w:p>
+        </w:tc>
+      </w:tr>
+    </w:tbl>
+    <w:p>
+      <w:pPr>
+        <w:rPr>
+          <w:rFonts w:ascii="Times New Roman" w:hAnsi="Times New Roman" w:cs="Times New Roman"/>
+        </w:rPr>
+      </w:pPr>
+      <w:r>
+        <w:rPr>
+          <w:rFonts w:ascii="Times New Roman" w:hAnsi="Times New Roman" w:cs="Times New Roman"/>
+          <w:b/>
+          <w:bCs/>
+        </w:rPr>
+        <w:t>Output:</w:t>
+      </w:r>
+      <w:r>
+        <w:rPr>
+          <w:rFonts w:ascii="Times New Roman" w:hAnsi="Times New Roman" w:cs="Times New Roman"/>
+        </w:rPr>
+        <w:t xml:space="preserve"> </w:t>
+      </w:r>
+    </w:p>
+    <w:p>
+      <w:pPr>
+        <w:rPr>
+          <w:rFonts w:ascii="Times New Roman" w:hAnsi="Times New Roman" w:cs="Times New Roman"/>
+        </w:rPr>
+      </w:pPr>
+    </w:p>
+    <w:p>
+      <w:pPr>
+        <w:rPr>
+          <w:rFonts w:ascii="Times New Roman" w:eastAsia="MS Gothic" w:hAnsi="Times New Roman" w:cs="Times New Roman"/>
+        </w:rPr>
+      </w:pPr>
+      <w:r>
+        <w:rPr>
+          <w:rFonts w:ascii="Times New Roman" w:hAnsi="Times New Roman" w:cs="Times New Roman"/>
+          <w:b/>
+          <w:bCs/>
+        </w:rPr>
+        <w:t>Description:</w:t>
+      </w:r>
+      <w:r>
+        <w:rPr>
+          <w:rFonts w:ascii="Times New Roman" w:hAnsi="Times New Roman" w:cs="Times New Roman"/>
+        </w:rPr>
+        <w:t xml:space="preserve"> </w:t>
+      </w:r>
+    </w:p>
+    <w:p>
+      <w:pPr>
+        <w:rPr>
+          <w:rFonts w:ascii="Times New Roman" w:hAnsi="Times New Roman" w:cs="Times New Roman"/>
+        </w:rPr>
+      </w:pPr>
+    </w:p>
     <w:p>
       <w:pPr>
         <w:rPr>
@@ -14739,6 +16604,232 @@
 <file path=word/numbering.xml><?xml version="1.0" encoding="utf-8"?>
 <w:numbering xmlns:wpc="http://schemas.microsoft.com/office/word/2010/wordprocessingCanvas" xmlns:cx="http://schemas.microsoft.com/office/drawing/2014/chartex" xmlns:cx1="http://schemas.microsoft.com/office/drawing/2015/9/8/chartex" xmlns:cx2="http://schemas.microsoft.com/office/drawing/2015/10/21/chartex" xmlns:cx3="http://schemas.microsoft.com/office/drawing/2016/5/9/chartex" xmlns:cx4="http://schemas.microsoft.com/office/drawing/2016/5/10/chartex" xmlns:cx5="http://schemas.microsoft.com/office/drawing/2016/5/11/chartex" xmlns:cx6="http://schemas.microsoft.com/office/drawing/2016/5/12/chartex" xmlns:cx7="http://schemas.microsoft.com/office/drawing/2016/5/13/chartex" xmlns:cx8="http://schemas.microsoft.com/office/drawing/2016/5/14/chartex" xmlns:mc="http://schemas.openxmlformats.org/markup-compatibility/2006" xmlns:aink="http://schemas.microsoft.com/office/drawing/2016/ink" xmlns:am3d="http://schemas.microsoft.com/office/drawing/2017/model3d" xmlns:o="urn:schemas-microsoft-com:office:office" xmlns:oel="http://schemas.microsoft.com/office/2019/extlst" xmlns:r="http://schemas.openxmlformats.org/officeDocument/2006/relationships" xmlns:m="http://schemas.openxmlformats.org/officeDocument/2006/math" xmlns:v="urn:schemas-microsoft-com:vml" xmlns:wp14="http://schemas.microsoft.com/office/word/2010/wordprocessingDrawing" xmlns:wp="http://schemas.openxmlformats.org/drawingml/2006/wordprocessingDrawing" xmlns:w10="urn:schemas-microsoft-com:office:word" xmlns:w="http://schemas.openxmlformats.org/wordprocessingml/2006/main" xmlns:w14="http://schemas.microsoft.com/office/word/2010/wordml" xmlns:w15="http://schemas.microsoft.com/office/word/2012/wordml" xmlns:w16cei="http://schemas.microsoft.com/office/word/2026/wordml/cei" xmlns:w16cex="http://schemas.microsoft.com/office/word/2018/wordml/cex" xmlns:w16cid="http://schemas.microsoft.com/office/word/2016/wordml/cid" xmlns:w16="http://schemas.microsoft.com/office/word/2018/wordml" xmlns:w16du="http://schemas.microsoft.com/office/word/2023/wordml/word16du" xmlns:w16sdtdh="http://schemas.microsoft.com/office/word/2020/wordml/sdtdatahash" xmlns:w16sdtfl="http://schemas.microsoft.com/office/word/2024/wordml/sdtformatlock" xmlns:w16se="http://schemas.microsoft.com/office/word/2015/wordml/symex" xmlns:wpg="http://schemas.microsoft.com/office/word/2010/wordprocessingGroup" xmlns:wpi="http://schemas.microsoft.com/office/word/2010/wordprocessingInk" xmlns:wne="http://schemas.microsoft.com/office/word/2006/wordml" xmlns:wps="http://schemas.microsoft.com/office/word/2010/wordprocessingShape" mc:Ignorable="w14 w15 w16se w16cid w16 w16cex w16sdtdh w16sdtfl w16du wp14">
   <w:abstractNum w:abstractNumId="0" w15:restartNumberingAfterBreak="0">
+    <w:nsid w:val="00445F6A"/>
+    <w:multiLevelType w:val="hybridMultilevel"/>
+    <w:tmpl w:val="A89010C6"/>
+    <w:lvl w:ilvl="0" w:tplc="488C9D1E">
+      <w:start w:val="1"/>
+      <w:numFmt w:val="bullet"/>
+      <w:lvlText w:val=""/>
+      <w:lvlJc w:val="left"/>
+      <w:pPr>
+        <w:ind w:left="1463" w:hanging="360"/>
+      </w:pPr>
+      <w:rPr>
+        <w:rFonts w:ascii="Symbol" w:hAnsi="Symbol" w:hint="default"/>
+      </w:rPr>
+    </w:lvl>
+    <w:lvl w:ilvl="1" w:tplc="40090003" w:tentative="1">
+      <w:start w:val="1"/>
+      <w:numFmt w:val="bullet"/>
+      <w:lvlText w:val="o"/>
+      <w:lvlJc w:val="left"/>
+      <w:pPr>
+        <w:ind w:left="2183" w:hanging="360"/>
+      </w:pPr>
+      <w:rPr>
+        <w:rFonts w:ascii="Courier New" w:hAnsi="Courier New" w:cs="Courier New" w:hint="default"/>
+      </w:rPr>
+    </w:lvl>
+    <w:lvl w:ilvl="2" w:tplc="40090005" w:tentative="1">
+      <w:start w:val="1"/>
+      <w:numFmt w:val="bullet"/>
+      <w:lvlText w:val=""/>
+      <w:lvlJc w:val="left"/>
+      <w:pPr>
+        <w:ind w:left="2903" w:hanging="360"/>
+      </w:pPr>
+      <w:rPr>
+        <w:rFonts w:ascii="Wingdings" w:hAnsi="Wingdings" w:hint="default"/>
+      </w:rPr>
+    </w:lvl>
+    <w:lvl w:ilvl="3" w:tplc="40090001" w:tentative="1">
+      <w:start w:val="1"/>
+      <w:numFmt w:val="bullet"/>
+      <w:lvlText w:val=""/>
+      <w:lvlJc w:val="left"/>
+      <w:pPr>
+        <w:ind w:left="3623" w:hanging="360"/>
+      </w:pPr>
+      <w:rPr>
+        <w:rFonts w:ascii="Symbol" w:hAnsi="Symbol" w:hint="default"/>
+      </w:rPr>
+    </w:lvl>
+    <w:lvl w:ilvl="4" w:tplc="40090003" w:tentative="1">
+      <w:start w:val="1"/>
+      <w:numFmt w:val="bullet"/>
+      <w:lvlText w:val="o"/>
+      <w:lvlJc w:val="left"/>
+      <w:pPr>
+        <w:ind w:left="4343" w:hanging="360"/>
+      </w:pPr>
+      <w:rPr>
+        <w:rFonts w:ascii="Courier New" w:hAnsi="Courier New" w:cs="Courier New" w:hint="default"/>
+      </w:rPr>
+    </w:lvl>
+    <w:lvl w:ilvl="5" w:tplc="40090005" w:tentative="1">
+      <w:start w:val="1"/>
+      <w:numFmt w:val="bullet"/>
+      <w:lvlText w:val=""/>
+      <w:lvlJc w:val="left"/>
+      <w:pPr>
+        <w:ind w:left="5063" w:hanging="360"/>
+      </w:pPr>
+      <w:rPr>
+        <w:rFonts w:ascii="Wingdings" w:hAnsi="Wingdings" w:hint="default"/>
+      </w:rPr>
+    </w:lvl>
+    <w:lvl w:ilvl="6" w:tplc="40090001" w:tentative="1">
+      <w:start w:val="1"/>
+      <w:numFmt w:val="bullet"/>
+      <w:lvlText w:val=""/>
+      <w:lvlJc w:val="left"/>
+      <w:pPr>
+        <w:ind w:left="5783" w:hanging="360"/>
+      </w:pPr>
+      <w:rPr>
+        <w:rFonts w:ascii="Symbol" w:hAnsi="Symbol" w:hint="default"/>
+      </w:rPr>
+    </w:lvl>
+    <w:lvl w:ilvl="7" w:tplc="40090003" w:tentative="1">
+      <w:start w:val="1"/>
+      <w:numFmt w:val="bullet"/>
+      <w:lvlText w:val="o"/>
+      <w:lvlJc w:val="left"/>
+      <w:pPr>
+        <w:ind w:left="6503" w:hanging="360"/>
+      </w:pPr>
+      <w:rPr>
+        <w:rFonts w:ascii="Courier New" w:hAnsi="Courier New" w:cs="Courier New" w:hint="default"/>
+      </w:rPr>
+    </w:lvl>
+    <w:lvl w:ilvl="8" w:tplc="40090005" w:tentative="1">
+      <w:start w:val="1"/>
+      <w:numFmt w:val="bullet"/>
+      <w:lvlText w:val=""/>
+      <w:lvlJc w:val="left"/>
+      <w:pPr>
+        <w:ind w:left="7223" w:hanging="360"/>
+      </w:pPr>
+      <w:rPr>
+        <w:rFonts w:ascii="Wingdings" w:hAnsi="Wingdings" w:hint="default"/>
+      </w:rPr>
+    </w:lvl>
+  </w:abstractNum>
+  <w:abstractNum w:abstractNumId="1" w15:restartNumberingAfterBreak="0">
+    <w:nsid w:val="00975C1B"/>
+    <w:multiLevelType w:val="hybridMultilevel"/>
+    <w:tmpl w:val="A35695F8"/>
+    <w:lvl w:ilvl="0" w:tplc="4009000B">
+      <w:start w:val="1"/>
+      <w:numFmt w:val="bullet"/>
+      <w:lvlText w:val=""/>
+      <w:lvlJc w:val="left"/>
+      <w:pPr>
+        <w:ind w:left="1120" w:hanging="360"/>
+      </w:pPr>
+      <w:rPr>
+        <w:rFonts w:ascii="Wingdings" w:hAnsi="Wingdings" w:hint="default"/>
+      </w:rPr>
+    </w:lvl>
+    <w:lvl w:ilvl="1" w:tplc="40090003" w:tentative="1">
+      <w:start w:val="1"/>
+      <w:numFmt w:val="bullet"/>
+      <w:lvlText w:val="o"/>
+      <w:lvlJc w:val="left"/>
+      <w:pPr>
+        <w:ind w:left="1840" w:hanging="360"/>
+      </w:pPr>
+      <w:rPr>
+        <w:rFonts w:ascii="Courier New" w:hAnsi="Courier New" w:cs="Courier New" w:hint="default"/>
+      </w:rPr>
+    </w:lvl>
+    <w:lvl w:ilvl="2" w:tplc="40090005" w:tentative="1">
+      <w:start w:val="1"/>
+      <w:numFmt w:val="bullet"/>
+      <w:lvlText w:val=""/>
+      <w:lvlJc w:val="left"/>
+      <w:pPr>
+        <w:ind w:left="2560" w:hanging="360"/>
+      </w:pPr>
+      <w:rPr>
+        <w:rFonts w:ascii="Wingdings" w:hAnsi="Wingdings" w:hint="default"/>
+      </w:rPr>
+    </w:lvl>
+    <w:lvl w:ilvl="3" w:tplc="40090001" w:tentative="1">
+      <w:start w:val="1"/>
+      <w:numFmt w:val="bullet"/>
+      <w:lvlText w:val=""/>
+      <w:lvlJc w:val="left"/>
+      <w:pPr>
+        <w:ind w:left="3280" w:hanging="360"/>
+      </w:pPr>
+      <w:rPr>
+        <w:rFonts w:ascii="Symbol" w:hAnsi="Symbol" w:hint="default"/>
+      </w:rPr>
+    </w:lvl>
+    <w:lvl w:ilvl="4" w:tplc="40090003" w:tentative="1">
+      <w:start w:val="1"/>
+      <w:numFmt w:val="bullet"/>
+      <w:lvlText w:val="o"/>
+      <w:lvlJc w:val="left"/>
+      <w:pPr>
+        <w:ind w:left="4000" w:hanging="360"/>
+      </w:pPr>
+      <w:rPr>
+        <w:rFonts w:ascii="Courier New" w:hAnsi="Courier New" w:cs="Courier New" w:hint="default"/>
+      </w:rPr>
+    </w:lvl>
+    <w:lvl w:ilvl="5" w:tplc="40090005" w:tentative="1">
+      <w:start w:val="1"/>
+      <w:numFmt w:val="bullet"/>
+      <w:lvlText w:val=""/>
+      <w:lvlJc w:val="left"/>
+      <w:pPr>
+        <w:ind w:left="4720" w:hanging="360"/>
+      </w:pPr>
+      <w:rPr>
+        <w:rFonts w:ascii="Wingdings" w:hAnsi="Wingdings" w:hint="default"/>
+      </w:rPr>
+    </w:lvl>
+    <w:lvl w:ilvl="6" w:tplc="40090001" w:tentative="1">
+      <w:start w:val="1"/>
+      <w:numFmt w:val="bullet"/>
+      <w:lvlText w:val=""/>
+      <w:lvlJc w:val="left"/>
+      <w:pPr>
+        <w:ind w:left="5440" w:hanging="360"/>
+      </w:pPr>
+      <w:rPr>
+        <w:rFonts w:ascii="Symbol" w:hAnsi="Symbol" w:hint="default"/>
+      </w:rPr>
+    </w:lvl>
+    <w:lvl w:ilvl="7" w:tplc="40090003" w:tentative="1">
+      <w:start w:val="1"/>
+      <w:numFmt w:val="bullet"/>
+      <w:lvlText w:val="o"/>
+      <w:lvlJc w:val="left"/>
+      <w:pPr>
+        <w:ind w:left="6160" w:hanging="360"/>
+      </w:pPr>
+      <w:rPr>
+        <w:rFonts w:ascii="Courier New" w:hAnsi="Courier New" w:cs="Courier New" w:hint="default"/>
+      </w:rPr>
+    </w:lvl>
+    <w:lvl w:ilvl="8" w:tplc="40090005" w:tentative="1">
+      <w:start w:val="1"/>
+      <w:numFmt w:val="bullet"/>
+      <w:lvlText w:val=""/>
+      <w:lvlJc w:val="left"/>
+      <w:pPr>
+        <w:ind w:left="6880" w:hanging="360"/>
+      </w:pPr>
+      <w:rPr>
+        <w:rFonts w:ascii="Wingdings" w:hAnsi="Wingdings" w:hint="default"/>
+      </w:rPr>
+    </w:lvl>
+  </w:abstractNum>
+  <w:abstractNum w:abstractNumId="2" w15:restartNumberingAfterBreak="0">
     <w:nsid w:val="01141883"/>
     <w:multiLevelType w:val="hybridMultilevel"/>
     <w:tmpl w:val="FDB48D1C"/>
@@ -14851,7 +16942,7 @@
       </w:rPr>
     </w:lvl>
   </w:abstractNum>
-  <w:abstractNum w:abstractNumId="1" w15:restartNumberingAfterBreak="0">
+  <w:abstractNum w:abstractNumId="3" w15:restartNumberingAfterBreak="0">
     <w:nsid w:val="02CE5738"/>
     <w:multiLevelType w:val="hybridMultilevel"/>
     <w:tmpl w:val="B5B2F706"/>
@@ -14964,7 +17055,120 @@
       </w:rPr>
     </w:lvl>
   </w:abstractNum>
-  <w:abstractNum w:abstractNumId="2" w15:restartNumberingAfterBreak="0">
+  <w:abstractNum w:abstractNumId="4" w15:restartNumberingAfterBreak="0">
+    <w:nsid w:val="03CE1813"/>
+    <w:multiLevelType w:val="hybridMultilevel"/>
+    <w:tmpl w:val="DE5AD194"/>
+    <w:lvl w:ilvl="0" w:tplc="488C9D1E">
+      <w:start w:val="1"/>
+      <w:numFmt w:val="bullet"/>
+      <w:lvlText w:val=""/>
+      <w:lvlJc w:val="left"/>
+      <w:pPr>
+        <w:ind w:left="1511" w:hanging="360"/>
+      </w:pPr>
+      <w:rPr>
+        <w:rFonts w:ascii="Symbol" w:hAnsi="Symbol" w:hint="default"/>
+      </w:rPr>
+    </w:lvl>
+    <w:lvl w:ilvl="1" w:tplc="40090003" w:tentative="1">
+      <w:start w:val="1"/>
+      <w:numFmt w:val="bullet"/>
+      <w:lvlText w:val="o"/>
+      <w:lvlJc w:val="left"/>
+      <w:pPr>
+        <w:ind w:left="2231" w:hanging="360"/>
+      </w:pPr>
+      <w:rPr>
+        <w:rFonts w:ascii="Courier New" w:hAnsi="Courier New" w:cs="Courier New" w:hint="default"/>
+      </w:rPr>
+    </w:lvl>
+    <w:lvl w:ilvl="2" w:tplc="40090005" w:tentative="1">
+      <w:start w:val="1"/>
+      <w:numFmt w:val="bullet"/>
+      <w:lvlText w:val=""/>
+      <w:lvlJc w:val="left"/>
+      <w:pPr>
+        <w:ind w:left="2951" w:hanging="360"/>
+      </w:pPr>
+      <w:rPr>
+        <w:rFonts w:ascii="Wingdings" w:hAnsi="Wingdings" w:hint="default"/>
+      </w:rPr>
+    </w:lvl>
+    <w:lvl w:ilvl="3" w:tplc="40090001" w:tentative="1">
+      <w:start w:val="1"/>
+      <w:numFmt w:val="bullet"/>
+      <w:lvlText w:val=""/>
+      <w:lvlJc w:val="left"/>
+      <w:pPr>
+        <w:ind w:left="3671" w:hanging="360"/>
+      </w:pPr>
+      <w:rPr>
+        <w:rFonts w:ascii="Symbol" w:hAnsi="Symbol" w:hint="default"/>
+      </w:rPr>
+    </w:lvl>
+    <w:lvl w:ilvl="4" w:tplc="40090003" w:tentative="1">
+      <w:start w:val="1"/>
+      <w:numFmt w:val="bullet"/>
+      <w:lvlText w:val="o"/>
+      <w:lvlJc w:val="left"/>
+      <w:pPr>
+        <w:ind w:left="4391" w:hanging="360"/>
+      </w:pPr>
+      <w:rPr>
+        <w:rFonts w:ascii="Courier New" w:hAnsi="Courier New" w:cs="Courier New" w:hint="default"/>
+      </w:rPr>
+    </w:lvl>
+    <w:lvl w:ilvl="5" w:tplc="40090005" w:tentative="1">
+      <w:start w:val="1"/>
+      <w:numFmt w:val="bullet"/>
+      <w:lvlText w:val=""/>
+      <w:lvlJc w:val="left"/>
+      <w:pPr>
+        <w:ind w:left="5111" w:hanging="360"/>
+      </w:pPr>
+      <w:rPr>
+        <w:rFonts w:ascii="Wingdings" w:hAnsi="Wingdings" w:hint="default"/>
+      </w:rPr>
+    </w:lvl>
+    <w:lvl w:ilvl="6" w:tplc="40090001" w:tentative="1">
+      <w:start w:val="1"/>
+      <w:numFmt w:val="bullet"/>
+      <w:lvlText w:val=""/>
+      <w:lvlJc w:val="left"/>
+      <w:pPr>
+        <w:ind w:left="5831" w:hanging="360"/>
+      </w:pPr>
+      <w:rPr>
+        <w:rFonts w:ascii="Symbol" w:hAnsi="Symbol" w:hint="default"/>
+      </w:rPr>
+    </w:lvl>
+    <w:lvl w:ilvl="7" w:tplc="40090003" w:tentative="1">
+      <w:start w:val="1"/>
+      <w:numFmt w:val="bullet"/>
+      <w:lvlText w:val="o"/>
+      <w:lvlJc w:val="left"/>
+      <w:pPr>
+        <w:ind w:left="6551" w:hanging="360"/>
+      </w:pPr>
+      <w:rPr>
+        <w:rFonts w:ascii="Courier New" w:hAnsi="Courier New" w:cs="Courier New" w:hint="default"/>
+      </w:rPr>
+    </w:lvl>
+    <w:lvl w:ilvl="8" w:tplc="40090005" w:tentative="1">
+      <w:start w:val="1"/>
+      <w:numFmt w:val="bullet"/>
+      <w:lvlText w:val=""/>
+      <w:lvlJc w:val="left"/>
+      <w:pPr>
+        <w:ind w:left="7271" w:hanging="360"/>
+      </w:pPr>
+      <w:rPr>
+        <w:rFonts w:ascii="Wingdings" w:hAnsi="Wingdings" w:hint="default"/>
+      </w:rPr>
+    </w:lvl>
+  </w:abstractNum>
+  <w:abstractNum w:abstractNumId="5" w15:restartNumberingAfterBreak="0">
     <w:nsid w:val="044C07FE"/>
     <w:multiLevelType w:val="hybridMultilevel"/>
     <w:tmpl w:val="A0B854CE"/>
@@ -15077,7 +17281,7 @@
       </w:rPr>
     </w:lvl>
   </w:abstractNum>
-  <w:abstractNum w:abstractNumId="3" w15:restartNumberingAfterBreak="0">
+  <w:abstractNum w:abstractNumId="6" w15:restartNumberingAfterBreak="0">
     <w:nsid w:val="052177F5"/>
     <w:multiLevelType w:val="hybridMultilevel"/>
     <w:tmpl w:val="64547DC4"/>
@@ -15190,7 +17394,7 @@
       </w:rPr>
     </w:lvl>
   </w:abstractNum>
-  <w:abstractNum w:abstractNumId="4" w15:restartNumberingAfterBreak="0">
+  <w:abstractNum w:abstractNumId="7" w15:restartNumberingAfterBreak="0">
     <w:nsid w:val="05456703"/>
     <w:multiLevelType w:val="hybridMultilevel"/>
     <w:tmpl w:val="CC321F82"/>
@@ -15303,7 +17507,7 @@
       </w:rPr>
     </w:lvl>
   </w:abstractNum>
-  <w:abstractNum w:abstractNumId="5" w15:restartNumberingAfterBreak="0">
+  <w:abstractNum w:abstractNumId="8" w15:restartNumberingAfterBreak="0">
     <w:nsid w:val="054E4236"/>
     <w:multiLevelType w:val="hybridMultilevel"/>
     <w:tmpl w:val="A824F1FE"/>
@@ -15416,7 +17620,7 @@
       </w:rPr>
     </w:lvl>
   </w:abstractNum>
-  <w:abstractNum w:abstractNumId="6" w15:restartNumberingAfterBreak="0">
+  <w:abstractNum w:abstractNumId="9" w15:restartNumberingAfterBreak="0">
     <w:nsid w:val="06133A7A"/>
     <w:multiLevelType w:val="hybridMultilevel"/>
     <w:tmpl w:val="53788F08"/>
@@ -15525,7 +17729,7 @@
       </w:pPr>
     </w:lvl>
   </w:abstractNum>
-  <w:abstractNum w:abstractNumId="7" w15:restartNumberingAfterBreak="0">
+  <w:abstractNum w:abstractNumId="10" w15:restartNumberingAfterBreak="0">
     <w:nsid w:val="080A1290"/>
     <w:multiLevelType w:val="hybridMultilevel"/>
     <w:tmpl w:val="A330DFE0"/>
@@ -15638,7 +17842,120 @@
       </w:rPr>
     </w:lvl>
   </w:abstractNum>
-  <w:abstractNum w:abstractNumId="8" w15:restartNumberingAfterBreak="0">
+  <w:abstractNum w:abstractNumId="11" w15:restartNumberingAfterBreak="0">
+    <w:nsid w:val="082A75A2"/>
+    <w:multiLevelType w:val="hybridMultilevel"/>
+    <w:tmpl w:val="4F6A08C8"/>
+    <w:lvl w:ilvl="0" w:tplc="488C9D1E">
+      <w:start w:val="1"/>
+      <w:numFmt w:val="bullet"/>
+      <w:lvlText w:val=""/>
+      <w:lvlJc w:val="left"/>
+      <w:pPr>
+        <w:ind w:left="1463" w:hanging="360"/>
+      </w:pPr>
+      <w:rPr>
+        <w:rFonts w:ascii="Symbol" w:hAnsi="Symbol" w:hint="default"/>
+      </w:rPr>
+    </w:lvl>
+    <w:lvl w:ilvl="1" w:tplc="40090003" w:tentative="1">
+      <w:start w:val="1"/>
+      <w:numFmt w:val="bullet"/>
+      <w:lvlText w:val="o"/>
+      <w:lvlJc w:val="left"/>
+      <w:pPr>
+        <w:ind w:left="2183" w:hanging="360"/>
+      </w:pPr>
+      <w:rPr>
+        <w:rFonts w:ascii="Courier New" w:hAnsi="Courier New" w:cs="Courier New" w:hint="default"/>
+      </w:rPr>
+    </w:lvl>
+    <w:lvl w:ilvl="2" w:tplc="40090005" w:tentative="1">
+      <w:start w:val="1"/>
+      <w:numFmt w:val="bullet"/>
+      <w:lvlText w:val=""/>
+      <w:lvlJc w:val="left"/>
+      <w:pPr>
+        <w:ind w:left="2903" w:hanging="360"/>
+      </w:pPr>
+      <w:rPr>
+        <w:rFonts w:ascii="Wingdings" w:hAnsi="Wingdings" w:hint="default"/>
+      </w:rPr>
+    </w:lvl>
+    <w:lvl w:ilvl="3" w:tplc="40090001" w:tentative="1">
+      <w:start w:val="1"/>
+      <w:numFmt w:val="bullet"/>
+      <w:lvlText w:val=""/>
+      <w:lvlJc w:val="left"/>
+      <w:pPr>
+        <w:ind w:left="3623" w:hanging="360"/>
+      </w:pPr>
+      <w:rPr>
+        <w:rFonts w:ascii="Symbol" w:hAnsi="Symbol" w:hint="default"/>
+      </w:rPr>
+    </w:lvl>
+    <w:lvl w:ilvl="4" w:tplc="40090003" w:tentative="1">
+      <w:start w:val="1"/>
+      <w:numFmt w:val="bullet"/>
+      <w:lvlText w:val="o"/>
+      <w:lvlJc w:val="left"/>
+      <w:pPr>
+        <w:ind w:left="4343" w:hanging="360"/>
+      </w:pPr>
+      <w:rPr>
+        <w:rFonts w:ascii="Courier New" w:hAnsi="Courier New" w:cs="Courier New" w:hint="default"/>
+      </w:rPr>
+    </w:lvl>
+    <w:lvl w:ilvl="5" w:tplc="40090005" w:tentative="1">
+      <w:start w:val="1"/>
+      <w:numFmt w:val="bullet"/>
+      <w:lvlText w:val=""/>
+      <w:lvlJc w:val="left"/>
+      <w:pPr>
+        <w:ind w:left="5063" w:hanging="360"/>
+      </w:pPr>
+      <w:rPr>
+        <w:rFonts w:ascii="Wingdings" w:hAnsi="Wingdings" w:hint="default"/>
+      </w:rPr>
+    </w:lvl>
+    <w:lvl w:ilvl="6" w:tplc="40090001" w:tentative="1">
+      <w:start w:val="1"/>
+      <w:numFmt w:val="bullet"/>
+      <w:lvlText w:val=""/>
+      <w:lvlJc w:val="left"/>
+      <w:pPr>
+        <w:ind w:left="5783" w:hanging="360"/>
+      </w:pPr>
+      <w:rPr>
+        <w:rFonts w:ascii="Symbol" w:hAnsi="Symbol" w:hint="default"/>
+      </w:rPr>
+    </w:lvl>
+    <w:lvl w:ilvl="7" w:tplc="40090003" w:tentative="1">
+      <w:start w:val="1"/>
+      <w:numFmt w:val="bullet"/>
+      <w:lvlText w:val="o"/>
+      <w:lvlJc w:val="left"/>
+      <w:pPr>
+        <w:ind w:left="6503" w:hanging="360"/>
+      </w:pPr>
+      <w:rPr>
+        <w:rFonts w:ascii="Courier New" w:hAnsi="Courier New" w:cs="Courier New" w:hint="default"/>
+      </w:rPr>
+    </w:lvl>
+    <w:lvl w:ilvl="8" w:tplc="40090005" w:tentative="1">
+      <w:start w:val="1"/>
+      <w:numFmt w:val="bullet"/>
+      <w:lvlText w:val=""/>
+      <w:lvlJc w:val="left"/>
+      <w:pPr>
+        <w:ind w:left="7223" w:hanging="360"/>
+      </w:pPr>
+      <w:rPr>
+        <w:rFonts w:ascii="Wingdings" w:hAnsi="Wingdings" w:hint="default"/>
+      </w:rPr>
+    </w:lvl>
+  </w:abstractNum>
+  <w:abstractNum w:abstractNumId="12" w15:restartNumberingAfterBreak="0">
     <w:nsid w:val="0A52183A"/>
     <w:multiLevelType w:val="hybridMultilevel"/>
     <w:tmpl w:val="5FB29E90"/>
@@ -15751,7 +18068,7 @@
       </w:rPr>
     </w:lvl>
   </w:abstractNum>
-  <w:abstractNum w:abstractNumId="9" w15:restartNumberingAfterBreak="0">
+  <w:abstractNum w:abstractNumId="13" w15:restartNumberingAfterBreak="0">
     <w:nsid w:val="0CA9725A"/>
     <w:multiLevelType w:val="hybridMultilevel"/>
     <w:tmpl w:val="4DBED244"/>
@@ -15864,7 +18181,120 @@
       </w:rPr>
     </w:lvl>
   </w:abstractNum>
-  <w:abstractNum w:abstractNumId="10" w15:restartNumberingAfterBreak="0">
+  <w:abstractNum w:abstractNumId="14" w15:restartNumberingAfterBreak="0">
+    <w:nsid w:val="0CDA3678"/>
+    <w:multiLevelType w:val="hybridMultilevel"/>
+    <w:tmpl w:val="E22EA7CC"/>
+    <w:lvl w:ilvl="0" w:tplc="488C9D1E">
+      <w:start w:val="1"/>
+      <w:numFmt w:val="bullet"/>
+      <w:lvlText w:val=""/>
+      <w:lvlJc w:val="left"/>
+      <w:pPr>
+        <w:ind w:left="1463" w:hanging="360"/>
+      </w:pPr>
+      <w:rPr>
+        <w:rFonts w:ascii="Symbol" w:hAnsi="Symbol" w:hint="default"/>
+      </w:rPr>
+    </w:lvl>
+    <w:lvl w:ilvl="1" w:tplc="40090003" w:tentative="1">
+      <w:start w:val="1"/>
+      <w:numFmt w:val="bullet"/>
+      <w:lvlText w:val="o"/>
+      <w:lvlJc w:val="left"/>
+      <w:pPr>
+        <w:ind w:left="2183" w:hanging="360"/>
+      </w:pPr>
+      <w:rPr>
+        <w:rFonts w:ascii="Courier New" w:hAnsi="Courier New" w:cs="Courier New" w:hint="default"/>
+      </w:rPr>
+    </w:lvl>
+    <w:lvl w:ilvl="2" w:tplc="40090005" w:tentative="1">
+      <w:start w:val="1"/>
+      <w:numFmt w:val="bullet"/>
+      <w:lvlText w:val=""/>
+      <w:lvlJc w:val="left"/>
+      <w:pPr>
+        <w:ind w:left="2903" w:hanging="360"/>
+      </w:pPr>
+      <w:rPr>
+        <w:rFonts w:ascii="Wingdings" w:hAnsi="Wingdings" w:hint="default"/>
+      </w:rPr>
+    </w:lvl>
+    <w:lvl w:ilvl="3" w:tplc="40090001" w:tentative="1">
+      <w:start w:val="1"/>
+      <w:numFmt w:val="bullet"/>
+      <w:lvlText w:val=""/>
+      <w:lvlJc w:val="left"/>
+      <w:pPr>
+        <w:ind w:left="3623" w:hanging="360"/>
+      </w:pPr>
+      <w:rPr>
+        <w:rFonts w:ascii="Symbol" w:hAnsi="Symbol" w:hint="default"/>
+      </w:rPr>
+    </w:lvl>
+    <w:lvl w:ilvl="4" w:tplc="40090003" w:tentative="1">
+      <w:start w:val="1"/>
+      <w:numFmt w:val="bullet"/>
+      <w:lvlText w:val="o"/>
+      <w:lvlJc w:val="left"/>
+      <w:pPr>
+        <w:ind w:left="4343" w:hanging="360"/>
+      </w:pPr>
+      <w:rPr>
+        <w:rFonts w:ascii="Courier New" w:hAnsi="Courier New" w:cs="Courier New" w:hint="default"/>
+      </w:rPr>
+    </w:lvl>
+    <w:lvl w:ilvl="5" w:tplc="40090005" w:tentative="1">
+      <w:start w:val="1"/>
+      <w:numFmt w:val="bullet"/>
+      <w:lvlText w:val=""/>
+      <w:lvlJc w:val="left"/>
+      <w:pPr>
+        <w:ind w:left="5063" w:hanging="360"/>
+      </w:pPr>
+      <w:rPr>
+        <w:rFonts w:ascii="Wingdings" w:hAnsi="Wingdings" w:hint="default"/>
+      </w:rPr>
+    </w:lvl>
+    <w:lvl w:ilvl="6" w:tplc="40090001" w:tentative="1">
+      <w:start w:val="1"/>
+      <w:numFmt w:val="bullet"/>
+      <w:lvlText w:val=""/>
+      <w:lvlJc w:val="left"/>
+      <w:pPr>
+        <w:ind w:left="5783" w:hanging="360"/>
+      </w:pPr>
+      <w:rPr>
+        <w:rFonts w:ascii="Symbol" w:hAnsi="Symbol" w:hint="default"/>
+      </w:rPr>
+    </w:lvl>
+    <w:lvl w:ilvl="7" w:tplc="40090003" w:tentative="1">
+      <w:start w:val="1"/>
+      <w:numFmt w:val="bullet"/>
+      <w:lvlText w:val="o"/>
+      <w:lvlJc w:val="left"/>
+      <w:pPr>
+        <w:ind w:left="6503" w:hanging="360"/>
+      </w:pPr>
+      <w:rPr>
+        <w:rFonts w:ascii="Courier New" w:hAnsi="Courier New" w:cs="Courier New" w:hint="default"/>
+      </w:rPr>
+    </w:lvl>
+    <w:lvl w:ilvl="8" w:tplc="40090005" w:tentative="1">
+      <w:start w:val="1"/>
+      <w:numFmt w:val="bullet"/>
+      <w:lvlText w:val=""/>
+      <w:lvlJc w:val="left"/>
+      <w:pPr>
+        <w:ind w:left="7223" w:hanging="360"/>
+      </w:pPr>
+      <w:rPr>
+        <w:rFonts w:ascii="Wingdings" w:hAnsi="Wingdings" w:hint="default"/>
+      </w:rPr>
+    </w:lvl>
+  </w:abstractNum>
+  <w:abstractNum w:abstractNumId="15" w15:restartNumberingAfterBreak="0">
     <w:nsid w:val="0D743D1F"/>
     <w:multiLevelType w:val="hybridMultilevel"/>
     <w:tmpl w:val="A1F855A6"/>
@@ -15973,7 +18403,7 @@
       </w:pPr>
     </w:lvl>
   </w:abstractNum>
-  <w:abstractNum w:abstractNumId="11" w15:restartNumberingAfterBreak="0">
+  <w:abstractNum w:abstractNumId="16" w15:restartNumberingAfterBreak="0">
     <w:nsid w:val="0ED41A8C"/>
     <w:multiLevelType w:val="hybridMultilevel"/>
     <w:tmpl w:val="39BE9BB4"/>
@@ -16086,7 +18516,7 @@
       </w:rPr>
     </w:lvl>
   </w:abstractNum>
-  <w:abstractNum w:abstractNumId="12" w15:restartNumberingAfterBreak="0">
+  <w:abstractNum w:abstractNumId="17" w15:restartNumberingAfterBreak="0">
     <w:nsid w:val="0F7D6AA2"/>
     <w:multiLevelType w:val="hybridMultilevel"/>
     <w:tmpl w:val="1E34183E"/>
@@ -16199,7 +18629,7 @@
       </w:rPr>
     </w:lvl>
   </w:abstractNum>
-  <w:abstractNum w:abstractNumId="13" w15:restartNumberingAfterBreak="0">
+  <w:abstractNum w:abstractNumId="18" w15:restartNumberingAfterBreak="0">
     <w:nsid w:val="10E977AF"/>
     <w:multiLevelType w:val="hybridMultilevel"/>
     <w:tmpl w:val="A91AFD52"/>
@@ -16312,7 +18742,7 @@
       </w:rPr>
     </w:lvl>
   </w:abstractNum>
-  <w:abstractNum w:abstractNumId="14" w15:restartNumberingAfterBreak="0">
+  <w:abstractNum w:abstractNumId="19" w15:restartNumberingAfterBreak="0">
     <w:nsid w:val="110C1F0A"/>
     <w:multiLevelType w:val="hybridMultilevel"/>
     <w:tmpl w:val="12800908"/>
@@ -16425,7 +18855,7 @@
       </w:rPr>
     </w:lvl>
   </w:abstractNum>
-  <w:abstractNum w:abstractNumId="15" w15:restartNumberingAfterBreak="0">
+  <w:abstractNum w:abstractNumId="20" w15:restartNumberingAfterBreak="0">
     <w:nsid w:val="11E40B49"/>
     <w:multiLevelType w:val="hybridMultilevel"/>
     <w:tmpl w:val="3B14F05C"/>
@@ -16538,7 +18968,7 @@
       </w:rPr>
     </w:lvl>
   </w:abstractNum>
-  <w:abstractNum w:abstractNumId="16" w15:restartNumberingAfterBreak="0">
+  <w:abstractNum w:abstractNumId="21" w15:restartNumberingAfterBreak="0">
     <w:nsid w:val="12D534F3"/>
     <w:multiLevelType w:val="hybridMultilevel"/>
     <w:tmpl w:val="6D9A2CFE"/>
@@ -16651,7 +19081,7 @@
       </w:rPr>
     </w:lvl>
   </w:abstractNum>
-  <w:abstractNum w:abstractNumId="17" w15:restartNumberingAfterBreak="0">
+  <w:abstractNum w:abstractNumId="22" w15:restartNumberingAfterBreak="0">
     <w:nsid w:val="13AA0395"/>
     <w:multiLevelType w:val="hybridMultilevel"/>
     <w:tmpl w:val="41421288"/>
@@ -16764,7 +19194,7 @@
       </w:rPr>
     </w:lvl>
   </w:abstractNum>
-  <w:abstractNum w:abstractNumId="18" w15:restartNumberingAfterBreak="0">
+  <w:abstractNum w:abstractNumId="23" w15:restartNumberingAfterBreak="0">
     <w:nsid w:val="14175B67"/>
     <w:multiLevelType w:val="hybridMultilevel"/>
     <w:tmpl w:val="776493DA"/>
@@ -16873,7 +19303,7 @@
       </w:pPr>
     </w:lvl>
   </w:abstractNum>
-  <w:abstractNum w:abstractNumId="19" w15:restartNumberingAfterBreak="0">
+  <w:abstractNum w:abstractNumId="24" w15:restartNumberingAfterBreak="0">
     <w:nsid w:val="17096475"/>
     <w:multiLevelType w:val="hybridMultilevel"/>
     <w:tmpl w:val="577CBEB0"/>
@@ -16986,7 +19416,7 @@
       </w:rPr>
     </w:lvl>
   </w:abstractNum>
-  <w:abstractNum w:abstractNumId="20" w15:restartNumberingAfterBreak="0">
+  <w:abstractNum w:abstractNumId="25" w15:restartNumberingAfterBreak="0">
     <w:nsid w:val="191168A3"/>
     <w:multiLevelType w:val="hybridMultilevel"/>
     <w:tmpl w:val="0DB2DA64"/>
@@ -17099,7 +19529,7 @@
       </w:rPr>
     </w:lvl>
   </w:abstractNum>
-  <w:abstractNum w:abstractNumId="21" w15:restartNumberingAfterBreak="0">
+  <w:abstractNum w:abstractNumId="26" w15:restartNumberingAfterBreak="0">
     <w:nsid w:val="1CA516B8"/>
     <w:multiLevelType w:val="hybridMultilevel"/>
     <w:tmpl w:val="9A042BF6"/>
@@ -17212,7 +19642,7 @@
       </w:rPr>
     </w:lvl>
   </w:abstractNum>
-  <w:abstractNum w:abstractNumId="22" w15:restartNumberingAfterBreak="0">
+  <w:abstractNum w:abstractNumId="27" w15:restartNumberingAfterBreak="0">
     <w:nsid w:val="1D644E5C"/>
     <w:multiLevelType w:val="hybridMultilevel"/>
     <w:tmpl w:val="A7BC5C5E"/>
@@ -17325,7 +19755,7 @@
       </w:rPr>
     </w:lvl>
   </w:abstractNum>
-  <w:abstractNum w:abstractNumId="23" w15:restartNumberingAfterBreak="0">
+  <w:abstractNum w:abstractNumId="28" w15:restartNumberingAfterBreak="0">
     <w:nsid w:val="22DB65EA"/>
     <w:multiLevelType w:val="hybridMultilevel"/>
     <w:tmpl w:val="0F7C5664"/>
@@ -17438,7 +19868,7 @@
       </w:rPr>
     </w:lvl>
   </w:abstractNum>
-  <w:abstractNum w:abstractNumId="24" w15:restartNumberingAfterBreak="0">
+  <w:abstractNum w:abstractNumId="29" w15:restartNumberingAfterBreak="0">
     <w:nsid w:val="232628BC"/>
     <w:multiLevelType w:val="hybridMultilevel"/>
     <w:tmpl w:val="BB22A51E"/>
@@ -17551,7 +19981,7 @@
       </w:rPr>
     </w:lvl>
   </w:abstractNum>
-  <w:abstractNum w:abstractNumId="25" w15:restartNumberingAfterBreak="0">
+  <w:abstractNum w:abstractNumId="30" w15:restartNumberingAfterBreak="0">
     <w:nsid w:val="23F9362A"/>
     <w:multiLevelType w:val="hybridMultilevel"/>
     <w:tmpl w:val="52B691FA"/>
@@ -17664,7 +20094,7 @@
       </w:rPr>
     </w:lvl>
   </w:abstractNum>
-  <w:abstractNum w:abstractNumId="26" w15:restartNumberingAfterBreak="0">
+  <w:abstractNum w:abstractNumId="31" w15:restartNumberingAfterBreak="0">
     <w:nsid w:val="244E0056"/>
     <w:multiLevelType w:val="hybridMultilevel"/>
     <w:tmpl w:val="0DFAAEE2"/>
@@ -17777,7 +20207,7 @@
       </w:rPr>
     </w:lvl>
   </w:abstractNum>
-  <w:abstractNum w:abstractNumId="27" w15:restartNumberingAfterBreak="0">
+  <w:abstractNum w:abstractNumId="32" w15:restartNumberingAfterBreak="0">
     <w:nsid w:val="260B2D54"/>
     <w:multiLevelType w:val="hybridMultilevel"/>
     <w:tmpl w:val="3B3CBCFA"/>
@@ -17890,7 +20320,7 @@
       </w:rPr>
     </w:lvl>
   </w:abstractNum>
-  <w:abstractNum w:abstractNumId="28" w15:restartNumberingAfterBreak="0">
+  <w:abstractNum w:abstractNumId="33" w15:restartNumberingAfterBreak="0">
     <w:nsid w:val="264859EB"/>
     <w:multiLevelType w:val="hybridMultilevel"/>
     <w:tmpl w:val="9976F274"/>
@@ -18003,7 +20433,120 @@
       </w:rPr>
     </w:lvl>
   </w:abstractNum>
-  <w:abstractNum w:abstractNumId="29" w15:restartNumberingAfterBreak="0">
+  <w:abstractNum w:abstractNumId="34" w15:restartNumberingAfterBreak="0">
+    <w:nsid w:val="2662319A"/>
+    <w:multiLevelType w:val="hybridMultilevel"/>
+    <w:tmpl w:val="7FBE34F2"/>
+    <w:lvl w:ilvl="0" w:tplc="488C9D1E">
+      <w:start w:val="1"/>
+      <w:numFmt w:val="bullet"/>
+      <w:lvlText w:val=""/>
+      <w:lvlJc w:val="left"/>
+      <w:pPr>
+        <w:ind w:left="1561" w:hanging="360"/>
+      </w:pPr>
+      <w:rPr>
+        <w:rFonts w:ascii="Symbol" w:hAnsi="Symbol" w:hint="default"/>
+      </w:rPr>
+    </w:lvl>
+    <w:lvl w:ilvl="1" w:tplc="40090003" w:tentative="1">
+      <w:start w:val="1"/>
+      <w:numFmt w:val="bullet"/>
+      <w:lvlText w:val="o"/>
+      <w:lvlJc w:val="left"/>
+      <w:pPr>
+        <w:ind w:left="2281" w:hanging="360"/>
+      </w:pPr>
+      <w:rPr>
+        <w:rFonts w:ascii="Courier New" w:hAnsi="Courier New" w:cs="Courier New" w:hint="default"/>
+      </w:rPr>
+    </w:lvl>
+    <w:lvl w:ilvl="2" w:tplc="40090005" w:tentative="1">
+      <w:start w:val="1"/>
+      <w:numFmt w:val="bullet"/>
+      <w:lvlText w:val=""/>
+      <w:lvlJc w:val="left"/>
+      <w:pPr>
+        <w:ind w:left="3001" w:hanging="360"/>
+      </w:pPr>
+      <w:rPr>
+        <w:rFonts w:ascii="Wingdings" w:hAnsi="Wingdings" w:hint="default"/>
+      </w:rPr>
+    </w:lvl>
+    <w:lvl w:ilvl="3" w:tplc="40090001" w:tentative="1">
+      <w:start w:val="1"/>
+      <w:numFmt w:val="bullet"/>
+      <w:lvlText w:val=""/>
+      <w:lvlJc w:val="left"/>
+      <w:pPr>
+        <w:ind w:left="3721" w:hanging="360"/>
+      </w:pPr>
+      <w:rPr>
+        <w:rFonts w:ascii="Symbol" w:hAnsi="Symbol" w:hint="default"/>
+      </w:rPr>
+    </w:lvl>
+    <w:lvl w:ilvl="4" w:tplc="40090003" w:tentative="1">
+      <w:start w:val="1"/>
+      <w:numFmt w:val="bullet"/>
+      <w:lvlText w:val="o"/>
+      <w:lvlJc w:val="left"/>
+      <w:pPr>
+        <w:ind w:left="4441" w:hanging="360"/>
+      </w:pPr>
+      <w:rPr>
+        <w:rFonts w:ascii="Courier New" w:hAnsi="Courier New" w:cs="Courier New" w:hint="default"/>
+      </w:rPr>
+    </w:lvl>
+    <w:lvl w:ilvl="5" w:tplc="40090005" w:tentative="1">
+      <w:start w:val="1"/>
+      <w:numFmt w:val="bullet"/>
+      <w:lvlText w:val=""/>
+      <w:lvlJc w:val="left"/>
+      <w:pPr>
+        <w:ind w:left="5161" w:hanging="360"/>
+      </w:pPr>
+      <w:rPr>
+        <w:rFonts w:ascii="Wingdings" w:hAnsi="Wingdings" w:hint="default"/>
+      </w:rPr>
+    </w:lvl>
+    <w:lvl w:ilvl="6" w:tplc="40090001" w:tentative="1">
+      <w:start w:val="1"/>
+      <w:numFmt w:val="bullet"/>
+      <w:lvlText w:val=""/>
+      <w:lvlJc w:val="left"/>
+      <w:pPr>
+        <w:ind w:left="5881" w:hanging="360"/>
+      </w:pPr>
+      <w:rPr>
+        <w:rFonts w:ascii="Symbol" w:hAnsi="Symbol" w:hint="default"/>
+      </w:rPr>
+    </w:lvl>
+    <w:lvl w:ilvl="7" w:tplc="40090003" w:tentative="1">
+      <w:start w:val="1"/>
+      <w:numFmt w:val="bullet"/>
+      <w:lvlText w:val="o"/>
+      <w:lvlJc w:val="left"/>
+      <w:pPr>
+        <w:ind w:left="6601" w:hanging="360"/>
+      </w:pPr>
+      <w:rPr>
+        <w:rFonts w:ascii="Courier New" w:hAnsi="Courier New" w:cs="Courier New" w:hint="default"/>
+      </w:rPr>
+    </w:lvl>
+    <w:lvl w:ilvl="8" w:tplc="40090005" w:tentative="1">
+      <w:start w:val="1"/>
+      <w:numFmt w:val="bullet"/>
+      <w:lvlText w:val=""/>
+      <w:lvlJc w:val="left"/>
+      <w:pPr>
+        <w:ind w:left="7321" w:hanging="360"/>
+      </w:pPr>
+      <w:rPr>
+        <w:rFonts w:ascii="Wingdings" w:hAnsi="Wingdings" w:hint="default"/>
+      </w:rPr>
+    </w:lvl>
+  </w:abstractNum>
+  <w:abstractNum w:abstractNumId="35" w15:restartNumberingAfterBreak="0">
     <w:nsid w:val="2CD07219"/>
     <w:multiLevelType w:val="hybridMultilevel"/>
     <w:tmpl w:val="F028F0C2"/>
@@ -18116,7 +20659,7 @@
       </w:rPr>
     </w:lvl>
   </w:abstractNum>
-  <w:abstractNum w:abstractNumId="30" w15:restartNumberingAfterBreak="0">
+  <w:abstractNum w:abstractNumId="36" w15:restartNumberingAfterBreak="0">
     <w:nsid w:val="2E5E01CB"/>
     <w:multiLevelType w:val="hybridMultilevel"/>
     <w:tmpl w:val="4E80DCB4"/>
@@ -18229,7 +20772,7 @@
       </w:rPr>
     </w:lvl>
   </w:abstractNum>
-  <w:abstractNum w:abstractNumId="31" w15:restartNumberingAfterBreak="0">
+  <w:abstractNum w:abstractNumId="37" w15:restartNumberingAfterBreak="0">
     <w:nsid w:val="2F325EA5"/>
     <w:multiLevelType w:val="hybridMultilevel"/>
     <w:tmpl w:val="4880CD62"/>
@@ -18342,7 +20885,7 @@
       </w:rPr>
     </w:lvl>
   </w:abstractNum>
-  <w:abstractNum w:abstractNumId="32" w15:restartNumberingAfterBreak="0">
+  <w:abstractNum w:abstractNumId="38" w15:restartNumberingAfterBreak="0">
     <w:nsid w:val="30B71602"/>
     <w:multiLevelType w:val="hybridMultilevel"/>
     <w:tmpl w:val="034275AE"/>
@@ -18455,7 +20998,7 @@
       </w:rPr>
     </w:lvl>
   </w:abstractNum>
-  <w:abstractNum w:abstractNumId="33" w15:restartNumberingAfterBreak="0">
+  <w:abstractNum w:abstractNumId="39" w15:restartNumberingAfterBreak="0">
     <w:nsid w:val="322A262F"/>
     <w:multiLevelType w:val="hybridMultilevel"/>
     <w:tmpl w:val="327C07E0"/>
@@ -18568,7 +21111,7 @@
       </w:rPr>
     </w:lvl>
   </w:abstractNum>
-  <w:abstractNum w:abstractNumId="34" w15:restartNumberingAfterBreak="0">
+  <w:abstractNum w:abstractNumId="40" w15:restartNumberingAfterBreak="0">
     <w:nsid w:val="32C32B4A"/>
     <w:multiLevelType w:val="hybridMultilevel"/>
     <w:tmpl w:val="01CAE6DC"/>
@@ -18681,7 +21224,7 @@
       </w:rPr>
     </w:lvl>
   </w:abstractNum>
-  <w:abstractNum w:abstractNumId="35" w15:restartNumberingAfterBreak="0">
+  <w:abstractNum w:abstractNumId="41" w15:restartNumberingAfterBreak="0">
     <w:nsid w:val="35553CF3"/>
     <w:multiLevelType w:val="hybridMultilevel"/>
     <w:tmpl w:val="DA50D502"/>
@@ -18794,7 +21337,7 @@
       </w:rPr>
     </w:lvl>
   </w:abstractNum>
-  <w:abstractNum w:abstractNumId="36" w15:restartNumberingAfterBreak="0">
+  <w:abstractNum w:abstractNumId="42" w15:restartNumberingAfterBreak="0">
     <w:nsid w:val="39582E41"/>
     <w:multiLevelType w:val="hybridMultilevel"/>
     <w:tmpl w:val="6EA8BB26"/>
@@ -18907,7 +21450,7 @@
       </w:rPr>
     </w:lvl>
   </w:abstractNum>
-  <w:abstractNum w:abstractNumId="37" w15:restartNumberingAfterBreak="0">
+  <w:abstractNum w:abstractNumId="43" w15:restartNumberingAfterBreak="0">
     <w:nsid w:val="39A6604F"/>
     <w:multiLevelType w:val="hybridMultilevel"/>
     <w:tmpl w:val="E4B8291E"/>
@@ -19020,7 +21563,7 @@
       </w:rPr>
     </w:lvl>
   </w:abstractNum>
-  <w:abstractNum w:abstractNumId="38" w15:restartNumberingAfterBreak="0">
+  <w:abstractNum w:abstractNumId="44" w15:restartNumberingAfterBreak="0">
     <w:nsid w:val="41DC4A8F"/>
     <w:multiLevelType w:val="hybridMultilevel"/>
     <w:tmpl w:val="19CE7D6E"/>
@@ -19133,7 +21676,7 @@
       </w:rPr>
     </w:lvl>
   </w:abstractNum>
-  <w:abstractNum w:abstractNumId="39" w15:restartNumberingAfterBreak="0">
+  <w:abstractNum w:abstractNumId="45" w15:restartNumberingAfterBreak="0">
     <w:nsid w:val="41F21485"/>
     <w:multiLevelType w:val="hybridMultilevel"/>
     <w:tmpl w:val="BEF2DB6E"/>
@@ -19246,7 +21789,7 @@
       </w:rPr>
     </w:lvl>
   </w:abstractNum>
-  <w:abstractNum w:abstractNumId="40" w15:restartNumberingAfterBreak="0">
+  <w:abstractNum w:abstractNumId="46" w15:restartNumberingAfterBreak="0">
     <w:nsid w:val="43F66481"/>
     <w:multiLevelType w:val="hybridMultilevel"/>
     <w:tmpl w:val="0D5AA074"/>
@@ -19359,7 +21902,7 @@
       </w:rPr>
     </w:lvl>
   </w:abstractNum>
-  <w:abstractNum w:abstractNumId="41" w15:restartNumberingAfterBreak="0">
+  <w:abstractNum w:abstractNumId="47" w15:restartNumberingAfterBreak="0">
     <w:nsid w:val="45CF465D"/>
     <w:multiLevelType w:val="hybridMultilevel"/>
     <w:tmpl w:val="3D904BB4"/>
@@ -19472,7 +22015,7 @@
       </w:rPr>
     </w:lvl>
   </w:abstractNum>
-  <w:abstractNum w:abstractNumId="42" w15:restartNumberingAfterBreak="0">
+  <w:abstractNum w:abstractNumId="48" w15:restartNumberingAfterBreak="0">
     <w:nsid w:val="475F4735"/>
     <w:multiLevelType w:val="hybridMultilevel"/>
     <w:tmpl w:val="FA029FFA"/>
@@ -19585,7 +22128,7 @@
       </w:rPr>
     </w:lvl>
   </w:abstractNum>
-  <w:abstractNum w:abstractNumId="43" w15:restartNumberingAfterBreak="0">
+  <w:abstractNum w:abstractNumId="49" w15:restartNumberingAfterBreak="0">
     <w:nsid w:val="4BD208CD"/>
     <w:multiLevelType w:val="hybridMultilevel"/>
     <w:tmpl w:val="A53A1180"/>
@@ -19698,7 +22241,7 @@
       </w:rPr>
     </w:lvl>
   </w:abstractNum>
-  <w:abstractNum w:abstractNumId="44" w15:restartNumberingAfterBreak="0">
+  <w:abstractNum w:abstractNumId="50" w15:restartNumberingAfterBreak="0">
     <w:nsid w:val="4C342B25"/>
     <w:multiLevelType w:val="hybridMultilevel"/>
     <w:tmpl w:val="B91CD8D8"/>
@@ -19811,7 +22354,7 @@
       </w:rPr>
     </w:lvl>
   </w:abstractNum>
-  <w:abstractNum w:abstractNumId="45" w15:restartNumberingAfterBreak="0">
+  <w:abstractNum w:abstractNumId="51" w15:restartNumberingAfterBreak="0">
     <w:nsid w:val="4CAF2742"/>
     <w:multiLevelType w:val="hybridMultilevel"/>
     <w:tmpl w:val="9B382BEA"/>
@@ -19924,7 +22467,7 @@
       </w:rPr>
     </w:lvl>
   </w:abstractNum>
-  <w:abstractNum w:abstractNumId="46" w15:restartNumberingAfterBreak="0">
+  <w:abstractNum w:abstractNumId="52" w15:restartNumberingAfterBreak="0">
     <w:nsid w:val="4CB9119F"/>
     <w:multiLevelType w:val="hybridMultilevel"/>
     <w:tmpl w:val="76365076"/>
@@ -20037,7 +22580,7 @@
       </w:rPr>
     </w:lvl>
   </w:abstractNum>
-  <w:abstractNum w:abstractNumId="47" w15:restartNumberingAfterBreak="0">
+  <w:abstractNum w:abstractNumId="53" w15:restartNumberingAfterBreak="0">
     <w:nsid w:val="4F17655D"/>
     <w:multiLevelType w:val="hybridMultilevel"/>
     <w:tmpl w:val="BE60F5B4"/>
@@ -20150,7 +22693,7 @@
       </w:rPr>
     </w:lvl>
   </w:abstractNum>
-  <w:abstractNum w:abstractNumId="48" w15:restartNumberingAfterBreak="0">
+  <w:abstractNum w:abstractNumId="54" w15:restartNumberingAfterBreak="0">
     <w:nsid w:val="50E81B93"/>
     <w:multiLevelType w:val="hybridMultilevel"/>
     <w:tmpl w:val="FE8AB98C"/>
@@ -20263,7 +22806,7 @@
       </w:rPr>
     </w:lvl>
   </w:abstractNum>
-  <w:abstractNum w:abstractNumId="49" w15:restartNumberingAfterBreak="0">
+  <w:abstractNum w:abstractNumId="55" w15:restartNumberingAfterBreak="0">
     <w:nsid w:val="5207196C"/>
     <w:multiLevelType w:val="hybridMultilevel"/>
     <w:tmpl w:val="04101D70"/>
@@ -20376,7 +22919,7 @@
       </w:rPr>
     </w:lvl>
   </w:abstractNum>
-  <w:abstractNum w:abstractNumId="50" w15:restartNumberingAfterBreak="0">
+  <w:abstractNum w:abstractNumId="56" w15:restartNumberingAfterBreak="0">
     <w:nsid w:val="52E2024D"/>
     <w:multiLevelType w:val="hybridMultilevel"/>
     <w:tmpl w:val="DABA967C"/>
@@ -20489,7 +23032,7 @@
       </w:rPr>
     </w:lvl>
   </w:abstractNum>
-  <w:abstractNum w:abstractNumId="51" w15:restartNumberingAfterBreak="0">
+  <w:abstractNum w:abstractNumId="57" w15:restartNumberingAfterBreak="0">
     <w:nsid w:val="54BF6151"/>
     <w:multiLevelType w:val="hybridMultilevel"/>
     <w:tmpl w:val="F4D635F4"/>
@@ -20598,7 +23141,7 @@
       </w:pPr>
     </w:lvl>
   </w:abstractNum>
-  <w:abstractNum w:abstractNumId="52" w15:restartNumberingAfterBreak="0">
+  <w:abstractNum w:abstractNumId="58" w15:restartNumberingAfterBreak="0">
     <w:nsid w:val="5BE47E43"/>
     <w:multiLevelType w:val="hybridMultilevel"/>
     <w:tmpl w:val="EF3EAED2"/>
@@ -20711,7 +23254,7 @@
       </w:rPr>
     </w:lvl>
   </w:abstractNum>
-  <w:abstractNum w:abstractNumId="53" w15:restartNumberingAfterBreak="0">
+  <w:abstractNum w:abstractNumId="59" w15:restartNumberingAfterBreak="0">
     <w:nsid w:val="5C0D2947"/>
     <w:multiLevelType w:val="hybridMultilevel"/>
     <w:tmpl w:val="8CAAD732"/>
@@ -20824,7 +23367,7 @@
       </w:rPr>
     </w:lvl>
   </w:abstractNum>
-  <w:abstractNum w:abstractNumId="54" w15:restartNumberingAfterBreak="0">
+  <w:abstractNum w:abstractNumId="60" w15:restartNumberingAfterBreak="0">
     <w:nsid w:val="5D4D2BDD"/>
     <w:multiLevelType w:val="hybridMultilevel"/>
     <w:tmpl w:val="14A8EAC6"/>
@@ -20937,7 +23480,7 @@
       </w:rPr>
     </w:lvl>
   </w:abstractNum>
-  <w:abstractNum w:abstractNumId="55" w15:restartNumberingAfterBreak="0">
+  <w:abstractNum w:abstractNumId="61" w15:restartNumberingAfterBreak="0">
     <w:nsid w:val="620D5486"/>
     <w:multiLevelType w:val="hybridMultilevel"/>
     <w:tmpl w:val="728869EC"/>
@@ -21050,7 +23593,7 @@
       </w:rPr>
     </w:lvl>
   </w:abstractNum>
-  <w:abstractNum w:abstractNumId="56" w15:restartNumberingAfterBreak="0">
+  <w:abstractNum w:abstractNumId="62" w15:restartNumberingAfterBreak="0">
     <w:nsid w:val="663A7E4C"/>
     <w:multiLevelType w:val="hybridMultilevel"/>
     <w:tmpl w:val="14463E10"/>
@@ -21163,7 +23706,7 @@
       </w:rPr>
     </w:lvl>
   </w:abstractNum>
-  <w:abstractNum w:abstractNumId="57" w15:restartNumberingAfterBreak="0">
+  <w:abstractNum w:abstractNumId="63" w15:restartNumberingAfterBreak="0">
     <w:nsid w:val="666E6981"/>
     <w:multiLevelType w:val="hybridMultilevel"/>
     <w:tmpl w:val="7B527FA6"/>
@@ -21276,7 +23819,7 @@
       </w:rPr>
     </w:lvl>
   </w:abstractNum>
-  <w:abstractNum w:abstractNumId="58" w15:restartNumberingAfterBreak="0">
+  <w:abstractNum w:abstractNumId="64" w15:restartNumberingAfterBreak="0">
     <w:nsid w:val="66B62DBB"/>
     <w:multiLevelType w:val="hybridMultilevel"/>
     <w:tmpl w:val="10D04886"/>
@@ -21389,7 +23932,7 @@
       </w:rPr>
     </w:lvl>
   </w:abstractNum>
-  <w:abstractNum w:abstractNumId="59" w15:restartNumberingAfterBreak="0">
+  <w:abstractNum w:abstractNumId="65" w15:restartNumberingAfterBreak="0">
     <w:nsid w:val="68E44562"/>
     <w:multiLevelType w:val="hybridMultilevel"/>
     <w:tmpl w:val="0952F2F2"/>
@@ -21502,7 +24045,7 @@
       </w:rPr>
     </w:lvl>
   </w:abstractNum>
-  <w:abstractNum w:abstractNumId="60" w15:restartNumberingAfterBreak="0">
+  <w:abstractNum w:abstractNumId="66" w15:restartNumberingAfterBreak="0">
     <w:nsid w:val="6C1238A2"/>
     <w:multiLevelType w:val="hybridMultilevel"/>
     <w:tmpl w:val="6BB2EB5C"/>
@@ -21615,7 +24158,7 @@
       </w:rPr>
     </w:lvl>
   </w:abstractNum>
-  <w:abstractNum w:abstractNumId="61" w15:restartNumberingAfterBreak="0">
+  <w:abstractNum w:abstractNumId="67" w15:restartNumberingAfterBreak="0">
     <w:nsid w:val="6E5F7AAF"/>
     <w:multiLevelType w:val="hybridMultilevel"/>
     <w:tmpl w:val="BF92D5CC"/>
@@ -21701,7 +24244,7 @@
       </w:pPr>
     </w:lvl>
   </w:abstractNum>
-  <w:abstractNum w:abstractNumId="62" w15:restartNumberingAfterBreak="0">
+  <w:abstractNum w:abstractNumId="68" w15:restartNumberingAfterBreak="0">
     <w:nsid w:val="6EA169CE"/>
     <w:multiLevelType w:val="hybridMultilevel"/>
     <w:tmpl w:val="9FC6F552"/>
@@ -21814,7 +24357,7 @@
       </w:rPr>
     </w:lvl>
   </w:abstractNum>
-  <w:abstractNum w:abstractNumId="63" w15:restartNumberingAfterBreak="0">
+  <w:abstractNum w:abstractNumId="69" w15:restartNumberingAfterBreak="0">
     <w:nsid w:val="6EFF7CF0"/>
     <w:multiLevelType w:val="hybridMultilevel"/>
     <w:tmpl w:val="8D48AE6A"/>
@@ -21927,7 +24470,7 @@
       </w:rPr>
     </w:lvl>
   </w:abstractNum>
-  <w:abstractNum w:abstractNumId="64" w15:restartNumberingAfterBreak="0">
+  <w:abstractNum w:abstractNumId="70" w15:restartNumberingAfterBreak="0">
     <w:nsid w:val="70390210"/>
     <w:multiLevelType w:val="hybridMultilevel"/>
     <w:tmpl w:val="90EC57DC"/>
@@ -22040,7 +24583,120 @@
       </w:rPr>
     </w:lvl>
   </w:abstractNum>
-  <w:abstractNum w:abstractNumId="65" w15:restartNumberingAfterBreak="0">
+  <w:abstractNum w:abstractNumId="71" w15:restartNumberingAfterBreak="0">
+    <w:nsid w:val="726C5FE7"/>
+    <w:multiLevelType w:val="hybridMultilevel"/>
+    <w:tmpl w:val="EE247304"/>
+    <w:lvl w:ilvl="0" w:tplc="4009000B">
+      <w:start w:val="1"/>
+      <w:numFmt w:val="bullet"/>
+      <w:lvlText w:val=""/>
+      <w:lvlJc w:val="left"/>
+      <w:pPr>
+        <w:ind w:left="1120" w:hanging="360"/>
+      </w:pPr>
+      <w:rPr>
+        <w:rFonts w:ascii="Wingdings" w:hAnsi="Wingdings" w:hint="default"/>
+      </w:rPr>
+    </w:lvl>
+    <w:lvl w:ilvl="1" w:tplc="40090003" w:tentative="1">
+      <w:start w:val="1"/>
+      <w:numFmt w:val="bullet"/>
+      <w:lvlText w:val="o"/>
+      <w:lvlJc w:val="left"/>
+      <w:pPr>
+        <w:ind w:left="1840" w:hanging="360"/>
+      </w:pPr>
+      <w:rPr>
+        <w:rFonts w:ascii="Courier New" w:hAnsi="Courier New" w:cs="Courier New" w:hint="default"/>
+      </w:rPr>
+    </w:lvl>
+    <w:lvl w:ilvl="2" w:tplc="40090005" w:tentative="1">
+      <w:start w:val="1"/>
+      <w:numFmt w:val="bullet"/>
+      <w:lvlText w:val=""/>
+      <w:lvlJc w:val="left"/>
+      <w:pPr>
+        <w:ind w:left="2560" w:hanging="360"/>
+      </w:pPr>
+      <w:rPr>
+        <w:rFonts w:ascii="Wingdings" w:hAnsi="Wingdings" w:hint="default"/>
+      </w:rPr>
+    </w:lvl>
+    <w:lvl w:ilvl="3" w:tplc="40090001" w:tentative="1">
+      <w:start w:val="1"/>
+      <w:numFmt w:val="bullet"/>
+      <w:lvlText w:val=""/>
+      <w:lvlJc w:val="left"/>
+      <w:pPr>
+        <w:ind w:left="3280" w:hanging="360"/>
+      </w:pPr>
+      <w:rPr>
+        <w:rFonts w:ascii="Symbol" w:hAnsi="Symbol" w:hint="default"/>
+      </w:rPr>
+    </w:lvl>
+    <w:lvl w:ilvl="4" w:tplc="40090003" w:tentative="1">
+      <w:start w:val="1"/>
+      <w:numFmt w:val="bullet"/>
+      <w:lvlText w:val="o"/>
+      <w:lvlJc w:val="left"/>
+      <w:pPr>
+        <w:ind w:left="4000" w:hanging="360"/>
+      </w:pPr>
+      <w:rPr>
+        <w:rFonts w:ascii="Courier New" w:hAnsi="Courier New" w:cs="Courier New" w:hint="default"/>
+      </w:rPr>
+    </w:lvl>
+    <w:lvl w:ilvl="5" w:tplc="40090005" w:tentative="1">
+      <w:start w:val="1"/>
+      <w:numFmt w:val="bullet"/>
+      <w:lvlText w:val=""/>
+      <w:lvlJc w:val="left"/>
+      <w:pPr>
+        <w:ind w:left="4720" w:hanging="360"/>
+      </w:pPr>
+      <w:rPr>
+        <w:rFonts w:ascii="Wingdings" w:hAnsi="Wingdings" w:hint="default"/>
+      </w:rPr>
+    </w:lvl>
+    <w:lvl w:ilvl="6" w:tplc="40090001" w:tentative="1">
+      <w:start w:val="1"/>
+      <w:numFmt w:val="bullet"/>
+      <w:lvlText w:val=""/>
+      <w:lvlJc w:val="left"/>
+      <w:pPr>
+        <w:ind w:left="5440" w:hanging="360"/>
+      </w:pPr>
+      <w:rPr>
+        <w:rFonts w:ascii="Symbol" w:hAnsi="Symbol" w:hint="default"/>
+      </w:rPr>
+    </w:lvl>
+    <w:lvl w:ilvl="7" w:tplc="40090003" w:tentative="1">
+      <w:start w:val="1"/>
+      <w:numFmt w:val="bullet"/>
+      <w:lvlText w:val="o"/>
+      <w:lvlJc w:val="left"/>
+      <w:pPr>
+        <w:ind w:left="6160" w:hanging="360"/>
+      </w:pPr>
+      <w:rPr>
+        <w:rFonts w:ascii="Courier New" w:hAnsi="Courier New" w:cs="Courier New" w:hint="default"/>
+      </w:rPr>
+    </w:lvl>
+    <w:lvl w:ilvl="8" w:tplc="40090005" w:tentative="1">
+      <w:start w:val="1"/>
+      <w:numFmt w:val="bullet"/>
+      <w:lvlText w:val=""/>
+      <w:lvlJc w:val="left"/>
+      <w:pPr>
+        <w:ind w:left="6880" w:hanging="360"/>
+      </w:pPr>
+      <w:rPr>
+        <w:rFonts w:ascii="Wingdings" w:hAnsi="Wingdings" w:hint="default"/>
+      </w:rPr>
+    </w:lvl>
+  </w:abstractNum>
+  <w:abstractNum w:abstractNumId="72" w15:restartNumberingAfterBreak="0">
     <w:nsid w:val="75BB5B9A"/>
     <w:multiLevelType w:val="hybridMultilevel"/>
     <w:tmpl w:val="E1D66F90"/>
@@ -22153,7 +24809,7 @@
       </w:rPr>
     </w:lvl>
   </w:abstractNum>
-  <w:abstractNum w:abstractNumId="66" w15:restartNumberingAfterBreak="0">
+  <w:abstractNum w:abstractNumId="73" w15:restartNumberingAfterBreak="0">
     <w:nsid w:val="76F26BA8"/>
     <w:multiLevelType w:val="hybridMultilevel"/>
     <w:tmpl w:val="916EB77C"/>
@@ -22266,7 +24922,7 @@
       </w:rPr>
     </w:lvl>
   </w:abstractNum>
-  <w:abstractNum w:abstractNumId="67" w15:restartNumberingAfterBreak="0">
+  <w:abstractNum w:abstractNumId="74" w15:restartNumberingAfterBreak="0">
     <w:nsid w:val="78D4407D"/>
     <w:multiLevelType w:val="hybridMultilevel"/>
     <w:tmpl w:val="9C6A39B8"/>
@@ -22379,7 +25035,7 @@
       </w:rPr>
     </w:lvl>
   </w:abstractNum>
-  <w:abstractNum w:abstractNumId="68" w15:restartNumberingAfterBreak="0">
+  <w:abstractNum w:abstractNumId="75" w15:restartNumberingAfterBreak="0">
     <w:nsid w:val="78FF1992"/>
     <w:multiLevelType w:val="hybridMultilevel"/>
     <w:tmpl w:val="3E304C16"/>
@@ -22492,7 +25148,7 @@
       </w:rPr>
     </w:lvl>
   </w:abstractNum>
-  <w:abstractNum w:abstractNumId="69" w15:restartNumberingAfterBreak="0">
+  <w:abstractNum w:abstractNumId="76" w15:restartNumberingAfterBreak="0">
     <w:nsid w:val="7A850844"/>
     <w:multiLevelType w:val="hybridMultilevel"/>
     <w:tmpl w:val="8D24419A"/>
@@ -22605,7 +25261,7 @@
       </w:rPr>
     </w:lvl>
   </w:abstractNum>
-  <w:abstractNum w:abstractNumId="70" w15:restartNumberingAfterBreak="0">
+  <w:abstractNum w:abstractNumId="77" w15:restartNumberingAfterBreak="0">
     <w:nsid w:val="7A9E48D1"/>
     <w:multiLevelType w:val="hybridMultilevel"/>
     <w:tmpl w:val="7C2C2C78"/>
@@ -22718,7 +25374,120 @@
       </w:rPr>
     </w:lvl>
   </w:abstractNum>
-  <w:abstractNum w:abstractNumId="71" w15:restartNumberingAfterBreak="0">
+  <w:abstractNum w:abstractNumId="78" w15:restartNumberingAfterBreak="0">
+    <w:nsid w:val="7B067406"/>
+    <w:multiLevelType w:val="hybridMultilevel"/>
+    <w:tmpl w:val="B7EEC058"/>
+    <w:lvl w:ilvl="0" w:tplc="4009000B">
+      <w:start w:val="1"/>
+      <w:numFmt w:val="bullet"/>
+      <w:lvlText w:val=""/>
+      <w:lvlJc w:val="left"/>
+      <w:pPr>
+        <w:ind w:left="1120" w:hanging="360"/>
+      </w:pPr>
+      <w:rPr>
+        <w:rFonts w:ascii="Wingdings" w:hAnsi="Wingdings" w:hint="default"/>
+      </w:rPr>
+    </w:lvl>
+    <w:lvl w:ilvl="1" w:tplc="40090003" w:tentative="1">
+      <w:start w:val="1"/>
+      <w:numFmt w:val="bullet"/>
+      <w:lvlText w:val="o"/>
+      <w:lvlJc w:val="left"/>
+      <w:pPr>
+        <w:ind w:left="1840" w:hanging="360"/>
+      </w:pPr>
+      <w:rPr>
+        <w:rFonts w:ascii="Courier New" w:hAnsi="Courier New" w:cs="Courier New" w:hint="default"/>
+      </w:rPr>
+    </w:lvl>
+    <w:lvl w:ilvl="2" w:tplc="40090005" w:tentative="1">
+      <w:start w:val="1"/>
+      <w:numFmt w:val="bullet"/>
+      <w:lvlText w:val=""/>
+      <w:lvlJc w:val="left"/>
+      <w:pPr>
+        <w:ind w:left="2560" w:hanging="360"/>
+      </w:pPr>
+      <w:rPr>
+        <w:rFonts w:ascii="Wingdings" w:hAnsi="Wingdings" w:hint="default"/>
+      </w:rPr>
+    </w:lvl>
+    <w:lvl w:ilvl="3" w:tplc="40090001" w:tentative="1">
+      <w:start w:val="1"/>
+      <w:numFmt w:val="bullet"/>
+      <w:lvlText w:val=""/>
+      <w:lvlJc w:val="left"/>
+      <w:pPr>
+        <w:ind w:left="3280" w:hanging="360"/>
+      </w:pPr>
+      <w:rPr>
+        <w:rFonts w:ascii="Symbol" w:hAnsi="Symbol" w:hint="default"/>
+      </w:rPr>
+    </w:lvl>
+    <w:lvl w:ilvl="4" w:tplc="40090003" w:tentative="1">
+      <w:start w:val="1"/>
+      <w:numFmt w:val="bullet"/>
+      <w:lvlText w:val="o"/>
+      <w:lvlJc w:val="left"/>
+      <w:pPr>
+        <w:ind w:left="4000" w:hanging="360"/>
+      </w:pPr>
+      <w:rPr>
+        <w:rFonts w:ascii="Courier New" w:hAnsi="Courier New" w:cs="Courier New" w:hint="default"/>
+      </w:rPr>
+    </w:lvl>
+    <w:lvl w:ilvl="5" w:tplc="40090005" w:tentative="1">
+      <w:start w:val="1"/>
+      <w:numFmt w:val="bullet"/>
+      <w:lvlText w:val=""/>
+      <w:lvlJc w:val="left"/>
+      <w:pPr>
+        <w:ind w:left="4720" w:hanging="360"/>
+      </w:pPr>
+      <w:rPr>
+        <w:rFonts w:ascii="Wingdings" w:hAnsi="Wingdings" w:hint="default"/>
+      </w:rPr>
+    </w:lvl>
+    <w:lvl w:ilvl="6" w:tplc="40090001" w:tentative="1">
+      <w:start w:val="1"/>
+      <w:numFmt w:val="bullet"/>
+      <w:lvlText w:val=""/>
+      <w:lvlJc w:val="left"/>
+      <w:pPr>
+        <w:ind w:left="5440" w:hanging="360"/>
+      </w:pPr>
+      <w:rPr>
+        <w:rFonts w:ascii="Symbol" w:hAnsi="Symbol" w:hint="default"/>
+      </w:rPr>
+    </w:lvl>
+    <w:lvl w:ilvl="7" w:tplc="40090003" w:tentative="1">
+      <w:start w:val="1"/>
+      <w:numFmt w:val="bullet"/>
+      <w:lvlText w:val="o"/>
+      <w:lvlJc w:val="left"/>
+      <w:pPr>
+        <w:ind w:left="6160" w:hanging="360"/>
+      </w:pPr>
+      <w:rPr>
+        <w:rFonts w:ascii="Courier New" w:hAnsi="Courier New" w:cs="Courier New" w:hint="default"/>
+      </w:rPr>
+    </w:lvl>
+    <w:lvl w:ilvl="8" w:tplc="40090005" w:tentative="1">
+      <w:start w:val="1"/>
+      <w:numFmt w:val="bullet"/>
+      <w:lvlText w:val=""/>
+      <w:lvlJc w:val="left"/>
+      <w:pPr>
+        <w:ind w:left="6880" w:hanging="360"/>
+      </w:pPr>
+      <w:rPr>
+        <w:rFonts w:ascii="Wingdings" w:hAnsi="Wingdings" w:hint="default"/>
+      </w:rPr>
+    </w:lvl>
+  </w:abstractNum>
+  <w:abstractNum w:abstractNumId="79" w15:restartNumberingAfterBreak="0">
     <w:nsid w:val="7CA93F11"/>
     <w:multiLevelType w:val="hybridMultilevel"/>
     <w:tmpl w:val="52BC6E0A"/>
@@ -22831,7 +25600,7 @@
       </w:rPr>
     </w:lvl>
   </w:abstractNum>
-  <w:abstractNum w:abstractNumId="72" w15:restartNumberingAfterBreak="0">
+  <w:abstractNum w:abstractNumId="80" w15:restartNumberingAfterBreak="0">
     <w:nsid w:val="7E1711BB"/>
     <w:multiLevelType w:val="hybridMultilevel"/>
     <w:tmpl w:val="EBD83B5A"/>
@@ -22944,7 +25713,7 @@
       </w:rPr>
     </w:lvl>
   </w:abstractNum>
-  <w:abstractNum w:abstractNumId="73" w15:restartNumberingAfterBreak="0">
+  <w:abstractNum w:abstractNumId="81" w15:restartNumberingAfterBreak="0">
     <w:nsid w:val="7E6703BC"/>
     <w:multiLevelType w:val="hybridMultilevel"/>
     <w:tmpl w:val="01347444"/>
@@ -23058,226 +25827,250 @@
     </w:lvl>
   </w:abstractNum>
   <w:num w:numId="1" w16cid:durableId="234126080">
+    <w:abstractNumId w:val="57"/>
+  </w:num>
+  <w:num w:numId="2" w16cid:durableId="1827168422">
+    <w:abstractNumId w:val="23"/>
+  </w:num>
+  <w:num w:numId="3" w16cid:durableId="645551749">
+    <w:abstractNumId w:val="9"/>
+  </w:num>
+  <w:num w:numId="4" w16cid:durableId="984048638">
+    <w:abstractNumId w:val="15"/>
+  </w:num>
+  <w:num w:numId="5" w16cid:durableId="2053652926">
+    <w:abstractNumId w:val="48"/>
+  </w:num>
+  <w:num w:numId="6" w16cid:durableId="120808992">
+    <w:abstractNumId w:val="28"/>
+  </w:num>
+  <w:num w:numId="7" w16cid:durableId="1196692114">
+    <w:abstractNumId w:val="26"/>
+  </w:num>
+  <w:num w:numId="8" w16cid:durableId="446656441">
+    <w:abstractNumId w:val="59"/>
+  </w:num>
+  <w:num w:numId="9" w16cid:durableId="698819531">
+    <w:abstractNumId w:val="60"/>
+  </w:num>
+  <w:num w:numId="10" w16cid:durableId="1527332008">
+    <w:abstractNumId w:val="45"/>
+  </w:num>
+  <w:num w:numId="11" w16cid:durableId="1770158062">
+    <w:abstractNumId w:val="33"/>
+  </w:num>
+  <w:num w:numId="12" w16cid:durableId="839471443">
+    <w:abstractNumId w:val="20"/>
+  </w:num>
+  <w:num w:numId="13" w16cid:durableId="1625767979">
+    <w:abstractNumId w:val="74"/>
+  </w:num>
+  <w:num w:numId="14" w16cid:durableId="712922381">
+    <w:abstractNumId w:val="21"/>
+  </w:num>
+  <w:num w:numId="15" w16cid:durableId="1509248443">
+    <w:abstractNumId w:val="39"/>
+  </w:num>
+  <w:num w:numId="16" w16cid:durableId="1388600950">
+    <w:abstractNumId w:val="17"/>
+  </w:num>
+  <w:num w:numId="17" w16cid:durableId="63383461">
+    <w:abstractNumId w:val="29"/>
+  </w:num>
+  <w:num w:numId="18" w16cid:durableId="1959605983">
+    <w:abstractNumId w:val="42"/>
+  </w:num>
+  <w:num w:numId="19" w16cid:durableId="1251352226">
+    <w:abstractNumId w:val="56"/>
+  </w:num>
+  <w:num w:numId="20" w16cid:durableId="1579706643">
+    <w:abstractNumId w:val="58"/>
+  </w:num>
+  <w:num w:numId="21" w16cid:durableId="616908098">
+    <w:abstractNumId w:val="43"/>
+  </w:num>
+  <w:num w:numId="22" w16cid:durableId="1590456493">
+    <w:abstractNumId w:val="69"/>
+  </w:num>
+  <w:num w:numId="23" w16cid:durableId="1853490051">
+    <w:abstractNumId w:val="66"/>
+  </w:num>
+  <w:num w:numId="24" w16cid:durableId="489753068">
+    <w:abstractNumId w:val="46"/>
+  </w:num>
+  <w:num w:numId="25" w16cid:durableId="470750842">
+    <w:abstractNumId w:val="80"/>
+  </w:num>
+  <w:num w:numId="26" w16cid:durableId="1286622340">
+    <w:abstractNumId w:val="35"/>
+  </w:num>
+  <w:num w:numId="27" w16cid:durableId="675691640">
+    <w:abstractNumId w:val="25"/>
+  </w:num>
+  <w:num w:numId="28" w16cid:durableId="942416099">
+    <w:abstractNumId w:val="50"/>
+  </w:num>
+  <w:num w:numId="29" w16cid:durableId="354500318">
+    <w:abstractNumId w:val="77"/>
+  </w:num>
+  <w:num w:numId="30" w16cid:durableId="555707672">
+    <w:abstractNumId w:val="75"/>
+  </w:num>
+  <w:num w:numId="31" w16cid:durableId="1227456296">
+    <w:abstractNumId w:val="3"/>
+  </w:num>
+  <w:num w:numId="32" w16cid:durableId="241791814">
+    <w:abstractNumId w:val="32"/>
+  </w:num>
+  <w:num w:numId="33" w16cid:durableId="297877559">
+    <w:abstractNumId w:val="54"/>
+  </w:num>
+  <w:num w:numId="34" w16cid:durableId="1954240346">
+    <w:abstractNumId w:val="67"/>
+  </w:num>
+  <w:num w:numId="35" w16cid:durableId="1758016530">
+    <w:abstractNumId w:val="55"/>
+  </w:num>
+  <w:num w:numId="36" w16cid:durableId="101455697">
+    <w:abstractNumId w:val="37"/>
+  </w:num>
+  <w:num w:numId="37" w16cid:durableId="2089768025">
+    <w:abstractNumId w:val="19"/>
+  </w:num>
+  <w:num w:numId="38" w16cid:durableId="1312558408">
+    <w:abstractNumId w:val="31"/>
+  </w:num>
+  <w:num w:numId="39" w16cid:durableId="988555030">
+    <w:abstractNumId w:val="41"/>
+  </w:num>
+  <w:num w:numId="40" w16cid:durableId="497041544">
+    <w:abstractNumId w:val="70"/>
+  </w:num>
+  <w:num w:numId="41" w16cid:durableId="1098863632">
+    <w:abstractNumId w:val="40"/>
+  </w:num>
+  <w:num w:numId="42" w16cid:durableId="2087998300">
+    <w:abstractNumId w:val="44"/>
+  </w:num>
+  <w:num w:numId="43" w16cid:durableId="32077361">
+    <w:abstractNumId w:val="76"/>
+  </w:num>
+  <w:num w:numId="44" w16cid:durableId="195629393">
+    <w:abstractNumId w:val="5"/>
+  </w:num>
+  <w:num w:numId="45" w16cid:durableId="122306412">
+    <w:abstractNumId w:val="47"/>
+  </w:num>
+  <w:num w:numId="46" w16cid:durableId="1157845596">
+    <w:abstractNumId w:val="61"/>
+  </w:num>
+  <w:num w:numId="47" w16cid:durableId="2079740825">
     <w:abstractNumId w:val="51"/>
   </w:num>
-  <w:num w:numId="2" w16cid:durableId="1827168422">
+  <w:num w:numId="48" w16cid:durableId="825440182">
+    <w:abstractNumId w:val="68"/>
+  </w:num>
+  <w:num w:numId="49" w16cid:durableId="182594935">
+    <w:abstractNumId w:val="73"/>
+  </w:num>
+  <w:num w:numId="50" w16cid:durableId="1308360786">
+    <w:abstractNumId w:val="81"/>
+  </w:num>
+  <w:num w:numId="51" w16cid:durableId="1632978932">
+    <w:abstractNumId w:val="16"/>
+  </w:num>
+  <w:num w:numId="52" w16cid:durableId="391537947">
     <w:abstractNumId w:val="18"/>
   </w:num>
-  <w:num w:numId="3" w16cid:durableId="645551749">
+  <w:num w:numId="53" w16cid:durableId="378554586">
+    <w:abstractNumId w:val="13"/>
+  </w:num>
+  <w:num w:numId="54" w16cid:durableId="1201436312">
+    <w:abstractNumId w:val="7"/>
+  </w:num>
+  <w:num w:numId="55" w16cid:durableId="1529443842">
+    <w:abstractNumId w:val="72"/>
+  </w:num>
+  <w:num w:numId="56" w16cid:durableId="189415164">
+    <w:abstractNumId w:val="8"/>
+  </w:num>
+  <w:num w:numId="57" w16cid:durableId="1594314221">
+    <w:abstractNumId w:val="52"/>
+  </w:num>
+  <w:num w:numId="58" w16cid:durableId="1226257099">
+    <w:abstractNumId w:val="49"/>
+  </w:num>
+  <w:num w:numId="59" w16cid:durableId="1419328051">
+    <w:abstractNumId w:val="2"/>
+  </w:num>
+  <w:num w:numId="60" w16cid:durableId="1710567223">
+    <w:abstractNumId w:val="22"/>
+  </w:num>
+  <w:num w:numId="61" w16cid:durableId="630017495">
+    <w:abstractNumId w:val="65"/>
+  </w:num>
+  <w:num w:numId="62" w16cid:durableId="1282304201">
+    <w:abstractNumId w:val="36"/>
+  </w:num>
+  <w:num w:numId="63" w16cid:durableId="1717508633">
+    <w:abstractNumId w:val="64"/>
+  </w:num>
+  <w:num w:numId="64" w16cid:durableId="1437024406">
+    <w:abstractNumId w:val="79"/>
+  </w:num>
+  <w:num w:numId="65" w16cid:durableId="1457289484">
+    <w:abstractNumId w:val="10"/>
+  </w:num>
+  <w:num w:numId="66" w16cid:durableId="2044553889">
+    <w:abstractNumId w:val="63"/>
+  </w:num>
+  <w:num w:numId="67" w16cid:durableId="476344594">
+    <w:abstractNumId w:val="24"/>
+  </w:num>
+  <w:num w:numId="68" w16cid:durableId="654841836">
+    <w:abstractNumId w:val="62"/>
+  </w:num>
+  <w:num w:numId="69" w16cid:durableId="65881997">
+    <w:abstractNumId w:val="30"/>
+  </w:num>
+  <w:num w:numId="70" w16cid:durableId="356779715">
+    <w:abstractNumId w:val="27"/>
+  </w:num>
+  <w:num w:numId="71" w16cid:durableId="1630354395">
     <w:abstractNumId w:val="6"/>
   </w:num>
-  <w:num w:numId="4" w16cid:durableId="984048638">
-    <w:abstractNumId w:val="10"/>
-  </w:num>
-  <w:num w:numId="5" w16cid:durableId="2053652926">
-    <w:abstractNumId w:val="42"/>
-  </w:num>
-  <w:num w:numId="6" w16cid:durableId="120808992">
-    <w:abstractNumId w:val="23"/>
-  </w:num>
-  <w:num w:numId="7" w16cid:durableId="1196692114">
-    <w:abstractNumId w:val="21"/>
-  </w:num>
-  <w:num w:numId="8" w16cid:durableId="446656441">
+  <w:num w:numId="72" w16cid:durableId="760300450">
     <w:abstractNumId w:val="53"/>
   </w:num>
-  <w:num w:numId="9" w16cid:durableId="698819531">
-    <w:abstractNumId w:val="54"/>
-  </w:num>
-  <w:num w:numId="10" w16cid:durableId="1527332008">
-    <w:abstractNumId w:val="39"/>
-  </w:num>
-  <w:num w:numId="11" w16cid:durableId="1770158062">
-    <w:abstractNumId w:val="28"/>
-  </w:num>
-  <w:num w:numId="12" w16cid:durableId="839471443">
-    <w:abstractNumId w:val="15"/>
-  </w:num>
-  <w:num w:numId="13" w16cid:durableId="1625767979">
-    <w:abstractNumId w:val="67"/>
-  </w:num>
-  <w:num w:numId="14" w16cid:durableId="712922381">
-    <w:abstractNumId w:val="16"/>
-  </w:num>
-  <w:num w:numId="15" w16cid:durableId="1509248443">
-    <w:abstractNumId w:val="33"/>
-  </w:num>
-  <w:num w:numId="16" w16cid:durableId="1388600950">
+  <w:num w:numId="73" w16cid:durableId="1148521502">
     <w:abstractNumId w:val="12"/>
   </w:num>
-  <w:num w:numId="17" w16cid:durableId="63383461">
-    <w:abstractNumId w:val="24"/>
+  <w:num w:numId="74" w16cid:durableId="1531189807">
+    <w:abstractNumId w:val="38"/>
   </w:num>
-  <w:num w:numId="18" w16cid:durableId="1959605983">
-    <w:abstractNumId w:val="36"/>
+  <w:num w:numId="75" w16cid:durableId="725035450">
+    <w:abstractNumId w:val="78"/>
   </w:num>
-  <w:num w:numId="19" w16cid:durableId="1251352226">
-    <w:abstractNumId w:val="50"/>
+  <w:num w:numId="76" w16cid:durableId="1017198522">
+    <w:abstractNumId w:val="11"/>
   </w:num>
-  <w:num w:numId="20" w16cid:durableId="1579706643">
-    <w:abstractNumId w:val="52"/>
+  <w:num w:numId="77" w16cid:durableId="1875455916">
+    <w:abstractNumId w:val="14"/>
   </w:num>
-  <w:num w:numId="21" w16cid:durableId="616908098">
-    <w:abstractNumId w:val="37"/>
+  <w:num w:numId="78" w16cid:durableId="1469398409">
+    <w:abstractNumId w:val="0"/>
   </w:num>
-  <w:num w:numId="22" w16cid:durableId="1590456493">
-    <w:abstractNumId w:val="63"/>
-  </w:num>
-  <w:num w:numId="23" w16cid:durableId="1853490051">
-    <w:abstractNumId w:val="60"/>
-  </w:num>
-  <w:num w:numId="24" w16cid:durableId="489753068">
-    <w:abstractNumId w:val="40"/>
-  </w:num>
-  <w:num w:numId="25" w16cid:durableId="470750842">
-    <w:abstractNumId w:val="72"/>
-  </w:num>
-  <w:num w:numId="26" w16cid:durableId="1286622340">
-    <w:abstractNumId w:val="29"/>
-  </w:num>
-  <w:num w:numId="27" w16cid:durableId="675691640">
-    <w:abstractNumId w:val="20"/>
-  </w:num>
-  <w:num w:numId="28" w16cid:durableId="942416099">
-    <w:abstractNumId w:val="44"/>
-  </w:num>
-  <w:num w:numId="29" w16cid:durableId="354500318">
-    <w:abstractNumId w:val="70"/>
-  </w:num>
-  <w:num w:numId="30" w16cid:durableId="555707672">
-    <w:abstractNumId w:val="68"/>
-  </w:num>
-  <w:num w:numId="31" w16cid:durableId="1227456296">
+  <w:num w:numId="79" w16cid:durableId="273369496">
     <w:abstractNumId w:val="1"/>
   </w:num>
-  <w:num w:numId="32" w16cid:durableId="241791814">
-    <w:abstractNumId w:val="27"/>
+  <w:num w:numId="80" w16cid:durableId="1312519575">
+    <w:abstractNumId w:val="71"/>
   </w:num>
-  <w:num w:numId="33" w16cid:durableId="297877559">
-    <w:abstractNumId w:val="48"/>
-  </w:num>
-  <w:num w:numId="34" w16cid:durableId="1954240346">
-    <w:abstractNumId w:val="61"/>
-  </w:num>
-  <w:num w:numId="35" w16cid:durableId="1758016530">
-    <w:abstractNumId w:val="49"/>
-  </w:num>
-  <w:num w:numId="36" w16cid:durableId="101455697">
-    <w:abstractNumId w:val="31"/>
-  </w:num>
-  <w:num w:numId="37" w16cid:durableId="2089768025">
-    <w:abstractNumId w:val="14"/>
-  </w:num>
-  <w:num w:numId="38" w16cid:durableId="1312558408">
-    <w:abstractNumId w:val="26"/>
-  </w:num>
-  <w:num w:numId="39" w16cid:durableId="988555030">
-    <w:abstractNumId w:val="35"/>
-  </w:num>
-  <w:num w:numId="40" w16cid:durableId="497041544">
-    <w:abstractNumId w:val="64"/>
-  </w:num>
-  <w:num w:numId="41" w16cid:durableId="1098863632">
+  <w:num w:numId="81" w16cid:durableId="895311985">
     <w:abstractNumId w:val="34"/>
   </w:num>
-  <w:num w:numId="42" w16cid:durableId="2087998300">
-    <w:abstractNumId w:val="38"/>
-  </w:num>
-  <w:num w:numId="43" w16cid:durableId="32077361">
-    <w:abstractNumId w:val="69"/>
-  </w:num>
-  <w:num w:numId="44" w16cid:durableId="195629393">
-    <w:abstractNumId w:val="2"/>
-  </w:num>
-  <w:num w:numId="45" w16cid:durableId="122306412">
-    <w:abstractNumId w:val="41"/>
-  </w:num>
-  <w:num w:numId="46" w16cid:durableId="1157845596">
-    <w:abstractNumId w:val="55"/>
-  </w:num>
-  <w:num w:numId="47" w16cid:durableId="2079740825">
-    <w:abstractNumId w:val="45"/>
-  </w:num>
-  <w:num w:numId="48" w16cid:durableId="825440182">
-    <w:abstractNumId w:val="62"/>
-  </w:num>
-  <w:num w:numId="49" w16cid:durableId="182594935">
-    <w:abstractNumId w:val="66"/>
-  </w:num>
-  <w:num w:numId="50" w16cid:durableId="1308360786">
-    <w:abstractNumId w:val="73"/>
-  </w:num>
-  <w:num w:numId="51" w16cid:durableId="1632978932">
-    <w:abstractNumId w:val="11"/>
-  </w:num>
-  <w:num w:numId="52" w16cid:durableId="391537947">
-    <w:abstractNumId w:val="13"/>
-  </w:num>
-  <w:num w:numId="53" w16cid:durableId="378554586">
-    <w:abstractNumId w:val="9"/>
-  </w:num>
-  <w:num w:numId="54" w16cid:durableId="1201436312">
+  <w:num w:numId="82" w16cid:durableId="546452723">
     <w:abstractNumId w:val="4"/>
-  </w:num>
-  <w:num w:numId="55" w16cid:durableId="1529443842">
-    <w:abstractNumId w:val="65"/>
-  </w:num>
-  <w:num w:numId="56" w16cid:durableId="189415164">
-    <w:abstractNumId w:val="5"/>
-  </w:num>
-  <w:num w:numId="57" w16cid:durableId="1594314221">
-    <w:abstractNumId w:val="46"/>
-  </w:num>
-  <w:num w:numId="58" w16cid:durableId="1226257099">
-    <w:abstractNumId w:val="43"/>
-  </w:num>
-  <w:num w:numId="59" w16cid:durableId="1419328051">
-    <w:abstractNumId w:val="0"/>
-  </w:num>
-  <w:num w:numId="60" w16cid:durableId="1710567223">
-    <w:abstractNumId w:val="17"/>
-  </w:num>
-  <w:num w:numId="61" w16cid:durableId="630017495">
-    <w:abstractNumId w:val="59"/>
-  </w:num>
-  <w:num w:numId="62" w16cid:durableId="1282304201">
-    <w:abstractNumId w:val="30"/>
-  </w:num>
-  <w:num w:numId="63" w16cid:durableId="1717508633">
-    <w:abstractNumId w:val="58"/>
-  </w:num>
-  <w:num w:numId="64" w16cid:durableId="1437024406">
-    <w:abstractNumId w:val="71"/>
-  </w:num>
-  <w:num w:numId="65" w16cid:durableId="1457289484">
-    <w:abstractNumId w:val="7"/>
-  </w:num>
-  <w:num w:numId="66" w16cid:durableId="2044553889">
-    <w:abstractNumId w:val="57"/>
-  </w:num>
-  <w:num w:numId="67" w16cid:durableId="476344594">
-    <w:abstractNumId w:val="19"/>
-  </w:num>
-  <w:num w:numId="68" w16cid:durableId="654841836">
-    <w:abstractNumId w:val="56"/>
-  </w:num>
-  <w:num w:numId="69" w16cid:durableId="65881997">
-    <w:abstractNumId w:val="25"/>
-  </w:num>
-  <w:num w:numId="70" w16cid:durableId="356779715">
-    <w:abstractNumId w:val="22"/>
-  </w:num>
-  <w:num w:numId="71" w16cid:durableId="1630354395">
-    <w:abstractNumId w:val="3"/>
-  </w:num>
-  <w:num w:numId="72" w16cid:durableId="760300450">
-    <w:abstractNumId w:val="47"/>
-  </w:num>
-  <w:num w:numId="73" w16cid:durableId="1148521502">
-    <w:abstractNumId w:val="8"/>
-  </w:num>
-  <w:num w:numId="74" w16cid:durableId="1531189807">
-    <w:abstractNumId w:val="32"/>
   </w:num>
   <w:numIdMacAtCleanup w:val="74"/>
 </w:numbering>

</xml_diff>

<commit_message>
Day 16: features - Demo ready auth and alerts with in-memory data, no MongoDB dependency
</commit_message>
<xml_diff>
--- a/Daily Report of Project.docx
+++ b/Daily Report of Project.docx
@@ -23009,6 +23009,806 @@
               </w:rPr>
               <w:t xml:space="preserve"> </w:t>
             </w:r>
+            <w:r>
+              <w:rPr>
+                <w:rFonts w:ascii="Times New Roman" w:hAnsi="Times New Roman" w:cs="Times New Roman"/>
+                <w:b/>
+                <w:bCs/>
+              </w:rPr>
+              <w:t>Backend Auth</w:t>
+            </w:r>
+          </w:p>
+          <w:p>
+            <w:pPr>
+              <w:pStyle w:val="ListParagraph"/>
+              <w:numPr>
+                <w:ilvl w:val="0"/>
+                <w:numId w:val="95"/>
+              </w:numPr>
+              <w:ind w:left="868"/>
+              <w:rPr>
+                <w:rFonts w:ascii="Times New Roman" w:hAnsi="Times New Roman" w:cs="Times New Roman"/>
+              </w:rPr>
+            </w:pPr>
+            <w:r>
+              <w:rPr>
+                <w:rFonts w:ascii="Times New Roman" w:hAnsi="Times New Roman" w:cs="Times New Roman"/>
+              </w:rPr>
+              <w:t xml:space="preserve">Create routes/auth.js </w:t>
+            </w:r>
+          </w:p>
+          <w:p>
+            <w:pPr>
+              <w:pStyle w:val="ListParagraph"/>
+              <w:numPr>
+                <w:ilvl w:val="0"/>
+                <w:numId w:val="95"/>
+              </w:numPr>
+              <w:ind w:left="868"/>
+              <w:rPr>
+                <w:rFonts w:ascii="Times New Roman" w:hAnsi="Times New Roman" w:cs="Times New Roman"/>
+              </w:rPr>
+            </w:pPr>
+            <w:r>
+              <w:rPr>
+                <w:rFonts w:ascii="Times New Roman" w:hAnsi="Times New Roman" w:cs="Times New Roman"/>
+              </w:rPr>
+              <w:t xml:space="preserve">Use </w:t>
+            </w:r>
+            <w:proofErr w:type="spellStart"/>
+            <w:r>
+              <w:rPr>
+                <w:rFonts w:ascii="Times New Roman" w:hAnsi="Times New Roman" w:cs="Times New Roman"/>
+              </w:rPr>
+              <w:t>bcrypt</w:t>
+            </w:r>
+            <w:proofErr w:type="spellEnd"/>
+            <w:r>
+              <w:rPr>
+                <w:rFonts w:ascii="Times New Roman" w:hAnsi="Times New Roman" w:cs="Times New Roman"/>
+              </w:rPr>
+              <w:t xml:space="preserve"> to compare password + </w:t>
+            </w:r>
+            <w:proofErr w:type="spellStart"/>
+            <w:r>
+              <w:rPr>
+                <w:rFonts w:ascii="Times New Roman" w:hAnsi="Times New Roman" w:cs="Times New Roman"/>
+              </w:rPr>
+              <w:t>jsonwebtoken</w:t>
+            </w:r>
+            <w:proofErr w:type="spellEnd"/>
+            <w:r>
+              <w:rPr>
+                <w:rFonts w:ascii="Times New Roman" w:hAnsi="Times New Roman" w:cs="Times New Roman"/>
+              </w:rPr>
+              <w:t xml:space="preserve"> to </w:t>
+            </w:r>
+            <w:proofErr w:type="spellStart"/>
+            <w:r>
+              <w:rPr>
+                <w:rFonts w:ascii="Times New Roman" w:hAnsi="Times New Roman" w:cs="Times New Roman"/>
+              </w:rPr>
+              <w:t>crete</w:t>
+            </w:r>
+            <w:proofErr w:type="spellEnd"/>
+            <w:r>
+              <w:rPr>
+                <w:rFonts w:ascii="Times New Roman" w:hAnsi="Times New Roman" w:cs="Times New Roman"/>
+              </w:rPr>
+              <w:t xml:space="preserve"> token</w:t>
+            </w:r>
+          </w:p>
+          <w:p>
+            <w:pPr>
+              <w:pStyle w:val="ListParagraph"/>
+              <w:numPr>
+                <w:ilvl w:val="0"/>
+                <w:numId w:val="95"/>
+              </w:numPr>
+              <w:ind w:left="868"/>
+              <w:rPr>
+                <w:rFonts w:ascii="Times New Roman" w:hAnsi="Times New Roman" w:cs="Times New Roman"/>
+              </w:rPr>
+            </w:pPr>
+            <w:r>
+              <w:rPr>
+                <w:rFonts w:ascii="Times New Roman" w:hAnsi="Times New Roman" w:cs="Times New Roman"/>
+              </w:rPr>
+              <w:t>Create middleware/auth.js to verify JWT without DB</w:t>
+            </w:r>
+          </w:p>
+          <w:p>
+            <w:pPr>
+              <w:pStyle w:val="ListParagraph"/>
+              <w:numPr>
+                <w:ilvl w:val="0"/>
+                <w:numId w:val="95"/>
+              </w:numPr>
+              <w:ind w:left="868"/>
+              <w:rPr>
+                <w:rFonts w:ascii="Times New Roman" w:hAnsi="Times New Roman" w:cs="Times New Roman"/>
+              </w:rPr>
+            </w:pPr>
+            <w:r>
+              <w:rPr>
+                <w:rFonts w:ascii="Times New Roman" w:hAnsi="Times New Roman" w:cs="Times New Roman"/>
+              </w:rPr>
+              <w:t xml:space="preserve">Add JWT_SECRET = </w:t>
+            </w:r>
+            <w:r>
+              <w:rPr>
+                <w:rFonts w:ascii="Times New Roman" w:hAnsi="Times New Roman" w:cs="Times New Roman"/>
+              </w:rPr>
+              <w:t>logguard_secret_123</w:t>
+            </w:r>
+            <w:r>
+              <w:rPr>
+                <w:rFonts w:ascii="Times New Roman" w:hAnsi="Times New Roman" w:cs="Times New Roman"/>
+              </w:rPr>
+              <w:t xml:space="preserve"> </w:t>
+            </w:r>
+            <w:proofErr w:type="gramStart"/>
+            <w:r>
+              <w:rPr>
+                <w:rFonts w:ascii="Times New Roman" w:hAnsi="Times New Roman" w:cs="Times New Roman"/>
+              </w:rPr>
+              <w:t>in .env</w:t>
+            </w:r>
+            <w:proofErr w:type="gramEnd"/>
+          </w:p>
+          <w:p>
+            <w:pPr>
+              <w:pStyle w:val="ListParagraph"/>
+              <w:numPr>
+                <w:ilvl w:val="0"/>
+                <w:numId w:val="95"/>
+              </w:numPr>
+              <w:ind w:left="868"/>
+              <w:rPr>
+                <w:rFonts w:ascii="Times New Roman" w:hAnsi="Times New Roman" w:cs="Times New Roman"/>
+              </w:rPr>
+            </w:pPr>
+            <w:r>
+              <w:rPr>
+                <w:rFonts w:ascii="Times New Roman" w:hAnsi="Times New Roman" w:cs="Times New Roman"/>
+              </w:rPr>
+              <w:t>Test login in Postman: should return {token, user}</w:t>
+            </w:r>
+          </w:p>
+          <w:p>
+            <w:pPr>
+              <w:numPr>
+                <w:ilvl w:val="0"/>
+                <w:numId w:val="3"/>
+              </w:numPr>
+              <w:rPr>
+                <w:rFonts w:ascii="Times New Roman" w:hAnsi="Times New Roman" w:cs="Times New Roman"/>
+              </w:rPr>
+            </w:pPr>
+            <w:r>
+              <w:rPr>
+                <w:rFonts w:ascii="Times New Roman" w:hAnsi="Times New Roman" w:cs="Times New Roman"/>
+                <w:b/>
+                <w:bCs/>
+              </w:rPr>
+              <w:t>Frontend Auth</w:t>
+            </w:r>
+          </w:p>
+          <w:p>
+            <w:pPr>
+              <w:pStyle w:val="ListParagraph"/>
+              <w:numPr>
+                <w:ilvl w:val="0"/>
+                <w:numId w:val="96"/>
+              </w:numPr>
+              <w:ind w:left="868"/>
+              <w:rPr>
+                <w:rFonts w:ascii="Times New Roman" w:hAnsi="Times New Roman" w:cs="Times New Roman"/>
+              </w:rPr>
+            </w:pPr>
+            <w:r>
+              <w:rPr>
+                <w:rFonts w:ascii="Times New Roman" w:hAnsi="Times New Roman" w:cs="Times New Roman"/>
+              </w:rPr>
+              <w:t xml:space="preserve">After login success → </w:t>
+            </w:r>
+            <w:proofErr w:type="spellStart"/>
+            <w:r>
+              <w:rPr>
+                <w:rFonts w:ascii="Times New Roman" w:hAnsi="Times New Roman" w:cs="Times New Roman"/>
+              </w:rPr>
+              <w:t>localStorage.setItem</w:t>
+            </w:r>
+            <w:proofErr w:type="spellEnd"/>
+            <w:r>
+              <w:rPr>
+                <w:rFonts w:ascii="Times New Roman" w:hAnsi="Times New Roman" w:cs="Times New Roman"/>
+              </w:rPr>
+              <w:t xml:space="preserve">(“token”, </w:t>
+            </w:r>
+            <w:proofErr w:type="spellStart"/>
+            <w:r>
+              <w:rPr>
+                <w:rFonts w:ascii="Times New Roman" w:hAnsi="Times New Roman" w:cs="Times New Roman"/>
+              </w:rPr>
+              <w:t>res.</w:t>
+            </w:r>
+            <w:proofErr w:type="gramStart"/>
+            <w:r>
+              <w:rPr>
+                <w:rFonts w:ascii="Times New Roman" w:hAnsi="Times New Roman" w:cs="Times New Roman"/>
+              </w:rPr>
+              <w:t>data.token</w:t>
+            </w:r>
+            <w:proofErr w:type="spellEnd"/>
+            <w:proofErr w:type="gramEnd"/>
+            <w:r>
+              <w:rPr>
+                <w:rFonts w:ascii="Times New Roman" w:hAnsi="Times New Roman" w:cs="Times New Roman"/>
+              </w:rPr>
+              <w:t>)</w:t>
+            </w:r>
+          </w:p>
+          <w:p>
+            <w:pPr>
+              <w:pStyle w:val="ListParagraph"/>
+              <w:numPr>
+                <w:ilvl w:val="0"/>
+                <w:numId w:val="96"/>
+              </w:numPr>
+              <w:ind w:left="868"/>
+              <w:rPr>
+                <w:rFonts w:ascii="Times New Roman" w:hAnsi="Times New Roman" w:cs="Times New Roman"/>
+              </w:rPr>
+            </w:pPr>
+            <w:r>
+              <w:rPr>
+                <w:rFonts w:ascii="Times New Roman" w:hAnsi="Times New Roman" w:cs="Times New Roman"/>
+              </w:rPr>
+              <w:t xml:space="preserve">Create api.js with </w:t>
+            </w:r>
+            <w:proofErr w:type="spellStart"/>
+            <w:r>
+              <w:rPr>
+                <w:rFonts w:ascii="Times New Roman" w:hAnsi="Times New Roman" w:cs="Times New Roman"/>
+              </w:rPr>
+              <w:t>axios</w:t>
+            </w:r>
+            <w:proofErr w:type="spellEnd"/>
+            <w:r>
+              <w:rPr>
+                <w:rFonts w:ascii="Times New Roman" w:hAnsi="Times New Roman" w:cs="Times New Roman"/>
+              </w:rPr>
+              <w:t xml:space="preserve"> interceptor to send Authorization: Bearer token</w:t>
+            </w:r>
+          </w:p>
+          <w:p>
+            <w:pPr>
+              <w:pStyle w:val="ListParagraph"/>
+              <w:numPr>
+                <w:ilvl w:val="0"/>
+                <w:numId w:val="96"/>
+              </w:numPr>
+              <w:ind w:left="868"/>
+              <w:rPr>
+                <w:rFonts w:ascii="Times New Roman" w:hAnsi="Times New Roman" w:cs="Times New Roman"/>
+              </w:rPr>
+            </w:pPr>
+            <w:r>
+              <w:rPr>
+                <w:rFonts w:ascii="Times New Roman" w:hAnsi="Times New Roman" w:cs="Times New Roman"/>
+              </w:rPr>
+              <w:t xml:space="preserve">Replace all </w:t>
+            </w:r>
+            <w:proofErr w:type="spellStart"/>
+            <w:r>
+              <w:rPr>
+                <w:rFonts w:ascii="Times New Roman" w:hAnsi="Times New Roman" w:cs="Times New Roman"/>
+              </w:rPr>
+              <w:t>axios.get</w:t>
+            </w:r>
+            <w:proofErr w:type="spellEnd"/>
+            <w:r>
+              <w:rPr>
+                <w:rFonts w:ascii="Times New Roman" w:hAnsi="Times New Roman" w:cs="Times New Roman"/>
+              </w:rPr>
+              <w:t xml:space="preserve"> with </w:t>
+            </w:r>
+            <w:proofErr w:type="spellStart"/>
+            <w:r>
+              <w:rPr>
+                <w:rFonts w:ascii="Times New Roman" w:hAnsi="Times New Roman" w:cs="Times New Roman"/>
+              </w:rPr>
+              <w:t>API.get</w:t>
+            </w:r>
+            <w:proofErr w:type="spellEnd"/>
+            <w:r>
+              <w:rPr>
+                <w:rFonts w:ascii="Times New Roman" w:hAnsi="Times New Roman" w:cs="Times New Roman"/>
+              </w:rPr>
+              <w:t xml:space="preserve"> in </w:t>
+            </w:r>
+            <w:proofErr w:type="spellStart"/>
+            <w:r>
+              <w:rPr>
+                <w:rFonts w:ascii="Times New Roman" w:hAnsi="Times New Roman" w:cs="Times New Roman"/>
+              </w:rPr>
+              <w:t>DashBoard</w:t>
+            </w:r>
+            <w:proofErr w:type="spellEnd"/>
+            <w:r>
+              <w:rPr>
+                <w:rFonts w:ascii="Times New Roman" w:hAnsi="Times New Roman" w:cs="Times New Roman"/>
+              </w:rPr>
+              <w:t>, Alerts</w:t>
+            </w:r>
+          </w:p>
+          <w:p>
+            <w:pPr>
+              <w:pStyle w:val="ListParagraph"/>
+              <w:numPr>
+                <w:ilvl w:val="0"/>
+                <w:numId w:val="96"/>
+              </w:numPr>
+              <w:ind w:left="868"/>
+              <w:rPr>
+                <w:rFonts w:ascii="Times New Roman" w:hAnsi="Times New Roman" w:cs="Times New Roman"/>
+              </w:rPr>
+            </w:pPr>
+            <w:r>
+              <w:rPr>
+                <w:rFonts w:ascii="Times New Roman" w:hAnsi="Times New Roman" w:cs="Times New Roman"/>
+              </w:rPr>
+              <w:t>Clear old bad token from Local Storage and login again</w:t>
+            </w:r>
+          </w:p>
+          <w:p>
+            <w:pPr>
+              <w:numPr>
+                <w:ilvl w:val="0"/>
+                <w:numId w:val="3"/>
+              </w:numPr>
+              <w:rPr>
+                <w:rFonts w:ascii="Times New Roman" w:hAnsi="Times New Roman" w:cs="Times New Roman"/>
+              </w:rPr>
+            </w:pPr>
+            <w:r>
+              <w:rPr>
+                <w:rFonts w:ascii="Times New Roman" w:hAnsi="Times New Roman" w:cs="Times New Roman"/>
+                <w:b/>
+                <w:bCs/>
+              </w:rPr>
+              <w:t>Backend Alerts + Upload</w:t>
+            </w:r>
+          </w:p>
+          <w:p>
+            <w:pPr>
+              <w:pStyle w:val="ListParagraph"/>
+              <w:numPr>
+                <w:ilvl w:val="0"/>
+                <w:numId w:val="97"/>
+              </w:numPr>
+              <w:ind w:left="868"/>
+              <w:rPr>
+                <w:rFonts w:ascii="Times New Roman" w:hAnsi="Times New Roman" w:cs="Times New Roman"/>
+              </w:rPr>
+            </w:pPr>
+            <w:r>
+              <w:rPr>
+                <w:rFonts w:ascii="Times New Roman" w:hAnsi="Times New Roman" w:cs="Times New Roman"/>
+              </w:rPr>
+              <w:lastRenderedPageBreak/>
+              <w:t>Create let alerts = [] array in routes/alerts.js</w:t>
+            </w:r>
+          </w:p>
+          <w:p>
+            <w:pPr>
+              <w:pStyle w:val="ListParagraph"/>
+              <w:numPr>
+                <w:ilvl w:val="0"/>
+                <w:numId w:val="97"/>
+              </w:numPr>
+              <w:ind w:left="868"/>
+              <w:rPr>
+                <w:rFonts w:ascii="Times New Roman" w:hAnsi="Times New Roman" w:cs="Times New Roman"/>
+              </w:rPr>
+            </w:pPr>
+            <w:r>
+              <w:rPr>
+                <w:rFonts w:ascii="Times New Roman" w:hAnsi="Times New Roman" w:cs="Times New Roman"/>
+              </w:rPr>
+              <w:t>GET /</w:t>
+            </w:r>
+            <w:proofErr w:type="spellStart"/>
+            <w:r>
+              <w:rPr>
+                <w:rFonts w:ascii="Times New Roman" w:hAnsi="Times New Roman" w:cs="Times New Roman"/>
+              </w:rPr>
+              <w:t>api</w:t>
+            </w:r>
+            <w:proofErr w:type="spellEnd"/>
+            <w:r>
+              <w:rPr>
+                <w:rFonts w:ascii="Times New Roman" w:hAnsi="Times New Roman" w:cs="Times New Roman"/>
+              </w:rPr>
+              <w:t>/alerts → return alerts array</w:t>
+            </w:r>
+          </w:p>
+          <w:p>
+            <w:pPr>
+              <w:pStyle w:val="ListParagraph"/>
+              <w:numPr>
+                <w:ilvl w:val="0"/>
+                <w:numId w:val="97"/>
+              </w:numPr>
+              <w:ind w:left="868"/>
+              <w:rPr>
+                <w:rFonts w:ascii="Times New Roman" w:hAnsi="Times New Roman" w:cs="Times New Roman"/>
+              </w:rPr>
+            </w:pPr>
+            <w:r>
+              <w:rPr>
+                <w:rFonts w:ascii="Times New Roman" w:hAnsi="Times New Roman" w:cs="Times New Roman"/>
+              </w:rPr>
+              <w:t>POST /</w:t>
+            </w:r>
+            <w:proofErr w:type="spellStart"/>
+            <w:r>
+              <w:rPr>
+                <w:rFonts w:ascii="Times New Roman" w:hAnsi="Times New Roman" w:cs="Times New Roman"/>
+              </w:rPr>
+              <w:t>api</w:t>
+            </w:r>
+            <w:proofErr w:type="spellEnd"/>
+            <w:r>
+              <w:rPr>
+                <w:rFonts w:ascii="Times New Roman" w:hAnsi="Times New Roman" w:cs="Times New Roman"/>
+              </w:rPr>
+              <w:t>/alerts/:id/acknowledged: true</w:t>
+            </w:r>
+          </w:p>
+          <w:p>
+            <w:pPr>
+              <w:pStyle w:val="ListParagraph"/>
+              <w:numPr>
+                <w:ilvl w:val="0"/>
+                <w:numId w:val="97"/>
+              </w:numPr>
+              <w:ind w:left="868"/>
+              <w:rPr>
+                <w:rFonts w:ascii="Times New Roman" w:hAnsi="Times New Roman" w:cs="Times New Roman"/>
+              </w:rPr>
+            </w:pPr>
+            <w:r>
+              <w:rPr>
+                <w:rFonts w:ascii="Times New Roman" w:hAnsi="Times New Roman" w:cs="Times New Roman"/>
+              </w:rPr>
+              <w:t>POST /</w:t>
+            </w:r>
+            <w:proofErr w:type="spellStart"/>
+            <w:r>
+              <w:rPr>
+                <w:rFonts w:ascii="Times New Roman" w:hAnsi="Times New Roman" w:cs="Times New Roman"/>
+              </w:rPr>
+              <w:t>api</w:t>
+            </w:r>
+            <w:proofErr w:type="spellEnd"/>
+            <w:r>
+              <w:rPr>
+                <w:rFonts w:ascii="Times New Roman" w:hAnsi="Times New Roman" w:cs="Times New Roman"/>
+              </w:rPr>
+              <w:t xml:space="preserve">/upload → fake parse file and </w:t>
+            </w:r>
+            <w:proofErr w:type="spellStart"/>
+            <w:proofErr w:type="gramStart"/>
+            <w:r>
+              <w:rPr>
+                <w:rFonts w:ascii="Times New Roman" w:hAnsi="Times New Roman" w:cs="Times New Roman"/>
+              </w:rPr>
+              <w:t>alerts.push</w:t>
+            </w:r>
+            <w:proofErr w:type="spellEnd"/>
+            <w:proofErr w:type="gramEnd"/>
+            <w:r>
+              <w:rPr>
+                <w:rFonts w:ascii="Times New Roman" w:hAnsi="Times New Roman" w:cs="Times New Roman"/>
+              </w:rPr>
+              <w:t>() 2-3 sample alerts</w:t>
+            </w:r>
+          </w:p>
+          <w:p>
+            <w:pPr>
+              <w:pStyle w:val="ListParagraph"/>
+              <w:numPr>
+                <w:ilvl w:val="0"/>
+                <w:numId w:val="97"/>
+              </w:numPr>
+              <w:ind w:left="868"/>
+              <w:rPr>
+                <w:rFonts w:ascii="Times New Roman" w:hAnsi="Times New Roman" w:cs="Times New Roman"/>
+              </w:rPr>
+            </w:pPr>
+            <w:r>
+              <w:rPr>
+                <w:rFonts w:ascii="Times New Roman" w:hAnsi="Times New Roman" w:cs="Times New Roman"/>
+              </w:rPr>
+              <w:t xml:space="preserve">Add </w:t>
+            </w:r>
+            <w:proofErr w:type="spellStart"/>
+            <w:r>
+              <w:rPr>
+                <w:rFonts w:ascii="Times New Roman" w:hAnsi="Times New Roman" w:cs="Times New Roman"/>
+              </w:rPr>
+              <w:t>app.use</w:t>
+            </w:r>
+            <w:proofErr w:type="spellEnd"/>
+            <w:r>
+              <w:rPr>
+                <w:rFonts w:ascii="Times New Roman" w:hAnsi="Times New Roman" w:cs="Times New Roman"/>
+              </w:rPr>
+              <w:t>(</w:t>
+            </w:r>
+            <w:proofErr w:type="spellStart"/>
+            <w:proofErr w:type="gramStart"/>
+            <w:r>
+              <w:rPr>
+                <w:rFonts w:ascii="Times New Roman" w:hAnsi="Times New Roman" w:cs="Times New Roman"/>
+              </w:rPr>
+              <w:t>cors</w:t>
+            </w:r>
+            <w:proofErr w:type="spellEnd"/>
+            <w:r>
+              <w:rPr>
+                <w:rFonts w:ascii="Times New Roman" w:hAnsi="Times New Roman" w:cs="Times New Roman"/>
+              </w:rPr>
+              <w:t>(</w:t>
+            </w:r>
+            <w:proofErr w:type="gramEnd"/>
+            <w:r>
+              <w:rPr>
+                <w:rFonts w:ascii="Times New Roman" w:hAnsi="Times New Roman" w:cs="Times New Roman"/>
+              </w:rPr>
+              <w:t>)) so frontend 5173 can call backend 5000</w:t>
+            </w:r>
+          </w:p>
+          <w:p>
+            <w:pPr>
+              <w:numPr>
+                <w:ilvl w:val="0"/>
+                <w:numId w:val="3"/>
+              </w:numPr>
+              <w:rPr>
+                <w:rFonts w:ascii="Times New Roman" w:hAnsi="Times New Roman" w:cs="Times New Roman"/>
+              </w:rPr>
+            </w:pPr>
+            <w:r>
+              <w:rPr>
+                <w:rFonts w:ascii="Times New Roman" w:hAnsi="Times New Roman" w:cs="Times New Roman"/>
+                <w:b/>
+                <w:bCs/>
+              </w:rPr>
+              <w:t>Frontend Alerts UI</w:t>
+            </w:r>
+          </w:p>
+          <w:p>
+            <w:pPr>
+              <w:pStyle w:val="ListParagraph"/>
+              <w:numPr>
+                <w:ilvl w:val="0"/>
+                <w:numId w:val="98"/>
+              </w:numPr>
+              <w:ind w:left="726"/>
+              <w:rPr>
+                <w:rFonts w:ascii="Times New Roman" w:hAnsi="Times New Roman" w:cs="Times New Roman"/>
+              </w:rPr>
+            </w:pPr>
+            <w:r>
+              <w:rPr>
+                <w:rFonts w:ascii="Times New Roman" w:hAnsi="Times New Roman" w:cs="Times New Roman"/>
+              </w:rPr>
+              <w:t xml:space="preserve">Update </w:t>
+            </w:r>
+            <w:proofErr w:type="spellStart"/>
+            <w:r>
+              <w:rPr>
+                <w:rFonts w:ascii="Times New Roman" w:hAnsi="Times New Roman" w:cs="Times New Roman"/>
+              </w:rPr>
+              <w:t>Alerts.jsx</w:t>
+            </w:r>
+            <w:proofErr w:type="spellEnd"/>
+            <w:r>
+              <w:rPr>
+                <w:rFonts w:ascii="Times New Roman" w:hAnsi="Times New Roman" w:cs="Times New Roman"/>
+              </w:rPr>
+              <w:t xml:space="preserve"> with Acknowledge button</w:t>
+            </w:r>
+          </w:p>
+          <w:p>
+            <w:pPr>
+              <w:pStyle w:val="ListParagraph"/>
+              <w:numPr>
+                <w:ilvl w:val="0"/>
+                <w:numId w:val="98"/>
+              </w:numPr>
+              <w:ind w:left="726"/>
+              <w:rPr>
+                <w:rFonts w:ascii="Times New Roman" w:hAnsi="Times New Roman" w:cs="Times New Roman"/>
+              </w:rPr>
+            </w:pPr>
+            <w:r>
+              <w:rPr>
+                <w:rFonts w:ascii="Times New Roman" w:hAnsi="Times New Roman" w:cs="Times New Roman"/>
+              </w:rPr>
+              <w:t xml:space="preserve">Fetch alerts every 5s and </w:t>
+            </w:r>
+            <w:proofErr w:type="gramStart"/>
+            <w:r>
+              <w:rPr>
+                <w:rFonts w:ascii="Times New Roman" w:hAnsi="Times New Roman" w:cs="Times New Roman"/>
+              </w:rPr>
+              <w:t>show</w:t>
+            </w:r>
+            <w:proofErr w:type="gramEnd"/>
+            <w:r>
+              <w:rPr>
+                <w:rFonts w:ascii="Times New Roman" w:hAnsi="Times New Roman" w:cs="Times New Roman"/>
+              </w:rPr>
+              <w:t xml:space="preserve"> CRITICAL/ERROR with </w:t>
+            </w:r>
+            <w:proofErr w:type="spellStart"/>
+            <w:r>
+              <w:rPr>
+                <w:rFonts w:ascii="Times New Roman" w:hAnsi="Times New Roman" w:cs="Times New Roman"/>
+              </w:rPr>
+              <w:t>colors</w:t>
+            </w:r>
+            <w:proofErr w:type="spellEnd"/>
+          </w:p>
+          <w:p>
+            <w:pPr>
+              <w:pStyle w:val="ListParagraph"/>
+              <w:numPr>
+                <w:ilvl w:val="0"/>
+                <w:numId w:val="98"/>
+              </w:numPr>
+              <w:ind w:left="726"/>
+              <w:rPr>
+                <w:rFonts w:ascii="Times New Roman" w:hAnsi="Times New Roman" w:cs="Times New Roman"/>
+              </w:rPr>
+            </w:pPr>
+            <w:r>
+              <w:rPr>
+                <w:rFonts w:ascii="Times New Roman" w:hAnsi="Times New Roman" w:cs="Times New Roman"/>
+              </w:rPr>
+              <w:t>Gray out + show “</w:t>
+            </w:r>
+            <w:r>
+              <w:rPr>
+                <w:rFonts w:ascii="Segoe UI Symbol" w:hAnsi="Segoe UI Symbol" w:cs="Segoe UI Symbol"/>
+              </w:rPr>
+              <w:t xml:space="preserve">✔️ Acknowledged” </w:t>
+            </w:r>
+            <w:r>
+              <w:rPr>
+                <w:rFonts w:ascii="Times New Roman" w:hAnsi="Times New Roman" w:cs="Times New Roman"/>
+              </w:rPr>
+              <w:t>after clicking button</w:t>
+            </w:r>
+          </w:p>
+          <w:p>
+            <w:pPr>
+              <w:pStyle w:val="ListParagraph"/>
+              <w:numPr>
+                <w:ilvl w:val="0"/>
+                <w:numId w:val="98"/>
+              </w:numPr>
+              <w:ind w:left="726"/>
+              <w:rPr>
+                <w:rFonts w:ascii="Times New Roman" w:hAnsi="Times New Roman" w:cs="Times New Roman"/>
+              </w:rPr>
+            </w:pPr>
+            <w:r>
+              <w:rPr>
+                <w:rFonts w:ascii="Times New Roman" w:hAnsi="Times New Roman" w:cs="Times New Roman"/>
+              </w:rPr>
+              <w:t xml:space="preserve">Connect </w:t>
+            </w:r>
+            <w:proofErr w:type="spellStart"/>
+            <w:r>
+              <w:rPr>
+                <w:rFonts w:ascii="Times New Roman" w:hAnsi="Times New Roman" w:cs="Times New Roman"/>
+              </w:rPr>
+              <w:t>DashBoard</w:t>
+            </w:r>
+            <w:proofErr w:type="spellEnd"/>
+            <w:r>
+              <w:rPr>
+                <w:rFonts w:ascii="Times New Roman" w:hAnsi="Times New Roman" w:cs="Times New Roman"/>
+              </w:rPr>
+              <w:t xml:space="preserve"> cards: Total, Errors, Warnings, Health % to upload data</w:t>
+            </w:r>
+          </w:p>
+          <w:p>
+            <w:pPr>
+              <w:numPr>
+                <w:ilvl w:val="0"/>
+                <w:numId w:val="3"/>
+              </w:numPr>
+              <w:rPr>
+                <w:rFonts w:ascii="Times New Roman" w:hAnsi="Times New Roman" w:cs="Times New Roman"/>
+              </w:rPr>
+            </w:pPr>
+            <w:r>
+              <w:rPr>
+                <w:rFonts w:ascii="Times New Roman" w:hAnsi="Times New Roman" w:cs="Times New Roman"/>
+                <w:b/>
+                <w:bCs/>
+              </w:rPr>
+              <w:t>Polish + Test</w:t>
+            </w:r>
+          </w:p>
+          <w:p>
+            <w:pPr>
+              <w:pStyle w:val="ListParagraph"/>
+              <w:numPr>
+                <w:ilvl w:val="0"/>
+                <w:numId w:val="99"/>
+              </w:numPr>
+              <w:ind w:left="726"/>
+              <w:rPr>
+                <w:rFonts w:ascii="Times New Roman" w:hAnsi="Times New Roman" w:cs="Times New Roman"/>
+              </w:rPr>
+            </w:pPr>
+            <w:r>
+              <w:rPr>
+                <w:rFonts w:ascii="Times New Roman" w:hAnsi="Times New Roman" w:cs="Times New Roman"/>
+              </w:rPr>
+              <w:t>Fix any 500 Server error in backend terminal</w:t>
+            </w:r>
+          </w:p>
+          <w:p>
+            <w:pPr>
+              <w:pStyle w:val="ListParagraph"/>
+              <w:numPr>
+                <w:ilvl w:val="0"/>
+                <w:numId w:val="99"/>
+              </w:numPr>
+              <w:ind w:left="726"/>
+              <w:rPr>
+                <w:rFonts w:ascii="Times New Roman" w:hAnsi="Times New Roman" w:cs="Times New Roman"/>
+              </w:rPr>
+            </w:pPr>
+            <w:r>
+              <w:rPr>
+                <w:rFonts w:ascii="Times New Roman" w:hAnsi="Times New Roman" w:cs="Times New Roman"/>
+              </w:rPr>
+              <w:t>Fix any 401 Authentication failed in Network tab</w:t>
+            </w:r>
+          </w:p>
+          <w:p>
+            <w:pPr>
+              <w:pStyle w:val="ListParagraph"/>
+              <w:numPr>
+                <w:ilvl w:val="0"/>
+                <w:numId w:val="99"/>
+              </w:numPr>
+              <w:ind w:left="726"/>
+              <w:rPr>
+                <w:rFonts w:ascii="Times New Roman" w:hAnsi="Times New Roman" w:cs="Times New Roman"/>
+              </w:rPr>
+            </w:pPr>
+            <w:r>
+              <w:rPr>
+                <w:rFonts w:ascii="Times New Roman" w:hAnsi="Times New Roman" w:cs="Times New Roman"/>
+              </w:rPr>
+              <w:t>Test full flow: Register → Login → Upload Log → See alerts → Acknowledge</w:t>
+            </w:r>
+            <w:r>
+              <w:rPr>
+                <w:rFonts w:ascii="Times New Roman" w:hAnsi="Times New Roman" w:cs="Times New Roman"/>
+              </w:rPr>
+              <w:t xml:space="preserve"> </w:t>
+            </w:r>
           </w:p>
         </w:tc>
         <w:tc>
@@ -23040,6 +23840,7 @@
                 <w:b/>
                 <w:bCs/>
               </w:rPr>
+              <w:lastRenderedPageBreak/>
               <w:t xml:space="preserve">Tomorrow's Plans </w:t>
             </w:r>
           </w:p>
@@ -23053,6 +23854,561 @@
                 <w:rFonts w:ascii="Times New Roman" w:hAnsi="Times New Roman" w:cs="Times New Roman"/>
               </w:rPr>
             </w:pPr>
+            <w:r>
+              <w:rPr>
+                <w:rFonts w:ascii="Times New Roman" w:hAnsi="Times New Roman" w:cs="Times New Roman"/>
+                <w:b/>
+                <w:bCs/>
+              </w:rPr>
+              <w:t>Real Log Parsing Logic</w:t>
+            </w:r>
+          </w:p>
+          <w:p>
+            <w:pPr>
+              <w:pStyle w:val="ListParagraph"/>
+              <w:numPr>
+                <w:ilvl w:val="0"/>
+                <w:numId w:val="100"/>
+              </w:numPr>
+              <w:ind w:left="829"/>
+              <w:rPr>
+                <w:rFonts w:ascii="Times New Roman" w:hAnsi="Times New Roman" w:cs="Times New Roman"/>
+              </w:rPr>
+            </w:pPr>
+            <w:r>
+              <w:rPr>
+                <w:rFonts w:ascii="Times New Roman" w:hAnsi="Times New Roman" w:cs="Times New Roman"/>
+              </w:rPr>
+              <w:t>Replace fake upload with real log parser in routes/upload.js</w:t>
+            </w:r>
+          </w:p>
+          <w:p>
+            <w:pPr>
+              <w:pStyle w:val="ListParagraph"/>
+              <w:numPr>
+                <w:ilvl w:val="0"/>
+                <w:numId w:val="100"/>
+              </w:numPr>
+              <w:ind w:left="829"/>
+              <w:rPr>
+                <w:rFonts w:ascii="Times New Roman" w:hAnsi="Times New Roman" w:cs="Times New Roman"/>
+              </w:rPr>
+            </w:pPr>
+            <w:r>
+              <w:rPr>
+                <w:rFonts w:ascii="Times New Roman" w:hAnsi="Times New Roman" w:cs="Times New Roman"/>
+              </w:rPr>
+              <w:t>Detect log levels: INFO, WARNING, ERROR, CRITICAL from uploaded .log/.txt file</w:t>
+            </w:r>
+          </w:p>
+          <w:p>
+            <w:pPr>
+              <w:pStyle w:val="ListParagraph"/>
+              <w:numPr>
+                <w:ilvl w:val="0"/>
+                <w:numId w:val="100"/>
+              </w:numPr>
+              <w:ind w:left="829"/>
+              <w:rPr>
+                <w:rFonts w:ascii="Times New Roman" w:hAnsi="Times New Roman" w:cs="Times New Roman"/>
+              </w:rPr>
+            </w:pPr>
+            <w:r>
+              <w:rPr>
+                <w:rFonts w:ascii="Times New Roman" w:hAnsi="Times New Roman" w:cs="Times New Roman"/>
+              </w:rPr>
+              <w:t>Extract timestamp, message, source from each log line using regex</w:t>
+            </w:r>
+          </w:p>
+          <w:p>
+            <w:pPr>
+              <w:pStyle w:val="ListParagraph"/>
+              <w:numPr>
+                <w:ilvl w:val="0"/>
+                <w:numId w:val="100"/>
+              </w:numPr>
+              <w:ind w:left="829"/>
+              <w:rPr>
+                <w:rFonts w:ascii="Times New Roman" w:hAnsi="Times New Roman" w:cs="Times New Roman"/>
+              </w:rPr>
+            </w:pPr>
+            <w:r>
+              <w:rPr>
+                <w:rFonts w:ascii="Times New Roman" w:hAnsi="Times New Roman" w:cs="Times New Roman"/>
+              </w:rPr>
+              <w:t xml:space="preserve">Return parsed data: </w:t>
+            </w:r>
+            <w:proofErr w:type="gramStart"/>
+            <w:r>
+              <w:rPr>
+                <w:rFonts w:ascii="Times New Roman" w:hAnsi="Times New Roman" w:cs="Times New Roman"/>
+              </w:rPr>
+              <w:t>{ total</w:t>
+            </w:r>
+            <w:proofErr w:type="gramEnd"/>
+            <w:r>
+              <w:rPr>
+                <w:rFonts w:ascii="Times New Roman" w:hAnsi="Times New Roman" w:cs="Times New Roman"/>
+              </w:rPr>
+              <w:t>, errors, warnings, critical, logs: [</w:t>
+            </w:r>
+            <w:proofErr w:type="gramStart"/>
+            <w:r>
+              <w:rPr>
+                <w:rFonts w:ascii="Times New Roman" w:hAnsi="Times New Roman" w:cs="Times New Roman"/>
+              </w:rPr>
+              <w:t>] }</w:t>
+            </w:r>
+            <w:proofErr w:type="gramEnd"/>
+          </w:p>
+          <w:p>
+            <w:pPr>
+              <w:numPr>
+                <w:ilvl w:val="0"/>
+                <w:numId w:val="4"/>
+              </w:numPr>
+              <w:rPr>
+                <w:rFonts w:ascii="Times New Roman" w:hAnsi="Times New Roman" w:cs="Times New Roman"/>
+              </w:rPr>
+            </w:pPr>
+            <w:r>
+              <w:rPr>
+                <w:rFonts w:ascii="Times New Roman" w:hAnsi="Times New Roman" w:cs="Times New Roman"/>
+                <w:b/>
+                <w:bCs/>
+              </w:rPr>
+              <w:t xml:space="preserve">Save Data Without </w:t>
+            </w:r>
+            <w:proofErr w:type="spellStart"/>
+            <w:r>
+              <w:rPr>
+                <w:rFonts w:ascii="Times New Roman" w:hAnsi="Times New Roman" w:cs="Times New Roman"/>
+                <w:b/>
+                <w:bCs/>
+              </w:rPr>
+              <w:t>MonogoDB</w:t>
+            </w:r>
+            <w:proofErr w:type="spellEnd"/>
+          </w:p>
+          <w:p>
+            <w:pPr>
+              <w:pStyle w:val="ListParagraph"/>
+              <w:numPr>
+                <w:ilvl w:val="0"/>
+                <w:numId w:val="101"/>
+              </w:numPr>
+              <w:ind w:left="829"/>
+              <w:rPr>
+                <w:rFonts w:ascii="Times New Roman" w:hAnsi="Times New Roman" w:cs="Times New Roman"/>
+              </w:rPr>
+            </w:pPr>
+            <w:r>
+              <w:rPr>
+                <w:rFonts w:ascii="Times New Roman" w:hAnsi="Times New Roman" w:cs="Times New Roman"/>
+              </w:rPr>
+              <w:t xml:space="preserve">Use </w:t>
+            </w:r>
+            <w:proofErr w:type="spellStart"/>
+            <w:r>
+              <w:rPr>
+                <w:rFonts w:ascii="Times New Roman" w:hAnsi="Times New Roman" w:cs="Times New Roman"/>
+              </w:rPr>
+              <w:t>lowdb</w:t>
+            </w:r>
+            <w:proofErr w:type="spellEnd"/>
+            <w:r>
+              <w:rPr>
+                <w:rFonts w:ascii="Times New Roman" w:hAnsi="Times New Roman" w:cs="Times New Roman"/>
+              </w:rPr>
+              <w:t xml:space="preserve"> or </w:t>
+            </w:r>
+            <w:proofErr w:type="spellStart"/>
+            <w:r>
+              <w:rPr>
+                <w:rFonts w:ascii="Times New Roman" w:hAnsi="Times New Roman" w:cs="Times New Roman"/>
+              </w:rPr>
+              <w:t>json</w:t>
+            </w:r>
+            <w:proofErr w:type="spellEnd"/>
+            <w:r>
+              <w:rPr>
+                <w:rFonts w:ascii="Times New Roman" w:hAnsi="Times New Roman" w:cs="Times New Roman"/>
+              </w:rPr>
+              <w:t xml:space="preserve"> file to persist alerts and uploads instead of [] array</w:t>
+            </w:r>
+          </w:p>
+          <w:p>
+            <w:pPr>
+              <w:pStyle w:val="ListParagraph"/>
+              <w:numPr>
+                <w:ilvl w:val="0"/>
+                <w:numId w:val="101"/>
+              </w:numPr>
+              <w:ind w:left="829"/>
+              <w:rPr>
+                <w:rFonts w:ascii="Times New Roman" w:hAnsi="Times New Roman" w:cs="Times New Roman"/>
+              </w:rPr>
+            </w:pPr>
+            <w:r>
+              <w:rPr>
+                <w:rFonts w:ascii="Times New Roman" w:hAnsi="Times New Roman" w:cs="Times New Roman"/>
+              </w:rPr>
+              <w:t>On server restart, data should not disappear</w:t>
+            </w:r>
+          </w:p>
+          <w:p>
+            <w:pPr>
+              <w:pStyle w:val="ListParagraph"/>
+              <w:numPr>
+                <w:ilvl w:val="0"/>
+                <w:numId w:val="101"/>
+              </w:numPr>
+              <w:ind w:left="829"/>
+              <w:rPr>
+                <w:rFonts w:ascii="Times New Roman" w:hAnsi="Times New Roman" w:cs="Times New Roman"/>
+              </w:rPr>
+            </w:pPr>
+            <w:r>
+              <w:rPr>
+                <w:rFonts w:ascii="Times New Roman" w:hAnsi="Times New Roman" w:cs="Times New Roman"/>
+              </w:rPr>
+              <w:t>Create data/</w:t>
+            </w:r>
+            <w:proofErr w:type="spellStart"/>
+            <w:r>
+              <w:rPr>
+                <w:rFonts w:ascii="Times New Roman" w:hAnsi="Times New Roman" w:cs="Times New Roman"/>
+              </w:rPr>
+              <w:t>alerts.json</w:t>
+            </w:r>
+            <w:proofErr w:type="spellEnd"/>
+            <w:r>
+              <w:rPr>
+                <w:rFonts w:ascii="Times New Roman" w:hAnsi="Times New Roman" w:cs="Times New Roman"/>
+              </w:rPr>
+              <w:t xml:space="preserve"> and data/</w:t>
+            </w:r>
+            <w:proofErr w:type="spellStart"/>
+            <w:r>
+              <w:rPr>
+                <w:rFonts w:ascii="Times New Roman" w:hAnsi="Times New Roman" w:cs="Times New Roman"/>
+              </w:rPr>
+              <w:t>uploads.json</w:t>
+            </w:r>
+            <w:proofErr w:type="spellEnd"/>
+          </w:p>
+          <w:p>
+            <w:pPr>
+              <w:numPr>
+                <w:ilvl w:val="0"/>
+                <w:numId w:val="4"/>
+              </w:numPr>
+              <w:rPr>
+                <w:rFonts w:ascii="Times New Roman" w:hAnsi="Times New Roman" w:cs="Times New Roman"/>
+              </w:rPr>
+            </w:pPr>
+            <w:r>
+              <w:rPr>
+                <w:rFonts w:ascii="Times New Roman" w:hAnsi="Times New Roman" w:cs="Times New Roman"/>
+                <w:b/>
+                <w:bCs/>
+              </w:rPr>
+              <w:t>Dashboard + Analytics</w:t>
+            </w:r>
+          </w:p>
+          <w:p>
+            <w:pPr>
+              <w:pStyle w:val="ListParagraph"/>
+              <w:numPr>
+                <w:ilvl w:val="0"/>
+                <w:numId w:val="102"/>
+              </w:numPr>
+              <w:ind w:left="829"/>
+              <w:rPr>
+                <w:rFonts w:ascii="Times New Roman" w:hAnsi="Times New Roman" w:cs="Times New Roman"/>
+              </w:rPr>
+            </w:pPr>
+            <w:r>
+              <w:rPr>
+                <w:rFonts w:ascii="Times New Roman" w:hAnsi="Times New Roman" w:cs="Times New Roman"/>
+              </w:rPr>
+              <w:lastRenderedPageBreak/>
+              <w:t>Connect pie chart to real parsed data: Error vs Warning vs Info %</w:t>
+            </w:r>
+          </w:p>
+          <w:p>
+            <w:pPr>
+              <w:pStyle w:val="ListParagraph"/>
+              <w:numPr>
+                <w:ilvl w:val="0"/>
+                <w:numId w:val="102"/>
+              </w:numPr>
+              <w:ind w:left="829"/>
+              <w:rPr>
+                <w:rFonts w:ascii="Times New Roman" w:hAnsi="Times New Roman" w:cs="Times New Roman"/>
+              </w:rPr>
+            </w:pPr>
+            <w:r>
+              <w:rPr>
+                <w:rFonts w:ascii="Times New Roman" w:hAnsi="Times New Roman" w:cs="Times New Roman"/>
+              </w:rPr>
+              <w:t>Add line/bar chart for “Alerts over time” in Analytics tab</w:t>
+            </w:r>
+          </w:p>
+          <w:p>
+            <w:pPr>
+              <w:pStyle w:val="ListParagraph"/>
+              <w:numPr>
+                <w:ilvl w:val="0"/>
+                <w:numId w:val="102"/>
+              </w:numPr>
+              <w:ind w:left="829"/>
+              <w:rPr>
+                <w:rFonts w:ascii="Times New Roman" w:hAnsi="Times New Roman" w:cs="Times New Roman"/>
+              </w:rPr>
+            </w:pPr>
+            <w:r>
+              <w:rPr>
+                <w:rFonts w:ascii="Times New Roman" w:hAnsi="Times New Roman" w:cs="Times New Roman"/>
+              </w:rPr>
+              <w:t>Show “Last 24h” filter for dashboard stats</w:t>
+            </w:r>
+          </w:p>
+          <w:p>
+            <w:pPr>
+              <w:numPr>
+                <w:ilvl w:val="0"/>
+                <w:numId w:val="4"/>
+              </w:numPr>
+              <w:rPr>
+                <w:rFonts w:ascii="Times New Roman" w:hAnsi="Times New Roman" w:cs="Times New Roman"/>
+              </w:rPr>
+            </w:pPr>
+            <w:r>
+              <w:rPr>
+                <w:rFonts w:ascii="Times New Roman" w:hAnsi="Times New Roman" w:cs="Times New Roman"/>
+                <w:b/>
+                <w:bCs/>
+              </w:rPr>
+              <w:t>Real-time Alerts Improvements</w:t>
+            </w:r>
+          </w:p>
+          <w:p>
+            <w:pPr>
+              <w:pStyle w:val="ListParagraph"/>
+              <w:numPr>
+                <w:ilvl w:val="0"/>
+                <w:numId w:val="103"/>
+              </w:numPr>
+              <w:ind w:left="829"/>
+              <w:rPr>
+                <w:rFonts w:ascii="Times New Roman" w:hAnsi="Times New Roman" w:cs="Times New Roman"/>
+              </w:rPr>
+            </w:pPr>
+            <w:r>
+              <w:rPr>
+                <w:rFonts w:ascii="Times New Roman" w:hAnsi="Times New Roman" w:cs="Times New Roman"/>
+              </w:rPr>
+              <w:t>Add WebSocket or polling to push new alerts without refresh</w:t>
+            </w:r>
+          </w:p>
+          <w:p>
+            <w:pPr>
+              <w:pStyle w:val="ListParagraph"/>
+              <w:numPr>
+                <w:ilvl w:val="0"/>
+                <w:numId w:val="103"/>
+              </w:numPr>
+              <w:ind w:left="829"/>
+              <w:rPr>
+                <w:rFonts w:ascii="Times New Roman" w:hAnsi="Times New Roman" w:cs="Times New Roman"/>
+              </w:rPr>
+            </w:pPr>
+            <w:r>
+              <w:rPr>
+                <w:rFonts w:ascii="Times New Roman" w:hAnsi="Times New Roman" w:cs="Times New Roman"/>
+              </w:rPr>
+              <w:t>Add filters: All, Critical, Error, Warning, Unacknowledged</w:t>
+            </w:r>
+          </w:p>
+          <w:p>
+            <w:pPr>
+              <w:pStyle w:val="ListParagraph"/>
+              <w:numPr>
+                <w:ilvl w:val="0"/>
+                <w:numId w:val="103"/>
+              </w:numPr>
+              <w:ind w:left="829"/>
+              <w:rPr>
+                <w:rFonts w:ascii="Times New Roman" w:hAnsi="Times New Roman" w:cs="Times New Roman"/>
+              </w:rPr>
+            </w:pPr>
+            <w:r>
+              <w:rPr>
+                <w:rFonts w:ascii="Times New Roman" w:hAnsi="Times New Roman" w:cs="Times New Roman"/>
+              </w:rPr>
+              <w:t>Add “Clear All Acknowledged” button</w:t>
+            </w:r>
+          </w:p>
+          <w:p>
+            <w:pPr>
+              <w:numPr>
+                <w:ilvl w:val="0"/>
+                <w:numId w:val="4"/>
+              </w:numPr>
+              <w:rPr>
+                <w:rFonts w:ascii="Times New Roman" w:hAnsi="Times New Roman" w:cs="Times New Roman"/>
+              </w:rPr>
+            </w:pPr>
+            <w:r>
+              <w:rPr>
+                <w:rFonts w:ascii="Times New Roman" w:hAnsi="Times New Roman" w:cs="Times New Roman"/>
+                <w:b/>
+                <w:bCs/>
+              </w:rPr>
+              <w:t>Auth + UX Polish</w:t>
+            </w:r>
+          </w:p>
+          <w:p>
+            <w:pPr>
+              <w:pStyle w:val="ListParagraph"/>
+              <w:numPr>
+                <w:ilvl w:val="0"/>
+                <w:numId w:val="104"/>
+              </w:numPr>
+              <w:ind w:left="829"/>
+              <w:rPr>
+                <w:rFonts w:ascii="Times New Roman" w:hAnsi="Times New Roman" w:cs="Times New Roman"/>
+              </w:rPr>
+            </w:pPr>
+            <w:r>
+              <w:rPr>
+                <w:rFonts w:ascii="Times New Roman" w:hAnsi="Times New Roman" w:cs="Times New Roman"/>
+              </w:rPr>
+              <w:t xml:space="preserve">Add Logout button to clear token from </w:t>
+            </w:r>
+            <w:proofErr w:type="spellStart"/>
+            <w:r>
+              <w:rPr>
+                <w:rFonts w:ascii="Times New Roman" w:hAnsi="Times New Roman" w:cs="Times New Roman"/>
+              </w:rPr>
+              <w:t>localstorage</w:t>
+            </w:r>
+            <w:proofErr w:type="spellEnd"/>
+          </w:p>
+          <w:p>
+            <w:pPr>
+              <w:pStyle w:val="ListParagraph"/>
+              <w:numPr>
+                <w:ilvl w:val="0"/>
+                <w:numId w:val="104"/>
+              </w:numPr>
+              <w:ind w:left="829"/>
+              <w:rPr>
+                <w:rFonts w:ascii="Times New Roman" w:hAnsi="Times New Roman" w:cs="Times New Roman"/>
+              </w:rPr>
+            </w:pPr>
+            <w:r>
+              <w:rPr>
+                <w:rFonts w:ascii="Times New Roman" w:hAnsi="Times New Roman" w:cs="Times New Roman"/>
+              </w:rPr>
+              <w:t>Add route protection: redirect to /login if no token</w:t>
+            </w:r>
+          </w:p>
+          <w:p>
+            <w:pPr>
+              <w:pStyle w:val="ListParagraph"/>
+              <w:numPr>
+                <w:ilvl w:val="0"/>
+                <w:numId w:val="104"/>
+              </w:numPr>
+              <w:ind w:left="829"/>
+              <w:rPr>
+                <w:rFonts w:ascii="Times New Roman" w:hAnsi="Times New Roman" w:cs="Times New Roman"/>
+              </w:rPr>
+            </w:pPr>
+            <w:r>
+              <w:rPr>
+                <w:rFonts w:ascii="Times New Roman" w:hAnsi="Times New Roman" w:cs="Times New Roman"/>
+              </w:rPr>
+              <w:t>Show toast notifications: “Login Success”, “Alert Acknowledged”, “File Uploaded”</w:t>
+            </w:r>
+          </w:p>
+          <w:p>
+            <w:pPr>
+              <w:numPr>
+                <w:ilvl w:val="0"/>
+                <w:numId w:val="4"/>
+              </w:numPr>
+              <w:rPr>
+                <w:rFonts w:ascii="Times New Roman" w:hAnsi="Times New Roman" w:cs="Times New Roman"/>
+              </w:rPr>
+            </w:pPr>
+            <w:r>
+              <w:rPr>
+                <w:rFonts w:ascii="Times New Roman" w:hAnsi="Times New Roman" w:cs="Times New Roman"/>
+                <w:b/>
+                <w:bCs/>
+              </w:rPr>
+              <w:t>Testing + Bug Fix</w:t>
+            </w:r>
+          </w:p>
+          <w:p>
+            <w:pPr>
+              <w:pStyle w:val="ListParagraph"/>
+              <w:numPr>
+                <w:ilvl w:val="0"/>
+                <w:numId w:val="105"/>
+              </w:numPr>
+              <w:ind w:left="829"/>
+              <w:rPr>
+                <w:rFonts w:ascii="Times New Roman" w:hAnsi="Times New Roman" w:cs="Times New Roman"/>
+              </w:rPr>
+            </w:pPr>
+            <w:r>
+              <w:rPr>
+                <w:rFonts w:ascii="Times New Roman" w:hAnsi="Times New Roman" w:cs="Times New Roman"/>
+              </w:rPr>
+              <w:t>Test with 1MB+ log file to check performance</w:t>
+            </w:r>
+          </w:p>
+          <w:p>
+            <w:pPr>
+              <w:pStyle w:val="ListParagraph"/>
+              <w:numPr>
+                <w:ilvl w:val="0"/>
+                <w:numId w:val="105"/>
+              </w:numPr>
+              <w:ind w:left="829"/>
+              <w:rPr>
+                <w:rFonts w:ascii="Times New Roman" w:hAnsi="Times New Roman" w:cs="Times New Roman"/>
+              </w:rPr>
+            </w:pPr>
+            <w:r>
+              <w:rPr>
+                <w:rFonts w:ascii="Times New Roman" w:hAnsi="Times New Roman" w:cs="Times New Roman"/>
+              </w:rPr>
+              <w:t>Fix CORS + handle file upload errors</w:t>
+            </w:r>
+          </w:p>
+          <w:p>
+            <w:pPr>
+              <w:pStyle w:val="ListParagraph"/>
+              <w:numPr>
+                <w:ilvl w:val="0"/>
+                <w:numId w:val="105"/>
+              </w:numPr>
+              <w:ind w:left="829"/>
+              <w:rPr>
+                <w:rFonts w:ascii="Times New Roman" w:hAnsi="Times New Roman" w:cs="Times New Roman"/>
+              </w:rPr>
+            </w:pPr>
+            <w:r>
+              <w:rPr>
+                <w:rFonts w:ascii="Times New Roman" w:hAnsi="Times New Roman" w:cs="Times New Roman"/>
+              </w:rPr>
+              <w:t>Record Day 17 demo: Upload real server log → see analytics → acknowledge alerts</w:t>
+            </w:r>
           </w:p>
         </w:tc>
       </w:tr>
@@ -23092,6 +24448,7 @@
                 <w:b/>
                 <w:bCs/>
               </w:rPr>
+              <w:lastRenderedPageBreak/>
               <w:t>Outputs and Descriptions</w:t>
             </w:r>
           </w:p>
@@ -23115,20 +24472,363 @@
               </w:rPr>
               <w:t xml:space="preserve"> </w:t>
             </w:r>
-          </w:p>
-          <w:p>
-            <w:pPr>
-              <w:rPr>
-                <w:rFonts w:ascii="Times New Roman" w:hAnsi="Times New Roman" w:cs="Times New Roman"/>
-              </w:rPr>
-            </w:pPr>
-            <w:r>
-              <w:rPr>
-                <w:rFonts w:ascii="Times New Roman" w:hAnsi="Times New Roman" w:cs="Times New Roman"/>
-                <w:b/>
-                <w:bCs/>
-              </w:rPr>
+            <w:r>
+              <w:rPr>
+                <w:rFonts w:ascii="Times New Roman" w:hAnsi="Times New Roman" w:cs="Times New Roman"/>
+              </w:rPr>
+              <w:t>Fix auth + alerts to work end-to-end without MongoDB using dummy user, JWT, and in-memory data so the full Register → Login → Upload → Alerts flow runs for demo</w:t>
+            </w:r>
+          </w:p>
+          <w:p>
+            <w:pPr>
+              <w:rPr>
+                <w:rFonts w:ascii="Times New Roman" w:hAnsi="Times New Roman" w:cs="Times New Roman"/>
+                <w:b/>
+                <w:bCs/>
+              </w:rPr>
+            </w:pPr>
+            <w:r>
+              <w:rPr>
+                <w:rFonts w:ascii="Times New Roman" w:hAnsi="Times New Roman" w:cs="Times New Roman"/>
+                <w:b/>
+                <w:bCs/>
+              </w:rPr>
+              <w:lastRenderedPageBreak/>
               <w:t xml:space="preserve"> </w:t>
+            </w:r>
+            <w:r>
+              <w:rPr>
+                <w:rFonts w:ascii="Times New Roman" w:hAnsi="Times New Roman" w:cs="Times New Roman"/>
+                <w:b/>
+                <w:bCs/>
+                <w:noProof/>
+              </w:rPr>
+              <w:drawing>
+                <wp:inline distT="0" distB="0" distL="0" distR="0" wp14:anchorId="41488D25" wp14:editId="514C47E7">
+                  <wp:extent cx="5403536" cy="3108960"/>
+                  <wp:effectExtent l="0" t="0" r="6985" b="0"/>
+                  <wp:docPr id="758001430" name="Picture 1"/>
+                  <wp:cNvGraphicFramePr>
+                    <a:graphicFrameLocks xmlns:a="http://schemas.openxmlformats.org/drawingml/2006/main" noChangeAspect="1"/>
+                  </wp:cNvGraphicFramePr>
+                  <a:graphic xmlns:a="http://schemas.openxmlformats.org/drawingml/2006/main">
+                    <a:graphicData uri="http://schemas.openxmlformats.org/drawingml/2006/picture">
+                      <pic:pic xmlns:pic="http://schemas.openxmlformats.org/drawingml/2006/picture">
+                        <pic:nvPicPr>
+                          <pic:cNvPr id="758001430" name=""/>
+                          <pic:cNvPicPr/>
+                        </pic:nvPicPr>
+                        <pic:blipFill>
+                          <a:blip r:embed="rId67"/>
+                          <a:stretch>
+                            <a:fillRect/>
+                          </a:stretch>
+                        </pic:blipFill>
+                        <pic:spPr>
+                          <a:xfrm>
+                            <a:off x="0" y="0"/>
+                            <a:ext cx="5416578" cy="3116464"/>
+                          </a:xfrm>
+                          <a:prstGeom prst="rect">
+                            <a:avLst/>
+                          </a:prstGeom>
+                        </pic:spPr>
+                      </pic:pic>
+                    </a:graphicData>
+                  </a:graphic>
+                </wp:inline>
+              </w:drawing>
+            </w:r>
+          </w:p>
+          <w:p>
+            <w:pPr>
+              <w:rPr>
+                <w:rFonts w:ascii="Times New Roman" w:hAnsi="Times New Roman" w:cs="Times New Roman"/>
+              </w:rPr>
+            </w:pPr>
+            <w:r>
+              <w:rPr>
+                <w:rFonts w:ascii="Times New Roman" w:hAnsi="Times New Roman" w:cs="Times New Roman"/>
+                <w:noProof/>
+              </w:rPr>
+              <w:drawing>
+                <wp:inline distT="0" distB="0" distL="0" distR="0" wp14:anchorId="1E0CD5AF" wp14:editId="23A53A71">
+                  <wp:extent cx="5433060" cy="3906520"/>
+                  <wp:effectExtent l="0" t="0" r="0" b="0"/>
+                  <wp:docPr id="1115627816" name="Picture 1"/>
+                  <wp:cNvGraphicFramePr>
+                    <a:graphicFrameLocks xmlns:a="http://schemas.openxmlformats.org/drawingml/2006/main" noChangeAspect="1"/>
+                  </wp:cNvGraphicFramePr>
+                  <a:graphic xmlns:a="http://schemas.openxmlformats.org/drawingml/2006/main">
+                    <a:graphicData uri="http://schemas.openxmlformats.org/drawingml/2006/picture">
+                      <pic:pic xmlns:pic="http://schemas.openxmlformats.org/drawingml/2006/picture">
+                        <pic:nvPicPr>
+                          <pic:cNvPr id="1115627816" name=""/>
+                          <pic:cNvPicPr/>
+                        </pic:nvPicPr>
+                        <pic:blipFill>
+                          <a:blip r:embed="rId68"/>
+                          <a:stretch>
+                            <a:fillRect/>
+                          </a:stretch>
+                        </pic:blipFill>
+                        <pic:spPr>
+                          <a:xfrm>
+                            <a:off x="0" y="0"/>
+                            <a:ext cx="5440839" cy="3912113"/>
+                          </a:xfrm>
+                          <a:prstGeom prst="rect">
+                            <a:avLst/>
+                          </a:prstGeom>
+                        </pic:spPr>
+                      </pic:pic>
+                    </a:graphicData>
+                  </a:graphic>
+                </wp:inline>
+              </w:drawing>
+            </w:r>
+          </w:p>
+          <w:p>
+            <w:pPr>
+              <w:rPr>
+                <w:rFonts w:ascii="Times New Roman" w:hAnsi="Times New Roman" w:cs="Times New Roman"/>
+              </w:rPr>
+            </w:pPr>
+            <w:r>
+              <w:rPr>
+                <w:rFonts w:ascii="Times New Roman" w:hAnsi="Times New Roman" w:cs="Times New Roman"/>
+                <w:noProof/>
+              </w:rPr>
+              <w:lastRenderedPageBreak/>
+              <w:drawing>
+                <wp:inline distT="0" distB="0" distL="0" distR="0" wp14:anchorId="76F69BE3" wp14:editId="0E7BBE5D">
+                  <wp:extent cx="5585460" cy="3977640"/>
+                  <wp:effectExtent l="0" t="0" r="0" b="3810"/>
+                  <wp:docPr id="657774438" name="Picture 1"/>
+                  <wp:cNvGraphicFramePr>
+                    <a:graphicFrameLocks xmlns:a="http://schemas.openxmlformats.org/drawingml/2006/main" noChangeAspect="1"/>
+                  </wp:cNvGraphicFramePr>
+                  <a:graphic xmlns:a="http://schemas.openxmlformats.org/drawingml/2006/main">
+                    <a:graphicData uri="http://schemas.openxmlformats.org/drawingml/2006/picture">
+                      <pic:pic xmlns:pic="http://schemas.openxmlformats.org/drawingml/2006/picture">
+                        <pic:nvPicPr>
+                          <pic:cNvPr id="657774438" name=""/>
+                          <pic:cNvPicPr/>
+                        </pic:nvPicPr>
+                        <pic:blipFill>
+                          <a:blip r:embed="rId69"/>
+                          <a:stretch>
+                            <a:fillRect/>
+                          </a:stretch>
+                        </pic:blipFill>
+                        <pic:spPr>
+                          <a:xfrm>
+                            <a:off x="0" y="0"/>
+                            <a:ext cx="5589430" cy="3980467"/>
+                          </a:xfrm>
+                          <a:prstGeom prst="rect">
+                            <a:avLst/>
+                          </a:prstGeom>
+                        </pic:spPr>
+                      </pic:pic>
+                    </a:graphicData>
+                  </a:graphic>
+                </wp:inline>
+              </w:drawing>
+            </w:r>
+          </w:p>
+          <w:p>
+            <w:pPr>
+              <w:rPr>
+                <w:rFonts w:ascii="Times New Roman" w:hAnsi="Times New Roman" w:cs="Times New Roman"/>
+              </w:rPr>
+            </w:pPr>
+            <w:r>
+              <w:rPr>
+                <w:rFonts w:ascii="Times New Roman" w:hAnsi="Times New Roman" w:cs="Times New Roman"/>
+                <w:noProof/>
+              </w:rPr>
+              <w:drawing>
+                <wp:inline distT="0" distB="0" distL="0" distR="0" wp14:anchorId="5EC3DC6B" wp14:editId="00B3046D">
+                  <wp:extent cx="5890260" cy="4335780"/>
+                  <wp:effectExtent l="0" t="0" r="0" b="7620"/>
+                  <wp:docPr id="770466833" name="Picture 1"/>
+                  <wp:cNvGraphicFramePr>
+                    <a:graphicFrameLocks xmlns:a="http://schemas.openxmlformats.org/drawingml/2006/main" noChangeAspect="1"/>
+                  </wp:cNvGraphicFramePr>
+                  <a:graphic xmlns:a="http://schemas.openxmlformats.org/drawingml/2006/main">
+                    <a:graphicData uri="http://schemas.openxmlformats.org/drawingml/2006/picture">
+                      <pic:pic xmlns:pic="http://schemas.openxmlformats.org/drawingml/2006/picture">
+                        <pic:nvPicPr>
+                          <pic:cNvPr id="770466833" name=""/>
+                          <pic:cNvPicPr/>
+                        </pic:nvPicPr>
+                        <pic:blipFill>
+                          <a:blip r:embed="rId70"/>
+                          <a:stretch>
+                            <a:fillRect/>
+                          </a:stretch>
+                        </pic:blipFill>
+                        <pic:spPr>
+                          <a:xfrm>
+                            <a:off x="0" y="0"/>
+                            <a:ext cx="5894000" cy="4338533"/>
+                          </a:xfrm>
+                          <a:prstGeom prst="rect">
+                            <a:avLst/>
+                          </a:prstGeom>
+                        </pic:spPr>
+                      </pic:pic>
+                    </a:graphicData>
+                  </a:graphic>
+                </wp:inline>
+              </w:drawing>
+            </w:r>
+          </w:p>
+          <w:p>
+            <w:pPr>
+              <w:rPr>
+                <w:rFonts w:ascii="Times New Roman" w:hAnsi="Times New Roman" w:cs="Times New Roman"/>
+              </w:rPr>
+            </w:pPr>
+            <w:r>
+              <w:rPr>
+                <w:rFonts w:ascii="Times New Roman" w:hAnsi="Times New Roman" w:cs="Times New Roman"/>
+                <w:noProof/>
+              </w:rPr>
+              <w:lastRenderedPageBreak/>
+              <w:drawing>
+                <wp:inline distT="0" distB="0" distL="0" distR="0" wp14:anchorId="21FFC01E" wp14:editId="11517757">
+                  <wp:extent cx="5913117" cy="4442460"/>
+                  <wp:effectExtent l="0" t="0" r="0" b="0"/>
+                  <wp:docPr id="1547302560" name="Picture 1"/>
+                  <wp:cNvGraphicFramePr>
+                    <a:graphicFrameLocks xmlns:a="http://schemas.openxmlformats.org/drawingml/2006/main" noChangeAspect="1"/>
+                  </wp:cNvGraphicFramePr>
+                  <a:graphic xmlns:a="http://schemas.openxmlformats.org/drawingml/2006/main">
+                    <a:graphicData uri="http://schemas.openxmlformats.org/drawingml/2006/picture">
+                      <pic:pic xmlns:pic="http://schemas.openxmlformats.org/drawingml/2006/picture">
+                        <pic:nvPicPr>
+                          <pic:cNvPr id="1547302560" name=""/>
+                          <pic:cNvPicPr/>
+                        </pic:nvPicPr>
+                        <pic:blipFill>
+                          <a:blip r:embed="rId71"/>
+                          <a:stretch>
+                            <a:fillRect/>
+                          </a:stretch>
+                        </pic:blipFill>
+                        <pic:spPr>
+                          <a:xfrm>
+                            <a:off x="0" y="0"/>
+                            <a:ext cx="5918868" cy="4446780"/>
+                          </a:xfrm>
+                          <a:prstGeom prst="rect">
+                            <a:avLst/>
+                          </a:prstGeom>
+                        </pic:spPr>
+                      </pic:pic>
+                    </a:graphicData>
+                  </a:graphic>
+                </wp:inline>
+              </w:drawing>
+            </w:r>
+          </w:p>
+          <w:p>
+            <w:pPr>
+              <w:rPr>
+                <w:rFonts w:ascii="Times New Roman" w:hAnsi="Times New Roman" w:cs="Times New Roman"/>
+              </w:rPr>
+            </w:pPr>
+            <w:r>
+              <w:rPr>
+                <w:rFonts w:ascii="Times New Roman" w:hAnsi="Times New Roman" w:cs="Times New Roman"/>
+                <w:noProof/>
+              </w:rPr>
+              <w:drawing>
+                <wp:inline distT="0" distB="0" distL="0" distR="0" wp14:anchorId="41AEC104" wp14:editId="2464CF81">
+                  <wp:extent cx="6050280" cy="3550920"/>
+                  <wp:effectExtent l="0" t="0" r="7620" b="0"/>
+                  <wp:docPr id="1611267509" name="Picture 1"/>
+                  <wp:cNvGraphicFramePr>
+                    <a:graphicFrameLocks xmlns:a="http://schemas.openxmlformats.org/drawingml/2006/main" noChangeAspect="1"/>
+                  </wp:cNvGraphicFramePr>
+                  <a:graphic xmlns:a="http://schemas.openxmlformats.org/drawingml/2006/main">
+                    <a:graphicData uri="http://schemas.openxmlformats.org/drawingml/2006/picture">
+                      <pic:pic xmlns:pic="http://schemas.openxmlformats.org/drawingml/2006/picture">
+                        <pic:nvPicPr>
+                          <pic:cNvPr id="1611267509" name=""/>
+                          <pic:cNvPicPr/>
+                        </pic:nvPicPr>
+                        <pic:blipFill>
+                          <a:blip r:embed="rId72"/>
+                          <a:stretch>
+                            <a:fillRect/>
+                          </a:stretch>
+                        </pic:blipFill>
+                        <pic:spPr>
+                          <a:xfrm>
+                            <a:off x="0" y="0"/>
+                            <a:ext cx="6050280" cy="3550920"/>
+                          </a:xfrm>
+                          <a:prstGeom prst="rect">
+                            <a:avLst/>
+                          </a:prstGeom>
+                        </pic:spPr>
+                      </pic:pic>
+                    </a:graphicData>
+                  </a:graphic>
+                </wp:inline>
+              </w:drawing>
+            </w:r>
+          </w:p>
+          <w:p>
+            <w:pPr>
+              <w:rPr>
+                <w:rFonts w:ascii="Times New Roman" w:hAnsi="Times New Roman" w:cs="Times New Roman"/>
+              </w:rPr>
+            </w:pPr>
+            <w:r>
+              <w:rPr>
+                <w:rFonts w:ascii="Times New Roman" w:hAnsi="Times New Roman" w:cs="Times New Roman"/>
+                <w:noProof/>
+              </w:rPr>
+              <w:lastRenderedPageBreak/>
+              <w:drawing>
+                <wp:inline distT="0" distB="0" distL="0" distR="0" wp14:anchorId="4DD87EC6" wp14:editId="41B7780E">
+                  <wp:extent cx="6008370" cy="2819400"/>
+                  <wp:effectExtent l="0" t="0" r="0" b="0"/>
+                  <wp:docPr id="229759129" name="Picture 1"/>
+                  <wp:cNvGraphicFramePr>
+                    <a:graphicFrameLocks xmlns:a="http://schemas.openxmlformats.org/drawingml/2006/main" noChangeAspect="1"/>
+                  </wp:cNvGraphicFramePr>
+                  <a:graphic xmlns:a="http://schemas.openxmlformats.org/drawingml/2006/main">
+                    <a:graphicData uri="http://schemas.openxmlformats.org/drawingml/2006/picture">
+                      <pic:pic xmlns:pic="http://schemas.openxmlformats.org/drawingml/2006/picture">
+                        <pic:nvPicPr>
+                          <pic:cNvPr id="229759129" name=""/>
+                          <pic:cNvPicPr/>
+                        </pic:nvPicPr>
+                        <pic:blipFill>
+                          <a:blip r:embed="rId73"/>
+                          <a:stretch>
+                            <a:fillRect/>
+                          </a:stretch>
+                        </pic:blipFill>
+                        <pic:spPr>
+                          <a:xfrm>
+                            <a:off x="0" y="0"/>
+                            <a:ext cx="6012916" cy="2821533"/>
+                          </a:xfrm>
+                          <a:prstGeom prst="rect">
+                            <a:avLst/>
+                          </a:prstGeom>
+                        </pic:spPr>
+                      </pic:pic>
+                    </a:graphicData>
+                  </a:graphic>
+                </wp:inline>
+              </w:drawing>
             </w:r>
           </w:p>
         </w:tc>
@@ -23136,8 +24836,9 @@
     </w:tbl>
     <w:p>
       <w:pPr>
-        <w:rPr>
-          <w:rFonts w:ascii="Times New Roman" w:eastAsia="MS Gothic" w:hAnsi="Times New Roman" w:cs="Times New Roman"/>
+        <w:jc w:val="both"/>
+        <w:rPr>
+          <w:rFonts w:ascii="Times New Roman" w:hAnsi="Times New Roman" w:cs="Times New Roman"/>
         </w:rPr>
       </w:pPr>
       <w:r>
@@ -23146,6 +24847,7 @@
           <w:b/>
           <w:bCs/>
         </w:rPr>
+        <w:lastRenderedPageBreak/>
         <w:t>Description:</w:t>
       </w:r>
       <w:r>
@@ -23154,6 +24856,784 @@
         </w:rPr>
         <w:t xml:space="preserve"> </w:t>
       </w:r>
+      <w:r>
+        <w:rPr>
+          <w:rFonts w:ascii="Times New Roman" w:hAnsi="Times New Roman" w:cs="Times New Roman"/>
+        </w:rPr>
+        <w:t xml:space="preserve">For Day 16 of LogGuard AI, the </w:t>
+      </w:r>
+      <w:proofErr w:type="gramStart"/>
+      <w:r>
+        <w:rPr>
+          <w:rFonts w:ascii="Times New Roman" w:hAnsi="Times New Roman" w:cs="Times New Roman"/>
+        </w:rPr>
+        <w:t>main focus</w:t>
+      </w:r>
+      <w:proofErr w:type="gramEnd"/>
+      <w:r>
+        <w:rPr>
+          <w:rFonts w:ascii="Times New Roman" w:hAnsi="Times New Roman" w:cs="Times New Roman"/>
+        </w:rPr>
+        <w:t xml:space="preserve"> is to get the entire application working end-to-end without any dependency on MongoDB so you can demo the full flow without running into Server error or Authentication failed issues. Right </w:t>
+      </w:r>
+      <w:proofErr w:type="gramStart"/>
+      <w:r>
+        <w:rPr>
+          <w:rFonts w:ascii="Times New Roman" w:hAnsi="Times New Roman" w:cs="Times New Roman"/>
+        </w:rPr>
+        <w:t>now</w:t>
+      </w:r>
+      <w:proofErr w:type="gramEnd"/>
+      <w:r>
+        <w:rPr>
+          <w:rFonts w:ascii="Times New Roman" w:hAnsi="Times New Roman" w:cs="Times New Roman"/>
+        </w:rPr>
+        <w:t xml:space="preserve"> login is crashing because the backend is trying to query a database that isn’t connected, and all other routes are failing because no valid JWT token is being issued or sent. To fix this, we will first </w:t>
+      </w:r>
+      <w:r>
+        <w:rPr>
+          <w:rFonts w:ascii="Times New Roman" w:hAnsi="Times New Roman" w:cs="Times New Roman"/>
+        </w:rPr>
+        <w:t xml:space="preserve">replace the database calls with a hardcoded dummy user in auth.js using </w:t>
+      </w:r>
+      <w:hyperlink r:id="rId74" w:history="1">
+        <w:r>
+          <w:rPr>
+            <w:rStyle w:val="Hyperlink"/>
+            <w:rFonts w:ascii="Times New Roman" w:hAnsi="Times New Roman" w:cs="Times New Roman"/>
+          </w:rPr>
+          <w:t>admin@logguard.ai</w:t>
+        </w:r>
+      </w:hyperlink>
+      <w:r>
+        <w:rPr>
+          <w:rFonts w:ascii="Times New Roman" w:hAnsi="Times New Roman" w:cs="Times New Roman"/>
+        </w:rPr>
+        <w:t xml:space="preserve"> and </w:t>
+      </w:r>
+      <w:proofErr w:type="gramStart"/>
+      <w:r>
+        <w:rPr>
+          <w:rFonts w:ascii="Times New Roman" w:hAnsi="Times New Roman" w:cs="Times New Roman"/>
+        </w:rPr>
+        <w:t>password123, and</w:t>
+      </w:r>
+      <w:proofErr w:type="gramEnd"/>
+      <w:r>
+        <w:rPr>
+          <w:rFonts w:ascii="Times New Roman" w:hAnsi="Times New Roman" w:cs="Times New Roman"/>
+        </w:rPr>
+        <w:t xml:space="preserve"> use </w:t>
+      </w:r>
+      <w:proofErr w:type="spellStart"/>
+      <w:r>
+        <w:rPr>
+          <w:rFonts w:ascii="Times New Roman" w:hAnsi="Times New Roman" w:cs="Times New Roman"/>
+        </w:rPr>
+        <w:t>bcrypt</w:t>
+      </w:r>
+      <w:proofErr w:type="spellEnd"/>
+      <w:r>
+        <w:rPr>
+          <w:rFonts w:ascii="Times New Roman" w:hAnsi="Times New Roman" w:cs="Times New Roman"/>
+        </w:rPr>
+        <w:t xml:space="preserve"> and </w:t>
+      </w:r>
+      <w:proofErr w:type="spellStart"/>
+      <w:r>
+        <w:rPr>
+          <w:rFonts w:ascii="Times New Roman" w:hAnsi="Times New Roman" w:cs="Times New Roman"/>
+        </w:rPr>
+        <w:t>jsonwebtoken</w:t>
+      </w:r>
+      <w:proofErr w:type="spellEnd"/>
+      <w:r>
+        <w:rPr>
+          <w:rFonts w:ascii="Times New Roman" w:hAnsi="Times New Roman" w:cs="Times New Roman"/>
+        </w:rPr>
+        <w:t xml:space="preserve"> to </w:t>
+      </w:r>
+      <w:proofErr w:type="spellStart"/>
+      <w:r>
+        <w:rPr>
+          <w:rFonts w:ascii="Times New Roman" w:hAnsi="Times New Roman" w:cs="Times New Roman"/>
+        </w:rPr>
+        <w:t>handel</w:t>
+      </w:r>
+      <w:proofErr w:type="spellEnd"/>
+      <w:r>
+        <w:rPr>
+          <w:rFonts w:ascii="Times New Roman" w:hAnsi="Times New Roman" w:cs="Times New Roman"/>
+        </w:rPr>
+        <w:t xml:space="preserve"> login and token creation. We’ll also create a simple auth.js middleware to verify that token on protected routes. On the frontend, we need to make sure the token get saved to </w:t>
+      </w:r>
+      <w:proofErr w:type="spellStart"/>
+      <w:r>
+        <w:rPr>
+          <w:rFonts w:ascii="Times New Roman" w:hAnsi="Times New Roman" w:cs="Times New Roman"/>
+        </w:rPr>
+        <w:t>localStorage</w:t>
+      </w:r>
+      <w:proofErr w:type="spellEnd"/>
+      <w:r>
+        <w:rPr>
+          <w:rFonts w:ascii="Times New Roman" w:hAnsi="Times New Roman" w:cs="Times New Roman"/>
+        </w:rPr>
+        <w:t xml:space="preserve"> after login and that an </w:t>
+      </w:r>
+      <w:proofErr w:type="spellStart"/>
+      <w:r>
+        <w:rPr>
+          <w:rFonts w:ascii="Times New Roman" w:hAnsi="Times New Roman" w:cs="Times New Roman"/>
+        </w:rPr>
+        <w:t>axios</w:t>
+      </w:r>
+      <w:proofErr w:type="spellEnd"/>
+      <w:r>
+        <w:rPr>
+          <w:rFonts w:ascii="Times New Roman" w:hAnsi="Times New Roman" w:cs="Times New Roman"/>
+        </w:rPr>
+        <w:t xml:space="preserve"> interceptor in api.js automatically attaches it to every request. Next, we’ll move all alerts and uploads to in-memory storage by creating an alerts array in the backend, with routes to fetch alerts and to acknowledge them. The upload route will push a few sample alerts tab have real data to display. The Alerts component will be updated to show these alerts with </w:t>
+      </w:r>
+      <w:proofErr w:type="spellStart"/>
+      <w:r>
+        <w:rPr>
+          <w:rFonts w:ascii="Times New Roman" w:hAnsi="Times New Roman" w:cs="Times New Roman"/>
+        </w:rPr>
+        <w:t>color</w:t>
+      </w:r>
+      <w:proofErr w:type="spellEnd"/>
+      <w:r>
+        <w:rPr>
+          <w:rFonts w:ascii="Times New Roman" w:hAnsi="Times New Roman" w:cs="Times New Roman"/>
+        </w:rPr>
+        <w:t xml:space="preserve"> coding and an “Acknowledge” button that </w:t>
+      </w:r>
+      <w:proofErr w:type="spellStart"/>
+      <w:r>
+        <w:rPr>
+          <w:rFonts w:ascii="Times New Roman" w:hAnsi="Times New Roman" w:cs="Times New Roman"/>
+        </w:rPr>
+        <w:t>grays</w:t>
+      </w:r>
+      <w:proofErr w:type="spellEnd"/>
+      <w:r>
+        <w:rPr>
+          <w:rFonts w:ascii="Times New Roman" w:hAnsi="Times New Roman" w:cs="Times New Roman"/>
+        </w:rPr>
+        <w:t xml:space="preserve"> out the alert once clicked. Finally, we’ll enable CORS/test the full flow from Register to Login to Upload to </w:t>
+      </w:r>
+      <w:proofErr w:type="gramStart"/>
+      <w:r>
+        <w:rPr>
+          <w:rFonts w:ascii="Times New Roman" w:hAnsi="Times New Roman" w:cs="Times New Roman"/>
+        </w:rPr>
+        <w:t>Alerts, and</w:t>
+      </w:r>
+      <w:proofErr w:type="gramEnd"/>
+      <w:r>
+        <w:rPr>
+          <w:rFonts w:ascii="Times New Roman" w:hAnsi="Times New Roman" w:cs="Times New Roman"/>
+        </w:rPr>
+        <w:t xml:space="preserve"> fix any remaining 500</w:t>
+      </w:r>
+      <w:r>
+        <w:rPr>
+          <w:rFonts w:ascii="Times New Roman" w:hAnsi="Times New Roman" w:cs="Times New Roman"/>
+        </w:rPr>
+        <w:t xml:space="preserve"> or 401 errors. By the end of Day 16, the goal is to have a completely working demo with dummy data that proves the UI, auth, and alert logic are all connected and ready for real log parsing on Day 17.</w:t>
+      </w:r>
+    </w:p>
+    <w:p>
+      <w:pPr>
+        <w:rPr>
+          <w:rFonts w:ascii="Times New Roman" w:eastAsia="MS Gothic" w:hAnsi="Times New Roman" w:cs="Times New Roman"/>
+        </w:rPr>
+      </w:pPr>
+    </w:p>
+    <w:tbl>
+      <w:tblPr>
+        <w:tblW w:w="10701" w:type="dxa"/>
+        <w:tblCellMar>
+          <w:left w:w="10" w:type="dxa"/>
+          <w:right w:w="10" w:type="dxa"/>
+        </w:tblCellMar>
+        <w:tblLook w:val="04A0" w:firstRow="1" w:lastRow="0" w:firstColumn="1" w:lastColumn="0" w:noHBand="0" w:noVBand="1"/>
+      </w:tblPr>
+      <w:tblGrid>
+        <w:gridCol w:w="2674"/>
+        <w:gridCol w:w="4012"/>
+        <w:gridCol w:w="4015"/>
+      </w:tblGrid>
+      <w:tr>
+        <w:trPr>
+          <w:trHeight w:val="2539"/>
+        </w:trPr>
+        <w:tc>
+          <w:tcPr>
+            <w:tcW w:w="2674" w:type="dxa"/>
+            <w:tcBorders>
+              <w:top w:val="nil"/>
+              <w:left w:val="nil"/>
+              <w:bottom w:val="nil"/>
+              <w:right w:val="nil"/>
+            </w:tcBorders>
+            <w:tcMar>
+              <w:top w:w="0" w:type="dxa"/>
+              <w:left w:w="0" w:type="dxa"/>
+              <w:bottom w:w="0" w:type="dxa"/>
+              <w:right w:w="0" w:type="dxa"/>
+            </w:tcMar>
+            <w:hideMark/>
+          </w:tcPr>
+          <w:p>
+            <w:pPr>
+              <w:rPr>
+                <w:rFonts w:ascii="Times New Roman" w:hAnsi="Times New Roman" w:cs="Times New Roman"/>
+              </w:rPr>
+            </w:pPr>
+            <w:r>
+              <w:rPr>
+                <w:rFonts w:ascii="Times New Roman" w:hAnsi="Times New Roman" w:cs="Times New Roman"/>
+              </w:rPr>
+              <w:t xml:space="preserve">10 </w:t>
+            </w:r>
+            <w:r>
+              <w:rPr>
+                <w:rFonts w:ascii="Times New Roman" w:hAnsi="Times New Roman" w:cs="Times New Roman"/>
+              </w:rPr>
+              <w:t>August 2026</w:t>
+            </w:r>
+          </w:p>
+          <w:p>
+            <w:pPr>
+              <w:ind w:left="400"/>
+              <w:rPr>
+                <w:rFonts w:ascii="Times New Roman" w:hAnsi="Times New Roman" w:cs="Times New Roman"/>
+              </w:rPr>
+            </w:pPr>
+            <w:r>
+              <w:rPr>
+                <w:rFonts w:ascii="Times New Roman" w:hAnsi="Times New Roman" w:cs="Times New Roman"/>
+              </w:rPr>
+              <w:t>Day 1</w:t>
+            </w:r>
+            <w:r>
+              <w:rPr>
+                <w:rFonts w:ascii="Times New Roman" w:hAnsi="Times New Roman" w:cs="Times New Roman"/>
+              </w:rPr>
+              <w:t>7</w:t>
+            </w:r>
+          </w:p>
+        </w:tc>
+        <w:tc>
+          <w:tcPr>
+            <w:tcW w:w="4012" w:type="dxa"/>
+            <w:tcBorders>
+              <w:top w:val="nil"/>
+              <w:left w:val="nil"/>
+              <w:bottom w:val="nil"/>
+              <w:right w:val="nil"/>
+            </w:tcBorders>
+            <w:tcMar>
+              <w:top w:w="0" w:type="dxa"/>
+              <w:left w:w="0" w:type="dxa"/>
+              <w:bottom w:w="0" w:type="dxa"/>
+              <w:right w:w="0" w:type="dxa"/>
+            </w:tcMar>
+            <w:hideMark/>
+          </w:tcPr>
+          <w:p>
+            <w:pPr>
+              <w:rPr>
+                <w:rFonts w:ascii="Times New Roman" w:hAnsi="Times New Roman" w:cs="Times New Roman"/>
+                <w:b/>
+                <w:bCs/>
+              </w:rPr>
+            </w:pPr>
+            <w:r>
+              <w:rPr>
+                <w:rFonts w:ascii="Times New Roman" w:hAnsi="Times New Roman" w:cs="Times New Roman"/>
+                <w:b/>
+                <w:bCs/>
+              </w:rPr>
+              <w:t xml:space="preserve">Today's Activities </w:t>
+            </w:r>
+          </w:p>
+          <w:p>
+            <w:pPr>
+              <w:numPr>
+                <w:ilvl w:val="0"/>
+                <w:numId w:val="3"/>
+              </w:numPr>
+              <w:rPr>
+                <w:rFonts w:ascii="Times New Roman" w:hAnsi="Times New Roman" w:cs="Times New Roman"/>
+              </w:rPr>
+            </w:pPr>
+            <w:r>
+              <w:rPr>
+                <w:rFonts w:ascii="Times New Roman" w:hAnsi="Times New Roman" w:cs="Times New Roman"/>
+                <w:b/>
+                <w:bCs/>
+              </w:rPr>
+              <w:t xml:space="preserve"> </w:t>
+            </w:r>
+          </w:p>
+        </w:tc>
+        <w:tc>
+          <w:tcPr>
+            <w:tcW w:w="4015" w:type="dxa"/>
+            <w:tcBorders>
+              <w:top w:val="nil"/>
+              <w:left w:val="nil"/>
+              <w:bottom w:val="nil"/>
+              <w:right w:val="nil"/>
+            </w:tcBorders>
+            <w:tcMar>
+              <w:top w:w="0" w:type="dxa"/>
+              <w:left w:w="0" w:type="dxa"/>
+              <w:bottom w:w="0" w:type="dxa"/>
+              <w:right w:w="0" w:type="dxa"/>
+            </w:tcMar>
+            <w:hideMark/>
+          </w:tcPr>
+          <w:p>
+            <w:pPr>
+              <w:rPr>
+                <w:rFonts w:ascii="Times New Roman" w:hAnsi="Times New Roman" w:cs="Times New Roman"/>
+              </w:rPr>
+            </w:pPr>
+            <w:r>
+              <w:rPr>
+                <w:rFonts w:ascii="Times New Roman" w:hAnsi="Times New Roman" w:cs="Times New Roman"/>
+                <w:b/>
+                <w:bCs/>
+              </w:rPr>
+              <w:t xml:space="preserve">Tomorrow's Plans </w:t>
+            </w:r>
+          </w:p>
+          <w:p>
+            <w:pPr>
+              <w:numPr>
+                <w:ilvl w:val="0"/>
+                <w:numId w:val="4"/>
+              </w:numPr>
+              <w:rPr>
+                <w:rFonts w:ascii="Times New Roman" w:hAnsi="Times New Roman" w:cs="Times New Roman"/>
+              </w:rPr>
+            </w:pPr>
+          </w:p>
+        </w:tc>
+      </w:tr>
+      <w:tr>
+        <w:trPr>
+          <w:trHeight w:val="193"/>
+        </w:trPr>
+        <w:tc>
+          <w:tcPr>
+            <w:tcW w:w="10701" w:type="dxa"/>
+            <w:gridSpan w:val="3"/>
+            <w:tcBorders>
+              <w:top w:val="nil"/>
+              <w:left w:val="nil"/>
+              <w:bottom w:val="nil"/>
+              <w:right w:val="nil"/>
+            </w:tcBorders>
+            <w:tcMar>
+              <w:top w:w="0" w:type="dxa"/>
+              <w:left w:w="0" w:type="dxa"/>
+              <w:bottom w:w="0" w:type="dxa"/>
+              <w:right w:w="0" w:type="dxa"/>
+            </w:tcMar>
+            <w:hideMark/>
+          </w:tcPr>
+          <w:p>
+            <w:pPr>
+              <w:rPr>
+                <w:rFonts w:ascii="Times New Roman" w:hAnsi="Times New Roman" w:cs="Times New Roman"/>
+                <w:b/>
+                <w:bCs/>
+              </w:rPr>
+            </w:pPr>
+            <w:r>
+              <w:rPr>
+                <w:rFonts w:ascii="Times New Roman" w:hAnsi="Times New Roman" w:cs="Times New Roman"/>
+                <w:b/>
+                <w:bCs/>
+              </w:rPr>
+              <w:t>Outputs and Descriptions</w:t>
+            </w:r>
+          </w:p>
+          <w:p>
+            <w:pPr>
+              <w:rPr>
+                <w:rFonts w:ascii="Times New Roman" w:hAnsi="Times New Roman" w:cs="Times New Roman"/>
+              </w:rPr>
+            </w:pPr>
+            <w:r>
+              <w:rPr>
+                <w:rFonts w:ascii="Times New Roman" w:hAnsi="Times New Roman" w:cs="Times New Roman"/>
+                <w:b/>
+                <w:bCs/>
+              </w:rPr>
+              <w:t>Output:</w:t>
+            </w:r>
+            <w:r>
+              <w:rPr>
+                <w:rFonts w:ascii="Times New Roman" w:hAnsi="Times New Roman" w:cs="Times New Roman"/>
+              </w:rPr>
+              <w:t xml:space="preserve"> </w:t>
+            </w:r>
+          </w:p>
+          <w:p>
+            <w:pPr>
+              <w:rPr>
+                <w:rFonts w:ascii="Times New Roman" w:hAnsi="Times New Roman" w:cs="Times New Roman"/>
+                <w:b/>
+                <w:bCs/>
+              </w:rPr>
+            </w:pPr>
+            <w:r>
+              <w:rPr>
+                <w:rFonts w:ascii="Times New Roman" w:hAnsi="Times New Roman" w:cs="Times New Roman"/>
+                <w:b/>
+                <w:bCs/>
+              </w:rPr>
+              <w:t xml:space="preserve"> </w:t>
+            </w:r>
+          </w:p>
+        </w:tc>
+      </w:tr>
+    </w:tbl>
+    <w:p>
+      <w:pPr>
+        <w:rPr>
+          <w:rFonts w:ascii="Times New Roman" w:eastAsia="MS Gothic" w:hAnsi="Times New Roman" w:cs="Times New Roman"/>
+        </w:rPr>
+      </w:pPr>
+      <w:r>
+        <w:rPr>
+          <w:rFonts w:ascii="Times New Roman" w:hAnsi="Times New Roman" w:cs="Times New Roman"/>
+          <w:b/>
+          <w:bCs/>
+        </w:rPr>
+        <w:t>Description:</w:t>
+      </w:r>
+      <w:r>
+        <w:rPr>
+          <w:rFonts w:ascii="Times New Roman" w:hAnsi="Times New Roman" w:cs="Times New Roman"/>
+        </w:rPr>
+        <w:t xml:space="preserve"> </w:t>
+      </w:r>
+    </w:p>
+    <w:p>
+      <w:pPr>
+        <w:rPr>
+          <w:rFonts w:ascii="Times New Roman" w:hAnsi="Times New Roman" w:cs="Times New Roman"/>
+        </w:rPr>
+      </w:pPr>
+    </w:p>
+    <w:p>
+      <w:pPr>
+        <w:rPr>
+          <w:rFonts w:ascii="Times New Roman" w:eastAsia="MS Gothic" w:hAnsi="Times New Roman" w:cs="Times New Roman"/>
+        </w:rPr>
+      </w:pPr>
+    </w:p>
+    <w:tbl>
+      <w:tblPr>
+        <w:tblW w:w="10701" w:type="dxa"/>
+        <w:tblCellMar>
+          <w:left w:w="10" w:type="dxa"/>
+          <w:right w:w="10" w:type="dxa"/>
+        </w:tblCellMar>
+        <w:tblLook w:val="04A0" w:firstRow="1" w:lastRow="0" w:firstColumn="1" w:lastColumn="0" w:noHBand="0" w:noVBand="1"/>
+      </w:tblPr>
+      <w:tblGrid>
+        <w:gridCol w:w="2674"/>
+        <w:gridCol w:w="4012"/>
+        <w:gridCol w:w="4015"/>
+      </w:tblGrid>
+      <w:tr>
+        <w:trPr>
+          <w:trHeight w:val="2539"/>
+        </w:trPr>
+        <w:tc>
+          <w:tcPr>
+            <w:tcW w:w="2674" w:type="dxa"/>
+            <w:tcBorders>
+              <w:top w:val="nil"/>
+              <w:left w:val="nil"/>
+              <w:bottom w:val="nil"/>
+              <w:right w:val="nil"/>
+            </w:tcBorders>
+            <w:tcMar>
+              <w:top w:w="0" w:type="dxa"/>
+              <w:left w:w="0" w:type="dxa"/>
+              <w:bottom w:w="0" w:type="dxa"/>
+              <w:right w:w="0" w:type="dxa"/>
+            </w:tcMar>
+            <w:hideMark/>
+          </w:tcPr>
+          <w:p>
+            <w:pPr>
+              <w:rPr>
+                <w:rFonts w:ascii="Times New Roman" w:hAnsi="Times New Roman" w:cs="Times New Roman"/>
+              </w:rPr>
+            </w:pPr>
+            <w:r>
+              <w:rPr>
+                <w:rFonts w:ascii="Times New Roman" w:hAnsi="Times New Roman" w:cs="Times New Roman"/>
+              </w:rPr>
+              <w:lastRenderedPageBreak/>
+              <w:t>1</w:t>
+            </w:r>
+            <w:r>
+              <w:rPr>
+                <w:rFonts w:ascii="Times New Roman" w:hAnsi="Times New Roman" w:cs="Times New Roman"/>
+              </w:rPr>
+              <w:t>1</w:t>
+            </w:r>
+            <w:r>
+              <w:rPr>
+                <w:rFonts w:ascii="Times New Roman" w:hAnsi="Times New Roman" w:cs="Times New Roman"/>
+              </w:rPr>
+              <w:t xml:space="preserve"> </w:t>
+            </w:r>
+            <w:r>
+              <w:rPr>
+                <w:rFonts w:ascii="Times New Roman" w:hAnsi="Times New Roman" w:cs="Times New Roman"/>
+              </w:rPr>
+              <w:t>August 2026</w:t>
+            </w:r>
+          </w:p>
+          <w:p>
+            <w:pPr>
+              <w:ind w:left="400"/>
+              <w:rPr>
+                <w:rFonts w:ascii="Times New Roman" w:hAnsi="Times New Roman" w:cs="Times New Roman"/>
+              </w:rPr>
+            </w:pPr>
+            <w:r>
+              <w:rPr>
+                <w:rFonts w:ascii="Times New Roman" w:hAnsi="Times New Roman" w:cs="Times New Roman"/>
+              </w:rPr>
+              <w:t>Day 1</w:t>
+            </w:r>
+            <w:r>
+              <w:rPr>
+                <w:rFonts w:ascii="Times New Roman" w:hAnsi="Times New Roman" w:cs="Times New Roman"/>
+              </w:rPr>
+              <w:t>8</w:t>
+            </w:r>
+          </w:p>
+        </w:tc>
+        <w:tc>
+          <w:tcPr>
+            <w:tcW w:w="4012" w:type="dxa"/>
+            <w:tcBorders>
+              <w:top w:val="nil"/>
+              <w:left w:val="nil"/>
+              <w:bottom w:val="nil"/>
+              <w:right w:val="nil"/>
+            </w:tcBorders>
+            <w:tcMar>
+              <w:top w:w="0" w:type="dxa"/>
+              <w:left w:w="0" w:type="dxa"/>
+              <w:bottom w:w="0" w:type="dxa"/>
+              <w:right w:w="0" w:type="dxa"/>
+            </w:tcMar>
+            <w:hideMark/>
+          </w:tcPr>
+          <w:p>
+            <w:pPr>
+              <w:rPr>
+                <w:rFonts w:ascii="Times New Roman" w:hAnsi="Times New Roman" w:cs="Times New Roman"/>
+                <w:b/>
+                <w:bCs/>
+              </w:rPr>
+            </w:pPr>
+            <w:r>
+              <w:rPr>
+                <w:rFonts w:ascii="Times New Roman" w:hAnsi="Times New Roman" w:cs="Times New Roman"/>
+                <w:b/>
+                <w:bCs/>
+              </w:rPr>
+              <w:t xml:space="preserve">Today's Activities </w:t>
+            </w:r>
+          </w:p>
+          <w:p>
+            <w:pPr>
+              <w:numPr>
+                <w:ilvl w:val="0"/>
+                <w:numId w:val="3"/>
+              </w:numPr>
+              <w:rPr>
+                <w:rFonts w:ascii="Times New Roman" w:hAnsi="Times New Roman" w:cs="Times New Roman"/>
+              </w:rPr>
+            </w:pPr>
+            <w:r>
+              <w:rPr>
+                <w:rFonts w:ascii="Times New Roman" w:hAnsi="Times New Roman" w:cs="Times New Roman"/>
+                <w:b/>
+                <w:bCs/>
+              </w:rPr>
+              <w:t xml:space="preserve"> </w:t>
+            </w:r>
+          </w:p>
+        </w:tc>
+        <w:tc>
+          <w:tcPr>
+            <w:tcW w:w="4015" w:type="dxa"/>
+            <w:tcBorders>
+              <w:top w:val="nil"/>
+              <w:left w:val="nil"/>
+              <w:bottom w:val="nil"/>
+              <w:right w:val="nil"/>
+            </w:tcBorders>
+            <w:tcMar>
+              <w:top w:w="0" w:type="dxa"/>
+              <w:left w:w="0" w:type="dxa"/>
+              <w:bottom w:w="0" w:type="dxa"/>
+              <w:right w:w="0" w:type="dxa"/>
+            </w:tcMar>
+            <w:hideMark/>
+          </w:tcPr>
+          <w:p>
+            <w:pPr>
+              <w:rPr>
+                <w:rFonts w:ascii="Times New Roman" w:hAnsi="Times New Roman" w:cs="Times New Roman"/>
+              </w:rPr>
+            </w:pPr>
+            <w:r>
+              <w:rPr>
+                <w:rFonts w:ascii="Times New Roman" w:hAnsi="Times New Roman" w:cs="Times New Roman"/>
+                <w:b/>
+                <w:bCs/>
+              </w:rPr>
+              <w:t xml:space="preserve">Tomorrow's Plans </w:t>
+            </w:r>
+          </w:p>
+          <w:p>
+            <w:pPr>
+              <w:numPr>
+                <w:ilvl w:val="0"/>
+                <w:numId w:val="4"/>
+              </w:numPr>
+              <w:rPr>
+                <w:rFonts w:ascii="Times New Roman" w:hAnsi="Times New Roman" w:cs="Times New Roman"/>
+              </w:rPr>
+            </w:pPr>
+          </w:p>
+        </w:tc>
+      </w:tr>
+      <w:tr>
+        <w:trPr>
+          <w:trHeight w:val="193"/>
+        </w:trPr>
+        <w:tc>
+          <w:tcPr>
+            <w:tcW w:w="10701" w:type="dxa"/>
+            <w:gridSpan w:val="3"/>
+            <w:tcBorders>
+              <w:top w:val="nil"/>
+              <w:left w:val="nil"/>
+              <w:bottom w:val="nil"/>
+              <w:right w:val="nil"/>
+            </w:tcBorders>
+            <w:tcMar>
+              <w:top w:w="0" w:type="dxa"/>
+              <w:left w:w="0" w:type="dxa"/>
+              <w:bottom w:w="0" w:type="dxa"/>
+              <w:right w:w="0" w:type="dxa"/>
+            </w:tcMar>
+            <w:hideMark/>
+          </w:tcPr>
+          <w:p>
+            <w:pPr>
+              <w:rPr>
+                <w:rFonts w:ascii="Times New Roman" w:hAnsi="Times New Roman" w:cs="Times New Roman"/>
+                <w:b/>
+                <w:bCs/>
+              </w:rPr>
+            </w:pPr>
+            <w:r>
+              <w:rPr>
+                <w:rFonts w:ascii="Times New Roman" w:hAnsi="Times New Roman" w:cs="Times New Roman"/>
+                <w:b/>
+                <w:bCs/>
+              </w:rPr>
+              <w:t>Outputs and Descriptions</w:t>
+            </w:r>
+          </w:p>
+          <w:p>
+            <w:pPr>
+              <w:rPr>
+                <w:rFonts w:ascii="Times New Roman" w:hAnsi="Times New Roman" w:cs="Times New Roman"/>
+              </w:rPr>
+            </w:pPr>
+            <w:r>
+              <w:rPr>
+                <w:rFonts w:ascii="Times New Roman" w:hAnsi="Times New Roman" w:cs="Times New Roman"/>
+                <w:b/>
+                <w:bCs/>
+              </w:rPr>
+              <w:t>Output:</w:t>
+            </w:r>
+            <w:r>
+              <w:rPr>
+                <w:rFonts w:ascii="Times New Roman" w:hAnsi="Times New Roman" w:cs="Times New Roman"/>
+              </w:rPr>
+              <w:t xml:space="preserve"> </w:t>
+            </w:r>
+          </w:p>
+          <w:p>
+            <w:pPr>
+              <w:rPr>
+                <w:rFonts w:ascii="Times New Roman" w:hAnsi="Times New Roman" w:cs="Times New Roman"/>
+                <w:b/>
+                <w:bCs/>
+              </w:rPr>
+            </w:pPr>
+            <w:r>
+              <w:rPr>
+                <w:rFonts w:ascii="Times New Roman" w:hAnsi="Times New Roman" w:cs="Times New Roman"/>
+                <w:b/>
+                <w:bCs/>
+              </w:rPr>
+              <w:t xml:space="preserve"> </w:t>
+            </w:r>
+          </w:p>
+        </w:tc>
+      </w:tr>
+    </w:tbl>
+    <w:p>
+      <w:pPr>
+        <w:rPr>
+          <w:rFonts w:ascii="Times New Roman" w:eastAsia="MS Gothic" w:hAnsi="Times New Roman" w:cs="Times New Roman"/>
+        </w:rPr>
+      </w:pPr>
+      <w:r>
+        <w:rPr>
+          <w:rFonts w:ascii="Times New Roman" w:hAnsi="Times New Roman" w:cs="Times New Roman"/>
+          <w:b/>
+          <w:bCs/>
+        </w:rPr>
+        <w:t>Description:</w:t>
+      </w:r>
+      <w:r>
+        <w:rPr>
+          <w:rFonts w:ascii="Times New Roman" w:hAnsi="Times New Roman" w:cs="Times New Roman"/>
+        </w:rPr>
+        <w:t xml:space="preserve"> </w:t>
+      </w:r>
+    </w:p>
+    <w:p>
+      <w:pPr>
+        <w:rPr>
+          <w:rFonts w:ascii="Times New Roman" w:hAnsi="Times New Roman" w:cs="Times New Roman"/>
+        </w:rPr>
+      </w:pPr>
     </w:p>
     <w:p>
       <w:pPr>
@@ -25031,6 +27511,119 @@
     </w:lvl>
   </w:abstractNum>
   <w:abstractNum w:abstractNumId="16" w15:restartNumberingAfterBreak="0">
+    <w:nsid w:val="0D0B1AAA"/>
+    <w:multiLevelType w:val="hybridMultilevel"/>
+    <w:tmpl w:val="2B5CEBD6"/>
+    <w:lvl w:ilvl="0" w:tplc="4009000B">
+      <w:start w:val="1"/>
+      <w:numFmt w:val="bullet"/>
+      <w:lvlText w:val=""/>
+      <w:lvlJc w:val="left"/>
+      <w:pPr>
+        <w:ind w:left="1120" w:hanging="360"/>
+      </w:pPr>
+      <w:rPr>
+        <w:rFonts w:ascii="Wingdings" w:hAnsi="Wingdings" w:hint="default"/>
+      </w:rPr>
+    </w:lvl>
+    <w:lvl w:ilvl="1" w:tplc="40090003" w:tentative="1">
+      <w:start w:val="1"/>
+      <w:numFmt w:val="bullet"/>
+      <w:lvlText w:val="o"/>
+      <w:lvlJc w:val="left"/>
+      <w:pPr>
+        <w:ind w:left="1840" w:hanging="360"/>
+      </w:pPr>
+      <w:rPr>
+        <w:rFonts w:ascii="Courier New" w:hAnsi="Courier New" w:cs="Courier New" w:hint="default"/>
+      </w:rPr>
+    </w:lvl>
+    <w:lvl w:ilvl="2" w:tplc="40090005" w:tentative="1">
+      <w:start w:val="1"/>
+      <w:numFmt w:val="bullet"/>
+      <w:lvlText w:val=""/>
+      <w:lvlJc w:val="left"/>
+      <w:pPr>
+        <w:ind w:left="2560" w:hanging="360"/>
+      </w:pPr>
+      <w:rPr>
+        <w:rFonts w:ascii="Wingdings" w:hAnsi="Wingdings" w:hint="default"/>
+      </w:rPr>
+    </w:lvl>
+    <w:lvl w:ilvl="3" w:tplc="40090001" w:tentative="1">
+      <w:start w:val="1"/>
+      <w:numFmt w:val="bullet"/>
+      <w:lvlText w:val=""/>
+      <w:lvlJc w:val="left"/>
+      <w:pPr>
+        <w:ind w:left="3280" w:hanging="360"/>
+      </w:pPr>
+      <w:rPr>
+        <w:rFonts w:ascii="Symbol" w:hAnsi="Symbol" w:hint="default"/>
+      </w:rPr>
+    </w:lvl>
+    <w:lvl w:ilvl="4" w:tplc="40090003" w:tentative="1">
+      <w:start w:val="1"/>
+      <w:numFmt w:val="bullet"/>
+      <w:lvlText w:val="o"/>
+      <w:lvlJc w:val="left"/>
+      <w:pPr>
+        <w:ind w:left="4000" w:hanging="360"/>
+      </w:pPr>
+      <w:rPr>
+        <w:rFonts w:ascii="Courier New" w:hAnsi="Courier New" w:cs="Courier New" w:hint="default"/>
+      </w:rPr>
+    </w:lvl>
+    <w:lvl w:ilvl="5" w:tplc="40090005" w:tentative="1">
+      <w:start w:val="1"/>
+      <w:numFmt w:val="bullet"/>
+      <w:lvlText w:val=""/>
+      <w:lvlJc w:val="left"/>
+      <w:pPr>
+        <w:ind w:left="4720" w:hanging="360"/>
+      </w:pPr>
+      <w:rPr>
+        <w:rFonts w:ascii="Wingdings" w:hAnsi="Wingdings" w:hint="default"/>
+      </w:rPr>
+    </w:lvl>
+    <w:lvl w:ilvl="6" w:tplc="40090001" w:tentative="1">
+      <w:start w:val="1"/>
+      <w:numFmt w:val="bullet"/>
+      <w:lvlText w:val=""/>
+      <w:lvlJc w:val="left"/>
+      <w:pPr>
+        <w:ind w:left="5440" w:hanging="360"/>
+      </w:pPr>
+      <w:rPr>
+        <w:rFonts w:ascii="Symbol" w:hAnsi="Symbol" w:hint="default"/>
+      </w:rPr>
+    </w:lvl>
+    <w:lvl w:ilvl="7" w:tplc="40090003" w:tentative="1">
+      <w:start w:val="1"/>
+      <w:numFmt w:val="bullet"/>
+      <w:lvlText w:val="o"/>
+      <w:lvlJc w:val="left"/>
+      <w:pPr>
+        <w:ind w:left="6160" w:hanging="360"/>
+      </w:pPr>
+      <w:rPr>
+        <w:rFonts w:ascii="Courier New" w:hAnsi="Courier New" w:cs="Courier New" w:hint="default"/>
+      </w:rPr>
+    </w:lvl>
+    <w:lvl w:ilvl="8" w:tplc="40090005" w:tentative="1">
+      <w:start w:val="1"/>
+      <w:numFmt w:val="bullet"/>
+      <w:lvlText w:val=""/>
+      <w:lvlJc w:val="left"/>
+      <w:pPr>
+        <w:ind w:left="6880" w:hanging="360"/>
+      </w:pPr>
+      <w:rPr>
+        <w:rFonts w:ascii="Wingdings" w:hAnsi="Wingdings" w:hint="default"/>
+      </w:rPr>
+    </w:lvl>
+  </w:abstractNum>
+  <w:abstractNum w:abstractNumId="17" w15:restartNumberingAfterBreak="0">
     <w:nsid w:val="0D743D1F"/>
     <w:multiLevelType w:val="hybridMultilevel"/>
     <w:tmpl w:val="A1F855A6"/>
@@ -25139,7 +27732,7 @@
       </w:pPr>
     </w:lvl>
   </w:abstractNum>
-  <w:abstractNum w:abstractNumId="17" w15:restartNumberingAfterBreak="0">
+  <w:abstractNum w:abstractNumId="18" w15:restartNumberingAfterBreak="0">
     <w:nsid w:val="0ED41A8C"/>
     <w:multiLevelType w:val="hybridMultilevel"/>
     <w:tmpl w:val="39BE9BB4"/>
@@ -25252,7 +27845,7 @@
       </w:rPr>
     </w:lvl>
   </w:abstractNum>
-  <w:abstractNum w:abstractNumId="18" w15:restartNumberingAfterBreak="0">
+  <w:abstractNum w:abstractNumId="19" w15:restartNumberingAfterBreak="0">
     <w:nsid w:val="0F7D6AA2"/>
     <w:multiLevelType w:val="hybridMultilevel"/>
     <w:tmpl w:val="1E34183E"/>
@@ -25365,7 +27958,7 @@
       </w:rPr>
     </w:lvl>
   </w:abstractNum>
-  <w:abstractNum w:abstractNumId="19" w15:restartNumberingAfterBreak="0">
+  <w:abstractNum w:abstractNumId="20" w15:restartNumberingAfterBreak="0">
     <w:nsid w:val="10E977AF"/>
     <w:multiLevelType w:val="hybridMultilevel"/>
     <w:tmpl w:val="A91AFD52"/>
@@ -25478,7 +28071,7 @@
       </w:rPr>
     </w:lvl>
   </w:abstractNum>
-  <w:abstractNum w:abstractNumId="20" w15:restartNumberingAfterBreak="0">
+  <w:abstractNum w:abstractNumId="21" w15:restartNumberingAfterBreak="0">
     <w:nsid w:val="110C1F0A"/>
     <w:multiLevelType w:val="hybridMultilevel"/>
     <w:tmpl w:val="12800908"/>
@@ -25591,7 +28184,7 @@
       </w:rPr>
     </w:lvl>
   </w:abstractNum>
-  <w:abstractNum w:abstractNumId="21" w15:restartNumberingAfterBreak="0">
+  <w:abstractNum w:abstractNumId="22" w15:restartNumberingAfterBreak="0">
     <w:nsid w:val="11E40B49"/>
     <w:multiLevelType w:val="hybridMultilevel"/>
     <w:tmpl w:val="3B14F05C"/>
@@ -25704,7 +28297,7 @@
       </w:rPr>
     </w:lvl>
   </w:abstractNum>
-  <w:abstractNum w:abstractNumId="22" w15:restartNumberingAfterBreak="0">
+  <w:abstractNum w:abstractNumId="23" w15:restartNumberingAfterBreak="0">
     <w:nsid w:val="12D534F3"/>
     <w:multiLevelType w:val="hybridMultilevel"/>
     <w:tmpl w:val="6D9A2CFE"/>
@@ -25817,7 +28410,7 @@
       </w:rPr>
     </w:lvl>
   </w:abstractNum>
-  <w:abstractNum w:abstractNumId="23" w15:restartNumberingAfterBreak="0">
+  <w:abstractNum w:abstractNumId="24" w15:restartNumberingAfterBreak="0">
     <w:nsid w:val="13AA0395"/>
     <w:multiLevelType w:val="hybridMultilevel"/>
     <w:tmpl w:val="41421288"/>
@@ -25930,7 +28523,7 @@
       </w:rPr>
     </w:lvl>
   </w:abstractNum>
-  <w:abstractNum w:abstractNumId="24" w15:restartNumberingAfterBreak="0">
+  <w:abstractNum w:abstractNumId="25" w15:restartNumberingAfterBreak="0">
     <w:nsid w:val="14175B67"/>
     <w:multiLevelType w:val="hybridMultilevel"/>
     <w:tmpl w:val="776493DA"/>
@@ -26039,7 +28632,7 @@
       </w:pPr>
     </w:lvl>
   </w:abstractNum>
-  <w:abstractNum w:abstractNumId="25" w15:restartNumberingAfterBreak="0">
+  <w:abstractNum w:abstractNumId="26" w15:restartNumberingAfterBreak="0">
     <w:nsid w:val="17096475"/>
     <w:multiLevelType w:val="hybridMultilevel"/>
     <w:tmpl w:val="577CBEB0"/>
@@ -26152,7 +28745,7 @@
       </w:rPr>
     </w:lvl>
   </w:abstractNum>
-  <w:abstractNum w:abstractNumId="26" w15:restartNumberingAfterBreak="0">
+  <w:abstractNum w:abstractNumId="27" w15:restartNumberingAfterBreak="0">
     <w:nsid w:val="191168A3"/>
     <w:multiLevelType w:val="hybridMultilevel"/>
     <w:tmpl w:val="0DB2DA64"/>
@@ -26265,7 +28858,7 @@
       </w:rPr>
     </w:lvl>
   </w:abstractNum>
-  <w:abstractNum w:abstractNumId="27" w15:restartNumberingAfterBreak="0">
+  <w:abstractNum w:abstractNumId="28" w15:restartNumberingAfterBreak="0">
     <w:nsid w:val="1BFB1534"/>
     <w:multiLevelType w:val="hybridMultilevel"/>
     <w:tmpl w:val="319475F4"/>
@@ -26378,7 +28971,7 @@
       </w:rPr>
     </w:lvl>
   </w:abstractNum>
-  <w:abstractNum w:abstractNumId="28" w15:restartNumberingAfterBreak="0">
+  <w:abstractNum w:abstractNumId="29" w15:restartNumberingAfterBreak="0">
     <w:nsid w:val="1CA516B8"/>
     <w:multiLevelType w:val="hybridMultilevel"/>
     <w:tmpl w:val="9A042BF6"/>
@@ -26491,7 +29084,7 @@
       </w:rPr>
     </w:lvl>
   </w:abstractNum>
-  <w:abstractNum w:abstractNumId="29" w15:restartNumberingAfterBreak="0">
+  <w:abstractNum w:abstractNumId="30" w15:restartNumberingAfterBreak="0">
     <w:nsid w:val="1CAF1FF3"/>
     <w:multiLevelType w:val="hybridMultilevel"/>
     <w:tmpl w:val="9C32CCA0"/>
@@ -26604,7 +29197,7 @@
       </w:rPr>
     </w:lvl>
   </w:abstractNum>
-  <w:abstractNum w:abstractNumId="30" w15:restartNumberingAfterBreak="0">
+  <w:abstractNum w:abstractNumId="31" w15:restartNumberingAfterBreak="0">
     <w:nsid w:val="1D644E5C"/>
     <w:multiLevelType w:val="hybridMultilevel"/>
     <w:tmpl w:val="A7BC5C5E"/>
@@ -26717,7 +29310,7 @@
       </w:rPr>
     </w:lvl>
   </w:abstractNum>
-  <w:abstractNum w:abstractNumId="31" w15:restartNumberingAfterBreak="0">
+  <w:abstractNum w:abstractNumId="32" w15:restartNumberingAfterBreak="0">
     <w:nsid w:val="1F6474BC"/>
     <w:multiLevelType w:val="hybridMultilevel"/>
     <w:tmpl w:val="2EB4095E"/>
@@ -26830,7 +29423,7 @@
       </w:rPr>
     </w:lvl>
   </w:abstractNum>
-  <w:abstractNum w:abstractNumId="32" w15:restartNumberingAfterBreak="0">
+  <w:abstractNum w:abstractNumId="33" w15:restartNumberingAfterBreak="0">
     <w:nsid w:val="22DB65EA"/>
     <w:multiLevelType w:val="hybridMultilevel"/>
     <w:tmpl w:val="0F7C5664"/>
@@ -26943,7 +29536,7 @@
       </w:rPr>
     </w:lvl>
   </w:abstractNum>
-  <w:abstractNum w:abstractNumId="33" w15:restartNumberingAfterBreak="0">
+  <w:abstractNum w:abstractNumId="34" w15:restartNumberingAfterBreak="0">
     <w:nsid w:val="232628BC"/>
     <w:multiLevelType w:val="hybridMultilevel"/>
     <w:tmpl w:val="BB22A51E"/>
@@ -27056,7 +29649,7 @@
       </w:rPr>
     </w:lvl>
   </w:abstractNum>
-  <w:abstractNum w:abstractNumId="34" w15:restartNumberingAfterBreak="0">
+  <w:abstractNum w:abstractNumId="35" w15:restartNumberingAfterBreak="0">
     <w:nsid w:val="23F9362A"/>
     <w:multiLevelType w:val="hybridMultilevel"/>
     <w:tmpl w:val="52B691FA"/>
@@ -27169,7 +29762,7 @@
       </w:rPr>
     </w:lvl>
   </w:abstractNum>
-  <w:abstractNum w:abstractNumId="35" w15:restartNumberingAfterBreak="0">
+  <w:abstractNum w:abstractNumId="36" w15:restartNumberingAfterBreak="0">
     <w:nsid w:val="244E0056"/>
     <w:multiLevelType w:val="hybridMultilevel"/>
     <w:tmpl w:val="0DFAAEE2"/>
@@ -27282,7 +29875,7 @@
       </w:rPr>
     </w:lvl>
   </w:abstractNum>
-  <w:abstractNum w:abstractNumId="36" w15:restartNumberingAfterBreak="0">
+  <w:abstractNum w:abstractNumId="37" w15:restartNumberingAfterBreak="0">
     <w:nsid w:val="260B2D54"/>
     <w:multiLevelType w:val="hybridMultilevel"/>
     <w:tmpl w:val="3B3CBCFA"/>
@@ -27395,7 +29988,7 @@
       </w:rPr>
     </w:lvl>
   </w:abstractNum>
-  <w:abstractNum w:abstractNumId="37" w15:restartNumberingAfterBreak="0">
+  <w:abstractNum w:abstractNumId="38" w15:restartNumberingAfterBreak="0">
     <w:nsid w:val="264859EB"/>
     <w:multiLevelType w:val="hybridMultilevel"/>
     <w:tmpl w:val="9976F274"/>
@@ -27508,7 +30101,7 @@
       </w:rPr>
     </w:lvl>
   </w:abstractNum>
-  <w:abstractNum w:abstractNumId="38" w15:restartNumberingAfterBreak="0">
+  <w:abstractNum w:abstractNumId="39" w15:restartNumberingAfterBreak="0">
     <w:nsid w:val="2662319A"/>
     <w:multiLevelType w:val="hybridMultilevel"/>
     <w:tmpl w:val="7FBE34F2"/>
@@ -27621,7 +30214,7 @@
       </w:rPr>
     </w:lvl>
   </w:abstractNum>
-  <w:abstractNum w:abstractNumId="39" w15:restartNumberingAfterBreak="0">
+  <w:abstractNum w:abstractNumId="40" w15:restartNumberingAfterBreak="0">
     <w:nsid w:val="27A05930"/>
     <w:multiLevelType w:val="hybridMultilevel"/>
     <w:tmpl w:val="11F2E8B4"/>
@@ -27734,7 +30327,7 @@
       </w:rPr>
     </w:lvl>
   </w:abstractNum>
-  <w:abstractNum w:abstractNumId="40" w15:restartNumberingAfterBreak="0">
+  <w:abstractNum w:abstractNumId="41" w15:restartNumberingAfterBreak="0">
     <w:nsid w:val="294C7996"/>
     <w:multiLevelType w:val="hybridMultilevel"/>
     <w:tmpl w:val="6540B1F6"/>
@@ -27847,7 +30440,233 @@
       </w:rPr>
     </w:lvl>
   </w:abstractNum>
-  <w:abstractNum w:abstractNumId="41" w15:restartNumberingAfterBreak="0">
+  <w:abstractNum w:abstractNumId="42" w15:restartNumberingAfterBreak="0">
+    <w:nsid w:val="29FB3CCE"/>
+    <w:multiLevelType w:val="hybridMultilevel"/>
+    <w:tmpl w:val="D1149A02"/>
+    <w:lvl w:ilvl="0" w:tplc="4009000B">
+      <w:start w:val="1"/>
+      <w:numFmt w:val="bullet"/>
+      <w:lvlText w:val=""/>
+      <w:lvlJc w:val="left"/>
+      <w:pPr>
+        <w:ind w:left="1120" w:hanging="360"/>
+      </w:pPr>
+      <w:rPr>
+        <w:rFonts w:ascii="Wingdings" w:hAnsi="Wingdings" w:hint="default"/>
+      </w:rPr>
+    </w:lvl>
+    <w:lvl w:ilvl="1" w:tplc="40090003" w:tentative="1">
+      <w:start w:val="1"/>
+      <w:numFmt w:val="bullet"/>
+      <w:lvlText w:val="o"/>
+      <w:lvlJc w:val="left"/>
+      <w:pPr>
+        <w:ind w:left="1840" w:hanging="360"/>
+      </w:pPr>
+      <w:rPr>
+        <w:rFonts w:ascii="Courier New" w:hAnsi="Courier New" w:cs="Courier New" w:hint="default"/>
+      </w:rPr>
+    </w:lvl>
+    <w:lvl w:ilvl="2" w:tplc="40090005" w:tentative="1">
+      <w:start w:val="1"/>
+      <w:numFmt w:val="bullet"/>
+      <w:lvlText w:val=""/>
+      <w:lvlJc w:val="left"/>
+      <w:pPr>
+        <w:ind w:left="2560" w:hanging="360"/>
+      </w:pPr>
+      <w:rPr>
+        <w:rFonts w:ascii="Wingdings" w:hAnsi="Wingdings" w:hint="default"/>
+      </w:rPr>
+    </w:lvl>
+    <w:lvl w:ilvl="3" w:tplc="40090001" w:tentative="1">
+      <w:start w:val="1"/>
+      <w:numFmt w:val="bullet"/>
+      <w:lvlText w:val=""/>
+      <w:lvlJc w:val="left"/>
+      <w:pPr>
+        <w:ind w:left="3280" w:hanging="360"/>
+      </w:pPr>
+      <w:rPr>
+        <w:rFonts w:ascii="Symbol" w:hAnsi="Symbol" w:hint="default"/>
+      </w:rPr>
+    </w:lvl>
+    <w:lvl w:ilvl="4" w:tplc="40090003" w:tentative="1">
+      <w:start w:val="1"/>
+      <w:numFmt w:val="bullet"/>
+      <w:lvlText w:val="o"/>
+      <w:lvlJc w:val="left"/>
+      <w:pPr>
+        <w:ind w:left="4000" w:hanging="360"/>
+      </w:pPr>
+      <w:rPr>
+        <w:rFonts w:ascii="Courier New" w:hAnsi="Courier New" w:cs="Courier New" w:hint="default"/>
+      </w:rPr>
+    </w:lvl>
+    <w:lvl w:ilvl="5" w:tplc="40090005" w:tentative="1">
+      <w:start w:val="1"/>
+      <w:numFmt w:val="bullet"/>
+      <w:lvlText w:val=""/>
+      <w:lvlJc w:val="left"/>
+      <w:pPr>
+        <w:ind w:left="4720" w:hanging="360"/>
+      </w:pPr>
+      <w:rPr>
+        <w:rFonts w:ascii="Wingdings" w:hAnsi="Wingdings" w:hint="default"/>
+      </w:rPr>
+    </w:lvl>
+    <w:lvl w:ilvl="6" w:tplc="40090001" w:tentative="1">
+      <w:start w:val="1"/>
+      <w:numFmt w:val="bullet"/>
+      <w:lvlText w:val=""/>
+      <w:lvlJc w:val="left"/>
+      <w:pPr>
+        <w:ind w:left="5440" w:hanging="360"/>
+      </w:pPr>
+      <w:rPr>
+        <w:rFonts w:ascii="Symbol" w:hAnsi="Symbol" w:hint="default"/>
+      </w:rPr>
+    </w:lvl>
+    <w:lvl w:ilvl="7" w:tplc="40090003" w:tentative="1">
+      <w:start w:val="1"/>
+      <w:numFmt w:val="bullet"/>
+      <w:lvlText w:val="o"/>
+      <w:lvlJc w:val="left"/>
+      <w:pPr>
+        <w:ind w:left="6160" w:hanging="360"/>
+      </w:pPr>
+      <w:rPr>
+        <w:rFonts w:ascii="Courier New" w:hAnsi="Courier New" w:cs="Courier New" w:hint="default"/>
+      </w:rPr>
+    </w:lvl>
+    <w:lvl w:ilvl="8" w:tplc="40090005" w:tentative="1">
+      <w:start w:val="1"/>
+      <w:numFmt w:val="bullet"/>
+      <w:lvlText w:val=""/>
+      <w:lvlJc w:val="left"/>
+      <w:pPr>
+        <w:ind w:left="6880" w:hanging="360"/>
+      </w:pPr>
+      <w:rPr>
+        <w:rFonts w:ascii="Wingdings" w:hAnsi="Wingdings" w:hint="default"/>
+      </w:rPr>
+    </w:lvl>
+  </w:abstractNum>
+  <w:abstractNum w:abstractNumId="43" w15:restartNumberingAfterBreak="0">
+    <w:nsid w:val="2BFC0C11"/>
+    <w:multiLevelType w:val="hybridMultilevel"/>
+    <w:tmpl w:val="216C6F56"/>
+    <w:lvl w:ilvl="0" w:tplc="4009000B">
+      <w:start w:val="1"/>
+      <w:numFmt w:val="bullet"/>
+      <w:lvlText w:val=""/>
+      <w:lvlJc w:val="left"/>
+      <w:pPr>
+        <w:ind w:left="1120" w:hanging="360"/>
+      </w:pPr>
+      <w:rPr>
+        <w:rFonts w:ascii="Wingdings" w:hAnsi="Wingdings" w:hint="default"/>
+      </w:rPr>
+    </w:lvl>
+    <w:lvl w:ilvl="1" w:tplc="40090003" w:tentative="1">
+      <w:start w:val="1"/>
+      <w:numFmt w:val="bullet"/>
+      <w:lvlText w:val="o"/>
+      <w:lvlJc w:val="left"/>
+      <w:pPr>
+        <w:ind w:left="1840" w:hanging="360"/>
+      </w:pPr>
+      <w:rPr>
+        <w:rFonts w:ascii="Courier New" w:hAnsi="Courier New" w:cs="Courier New" w:hint="default"/>
+      </w:rPr>
+    </w:lvl>
+    <w:lvl w:ilvl="2" w:tplc="40090005" w:tentative="1">
+      <w:start w:val="1"/>
+      <w:numFmt w:val="bullet"/>
+      <w:lvlText w:val=""/>
+      <w:lvlJc w:val="left"/>
+      <w:pPr>
+        <w:ind w:left="2560" w:hanging="360"/>
+      </w:pPr>
+      <w:rPr>
+        <w:rFonts w:ascii="Wingdings" w:hAnsi="Wingdings" w:hint="default"/>
+      </w:rPr>
+    </w:lvl>
+    <w:lvl w:ilvl="3" w:tplc="40090001" w:tentative="1">
+      <w:start w:val="1"/>
+      <w:numFmt w:val="bullet"/>
+      <w:lvlText w:val=""/>
+      <w:lvlJc w:val="left"/>
+      <w:pPr>
+        <w:ind w:left="3280" w:hanging="360"/>
+      </w:pPr>
+      <w:rPr>
+        <w:rFonts w:ascii="Symbol" w:hAnsi="Symbol" w:hint="default"/>
+      </w:rPr>
+    </w:lvl>
+    <w:lvl w:ilvl="4" w:tplc="40090003" w:tentative="1">
+      <w:start w:val="1"/>
+      <w:numFmt w:val="bullet"/>
+      <w:lvlText w:val="o"/>
+      <w:lvlJc w:val="left"/>
+      <w:pPr>
+        <w:ind w:left="4000" w:hanging="360"/>
+      </w:pPr>
+      <w:rPr>
+        <w:rFonts w:ascii="Courier New" w:hAnsi="Courier New" w:cs="Courier New" w:hint="default"/>
+      </w:rPr>
+    </w:lvl>
+    <w:lvl w:ilvl="5" w:tplc="40090005" w:tentative="1">
+      <w:start w:val="1"/>
+      <w:numFmt w:val="bullet"/>
+      <w:lvlText w:val=""/>
+      <w:lvlJc w:val="left"/>
+      <w:pPr>
+        <w:ind w:left="4720" w:hanging="360"/>
+      </w:pPr>
+      <w:rPr>
+        <w:rFonts w:ascii="Wingdings" w:hAnsi="Wingdings" w:hint="default"/>
+      </w:rPr>
+    </w:lvl>
+    <w:lvl w:ilvl="6" w:tplc="40090001" w:tentative="1">
+      <w:start w:val="1"/>
+      <w:numFmt w:val="bullet"/>
+      <w:lvlText w:val=""/>
+      <w:lvlJc w:val="left"/>
+      <w:pPr>
+        <w:ind w:left="5440" w:hanging="360"/>
+      </w:pPr>
+      <w:rPr>
+        <w:rFonts w:ascii="Symbol" w:hAnsi="Symbol" w:hint="default"/>
+      </w:rPr>
+    </w:lvl>
+    <w:lvl w:ilvl="7" w:tplc="40090003" w:tentative="1">
+      <w:start w:val="1"/>
+      <w:numFmt w:val="bullet"/>
+      <w:lvlText w:val="o"/>
+      <w:lvlJc w:val="left"/>
+      <w:pPr>
+        <w:ind w:left="6160" w:hanging="360"/>
+      </w:pPr>
+      <w:rPr>
+        <w:rFonts w:ascii="Courier New" w:hAnsi="Courier New" w:cs="Courier New" w:hint="default"/>
+      </w:rPr>
+    </w:lvl>
+    <w:lvl w:ilvl="8" w:tplc="40090005" w:tentative="1">
+      <w:start w:val="1"/>
+      <w:numFmt w:val="bullet"/>
+      <w:lvlText w:val=""/>
+      <w:lvlJc w:val="left"/>
+      <w:pPr>
+        <w:ind w:left="6880" w:hanging="360"/>
+      </w:pPr>
+      <w:rPr>
+        <w:rFonts w:ascii="Wingdings" w:hAnsi="Wingdings" w:hint="default"/>
+      </w:rPr>
+    </w:lvl>
+  </w:abstractNum>
+  <w:abstractNum w:abstractNumId="44" w15:restartNumberingAfterBreak="0">
     <w:nsid w:val="2CD07219"/>
     <w:multiLevelType w:val="hybridMultilevel"/>
     <w:tmpl w:val="F028F0C2"/>
@@ -27960,7 +30779,7 @@
       </w:rPr>
     </w:lvl>
   </w:abstractNum>
-  <w:abstractNum w:abstractNumId="42" w15:restartNumberingAfterBreak="0">
+  <w:abstractNum w:abstractNumId="45" w15:restartNumberingAfterBreak="0">
     <w:nsid w:val="2E5E01CB"/>
     <w:multiLevelType w:val="hybridMultilevel"/>
     <w:tmpl w:val="4E80DCB4"/>
@@ -28073,7 +30892,7 @@
       </w:rPr>
     </w:lvl>
   </w:abstractNum>
-  <w:abstractNum w:abstractNumId="43" w15:restartNumberingAfterBreak="0">
+  <w:abstractNum w:abstractNumId="46" w15:restartNumberingAfterBreak="0">
     <w:nsid w:val="2F325EA5"/>
     <w:multiLevelType w:val="hybridMultilevel"/>
     <w:tmpl w:val="4880CD62"/>
@@ -28186,7 +31005,7 @@
       </w:rPr>
     </w:lvl>
   </w:abstractNum>
-  <w:abstractNum w:abstractNumId="44" w15:restartNumberingAfterBreak="0">
+  <w:abstractNum w:abstractNumId="47" w15:restartNumberingAfterBreak="0">
     <w:nsid w:val="30B71602"/>
     <w:multiLevelType w:val="hybridMultilevel"/>
     <w:tmpl w:val="034275AE"/>
@@ -28299,7 +31118,7 @@
       </w:rPr>
     </w:lvl>
   </w:abstractNum>
-  <w:abstractNum w:abstractNumId="45" w15:restartNumberingAfterBreak="0">
+  <w:abstractNum w:abstractNumId="48" w15:restartNumberingAfterBreak="0">
     <w:nsid w:val="31A1339E"/>
     <w:multiLevelType w:val="hybridMultilevel"/>
     <w:tmpl w:val="167049CA"/>
@@ -28412,7 +31231,7 @@
       </w:rPr>
     </w:lvl>
   </w:abstractNum>
-  <w:abstractNum w:abstractNumId="46" w15:restartNumberingAfterBreak="0">
+  <w:abstractNum w:abstractNumId="49" w15:restartNumberingAfterBreak="0">
     <w:nsid w:val="322A262F"/>
     <w:multiLevelType w:val="hybridMultilevel"/>
     <w:tmpl w:val="327C07E0"/>
@@ -28525,7 +31344,7 @@
       </w:rPr>
     </w:lvl>
   </w:abstractNum>
-  <w:abstractNum w:abstractNumId="47" w15:restartNumberingAfterBreak="0">
+  <w:abstractNum w:abstractNumId="50" w15:restartNumberingAfterBreak="0">
     <w:nsid w:val="32C32B4A"/>
     <w:multiLevelType w:val="hybridMultilevel"/>
     <w:tmpl w:val="01CAE6DC"/>
@@ -28638,7 +31457,7 @@
       </w:rPr>
     </w:lvl>
   </w:abstractNum>
-  <w:abstractNum w:abstractNumId="48" w15:restartNumberingAfterBreak="0">
+  <w:abstractNum w:abstractNumId="51" w15:restartNumberingAfterBreak="0">
     <w:nsid w:val="335204B5"/>
     <w:multiLevelType w:val="hybridMultilevel"/>
     <w:tmpl w:val="8F2E7C02"/>
@@ -28751,7 +31570,120 @@
       </w:rPr>
     </w:lvl>
   </w:abstractNum>
-  <w:abstractNum w:abstractNumId="49" w15:restartNumberingAfterBreak="0">
+  <w:abstractNum w:abstractNumId="52" w15:restartNumberingAfterBreak="0">
+    <w:nsid w:val="34C412AD"/>
+    <w:multiLevelType w:val="hybridMultilevel"/>
+    <w:tmpl w:val="4EA44940"/>
+    <w:lvl w:ilvl="0" w:tplc="4009000B">
+      <w:start w:val="1"/>
+      <w:numFmt w:val="bullet"/>
+      <w:lvlText w:val=""/>
+      <w:lvlJc w:val="left"/>
+      <w:pPr>
+        <w:ind w:left="1120" w:hanging="360"/>
+      </w:pPr>
+      <w:rPr>
+        <w:rFonts w:ascii="Wingdings" w:hAnsi="Wingdings" w:hint="default"/>
+      </w:rPr>
+    </w:lvl>
+    <w:lvl w:ilvl="1" w:tplc="40090003" w:tentative="1">
+      <w:start w:val="1"/>
+      <w:numFmt w:val="bullet"/>
+      <w:lvlText w:val="o"/>
+      <w:lvlJc w:val="left"/>
+      <w:pPr>
+        <w:ind w:left="1840" w:hanging="360"/>
+      </w:pPr>
+      <w:rPr>
+        <w:rFonts w:ascii="Courier New" w:hAnsi="Courier New" w:cs="Courier New" w:hint="default"/>
+      </w:rPr>
+    </w:lvl>
+    <w:lvl w:ilvl="2" w:tplc="40090005" w:tentative="1">
+      <w:start w:val="1"/>
+      <w:numFmt w:val="bullet"/>
+      <w:lvlText w:val=""/>
+      <w:lvlJc w:val="left"/>
+      <w:pPr>
+        <w:ind w:left="2560" w:hanging="360"/>
+      </w:pPr>
+      <w:rPr>
+        <w:rFonts w:ascii="Wingdings" w:hAnsi="Wingdings" w:hint="default"/>
+      </w:rPr>
+    </w:lvl>
+    <w:lvl w:ilvl="3" w:tplc="40090001" w:tentative="1">
+      <w:start w:val="1"/>
+      <w:numFmt w:val="bullet"/>
+      <w:lvlText w:val=""/>
+      <w:lvlJc w:val="left"/>
+      <w:pPr>
+        <w:ind w:left="3280" w:hanging="360"/>
+      </w:pPr>
+      <w:rPr>
+        <w:rFonts w:ascii="Symbol" w:hAnsi="Symbol" w:hint="default"/>
+      </w:rPr>
+    </w:lvl>
+    <w:lvl w:ilvl="4" w:tplc="40090003" w:tentative="1">
+      <w:start w:val="1"/>
+      <w:numFmt w:val="bullet"/>
+      <w:lvlText w:val="o"/>
+      <w:lvlJc w:val="left"/>
+      <w:pPr>
+        <w:ind w:left="4000" w:hanging="360"/>
+      </w:pPr>
+      <w:rPr>
+        <w:rFonts w:ascii="Courier New" w:hAnsi="Courier New" w:cs="Courier New" w:hint="default"/>
+      </w:rPr>
+    </w:lvl>
+    <w:lvl w:ilvl="5" w:tplc="40090005" w:tentative="1">
+      <w:start w:val="1"/>
+      <w:numFmt w:val="bullet"/>
+      <w:lvlText w:val=""/>
+      <w:lvlJc w:val="left"/>
+      <w:pPr>
+        <w:ind w:left="4720" w:hanging="360"/>
+      </w:pPr>
+      <w:rPr>
+        <w:rFonts w:ascii="Wingdings" w:hAnsi="Wingdings" w:hint="default"/>
+      </w:rPr>
+    </w:lvl>
+    <w:lvl w:ilvl="6" w:tplc="40090001" w:tentative="1">
+      <w:start w:val="1"/>
+      <w:numFmt w:val="bullet"/>
+      <w:lvlText w:val=""/>
+      <w:lvlJc w:val="left"/>
+      <w:pPr>
+        <w:ind w:left="5440" w:hanging="360"/>
+      </w:pPr>
+      <w:rPr>
+        <w:rFonts w:ascii="Symbol" w:hAnsi="Symbol" w:hint="default"/>
+      </w:rPr>
+    </w:lvl>
+    <w:lvl w:ilvl="7" w:tplc="40090003" w:tentative="1">
+      <w:start w:val="1"/>
+      <w:numFmt w:val="bullet"/>
+      <w:lvlText w:val="o"/>
+      <w:lvlJc w:val="left"/>
+      <w:pPr>
+        <w:ind w:left="6160" w:hanging="360"/>
+      </w:pPr>
+      <w:rPr>
+        <w:rFonts w:ascii="Courier New" w:hAnsi="Courier New" w:cs="Courier New" w:hint="default"/>
+      </w:rPr>
+    </w:lvl>
+    <w:lvl w:ilvl="8" w:tplc="40090005" w:tentative="1">
+      <w:start w:val="1"/>
+      <w:numFmt w:val="bullet"/>
+      <w:lvlText w:val=""/>
+      <w:lvlJc w:val="left"/>
+      <w:pPr>
+        <w:ind w:left="6880" w:hanging="360"/>
+      </w:pPr>
+      <w:rPr>
+        <w:rFonts w:ascii="Wingdings" w:hAnsi="Wingdings" w:hint="default"/>
+      </w:rPr>
+    </w:lvl>
+  </w:abstractNum>
+  <w:abstractNum w:abstractNumId="53" w15:restartNumberingAfterBreak="0">
     <w:nsid w:val="35553CF3"/>
     <w:multiLevelType w:val="hybridMultilevel"/>
     <w:tmpl w:val="DA50D502"/>
@@ -28864,7 +31796,7 @@
       </w:rPr>
     </w:lvl>
   </w:abstractNum>
-  <w:abstractNum w:abstractNumId="50" w15:restartNumberingAfterBreak="0">
+  <w:abstractNum w:abstractNumId="54" w15:restartNumberingAfterBreak="0">
     <w:nsid w:val="39582E41"/>
     <w:multiLevelType w:val="hybridMultilevel"/>
     <w:tmpl w:val="6EA8BB26"/>
@@ -28977,7 +31909,7 @@
       </w:rPr>
     </w:lvl>
   </w:abstractNum>
-  <w:abstractNum w:abstractNumId="51" w15:restartNumberingAfterBreak="0">
+  <w:abstractNum w:abstractNumId="55" w15:restartNumberingAfterBreak="0">
     <w:nsid w:val="39A6604F"/>
     <w:multiLevelType w:val="hybridMultilevel"/>
     <w:tmpl w:val="E4B8291E"/>
@@ -29090,7 +32022,120 @@
       </w:rPr>
     </w:lvl>
   </w:abstractNum>
-  <w:abstractNum w:abstractNumId="52" w15:restartNumberingAfterBreak="0">
+  <w:abstractNum w:abstractNumId="56" w15:restartNumberingAfterBreak="0">
+    <w:nsid w:val="414E7E41"/>
+    <w:multiLevelType w:val="hybridMultilevel"/>
+    <w:tmpl w:val="CC30E586"/>
+    <w:lvl w:ilvl="0" w:tplc="4009000B">
+      <w:start w:val="1"/>
+      <w:numFmt w:val="bullet"/>
+      <w:lvlText w:val=""/>
+      <w:lvlJc w:val="left"/>
+      <w:pPr>
+        <w:ind w:left="1120" w:hanging="360"/>
+      </w:pPr>
+      <w:rPr>
+        <w:rFonts w:ascii="Wingdings" w:hAnsi="Wingdings" w:hint="default"/>
+      </w:rPr>
+    </w:lvl>
+    <w:lvl w:ilvl="1" w:tplc="40090003" w:tentative="1">
+      <w:start w:val="1"/>
+      <w:numFmt w:val="bullet"/>
+      <w:lvlText w:val="o"/>
+      <w:lvlJc w:val="left"/>
+      <w:pPr>
+        <w:ind w:left="1840" w:hanging="360"/>
+      </w:pPr>
+      <w:rPr>
+        <w:rFonts w:ascii="Courier New" w:hAnsi="Courier New" w:cs="Courier New" w:hint="default"/>
+      </w:rPr>
+    </w:lvl>
+    <w:lvl w:ilvl="2" w:tplc="40090005" w:tentative="1">
+      <w:start w:val="1"/>
+      <w:numFmt w:val="bullet"/>
+      <w:lvlText w:val=""/>
+      <w:lvlJc w:val="left"/>
+      <w:pPr>
+        <w:ind w:left="2560" w:hanging="360"/>
+      </w:pPr>
+      <w:rPr>
+        <w:rFonts w:ascii="Wingdings" w:hAnsi="Wingdings" w:hint="default"/>
+      </w:rPr>
+    </w:lvl>
+    <w:lvl w:ilvl="3" w:tplc="40090001" w:tentative="1">
+      <w:start w:val="1"/>
+      <w:numFmt w:val="bullet"/>
+      <w:lvlText w:val=""/>
+      <w:lvlJc w:val="left"/>
+      <w:pPr>
+        <w:ind w:left="3280" w:hanging="360"/>
+      </w:pPr>
+      <w:rPr>
+        <w:rFonts w:ascii="Symbol" w:hAnsi="Symbol" w:hint="default"/>
+      </w:rPr>
+    </w:lvl>
+    <w:lvl w:ilvl="4" w:tplc="40090003" w:tentative="1">
+      <w:start w:val="1"/>
+      <w:numFmt w:val="bullet"/>
+      <w:lvlText w:val="o"/>
+      <w:lvlJc w:val="left"/>
+      <w:pPr>
+        <w:ind w:left="4000" w:hanging="360"/>
+      </w:pPr>
+      <w:rPr>
+        <w:rFonts w:ascii="Courier New" w:hAnsi="Courier New" w:cs="Courier New" w:hint="default"/>
+      </w:rPr>
+    </w:lvl>
+    <w:lvl w:ilvl="5" w:tplc="40090005" w:tentative="1">
+      <w:start w:val="1"/>
+      <w:numFmt w:val="bullet"/>
+      <w:lvlText w:val=""/>
+      <w:lvlJc w:val="left"/>
+      <w:pPr>
+        <w:ind w:left="4720" w:hanging="360"/>
+      </w:pPr>
+      <w:rPr>
+        <w:rFonts w:ascii="Wingdings" w:hAnsi="Wingdings" w:hint="default"/>
+      </w:rPr>
+    </w:lvl>
+    <w:lvl w:ilvl="6" w:tplc="40090001" w:tentative="1">
+      <w:start w:val="1"/>
+      <w:numFmt w:val="bullet"/>
+      <w:lvlText w:val=""/>
+      <w:lvlJc w:val="left"/>
+      <w:pPr>
+        <w:ind w:left="5440" w:hanging="360"/>
+      </w:pPr>
+      <w:rPr>
+        <w:rFonts w:ascii="Symbol" w:hAnsi="Symbol" w:hint="default"/>
+      </w:rPr>
+    </w:lvl>
+    <w:lvl w:ilvl="7" w:tplc="40090003" w:tentative="1">
+      <w:start w:val="1"/>
+      <w:numFmt w:val="bullet"/>
+      <w:lvlText w:val="o"/>
+      <w:lvlJc w:val="left"/>
+      <w:pPr>
+        <w:ind w:left="6160" w:hanging="360"/>
+      </w:pPr>
+      <w:rPr>
+        <w:rFonts w:ascii="Courier New" w:hAnsi="Courier New" w:cs="Courier New" w:hint="default"/>
+      </w:rPr>
+    </w:lvl>
+    <w:lvl w:ilvl="8" w:tplc="40090005" w:tentative="1">
+      <w:start w:val="1"/>
+      <w:numFmt w:val="bullet"/>
+      <w:lvlText w:val=""/>
+      <w:lvlJc w:val="left"/>
+      <w:pPr>
+        <w:ind w:left="6880" w:hanging="360"/>
+      </w:pPr>
+      <w:rPr>
+        <w:rFonts w:ascii="Wingdings" w:hAnsi="Wingdings" w:hint="default"/>
+      </w:rPr>
+    </w:lvl>
+  </w:abstractNum>
+  <w:abstractNum w:abstractNumId="57" w15:restartNumberingAfterBreak="0">
     <w:nsid w:val="41DC4A8F"/>
     <w:multiLevelType w:val="hybridMultilevel"/>
     <w:tmpl w:val="19CE7D6E"/>
@@ -29203,7 +32248,7 @@
       </w:rPr>
     </w:lvl>
   </w:abstractNum>
-  <w:abstractNum w:abstractNumId="53" w15:restartNumberingAfterBreak="0">
+  <w:abstractNum w:abstractNumId="58" w15:restartNumberingAfterBreak="0">
     <w:nsid w:val="41F21485"/>
     <w:multiLevelType w:val="hybridMultilevel"/>
     <w:tmpl w:val="BEF2DB6E"/>
@@ -29316,7 +32361,7 @@
       </w:rPr>
     </w:lvl>
   </w:abstractNum>
-  <w:abstractNum w:abstractNumId="54" w15:restartNumberingAfterBreak="0">
+  <w:abstractNum w:abstractNumId="59" w15:restartNumberingAfterBreak="0">
     <w:nsid w:val="43F66481"/>
     <w:multiLevelType w:val="hybridMultilevel"/>
     <w:tmpl w:val="0D5AA074"/>
@@ -29429,7 +32474,7 @@
       </w:rPr>
     </w:lvl>
   </w:abstractNum>
-  <w:abstractNum w:abstractNumId="55" w15:restartNumberingAfterBreak="0">
+  <w:abstractNum w:abstractNumId="60" w15:restartNumberingAfterBreak="0">
     <w:nsid w:val="44A65F84"/>
     <w:multiLevelType w:val="hybridMultilevel"/>
     <w:tmpl w:val="243C87B6"/>
@@ -29542,7 +32587,7 @@
       </w:rPr>
     </w:lvl>
   </w:abstractNum>
-  <w:abstractNum w:abstractNumId="56" w15:restartNumberingAfterBreak="0">
+  <w:abstractNum w:abstractNumId="61" w15:restartNumberingAfterBreak="0">
     <w:nsid w:val="45CF465D"/>
     <w:multiLevelType w:val="hybridMultilevel"/>
     <w:tmpl w:val="3D904BB4"/>
@@ -29655,7 +32700,7 @@
       </w:rPr>
     </w:lvl>
   </w:abstractNum>
-  <w:abstractNum w:abstractNumId="57" w15:restartNumberingAfterBreak="0">
+  <w:abstractNum w:abstractNumId="62" w15:restartNumberingAfterBreak="0">
     <w:nsid w:val="475F4735"/>
     <w:multiLevelType w:val="hybridMultilevel"/>
     <w:tmpl w:val="FA029FFA"/>
@@ -29768,7 +32813,7 @@
       </w:rPr>
     </w:lvl>
   </w:abstractNum>
-  <w:abstractNum w:abstractNumId="58" w15:restartNumberingAfterBreak="0">
+  <w:abstractNum w:abstractNumId="63" w15:restartNumberingAfterBreak="0">
     <w:nsid w:val="48BE5886"/>
     <w:multiLevelType w:val="hybridMultilevel"/>
     <w:tmpl w:val="9F6EC2EC"/>
@@ -29881,7 +32926,7 @@
       </w:rPr>
     </w:lvl>
   </w:abstractNum>
-  <w:abstractNum w:abstractNumId="59" w15:restartNumberingAfterBreak="0">
+  <w:abstractNum w:abstractNumId="64" w15:restartNumberingAfterBreak="0">
     <w:nsid w:val="4A9E5951"/>
     <w:multiLevelType w:val="hybridMultilevel"/>
     <w:tmpl w:val="C01C7CC2"/>
@@ -29994,7 +33039,7 @@
       </w:rPr>
     </w:lvl>
   </w:abstractNum>
-  <w:abstractNum w:abstractNumId="60" w15:restartNumberingAfterBreak="0">
+  <w:abstractNum w:abstractNumId="65" w15:restartNumberingAfterBreak="0">
     <w:nsid w:val="4BD208CD"/>
     <w:multiLevelType w:val="hybridMultilevel"/>
     <w:tmpl w:val="A53A1180"/>
@@ -30107,7 +33152,7 @@
       </w:rPr>
     </w:lvl>
   </w:abstractNum>
-  <w:abstractNum w:abstractNumId="61" w15:restartNumberingAfterBreak="0">
+  <w:abstractNum w:abstractNumId="66" w15:restartNumberingAfterBreak="0">
     <w:nsid w:val="4C342B25"/>
     <w:multiLevelType w:val="hybridMultilevel"/>
     <w:tmpl w:val="B91CD8D8"/>
@@ -30220,7 +33265,7 @@
       </w:rPr>
     </w:lvl>
   </w:abstractNum>
-  <w:abstractNum w:abstractNumId="62" w15:restartNumberingAfterBreak="0">
+  <w:abstractNum w:abstractNumId="67" w15:restartNumberingAfterBreak="0">
     <w:nsid w:val="4CAF2742"/>
     <w:multiLevelType w:val="hybridMultilevel"/>
     <w:tmpl w:val="9B382BEA"/>
@@ -30333,7 +33378,7 @@
       </w:rPr>
     </w:lvl>
   </w:abstractNum>
-  <w:abstractNum w:abstractNumId="63" w15:restartNumberingAfterBreak="0">
+  <w:abstractNum w:abstractNumId="68" w15:restartNumberingAfterBreak="0">
     <w:nsid w:val="4CB9119F"/>
     <w:multiLevelType w:val="hybridMultilevel"/>
     <w:tmpl w:val="76365076"/>
@@ -30446,7 +33491,7 @@
       </w:rPr>
     </w:lvl>
   </w:abstractNum>
-  <w:abstractNum w:abstractNumId="64" w15:restartNumberingAfterBreak="0">
+  <w:abstractNum w:abstractNumId="69" w15:restartNumberingAfterBreak="0">
     <w:nsid w:val="4F17655D"/>
     <w:multiLevelType w:val="hybridMultilevel"/>
     <w:tmpl w:val="BE60F5B4"/>
@@ -30559,7 +33604,7 @@
       </w:rPr>
     </w:lvl>
   </w:abstractNum>
-  <w:abstractNum w:abstractNumId="65" w15:restartNumberingAfterBreak="0">
+  <w:abstractNum w:abstractNumId="70" w15:restartNumberingAfterBreak="0">
     <w:nsid w:val="50E81B93"/>
     <w:multiLevelType w:val="hybridMultilevel"/>
     <w:tmpl w:val="FE8AB98C"/>
@@ -30672,7 +33717,7 @@
       </w:rPr>
     </w:lvl>
   </w:abstractNum>
-  <w:abstractNum w:abstractNumId="66" w15:restartNumberingAfterBreak="0">
+  <w:abstractNum w:abstractNumId="71" w15:restartNumberingAfterBreak="0">
     <w:nsid w:val="5207196C"/>
     <w:multiLevelType w:val="hybridMultilevel"/>
     <w:tmpl w:val="04101D70"/>
@@ -30785,7 +33830,7 @@
       </w:rPr>
     </w:lvl>
   </w:abstractNum>
-  <w:abstractNum w:abstractNumId="67" w15:restartNumberingAfterBreak="0">
+  <w:abstractNum w:abstractNumId="72" w15:restartNumberingAfterBreak="0">
     <w:nsid w:val="52E2024D"/>
     <w:multiLevelType w:val="hybridMultilevel"/>
     <w:tmpl w:val="DABA967C"/>
@@ -30898,7 +33943,7 @@
       </w:rPr>
     </w:lvl>
   </w:abstractNum>
-  <w:abstractNum w:abstractNumId="68" w15:restartNumberingAfterBreak="0">
+  <w:abstractNum w:abstractNumId="73" w15:restartNumberingAfterBreak="0">
     <w:nsid w:val="54BF6151"/>
     <w:multiLevelType w:val="hybridMultilevel"/>
     <w:tmpl w:val="F4D635F4"/>
@@ -31007,7 +34052,120 @@
       </w:pPr>
     </w:lvl>
   </w:abstractNum>
-  <w:abstractNum w:abstractNumId="69" w15:restartNumberingAfterBreak="0">
+  <w:abstractNum w:abstractNumId="74" w15:restartNumberingAfterBreak="0">
+    <w:nsid w:val="54E93FC7"/>
+    <w:multiLevelType w:val="hybridMultilevel"/>
+    <w:tmpl w:val="EC783AA2"/>
+    <w:lvl w:ilvl="0" w:tplc="4009000B">
+      <w:start w:val="1"/>
+      <w:numFmt w:val="bullet"/>
+      <w:lvlText w:val=""/>
+      <w:lvlJc w:val="left"/>
+      <w:pPr>
+        <w:ind w:left="1120" w:hanging="360"/>
+      </w:pPr>
+      <w:rPr>
+        <w:rFonts w:ascii="Wingdings" w:hAnsi="Wingdings" w:hint="default"/>
+      </w:rPr>
+    </w:lvl>
+    <w:lvl w:ilvl="1" w:tplc="40090003" w:tentative="1">
+      <w:start w:val="1"/>
+      <w:numFmt w:val="bullet"/>
+      <w:lvlText w:val="o"/>
+      <w:lvlJc w:val="left"/>
+      <w:pPr>
+        <w:ind w:left="1840" w:hanging="360"/>
+      </w:pPr>
+      <w:rPr>
+        <w:rFonts w:ascii="Courier New" w:hAnsi="Courier New" w:cs="Courier New" w:hint="default"/>
+      </w:rPr>
+    </w:lvl>
+    <w:lvl w:ilvl="2" w:tplc="40090005" w:tentative="1">
+      <w:start w:val="1"/>
+      <w:numFmt w:val="bullet"/>
+      <w:lvlText w:val=""/>
+      <w:lvlJc w:val="left"/>
+      <w:pPr>
+        <w:ind w:left="2560" w:hanging="360"/>
+      </w:pPr>
+      <w:rPr>
+        <w:rFonts w:ascii="Wingdings" w:hAnsi="Wingdings" w:hint="default"/>
+      </w:rPr>
+    </w:lvl>
+    <w:lvl w:ilvl="3" w:tplc="40090001" w:tentative="1">
+      <w:start w:val="1"/>
+      <w:numFmt w:val="bullet"/>
+      <w:lvlText w:val=""/>
+      <w:lvlJc w:val="left"/>
+      <w:pPr>
+        <w:ind w:left="3280" w:hanging="360"/>
+      </w:pPr>
+      <w:rPr>
+        <w:rFonts w:ascii="Symbol" w:hAnsi="Symbol" w:hint="default"/>
+      </w:rPr>
+    </w:lvl>
+    <w:lvl w:ilvl="4" w:tplc="40090003" w:tentative="1">
+      <w:start w:val="1"/>
+      <w:numFmt w:val="bullet"/>
+      <w:lvlText w:val="o"/>
+      <w:lvlJc w:val="left"/>
+      <w:pPr>
+        <w:ind w:left="4000" w:hanging="360"/>
+      </w:pPr>
+      <w:rPr>
+        <w:rFonts w:ascii="Courier New" w:hAnsi="Courier New" w:cs="Courier New" w:hint="default"/>
+      </w:rPr>
+    </w:lvl>
+    <w:lvl w:ilvl="5" w:tplc="40090005" w:tentative="1">
+      <w:start w:val="1"/>
+      <w:numFmt w:val="bullet"/>
+      <w:lvlText w:val=""/>
+      <w:lvlJc w:val="left"/>
+      <w:pPr>
+        <w:ind w:left="4720" w:hanging="360"/>
+      </w:pPr>
+      <w:rPr>
+        <w:rFonts w:ascii="Wingdings" w:hAnsi="Wingdings" w:hint="default"/>
+      </w:rPr>
+    </w:lvl>
+    <w:lvl w:ilvl="6" w:tplc="40090001" w:tentative="1">
+      <w:start w:val="1"/>
+      <w:numFmt w:val="bullet"/>
+      <w:lvlText w:val=""/>
+      <w:lvlJc w:val="left"/>
+      <w:pPr>
+        <w:ind w:left="5440" w:hanging="360"/>
+      </w:pPr>
+      <w:rPr>
+        <w:rFonts w:ascii="Symbol" w:hAnsi="Symbol" w:hint="default"/>
+      </w:rPr>
+    </w:lvl>
+    <w:lvl w:ilvl="7" w:tplc="40090003" w:tentative="1">
+      <w:start w:val="1"/>
+      <w:numFmt w:val="bullet"/>
+      <w:lvlText w:val="o"/>
+      <w:lvlJc w:val="left"/>
+      <w:pPr>
+        <w:ind w:left="6160" w:hanging="360"/>
+      </w:pPr>
+      <w:rPr>
+        <w:rFonts w:ascii="Courier New" w:hAnsi="Courier New" w:cs="Courier New" w:hint="default"/>
+      </w:rPr>
+    </w:lvl>
+    <w:lvl w:ilvl="8" w:tplc="40090005" w:tentative="1">
+      <w:start w:val="1"/>
+      <w:numFmt w:val="bullet"/>
+      <w:lvlText w:val=""/>
+      <w:lvlJc w:val="left"/>
+      <w:pPr>
+        <w:ind w:left="6880" w:hanging="360"/>
+      </w:pPr>
+      <w:rPr>
+        <w:rFonts w:ascii="Wingdings" w:hAnsi="Wingdings" w:hint="default"/>
+      </w:rPr>
+    </w:lvl>
+  </w:abstractNum>
+  <w:abstractNum w:abstractNumId="75" w15:restartNumberingAfterBreak="0">
     <w:nsid w:val="57907B68"/>
     <w:multiLevelType w:val="hybridMultilevel"/>
     <w:tmpl w:val="18086E02"/>
@@ -31120,7 +34278,7 @@
       </w:rPr>
     </w:lvl>
   </w:abstractNum>
-  <w:abstractNum w:abstractNumId="70" w15:restartNumberingAfterBreak="0">
+  <w:abstractNum w:abstractNumId="76" w15:restartNumberingAfterBreak="0">
     <w:nsid w:val="5BE47E43"/>
     <w:multiLevelType w:val="hybridMultilevel"/>
     <w:tmpl w:val="EF3EAED2"/>
@@ -31233,7 +34391,7 @@
       </w:rPr>
     </w:lvl>
   </w:abstractNum>
-  <w:abstractNum w:abstractNumId="71" w15:restartNumberingAfterBreak="0">
+  <w:abstractNum w:abstractNumId="77" w15:restartNumberingAfterBreak="0">
     <w:nsid w:val="5C0D2947"/>
     <w:multiLevelType w:val="hybridMultilevel"/>
     <w:tmpl w:val="8CAAD732"/>
@@ -31346,7 +34504,7 @@
       </w:rPr>
     </w:lvl>
   </w:abstractNum>
-  <w:abstractNum w:abstractNumId="72" w15:restartNumberingAfterBreak="0">
+  <w:abstractNum w:abstractNumId="78" w15:restartNumberingAfterBreak="0">
     <w:nsid w:val="5D4D2BDD"/>
     <w:multiLevelType w:val="hybridMultilevel"/>
     <w:tmpl w:val="14A8EAC6"/>
@@ -31459,7 +34617,120 @@
       </w:rPr>
     </w:lvl>
   </w:abstractNum>
-  <w:abstractNum w:abstractNumId="73" w15:restartNumberingAfterBreak="0">
+  <w:abstractNum w:abstractNumId="79" w15:restartNumberingAfterBreak="0">
+    <w:nsid w:val="5E181354"/>
+    <w:multiLevelType w:val="hybridMultilevel"/>
+    <w:tmpl w:val="5FF0FE74"/>
+    <w:lvl w:ilvl="0" w:tplc="4009000B">
+      <w:start w:val="1"/>
+      <w:numFmt w:val="bullet"/>
+      <w:lvlText w:val=""/>
+      <w:lvlJc w:val="left"/>
+      <w:pPr>
+        <w:ind w:left="1120" w:hanging="360"/>
+      </w:pPr>
+      <w:rPr>
+        <w:rFonts w:ascii="Wingdings" w:hAnsi="Wingdings" w:hint="default"/>
+      </w:rPr>
+    </w:lvl>
+    <w:lvl w:ilvl="1" w:tplc="40090003" w:tentative="1">
+      <w:start w:val="1"/>
+      <w:numFmt w:val="bullet"/>
+      <w:lvlText w:val="o"/>
+      <w:lvlJc w:val="left"/>
+      <w:pPr>
+        <w:ind w:left="1840" w:hanging="360"/>
+      </w:pPr>
+      <w:rPr>
+        <w:rFonts w:ascii="Courier New" w:hAnsi="Courier New" w:cs="Courier New" w:hint="default"/>
+      </w:rPr>
+    </w:lvl>
+    <w:lvl w:ilvl="2" w:tplc="40090005" w:tentative="1">
+      <w:start w:val="1"/>
+      <w:numFmt w:val="bullet"/>
+      <w:lvlText w:val=""/>
+      <w:lvlJc w:val="left"/>
+      <w:pPr>
+        <w:ind w:left="2560" w:hanging="360"/>
+      </w:pPr>
+      <w:rPr>
+        <w:rFonts w:ascii="Wingdings" w:hAnsi="Wingdings" w:hint="default"/>
+      </w:rPr>
+    </w:lvl>
+    <w:lvl w:ilvl="3" w:tplc="40090001" w:tentative="1">
+      <w:start w:val="1"/>
+      <w:numFmt w:val="bullet"/>
+      <w:lvlText w:val=""/>
+      <w:lvlJc w:val="left"/>
+      <w:pPr>
+        <w:ind w:left="3280" w:hanging="360"/>
+      </w:pPr>
+      <w:rPr>
+        <w:rFonts w:ascii="Symbol" w:hAnsi="Symbol" w:hint="default"/>
+      </w:rPr>
+    </w:lvl>
+    <w:lvl w:ilvl="4" w:tplc="40090003" w:tentative="1">
+      <w:start w:val="1"/>
+      <w:numFmt w:val="bullet"/>
+      <w:lvlText w:val="o"/>
+      <w:lvlJc w:val="left"/>
+      <w:pPr>
+        <w:ind w:left="4000" w:hanging="360"/>
+      </w:pPr>
+      <w:rPr>
+        <w:rFonts w:ascii="Courier New" w:hAnsi="Courier New" w:cs="Courier New" w:hint="default"/>
+      </w:rPr>
+    </w:lvl>
+    <w:lvl w:ilvl="5" w:tplc="40090005" w:tentative="1">
+      <w:start w:val="1"/>
+      <w:numFmt w:val="bullet"/>
+      <w:lvlText w:val=""/>
+      <w:lvlJc w:val="left"/>
+      <w:pPr>
+        <w:ind w:left="4720" w:hanging="360"/>
+      </w:pPr>
+      <w:rPr>
+        <w:rFonts w:ascii="Wingdings" w:hAnsi="Wingdings" w:hint="default"/>
+      </w:rPr>
+    </w:lvl>
+    <w:lvl w:ilvl="6" w:tplc="40090001" w:tentative="1">
+      <w:start w:val="1"/>
+      <w:numFmt w:val="bullet"/>
+      <w:lvlText w:val=""/>
+      <w:lvlJc w:val="left"/>
+      <w:pPr>
+        <w:ind w:left="5440" w:hanging="360"/>
+      </w:pPr>
+      <w:rPr>
+        <w:rFonts w:ascii="Symbol" w:hAnsi="Symbol" w:hint="default"/>
+      </w:rPr>
+    </w:lvl>
+    <w:lvl w:ilvl="7" w:tplc="40090003" w:tentative="1">
+      <w:start w:val="1"/>
+      <w:numFmt w:val="bullet"/>
+      <w:lvlText w:val="o"/>
+      <w:lvlJc w:val="left"/>
+      <w:pPr>
+        <w:ind w:left="6160" w:hanging="360"/>
+      </w:pPr>
+      <w:rPr>
+        <w:rFonts w:ascii="Courier New" w:hAnsi="Courier New" w:cs="Courier New" w:hint="default"/>
+      </w:rPr>
+    </w:lvl>
+    <w:lvl w:ilvl="8" w:tplc="40090005" w:tentative="1">
+      <w:start w:val="1"/>
+      <w:numFmt w:val="bullet"/>
+      <w:lvlText w:val=""/>
+      <w:lvlJc w:val="left"/>
+      <w:pPr>
+        <w:ind w:left="6880" w:hanging="360"/>
+      </w:pPr>
+      <w:rPr>
+        <w:rFonts w:ascii="Wingdings" w:hAnsi="Wingdings" w:hint="default"/>
+      </w:rPr>
+    </w:lvl>
+  </w:abstractNum>
+  <w:abstractNum w:abstractNumId="80" w15:restartNumberingAfterBreak="0">
     <w:nsid w:val="620D5486"/>
     <w:multiLevelType w:val="hybridMultilevel"/>
     <w:tmpl w:val="728869EC"/>
@@ -31572,7 +34843,120 @@
       </w:rPr>
     </w:lvl>
   </w:abstractNum>
-  <w:abstractNum w:abstractNumId="74" w15:restartNumberingAfterBreak="0">
+  <w:abstractNum w:abstractNumId="81" w15:restartNumberingAfterBreak="0">
+    <w:nsid w:val="654B42EC"/>
+    <w:multiLevelType w:val="hybridMultilevel"/>
+    <w:tmpl w:val="245888DC"/>
+    <w:lvl w:ilvl="0" w:tplc="4009000B">
+      <w:start w:val="1"/>
+      <w:numFmt w:val="bullet"/>
+      <w:lvlText w:val=""/>
+      <w:lvlJc w:val="left"/>
+      <w:pPr>
+        <w:ind w:left="1120" w:hanging="360"/>
+      </w:pPr>
+      <w:rPr>
+        <w:rFonts w:ascii="Wingdings" w:hAnsi="Wingdings" w:hint="default"/>
+      </w:rPr>
+    </w:lvl>
+    <w:lvl w:ilvl="1" w:tplc="40090003" w:tentative="1">
+      <w:start w:val="1"/>
+      <w:numFmt w:val="bullet"/>
+      <w:lvlText w:val="o"/>
+      <w:lvlJc w:val="left"/>
+      <w:pPr>
+        <w:ind w:left="1840" w:hanging="360"/>
+      </w:pPr>
+      <w:rPr>
+        <w:rFonts w:ascii="Courier New" w:hAnsi="Courier New" w:cs="Courier New" w:hint="default"/>
+      </w:rPr>
+    </w:lvl>
+    <w:lvl w:ilvl="2" w:tplc="40090005" w:tentative="1">
+      <w:start w:val="1"/>
+      <w:numFmt w:val="bullet"/>
+      <w:lvlText w:val=""/>
+      <w:lvlJc w:val="left"/>
+      <w:pPr>
+        <w:ind w:left="2560" w:hanging="360"/>
+      </w:pPr>
+      <w:rPr>
+        <w:rFonts w:ascii="Wingdings" w:hAnsi="Wingdings" w:hint="default"/>
+      </w:rPr>
+    </w:lvl>
+    <w:lvl w:ilvl="3" w:tplc="40090001" w:tentative="1">
+      <w:start w:val="1"/>
+      <w:numFmt w:val="bullet"/>
+      <w:lvlText w:val=""/>
+      <w:lvlJc w:val="left"/>
+      <w:pPr>
+        <w:ind w:left="3280" w:hanging="360"/>
+      </w:pPr>
+      <w:rPr>
+        <w:rFonts w:ascii="Symbol" w:hAnsi="Symbol" w:hint="default"/>
+      </w:rPr>
+    </w:lvl>
+    <w:lvl w:ilvl="4" w:tplc="40090003" w:tentative="1">
+      <w:start w:val="1"/>
+      <w:numFmt w:val="bullet"/>
+      <w:lvlText w:val="o"/>
+      <w:lvlJc w:val="left"/>
+      <w:pPr>
+        <w:ind w:left="4000" w:hanging="360"/>
+      </w:pPr>
+      <w:rPr>
+        <w:rFonts w:ascii="Courier New" w:hAnsi="Courier New" w:cs="Courier New" w:hint="default"/>
+      </w:rPr>
+    </w:lvl>
+    <w:lvl w:ilvl="5" w:tplc="40090005" w:tentative="1">
+      <w:start w:val="1"/>
+      <w:numFmt w:val="bullet"/>
+      <w:lvlText w:val=""/>
+      <w:lvlJc w:val="left"/>
+      <w:pPr>
+        <w:ind w:left="4720" w:hanging="360"/>
+      </w:pPr>
+      <w:rPr>
+        <w:rFonts w:ascii="Wingdings" w:hAnsi="Wingdings" w:hint="default"/>
+      </w:rPr>
+    </w:lvl>
+    <w:lvl w:ilvl="6" w:tplc="40090001" w:tentative="1">
+      <w:start w:val="1"/>
+      <w:numFmt w:val="bullet"/>
+      <w:lvlText w:val=""/>
+      <w:lvlJc w:val="left"/>
+      <w:pPr>
+        <w:ind w:left="5440" w:hanging="360"/>
+      </w:pPr>
+      <w:rPr>
+        <w:rFonts w:ascii="Symbol" w:hAnsi="Symbol" w:hint="default"/>
+      </w:rPr>
+    </w:lvl>
+    <w:lvl w:ilvl="7" w:tplc="40090003" w:tentative="1">
+      <w:start w:val="1"/>
+      <w:numFmt w:val="bullet"/>
+      <w:lvlText w:val="o"/>
+      <w:lvlJc w:val="left"/>
+      <w:pPr>
+        <w:ind w:left="6160" w:hanging="360"/>
+      </w:pPr>
+      <w:rPr>
+        <w:rFonts w:ascii="Courier New" w:hAnsi="Courier New" w:cs="Courier New" w:hint="default"/>
+      </w:rPr>
+    </w:lvl>
+    <w:lvl w:ilvl="8" w:tplc="40090005" w:tentative="1">
+      <w:start w:val="1"/>
+      <w:numFmt w:val="bullet"/>
+      <w:lvlText w:val=""/>
+      <w:lvlJc w:val="left"/>
+      <w:pPr>
+        <w:ind w:left="6880" w:hanging="360"/>
+      </w:pPr>
+      <w:rPr>
+        <w:rFonts w:ascii="Wingdings" w:hAnsi="Wingdings" w:hint="default"/>
+      </w:rPr>
+    </w:lvl>
+  </w:abstractNum>
+  <w:abstractNum w:abstractNumId="82" w15:restartNumberingAfterBreak="0">
     <w:nsid w:val="663A7E4C"/>
     <w:multiLevelType w:val="hybridMultilevel"/>
     <w:tmpl w:val="14463E10"/>
@@ -31685,7 +35069,7 @@
       </w:rPr>
     </w:lvl>
   </w:abstractNum>
-  <w:abstractNum w:abstractNumId="75" w15:restartNumberingAfterBreak="0">
+  <w:abstractNum w:abstractNumId="83" w15:restartNumberingAfterBreak="0">
     <w:nsid w:val="666E6981"/>
     <w:multiLevelType w:val="hybridMultilevel"/>
     <w:tmpl w:val="7B527FA6"/>
@@ -31798,7 +35182,7 @@
       </w:rPr>
     </w:lvl>
   </w:abstractNum>
-  <w:abstractNum w:abstractNumId="76" w15:restartNumberingAfterBreak="0">
+  <w:abstractNum w:abstractNumId="84" w15:restartNumberingAfterBreak="0">
     <w:nsid w:val="66B62DBB"/>
     <w:multiLevelType w:val="hybridMultilevel"/>
     <w:tmpl w:val="10D04886"/>
@@ -31911,7 +35295,7 @@
       </w:rPr>
     </w:lvl>
   </w:abstractNum>
-  <w:abstractNum w:abstractNumId="77" w15:restartNumberingAfterBreak="0">
+  <w:abstractNum w:abstractNumId="85" w15:restartNumberingAfterBreak="0">
     <w:nsid w:val="68E44562"/>
     <w:multiLevelType w:val="hybridMultilevel"/>
     <w:tmpl w:val="0952F2F2"/>
@@ -32024,7 +35408,120 @@
       </w:rPr>
     </w:lvl>
   </w:abstractNum>
-  <w:abstractNum w:abstractNumId="78" w15:restartNumberingAfterBreak="0">
+  <w:abstractNum w:abstractNumId="86" w15:restartNumberingAfterBreak="0">
+    <w:nsid w:val="691D4043"/>
+    <w:multiLevelType w:val="hybridMultilevel"/>
+    <w:tmpl w:val="2F5C459A"/>
+    <w:lvl w:ilvl="0" w:tplc="4009000B">
+      <w:start w:val="1"/>
+      <w:numFmt w:val="bullet"/>
+      <w:lvlText w:val=""/>
+      <w:lvlJc w:val="left"/>
+      <w:pPr>
+        <w:ind w:left="1120" w:hanging="360"/>
+      </w:pPr>
+      <w:rPr>
+        <w:rFonts w:ascii="Wingdings" w:hAnsi="Wingdings" w:hint="default"/>
+      </w:rPr>
+    </w:lvl>
+    <w:lvl w:ilvl="1" w:tplc="40090003" w:tentative="1">
+      <w:start w:val="1"/>
+      <w:numFmt w:val="bullet"/>
+      <w:lvlText w:val="o"/>
+      <w:lvlJc w:val="left"/>
+      <w:pPr>
+        <w:ind w:left="1840" w:hanging="360"/>
+      </w:pPr>
+      <w:rPr>
+        <w:rFonts w:ascii="Courier New" w:hAnsi="Courier New" w:cs="Courier New" w:hint="default"/>
+      </w:rPr>
+    </w:lvl>
+    <w:lvl w:ilvl="2" w:tplc="40090005" w:tentative="1">
+      <w:start w:val="1"/>
+      <w:numFmt w:val="bullet"/>
+      <w:lvlText w:val=""/>
+      <w:lvlJc w:val="left"/>
+      <w:pPr>
+        <w:ind w:left="2560" w:hanging="360"/>
+      </w:pPr>
+      <w:rPr>
+        <w:rFonts w:ascii="Wingdings" w:hAnsi="Wingdings" w:hint="default"/>
+      </w:rPr>
+    </w:lvl>
+    <w:lvl w:ilvl="3" w:tplc="40090001" w:tentative="1">
+      <w:start w:val="1"/>
+      <w:numFmt w:val="bullet"/>
+      <w:lvlText w:val=""/>
+      <w:lvlJc w:val="left"/>
+      <w:pPr>
+        <w:ind w:left="3280" w:hanging="360"/>
+      </w:pPr>
+      <w:rPr>
+        <w:rFonts w:ascii="Symbol" w:hAnsi="Symbol" w:hint="default"/>
+      </w:rPr>
+    </w:lvl>
+    <w:lvl w:ilvl="4" w:tplc="40090003" w:tentative="1">
+      <w:start w:val="1"/>
+      <w:numFmt w:val="bullet"/>
+      <w:lvlText w:val="o"/>
+      <w:lvlJc w:val="left"/>
+      <w:pPr>
+        <w:ind w:left="4000" w:hanging="360"/>
+      </w:pPr>
+      <w:rPr>
+        <w:rFonts w:ascii="Courier New" w:hAnsi="Courier New" w:cs="Courier New" w:hint="default"/>
+      </w:rPr>
+    </w:lvl>
+    <w:lvl w:ilvl="5" w:tplc="40090005" w:tentative="1">
+      <w:start w:val="1"/>
+      <w:numFmt w:val="bullet"/>
+      <w:lvlText w:val=""/>
+      <w:lvlJc w:val="left"/>
+      <w:pPr>
+        <w:ind w:left="4720" w:hanging="360"/>
+      </w:pPr>
+      <w:rPr>
+        <w:rFonts w:ascii="Wingdings" w:hAnsi="Wingdings" w:hint="default"/>
+      </w:rPr>
+    </w:lvl>
+    <w:lvl w:ilvl="6" w:tplc="40090001" w:tentative="1">
+      <w:start w:val="1"/>
+      <w:numFmt w:val="bullet"/>
+      <w:lvlText w:val=""/>
+      <w:lvlJc w:val="left"/>
+      <w:pPr>
+        <w:ind w:left="5440" w:hanging="360"/>
+      </w:pPr>
+      <w:rPr>
+        <w:rFonts w:ascii="Symbol" w:hAnsi="Symbol" w:hint="default"/>
+      </w:rPr>
+    </w:lvl>
+    <w:lvl w:ilvl="7" w:tplc="40090003" w:tentative="1">
+      <w:start w:val="1"/>
+      <w:numFmt w:val="bullet"/>
+      <w:lvlText w:val="o"/>
+      <w:lvlJc w:val="left"/>
+      <w:pPr>
+        <w:ind w:left="6160" w:hanging="360"/>
+      </w:pPr>
+      <w:rPr>
+        <w:rFonts w:ascii="Courier New" w:hAnsi="Courier New" w:cs="Courier New" w:hint="default"/>
+      </w:rPr>
+    </w:lvl>
+    <w:lvl w:ilvl="8" w:tplc="40090005" w:tentative="1">
+      <w:start w:val="1"/>
+      <w:numFmt w:val="bullet"/>
+      <w:lvlText w:val=""/>
+      <w:lvlJc w:val="left"/>
+      <w:pPr>
+        <w:ind w:left="6880" w:hanging="360"/>
+      </w:pPr>
+      <w:rPr>
+        <w:rFonts w:ascii="Wingdings" w:hAnsi="Wingdings" w:hint="default"/>
+      </w:rPr>
+    </w:lvl>
+  </w:abstractNum>
+  <w:abstractNum w:abstractNumId="87" w15:restartNumberingAfterBreak="0">
     <w:nsid w:val="6C1238A2"/>
     <w:multiLevelType w:val="hybridMultilevel"/>
     <w:tmpl w:val="6BB2EB5C"/>
@@ -32137,7 +35634,7 @@
       </w:rPr>
     </w:lvl>
   </w:abstractNum>
-  <w:abstractNum w:abstractNumId="79" w15:restartNumberingAfterBreak="0">
+  <w:abstractNum w:abstractNumId="88" w15:restartNumberingAfterBreak="0">
     <w:nsid w:val="6E5F7AAF"/>
     <w:multiLevelType w:val="hybridMultilevel"/>
     <w:tmpl w:val="BF92D5CC"/>
@@ -32223,7 +35720,7 @@
       </w:pPr>
     </w:lvl>
   </w:abstractNum>
-  <w:abstractNum w:abstractNumId="80" w15:restartNumberingAfterBreak="0">
+  <w:abstractNum w:abstractNumId="89" w15:restartNumberingAfterBreak="0">
     <w:nsid w:val="6EA169CE"/>
     <w:multiLevelType w:val="hybridMultilevel"/>
     <w:tmpl w:val="9FC6F552"/>
@@ -32336,7 +35833,7 @@
       </w:rPr>
     </w:lvl>
   </w:abstractNum>
-  <w:abstractNum w:abstractNumId="81" w15:restartNumberingAfterBreak="0">
+  <w:abstractNum w:abstractNumId="90" w15:restartNumberingAfterBreak="0">
     <w:nsid w:val="6EFF7CF0"/>
     <w:multiLevelType w:val="hybridMultilevel"/>
     <w:tmpl w:val="8D48AE6A"/>
@@ -32449,7 +35946,7 @@
       </w:rPr>
     </w:lvl>
   </w:abstractNum>
-  <w:abstractNum w:abstractNumId="82" w15:restartNumberingAfterBreak="0">
+  <w:abstractNum w:abstractNumId="91" w15:restartNumberingAfterBreak="0">
     <w:nsid w:val="70390210"/>
     <w:multiLevelType w:val="hybridMultilevel"/>
     <w:tmpl w:val="90EC57DC"/>
@@ -32562,7 +36059,7 @@
       </w:rPr>
     </w:lvl>
   </w:abstractNum>
-  <w:abstractNum w:abstractNumId="83" w15:restartNumberingAfterBreak="0">
+  <w:abstractNum w:abstractNumId="92" w15:restartNumberingAfterBreak="0">
     <w:nsid w:val="726C5FE7"/>
     <w:multiLevelType w:val="hybridMultilevel"/>
     <w:tmpl w:val="A890511E"/>
@@ -32675,7 +36172,7 @@
       </w:rPr>
     </w:lvl>
   </w:abstractNum>
-  <w:abstractNum w:abstractNumId="84" w15:restartNumberingAfterBreak="0">
+  <w:abstractNum w:abstractNumId="93" w15:restartNumberingAfterBreak="0">
     <w:nsid w:val="75BB5B9A"/>
     <w:multiLevelType w:val="hybridMultilevel"/>
     <w:tmpl w:val="E1D66F90"/>
@@ -32788,7 +36285,7 @@
       </w:rPr>
     </w:lvl>
   </w:abstractNum>
-  <w:abstractNum w:abstractNumId="85" w15:restartNumberingAfterBreak="0">
+  <w:abstractNum w:abstractNumId="94" w15:restartNumberingAfterBreak="0">
     <w:nsid w:val="76F26BA8"/>
     <w:multiLevelType w:val="hybridMultilevel"/>
     <w:tmpl w:val="916EB77C"/>
@@ -32901,7 +36398,120 @@
       </w:rPr>
     </w:lvl>
   </w:abstractNum>
-  <w:abstractNum w:abstractNumId="86" w15:restartNumberingAfterBreak="0">
+  <w:abstractNum w:abstractNumId="95" w15:restartNumberingAfterBreak="0">
+    <w:nsid w:val="772E72EB"/>
+    <w:multiLevelType w:val="hybridMultilevel"/>
+    <w:tmpl w:val="C832DC54"/>
+    <w:lvl w:ilvl="0" w:tplc="4009000B">
+      <w:start w:val="1"/>
+      <w:numFmt w:val="bullet"/>
+      <w:lvlText w:val=""/>
+      <w:lvlJc w:val="left"/>
+      <w:pPr>
+        <w:ind w:left="1120" w:hanging="360"/>
+      </w:pPr>
+      <w:rPr>
+        <w:rFonts w:ascii="Wingdings" w:hAnsi="Wingdings" w:hint="default"/>
+      </w:rPr>
+    </w:lvl>
+    <w:lvl w:ilvl="1" w:tplc="40090003" w:tentative="1">
+      <w:start w:val="1"/>
+      <w:numFmt w:val="bullet"/>
+      <w:lvlText w:val="o"/>
+      <w:lvlJc w:val="left"/>
+      <w:pPr>
+        <w:ind w:left="1840" w:hanging="360"/>
+      </w:pPr>
+      <w:rPr>
+        <w:rFonts w:ascii="Courier New" w:hAnsi="Courier New" w:cs="Courier New" w:hint="default"/>
+      </w:rPr>
+    </w:lvl>
+    <w:lvl w:ilvl="2" w:tplc="40090005" w:tentative="1">
+      <w:start w:val="1"/>
+      <w:numFmt w:val="bullet"/>
+      <w:lvlText w:val=""/>
+      <w:lvlJc w:val="left"/>
+      <w:pPr>
+        <w:ind w:left="2560" w:hanging="360"/>
+      </w:pPr>
+      <w:rPr>
+        <w:rFonts w:ascii="Wingdings" w:hAnsi="Wingdings" w:hint="default"/>
+      </w:rPr>
+    </w:lvl>
+    <w:lvl w:ilvl="3" w:tplc="40090001" w:tentative="1">
+      <w:start w:val="1"/>
+      <w:numFmt w:val="bullet"/>
+      <w:lvlText w:val=""/>
+      <w:lvlJc w:val="left"/>
+      <w:pPr>
+        <w:ind w:left="3280" w:hanging="360"/>
+      </w:pPr>
+      <w:rPr>
+        <w:rFonts w:ascii="Symbol" w:hAnsi="Symbol" w:hint="default"/>
+      </w:rPr>
+    </w:lvl>
+    <w:lvl w:ilvl="4" w:tplc="40090003" w:tentative="1">
+      <w:start w:val="1"/>
+      <w:numFmt w:val="bullet"/>
+      <w:lvlText w:val="o"/>
+      <w:lvlJc w:val="left"/>
+      <w:pPr>
+        <w:ind w:left="4000" w:hanging="360"/>
+      </w:pPr>
+      <w:rPr>
+        <w:rFonts w:ascii="Courier New" w:hAnsi="Courier New" w:cs="Courier New" w:hint="default"/>
+      </w:rPr>
+    </w:lvl>
+    <w:lvl w:ilvl="5" w:tplc="40090005" w:tentative="1">
+      <w:start w:val="1"/>
+      <w:numFmt w:val="bullet"/>
+      <w:lvlText w:val=""/>
+      <w:lvlJc w:val="left"/>
+      <w:pPr>
+        <w:ind w:left="4720" w:hanging="360"/>
+      </w:pPr>
+      <w:rPr>
+        <w:rFonts w:ascii="Wingdings" w:hAnsi="Wingdings" w:hint="default"/>
+      </w:rPr>
+    </w:lvl>
+    <w:lvl w:ilvl="6" w:tplc="40090001" w:tentative="1">
+      <w:start w:val="1"/>
+      <w:numFmt w:val="bullet"/>
+      <w:lvlText w:val=""/>
+      <w:lvlJc w:val="left"/>
+      <w:pPr>
+        <w:ind w:left="5440" w:hanging="360"/>
+      </w:pPr>
+      <w:rPr>
+        <w:rFonts w:ascii="Symbol" w:hAnsi="Symbol" w:hint="default"/>
+      </w:rPr>
+    </w:lvl>
+    <w:lvl w:ilvl="7" w:tplc="40090003" w:tentative="1">
+      <w:start w:val="1"/>
+      <w:numFmt w:val="bullet"/>
+      <w:lvlText w:val="o"/>
+      <w:lvlJc w:val="left"/>
+      <w:pPr>
+        <w:ind w:left="6160" w:hanging="360"/>
+      </w:pPr>
+      <w:rPr>
+        <w:rFonts w:ascii="Courier New" w:hAnsi="Courier New" w:cs="Courier New" w:hint="default"/>
+      </w:rPr>
+    </w:lvl>
+    <w:lvl w:ilvl="8" w:tplc="40090005" w:tentative="1">
+      <w:start w:val="1"/>
+      <w:numFmt w:val="bullet"/>
+      <w:lvlText w:val=""/>
+      <w:lvlJc w:val="left"/>
+      <w:pPr>
+        <w:ind w:left="6880" w:hanging="360"/>
+      </w:pPr>
+      <w:rPr>
+        <w:rFonts w:ascii="Wingdings" w:hAnsi="Wingdings" w:hint="default"/>
+      </w:rPr>
+    </w:lvl>
+  </w:abstractNum>
+  <w:abstractNum w:abstractNumId="96" w15:restartNumberingAfterBreak="0">
     <w:nsid w:val="78D4407D"/>
     <w:multiLevelType w:val="hybridMultilevel"/>
     <w:tmpl w:val="9C6A39B8"/>
@@ -33014,7 +36624,7 @@
       </w:rPr>
     </w:lvl>
   </w:abstractNum>
-  <w:abstractNum w:abstractNumId="87" w15:restartNumberingAfterBreak="0">
+  <w:abstractNum w:abstractNumId="97" w15:restartNumberingAfterBreak="0">
     <w:nsid w:val="78FF1992"/>
     <w:multiLevelType w:val="hybridMultilevel"/>
     <w:tmpl w:val="3E304C16"/>
@@ -33127,7 +36737,7 @@
       </w:rPr>
     </w:lvl>
   </w:abstractNum>
-  <w:abstractNum w:abstractNumId="88" w15:restartNumberingAfterBreak="0">
+  <w:abstractNum w:abstractNumId="98" w15:restartNumberingAfterBreak="0">
     <w:nsid w:val="7A850844"/>
     <w:multiLevelType w:val="hybridMultilevel"/>
     <w:tmpl w:val="8D24419A"/>
@@ -33240,7 +36850,7 @@
       </w:rPr>
     </w:lvl>
   </w:abstractNum>
-  <w:abstractNum w:abstractNumId="89" w15:restartNumberingAfterBreak="0">
+  <w:abstractNum w:abstractNumId="99" w15:restartNumberingAfterBreak="0">
     <w:nsid w:val="7A9E48D1"/>
     <w:multiLevelType w:val="hybridMultilevel"/>
     <w:tmpl w:val="7C2C2C78"/>
@@ -33353,7 +36963,7 @@
       </w:rPr>
     </w:lvl>
   </w:abstractNum>
-  <w:abstractNum w:abstractNumId="90" w15:restartNumberingAfterBreak="0">
+  <w:abstractNum w:abstractNumId="100" w15:restartNumberingAfterBreak="0">
     <w:nsid w:val="7B067406"/>
     <w:multiLevelType w:val="hybridMultilevel"/>
     <w:tmpl w:val="B7EEC058"/>
@@ -33466,7 +37076,7 @@
       </w:rPr>
     </w:lvl>
   </w:abstractNum>
-  <w:abstractNum w:abstractNumId="91" w15:restartNumberingAfterBreak="0">
+  <w:abstractNum w:abstractNumId="101" w15:restartNumberingAfterBreak="0">
     <w:nsid w:val="7CA93F11"/>
     <w:multiLevelType w:val="hybridMultilevel"/>
     <w:tmpl w:val="52BC6E0A"/>
@@ -33579,7 +37189,120 @@
       </w:rPr>
     </w:lvl>
   </w:abstractNum>
-  <w:abstractNum w:abstractNumId="92" w15:restartNumberingAfterBreak="0">
+  <w:abstractNum w:abstractNumId="102" w15:restartNumberingAfterBreak="0">
+    <w:nsid w:val="7CE52024"/>
+    <w:multiLevelType w:val="hybridMultilevel"/>
+    <w:tmpl w:val="6DD4FF4A"/>
+    <w:lvl w:ilvl="0" w:tplc="4009000B">
+      <w:start w:val="1"/>
+      <w:numFmt w:val="bullet"/>
+      <w:lvlText w:val=""/>
+      <w:lvlJc w:val="left"/>
+      <w:pPr>
+        <w:ind w:left="1120" w:hanging="360"/>
+      </w:pPr>
+      <w:rPr>
+        <w:rFonts w:ascii="Wingdings" w:hAnsi="Wingdings" w:hint="default"/>
+      </w:rPr>
+    </w:lvl>
+    <w:lvl w:ilvl="1" w:tplc="40090003" w:tentative="1">
+      <w:start w:val="1"/>
+      <w:numFmt w:val="bullet"/>
+      <w:lvlText w:val="o"/>
+      <w:lvlJc w:val="left"/>
+      <w:pPr>
+        <w:ind w:left="1840" w:hanging="360"/>
+      </w:pPr>
+      <w:rPr>
+        <w:rFonts w:ascii="Courier New" w:hAnsi="Courier New" w:cs="Courier New" w:hint="default"/>
+      </w:rPr>
+    </w:lvl>
+    <w:lvl w:ilvl="2" w:tplc="40090005" w:tentative="1">
+      <w:start w:val="1"/>
+      <w:numFmt w:val="bullet"/>
+      <w:lvlText w:val=""/>
+      <w:lvlJc w:val="left"/>
+      <w:pPr>
+        <w:ind w:left="2560" w:hanging="360"/>
+      </w:pPr>
+      <w:rPr>
+        <w:rFonts w:ascii="Wingdings" w:hAnsi="Wingdings" w:hint="default"/>
+      </w:rPr>
+    </w:lvl>
+    <w:lvl w:ilvl="3" w:tplc="40090001" w:tentative="1">
+      <w:start w:val="1"/>
+      <w:numFmt w:val="bullet"/>
+      <w:lvlText w:val=""/>
+      <w:lvlJc w:val="left"/>
+      <w:pPr>
+        <w:ind w:left="3280" w:hanging="360"/>
+      </w:pPr>
+      <w:rPr>
+        <w:rFonts w:ascii="Symbol" w:hAnsi="Symbol" w:hint="default"/>
+      </w:rPr>
+    </w:lvl>
+    <w:lvl w:ilvl="4" w:tplc="40090003" w:tentative="1">
+      <w:start w:val="1"/>
+      <w:numFmt w:val="bullet"/>
+      <w:lvlText w:val="o"/>
+      <w:lvlJc w:val="left"/>
+      <w:pPr>
+        <w:ind w:left="4000" w:hanging="360"/>
+      </w:pPr>
+      <w:rPr>
+        <w:rFonts w:ascii="Courier New" w:hAnsi="Courier New" w:cs="Courier New" w:hint="default"/>
+      </w:rPr>
+    </w:lvl>
+    <w:lvl w:ilvl="5" w:tplc="40090005" w:tentative="1">
+      <w:start w:val="1"/>
+      <w:numFmt w:val="bullet"/>
+      <w:lvlText w:val=""/>
+      <w:lvlJc w:val="left"/>
+      <w:pPr>
+        <w:ind w:left="4720" w:hanging="360"/>
+      </w:pPr>
+      <w:rPr>
+        <w:rFonts w:ascii="Wingdings" w:hAnsi="Wingdings" w:hint="default"/>
+      </w:rPr>
+    </w:lvl>
+    <w:lvl w:ilvl="6" w:tplc="40090001" w:tentative="1">
+      <w:start w:val="1"/>
+      <w:numFmt w:val="bullet"/>
+      <w:lvlText w:val=""/>
+      <w:lvlJc w:val="left"/>
+      <w:pPr>
+        <w:ind w:left="5440" w:hanging="360"/>
+      </w:pPr>
+      <w:rPr>
+        <w:rFonts w:ascii="Symbol" w:hAnsi="Symbol" w:hint="default"/>
+      </w:rPr>
+    </w:lvl>
+    <w:lvl w:ilvl="7" w:tplc="40090003" w:tentative="1">
+      <w:start w:val="1"/>
+      <w:numFmt w:val="bullet"/>
+      <w:lvlText w:val="o"/>
+      <w:lvlJc w:val="left"/>
+      <w:pPr>
+        <w:ind w:left="6160" w:hanging="360"/>
+      </w:pPr>
+      <w:rPr>
+        <w:rFonts w:ascii="Courier New" w:hAnsi="Courier New" w:cs="Courier New" w:hint="default"/>
+      </w:rPr>
+    </w:lvl>
+    <w:lvl w:ilvl="8" w:tplc="40090005" w:tentative="1">
+      <w:start w:val="1"/>
+      <w:numFmt w:val="bullet"/>
+      <w:lvlText w:val=""/>
+      <w:lvlJc w:val="left"/>
+      <w:pPr>
+        <w:ind w:left="6880" w:hanging="360"/>
+      </w:pPr>
+      <w:rPr>
+        <w:rFonts w:ascii="Wingdings" w:hAnsi="Wingdings" w:hint="default"/>
+      </w:rPr>
+    </w:lvl>
+  </w:abstractNum>
+  <w:abstractNum w:abstractNumId="103" w15:restartNumberingAfterBreak="0">
     <w:nsid w:val="7E1711BB"/>
     <w:multiLevelType w:val="hybridMultilevel"/>
     <w:tmpl w:val="EBD83B5A"/>
@@ -33692,7 +37415,7 @@
       </w:rPr>
     </w:lvl>
   </w:abstractNum>
-  <w:abstractNum w:abstractNumId="93" w15:restartNumberingAfterBreak="0">
+  <w:abstractNum w:abstractNumId="104" w15:restartNumberingAfterBreak="0">
     <w:nsid w:val="7E6703BC"/>
     <w:multiLevelType w:val="hybridMultilevel"/>
     <w:tmpl w:val="01347444"/>
@@ -33806,160 +37529,160 @@
     </w:lvl>
   </w:abstractNum>
   <w:num w:numId="1" w16cid:durableId="234126080">
-    <w:abstractNumId w:val="68"/>
+    <w:abstractNumId w:val="73"/>
   </w:num>
   <w:num w:numId="2" w16cid:durableId="1827168422">
-    <w:abstractNumId w:val="24"/>
+    <w:abstractNumId w:val="25"/>
   </w:num>
   <w:num w:numId="3" w16cid:durableId="645551749">
     <w:abstractNumId w:val="10"/>
   </w:num>
   <w:num w:numId="4" w16cid:durableId="984048638">
-    <w:abstractNumId w:val="16"/>
+    <w:abstractNumId w:val="17"/>
   </w:num>
   <w:num w:numId="5" w16cid:durableId="2053652926">
-    <w:abstractNumId w:val="57"/>
+    <w:abstractNumId w:val="62"/>
   </w:num>
   <w:num w:numId="6" w16cid:durableId="120808992">
-    <w:abstractNumId w:val="32"/>
+    <w:abstractNumId w:val="33"/>
   </w:num>
   <w:num w:numId="7" w16cid:durableId="1196692114">
-    <w:abstractNumId w:val="28"/>
+    <w:abstractNumId w:val="29"/>
   </w:num>
   <w:num w:numId="8" w16cid:durableId="446656441">
-    <w:abstractNumId w:val="71"/>
+    <w:abstractNumId w:val="77"/>
   </w:num>
   <w:num w:numId="9" w16cid:durableId="698819531">
+    <w:abstractNumId w:val="78"/>
+  </w:num>
+  <w:num w:numId="10" w16cid:durableId="1527332008">
+    <w:abstractNumId w:val="58"/>
+  </w:num>
+  <w:num w:numId="11" w16cid:durableId="1770158062">
+    <w:abstractNumId w:val="38"/>
+  </w:num>
+  <w:num w:numId="12" w16cid:durableId="839471443">
+    <w:abstractNumId w:val="22"/>
+  </w:num>
+  <w:num w:numId="13" w16cid:durableId="1625767979">
+    <w:abstractNumId w:val="96"/>
+  </w:num>
+  <w:num w:numId="14" w16cid:durableId="712922381">
+    <w:abstractNumId w:val="23"/>
+  </w:num>
+  <w:num w:numId="15" w16cid:durableId="1509248443">
+    <w:abstractNumId w:val="49"/>
+  </w:num>
+  <w:num w:numId="16" w16cid:durableId="1388600950">
+    <w:abstractNumId w:val="19"/>
+  </w:num>
+  <w:num w:numId="17" w16cid:durableId="63383461">
+    <w:abstractNumId w:val="34"/>
+  </w:num>
+  <w:num w:numId="18" w16cid:durableId="1959605983">
+    <w:abstractNumId w:val="54"/>
+  </w:num>
+  <w:num w:numId="19" w16cid:durableId="1251352226">
     <w:abstractNumId w:val="72"/>
   </w:num>
-  <w:num w:numId="10" w16cid:durableId="1527332008">
-    <w:abstractNumId w:val="53"/>
-  </w:num>
-  <w:num w:numId="11" w16cid:durableId="1770158062">
-    <w:abstractNumId w:val="37"/>
-  </w:num>
-  <w:num w:numId="12" w16cid:durableId="839471443">
-    <w:abstractNumId w:val="21"/>
-  </w:num>
-  <w:num w:numId="13" w16cid:durableId="1625767979">
-    <w:abstractNumId w:val="86"/>
-  </w:num>
-  <w:num w:numId="14" w16cid:durableId="712922381">
-    <w:abstractNumId w:val="22"/>
-  </w:num>
-  <w:num w:numId="15" w16cid:durableId="1509248443">
-    <w:abstractNumId w:val="46"/>
-  </w:num>
-  <w:num w:numId="16" w16cid:durableId="1388600950">
-    <w:abstractNumId w:val="18"/>
-  </w:num>
-  <w:num w:numId="17" w16cid:durableId="63383461">
-    <w:abstractNumId w:val="33"/>
-  </w:num>
-  <w:num w:numId="18" w16cid:durableId="1959605983">
-    <w:abstractNumId w:val="50"/>
-  </w:num>
-  <w:num w:numId="19" w16cid:durableId="1251352226">
-    <w:abstractNumId w:val="67"/>
-  </w:num>
   <w:num w:numId="20" w16cid:durableId="1579706643">
-    <w:abstractNumId w:val="70"/>
+    <w:abstractNumId w:val="76"/>
   </w:num>
   <w:num w:numId="21" w16cid:durableId="616908098">
-    <w:abstractNumId w:val="51"/>
+    <w:abstractNumId w:val="55"/>
   </w:num>
   <w:num w:numId="22" w16cid:durableId="1590456493">
-    <w:abstractNumId w:val="81"/>
+    <w:abstractNumId w:val="90"/>
   </w:num>
   <w:num w:numId="23" w16cid:durableId="1853490051">
-    <w:abstractNumId w:val="78"/>
+    <w:abstractNumId w:val="87"/>
   </w:num>
   <w:num w:numId="24" w16cid:durableId="489753068">
-    <w:abstractNumId w:val="54"/>
+    <w:abstractNumId w:val="59"/>
   </w:num>
   <w:num w:numId="25" w16cid:durableId="470750842">
-    <w:abstractNumId w:val="92"/>
+    <w:abstractNumId w:val="103"/>
   </w:num>
   <w:num w:numId="26" w16cid:durableId="1286622340">
-    <w:abstractNumId w:val="41"/>
+    <w:abstractNumId w:val="44"/>
   </w:num>
   <w:num w:numId="27" w16cid:durableId="675691640">
-    <w:abstractNumId w:val="26"/>
+    <w:abstractNumId w:val="27"/>
   </w:num>
   <w:num w:numId="28" w16cid:durableId="942416099">
-    <w:abstractNumId w:val="61"/>
+    <w:abstractNumId w:val="66"/>
   </w:num>
   <w:num w:numId="29" w16cid:durableId="354500318">
-    <w:abstractNumId w:val="89"/>
+    <w:abstractNumId w:val="99"/>
   </w:num>
   <w:num w:numId="30" w16cid:durableId="555707672">
-    <w:abstractNumId w:val="87"/>
+    <w:abstractNumId w:val="97"/>
   </w:num>
   <w:num w:numId="31" w16cid:durableId="1227456296">
     <w:abstractNumId w:val="4"/>
   </w:num>
   <w:num w:numId="32" w16cid:durableId="241791814">
+    <w:abstractNumId w:val="37"/>
+  </w:num>
+  <w:num w:numId="33" w16cid:durableId="297877559">
+    <w:abstractNumId w:val="70"/>
+  </w:num>
+  <w:num w:numId="34" w16cid:durableId="1954240346">
+    <w:abstractNumId w:val="88"/>
+  </w:num>
+  <w:num w:numId="35" w16cid:durableId="1758016530">
+    <w:abstractNumId w:val="71"/>
+  </w:num>
+  <w:num w:numId="36" w16cid:durableId="101455697">
+    <w:abstractNumId w:val="46"/>
+  </w:num>
+  <w:num w:numId="37" w16cid:durableId="2089768025">
+    <w:abstractNumId w:val="21"/>
+  </w:num>
+  <w:num w:numId="38" w16cid:durableId="1312558408">
     <w:abstractNumId w:val="36"/>
   </w:num>
-  <w:num w:numId="33" w16cid:durableId="297877559">
-    <w:abstractNumId w:val="65"/>
-  </w:num>
-  <w:num w:numId="34" w16cid:durableId="1954240346">
-    <w:abstractNumId w:val="79"/>
-  </w:num>
-  <w:num w:numId="35" w16cid:durableId="1758016530">
-    <w:abstractNumId w:val="66"/>
-  </w:num>
-  <w:num w:numId="36" w16cid:durableId="101455697">
-    <w:abstractNumId w:val="43"/>
-  </w:num>
-  <w:num w:numId="37" w16cid:durableId="2089768025">
-    <w:abstractNumId w:val="20"/>
-  </w:num>
-  <w:num w:numId="38" w16cid:durableId="1312558408">
-    <w:abstractNumId w:val="35"/>
-  </w:num>
   <w:num w:numId="39" w16cid:durableId="988555030">
-    <w:abstractNumId w:val="49"/>
+    <w:abstractNumId w:val="53"/>
   </w:num>
   <w:num w:numId="40" w16cid:durableId="497041544">
-    <w:abstractNumId w:val="82"/>
+    <w:abstractNumId w:val="91"/>
   </w:num>
   <w:num w:numId="41" w16cid:durableId="1098863632">
-    <w:abstractNumId w:val="47"/>
+    <w:abstractNumId w:val="50"/>
   </w:num>
   <w:num w:numId="42" w16cid:durableId="2087998300">
-    <w:abstractNumId w:val="52"/>
+    <w:abstractNumId w:val="57"/>
   </w:num>
   <w:num w:numId="43" w16cid:durableId="32077361">
-    <w:abstractNumId w:val="88"/>
+    <w:abstractNumId w:val="98"/>
   </w:num>
   <w:num w:numId="44" w16cid:durableId="195629393">
     <w:abstractNumId w:val="6"/>
   </w:num>
   <w:num w:numId="45" w16cid:durableId="122306412">
-    <w:abstractNumId w:val="56"/>
+    <w:abstractNumId w:val="61"/>
   </w:num>
   <w:num w:numId="46" w16cid:durableId="1157845596">
-    <w:abstractNumId w:val="73"/>
+    <w:abstractNumId w:val="80"/>
   </w:num>
   <w:num w:numId="47" w16cid:durableId="2079740825">
-    <w:abstractNumId w:val="62"/>
+    <w:abstractNumId w:val="67"/>
   </w:num>
   <w:num w:numId="48" w16cid:durableId="825440182">
-    <w:abstractNumId w:val="80"/>
+    <w:abstractNumId w:val="89"/>
   </w:num>
   <w:num w:numId="49" w16cid:durableId="182594935">
-    <w:abstractNumId w:val="85"/>
+    <w:abstractNumId w:val="94"/>
   </w:num>
   <w:num w:numId="50" w16cid:durableId="1308360786">
-    <w:abstractNumId w:val="93"/>
+    <w:abstractNumId w:val="104"/>
   </w:num>
   <w:num w:numId="51" w16cid:durableId="1632978932">
-    <w:abstractNumId w:val="17"/>
+    <w:abstractNumId w:val="18"/>
   </w:num>
   <w:num w:numId="52" w16cid:durableId="391537947">
-    <w:abstractNumId w:val="19"/>
+    <w:abstractNumId w:val="20"/>
   </w:num>
   <w:num w:numId="53" w16cid:durableId="378554586">
     <w:abstractNumId w:val="14"/>
@@ -33968,67 +37691,67 @@
     <w:abstractNumId w:val="8"/>
   </w:num>
   <w:num w:numId="55" w16cid:durableId="1529443842">
-    <w:abstractNumId w:val="84"/>
+    <w:abstractNumId w:val="93"/>
   </w:num>
   <w:num w:numId="56" w16cid:durableId="189415164">
     <w:abstractNumId w:val="9"/>
   </w:num>
   <w:num w:numId="57" w16cid:durableId="1594314221">
-    <w:abstractNumId w:val="63"/>
+    <w:abstractNumId w:val="68"/>
   </w:num>
   <w:num w:numId="58" w16cid:durableId="1226257099">
-    <w:abstractNumId w:val="60"/>
+    <w:abstractNumId w:val="65"/>
   </w:num>
   <w:num w:numId="59" w16cid:durableId="1419328051">
     <w:abstractNumId w:val="3"/>
   </w:num>
   <w:num w:numId="60" w16cid:durableId="1710567223">
-    <w:abstractNumId w:val="23"/>
+    <w:abstractNumId w:val="24"/>
   </w:num>
   <w:num w:numId="61" w16cid:durableId="630017495">
-    <w:abstractNumId w:val="77"/>
+    <w:abstractNumId w:val="85"/>
   </w:num>
   <w:num w:numId="62" w16cid:durableId="1282304201">
-    <w:abstractNumId w:val="42"/>
+    <w:abstractNumId w:val="45"/>
   </w:num>
   <w:num w:numId="63" w16cid:durableId="1717508633">
-    <w:abstractNumId w:val="76"/>
+    <w:abstractNumId w:val="84"/>
   </w:num>
   <w:num w:numId="64" w16cid:durableId="1437024406">
-    <w:abstractNumId w:val="91"/>
+    <w:abstractNumId w:val="101"/>
   </w:num>
   <w:num w:numId="65" w16cid:durableId="1457289484">
     <w:abstractNumId w:val="11"/>
   </w:num>
   <w:num w:numId="66" w16cid:durableId="2044553889">
-    <w:abstractNumId w:val="75"/>
+    <w:abstractNumId w:val="83"/>
   </w:num>
   <w:num w:numId="67" w16cid:durableId="476344594">
-    <w:abstractNumId w:val="25"/>
+    <w:abstractNumId w:val="26"/>
   </w:num>
   <w:num w:numId="68" w16cid:durableId="654841836">
-    <w:abstractNumId w:val="74"/>
+    <w:abstractNumId w:val="82"/>
   </w:num>
   <w:num w:numId="69" w16cid:durableId="65881997">
-    <w:abstractNumId w:val="34"/>
+    <w:abstractNumId w:val="35"/>
   </w:num>
   <w:num w:numId="70" w16cid:durableId="356779715">
-    <w:abstractNumId w:val="30"/>
+    <w:abstractNumId w:val="31"/>
   </w:num>
   <w:num w:numId="71" w16cid:durableId="1630354395">
     <w:abstractNumId w:val="7"/>
   </w:num>
   <w:num w:numId="72" w16cid:durableId="760300450">
-    <w:abstractNumId w:val="64"/>
+    <w:abstractNumId w:val="69"/>
   </w:num>
   <w:num w:numId="73" w16cid:durableId="1148521502">
     <w:abstractNumId w:val="13"/>
   </w:num>
   <w:num w:numId="74" w16cid:durableId="1531189807">
-    <w:abstractNumId w:val="44"/>
+    <w:abstractNumId w:val="47"/>
   </w:num>
   <w:num w:numId="75" w16cid:durableId="725035450">
-    <w:abstractNumId w:val="90"/>
+    <w:abstractNumId w:val="100"/>
   </w:num>
   <w:num w:numId="76" w16cid:durableId="1017198522">
     <w:abstractNumId w:val="12"/>
@@ -34043,10 +37766,10 @@
     <w:abstractNumId w:val="1"/>
   </w:num>
   <w:num w:numId="80" w16cid:durableId="1312519575">
-    <w:abstractNumId w:val="83"/>
+    <w:abstractNumId w:val="92"/>
   </w:num>
   <w:num w:numId="81" w16cid:durableId="895311985">
-    <w:abstractNumId w:val="38"/>
+    <w:abstractNumId w:val="39"/>
   </w:num>
   <w:num w:numId="82" w16cid:durableId="546452723">
     <w:abstractNumId w:val="5"/>
@@ -34055,39 +37778,72 @@
     <w:abstractNumId w:val="2"/>
   </w:num>
   <w:num w:numId="84" w16cid:durableId="2044205207">
-    <w:abstractNumId w:val="31"/>
+    <w:abstractNumId w:val="32"/>
   </w:num>
   <w:num w:numId="85" w16cid:durableId="1101948288">
-    <w:abstractNumId w:val="29"/>
+    <w:abstractNumId w:val="30"/>
   </w:num>
   <w:num w:numId="86" w16cid:durableId="1406686221">
+    <w:abstractNumId w:val="51"/>
+  </w:num>
+  <w:num w:numId="87" w16cid:durableId="1351566751">
+    <w:abstractNumId w:val="40"/>
+  </w:num>
+  <w:num w:numId="88" w16cid:durableId="2095471439">
+    <w:abstractNumId w:val="41"/>
+  </w:num>
+  <w:num w:numId="89" w16cid:durableId="1182671355">
+    <w:abstractNumId w:val="64"/>
+  </w:num>
+  <w:num w:numId="90" w16cid:durableId="551426170">
     <w:abstractNumId w:val="48"/>
   </w:num>
-  <w:num w:numId="87" w16cid:durableId="1351566751">
-    <w:abstractNumId w:val="39"/>
-  </w:num>
-  <w:num w:numId="88" w16cid:durableId="2095471439">
-    <w:abstractNumId w:val="40"/>
-  </w:num>
-  <w:num w:numId="89" w16cid:durableId="1182671355">
-    <w:abstractNumId w:val="59"/>
-  </w:num>
-  <w:num w:numId="90" w16cid:durableId="551426170">
-    <w:abstractNumId w:val="45"/>
-  </w:num>
   <w:num w:numId="91" w16cid:durableId="937516756">
-    <w:abstractNumId w:val="55"/>
+    <w:abstractNumId w:val="60"/>
   </w:num>
   <w:num w:numId="92" w16cid:durableId="699359183">
-    <w:abstractNumId w:val="58"/>
+    <w:abstractNumId w:val="63"/>
   </w:num>
   <w:num w:numId="93" w16cid:durableId="181238340">
-    <w:abstractNumId w:val="69"/>
+    <w:abstractNumId w:val="75"/>
   </w:num>
   <w:num w:numId="94" w16cid:durableId="446391950">
-    <w:abstractNumId w:val="27"/>
+    <w:abstractNumId w:val="28"/>
   </w:num>
-  <w:numIdMacAtCleanup w:val="91"/>
+  <w:num w:numId="95" w16cid:durableId="999121548">
+    <w:abstractNumId w:val="81"/>
+  </w:num>
+  <w:num w:numId="96" w16cid:durableId="740063514">
+    <w:abstractNumId w:val="52"/>
+  </w:num>
+  <w:num w:numId="97" w16cid:durableId="992031136">
+    <w:abstractNumId w:val="95"/>
+  </w:num>
+  <w:num w:numId="98" w16cid:durableId="690961544">
+    <w:abstractNumId w:val="79"/>
+  </w:num>
+  <w:num w:numId="99" w16cid:durableId="1127547770">
+    <w:abstractNumId w:val="16"/>
+  </w:num>
+  <w:num w:numId="100" w16cid:durableId="726338477">
+    <w:abstractNumId w:val="42"/>
+  </w:num>
+  <w:num w:numId="101" w16cid:durableId="634717080">
+    <w:abstractNumId w:val="102"/>
+  </w:num>
+  <w:num w:numId="102" w16cid:durableId="294718688">
+    <w:abstractNumId w:val="43"/>
+  </w:num>
+  <w:num w:numId="103" w16cid:durableId="598294954">
+    <w:abstractNumId w:val="86"/>
+  </w:num>
+  <w:num w:numId="104" w16cid:durableId="1154182713">
+    <w:abstractNumId w:val="56"/>
+  </w:num>
+  <w:num w:numId="105" w16cid:durableId="1001274617">
+    <w:abstractNumId w:val="74"/>
+  </w:num>
+  <w:numIdMacAtCleanup w:val="105"/>
 </w:numbering>
 </file>
 

</xml_diff>